<commit_message>
Add guide name and MGM logo to blackbook, deck and paper; export blackbook PDF
</commit_message>
<xml_diff>
--- a/docs/blackbook/DreamOS-Final-Year-Project-Report.docx
+++ b/docs/blackbook/DreamOS-Final-Year-Project-Report.docx
@@ -2,6 +2,55 @@
 <file path=word/document.xml><?xml version="1.0" encoding="utf-8"?>
 <w:document xmlns:wpc="http://schemas.microsoft.com/office/word/2010/wordprocessingCanvas" xmlns:cx="http://schemas.microsoft.com/office/drawing/2014/chartex" xmlns:cx1="http://schemas.microsoft.com/office/drawing/2015/9/8/chartex" xmlns:cx2="http://schemas.microsoft.com/office/drawing/2015/10/21/chartex" xmlns:cx3="http://schemas.microsoft.com/office/drawing/2016/5/9/chartex" xmlns:cx4="http://schemas.microsoft.com/office/drawing/2016/5/10/chartex" xmlns:cx5="http://schemas.microsoft.com/office/drawing/2016/5/11/chartex" xmlns:cx6="http://schemas.microsoft.com/office/drawing/2016/5/12/chartex" xmlns:cx7="http://schemas.microsoft.com/office/drawing/2016/5/13/chartex" xmlns:cx8="http://schemas.microsoft.com/office/drawing/2016/5/14/chartex" xmlns:mc="http://schemas.openxmlformats.org/markup-compatibility/2006" xmlns:aink="http://schemas.microsoft.com/office/drawing/2016/ink" xmlns:am3d="http://schemas.microsoft.com/office/drawing/2017/model3d" xmlns:o="urn:schemas-microsoft-com:office:office" xmlns:oel="http://schemas.microsoft.com/office/2019/extlst" xmlns:r="http://schemas.openxmlformats.org/officeDocument/2006/relationships" xmlns:m="http://schemas.openxmlformats.org/officeDocument/2006/math" xmlns:v="urn:schemas-microsoft-com:vml" xmlns:wp14="http://schemas.microsoft.com/office/word/2010/wordprocessingDrawing" xmlns:wp="http://schemas.openxmlformats.org/drawingml/2006/wordprocessingDrawing" xmlns:w10="urn:schemas-microsoft-com:office:word" xmlns:w="http://schemas.openxmlformats.org/wordprocessingml/2006/main" xmlns:w14="http://schemas.microsoft.com/office/word/2010/wordml" xmlns:w15="http://schemas.microsoft.com/office/word/2012/wordml" xmlns:w16cex="http://schemas.microsoft.com/office/word/2018/wordml/cex" xmlns:w16cid="http://schemas.microsoft.com/office/word/2016/wordml/cid" xmlns:w16="http://schemas.microsoft.com/office/word/2018/wordml" xmlns:w16du="http://schemas.microsoft.com/office/word/2023/wordml/word16du" xmlns:w16sdtdh="http://schemas.microsoft.com/office/word/2020/wordml/sdtdatahash" xmlns:w16sdtfl="http://schemas.microsoft.com/office/word/2024/wordml/sdtformatlock" xmlns:w16se="http://schemas.microsoft.com/office/word/2015/wordml/symex" xmlns:wpg="http://schemas.microsoft.com/office/word/2010/wordprocessingGroup" xmlns:wpi="http://schemas.microsoft.com/office/word/2010/wordprocessingInk" xmlns:wne="http://schemas.microsoft.com/office/word/2006/wordml" xmlns:wps="http://schemas.microsoft.com/office/word/2010/wordprocessingShape" mc:Ignorable="w14 w15 w16se w16cid w16 w16cex w16sdtdh w16sdtfl w16du wp14">
   <w:body>
+    <w:p>
+      <w:pPr>
+        <w:spacing w:after="300"/>
+        <w:jc w:val="center"/>
+      </w:pPr>
+      <w:r>
+        <w:rPr>
+          <w:noProof/>
+        </w:rPr>
+        <w:drawing>
+          <wp:inline distT="0" distB="0" distL="0" distR="0" wp14:anchorId="0B246C68" wp14:editId="0F5F7886">
+            <wp:extent cx="2286000" cy="1304925"/>
+            <wp:effectExtent l="0" t="0" r="0" b="0"/>
+            <wp:docPr id="1" name="mgm-logo.png" descr="MGM University logo" title="MGM University logo"/>
+            <wp:cNvGraphicFramePr>
+              <a:graphicFrameLocks xmlns:a="http://schemas.openxmlformats.org/drawingml/2006/main" noChangeAspect="1"/>
+            </wp:cNvGraphicFramePr>
+            <a:graphic xmlns:a="http://schemas.openxmlformats.org/drawingml/2006/main">
+              <a:graphicData uri="http://schemas.openxmlformats.org/drawingml/2006/picture">
+                <pic:pic xmlns:pic="http://schemas.openxmlformats.org/drawingml/2006/picture">
+                  <pic:nvPicPr>
+                    <pic:cNvPr id="0" name=""/>
+                    <pic:cNvPicPr>
+                      <a:picLocks noChangeAspect="1" noChangeArrowheads="1"/>
+                    </pic:cNvPicPr>
+                  </pic:nvPicPr>
+                  <pic:blipFill>
+                    <a:blip r:embed="rId7"/>
+                    <a:srcRect/>
+                    <a:stretch>
+                      <a:fillRect/>
+                    </a:stretch>
+                  </pic:blipFill>
+                  <pic:spPr bwMode="auto">
+                    <a:xfrm>
+                      <a:off x="0" y="0"/>
+                      <a:ext cx="2286000" cy="1304925"/>
+                    </a:xfrm>
+                    <a:prstGeom prst="rect">
+                      <a:avLst/>
+                    </a:prstGeom>
+                  </pic:spPr>
+                </pic:pic>
+              </a:graphicData>
+            </a:graphic>
+          </wp:inline>
+        </w:drawing>
+      </w:r>
+    </w:p>
     <w:p>
       <w:pPr>
         <w:spacing w:line="360" w:lineRule="auto"/>
@@ -146,7 +195,7 @@
           <w:b/>
           <w:bCs/>
         </w:rPr>
-        <w:t>&lt;Name of Guide&gt;</w:t>
+        <w:t>Dr. Minakshi R. Rajput</w:t>
       </w:r>
     </w:p>
     <w:p>
@@ -200,6 +249,56 @@
     </w:p>
     <w:p>
       <w:pPr>
+        <w:spacing w:after="200"/>
+        <w:jc w:val="center"/>
+      </w:pPr>
+      <w:r>
+        <w:rPr>
+          <w:noProof/>
+        </w:rPr>
+        <w:lastRenderedPageBreak/>
+        <w:drawing>
+          <wp:inline distT="0" distB="0" distL="0" distR="0" wp14:anchorId="5C9F5CA2" wp14:editId="68B19647">
+            <wp:extent cx="1428750" cy="819150"/>
+            <wp:effectExtent l="0" t="0" r="0" b="0"/>
+            <wp:docPr id="1939589696" name="mgm-logo.png" descr="MGM University logo" title="MGM University logo"/>
+            <wp:cNvGraphicFramePr>
+              <a:graphicFrameLocks xmlns:a="http://schemas.openxmlformats.org/drawingml/2006/main" noChangeAspect="1"/>
+            </wp:cNvGraphicFramePr>
+            <a:graphic xmlns:a="http://schemas.openxmlformats.org/drawingml/2006/main">
+              <a:graphicData uri="http://schemas.openxmlformats.org/drawingml/2006/picture">
+                <pic:pic xmlns:pic="http://schemas.openxmlformats.org/drawingml/2006/picture">
+                  <pic:nvPicPr>
+                    <pic:cNvPr id="0" name=""/>
+                    <pic:cNvPicPr>
+                      <a:picLocks noChangeAspect="1" noChangeArrowheads="1"/>
+                    </pic:cNvPicPr>
+                  </pic:nvPicPr>
+                  <pic:blipFill>
+                    <a:blip r:embed="rId7"/>
+                    <a:srcRect/>
+                    <a:stretch>
+                      <a:fillRect/>
+                    </a:stretch>
+                  </pic:blipFill>
+                  <pic:spPr bwMode="auto">
+                    <a:xfrm>
+                      <a:off x="0" y="0"/>
+                      <a:ext cx="1428750" cy="819150"/>
+                    </a:xfrm>
+                    <a:prstGeom prst="rect">
+                      <a:avLst/>
+                    </a:prstGeom>
+                  </pic:spPr>
+                </pic:pic>
+              </a:graphicData>
+            </a:graphic>
+          </wp:inline>
+        </w:drawing>
+      </w:r>
+    </w:p>
+    <w:p>
+      <w:pPr>
         <w:spacing w:line="360" w:lineRule="auto"/>
         <w:jc w:val="center"/>
       </w:pPr>
@@ -208,7 +307,6 @@
           <w:b/>
           <w:bCs/>
         </w:rPr>
-        <w:lastRenderedPageBreak/>
         <w:t>Institute of Information and Communication Technology</w:t>
       </w:r>
     </w:p>
@@ -246,7 +344,7 @@
         <w:jc w:val="both"/>
       </w:pPr>
       <w:r>
-        <w:t>This is to certify that Zaid Ali Syed (Roll No. 2305139), Om Vyas (Roll No. 2305170) and Krushna Kadam (Roll No. 2305165) of B.Tech (IT), have successfully completed project work on “DreamOS: An AI-Native Semantic File Management System” under the guidance of &lt;Name of Guide&gt;, and submitted the same during the academic year 2026-2027 towards the partial fulfillment of the degree of B.Tech (IT) from Institute of Information and Communication Technology, MGM University, Chh. Sambhajinagar.</w:t>
+        <w:t>This is to certify that Zaid Ali Syed (Roll No. 2305139), Om Vyas (Roll No. 2305170) and Krushna Kadam (Roll No. 2305165) of B.Tech (IT), have successfully completed project work on “DreamOS: An AI-Native Semantic File Management System” under the guidance of Dr. Minakshi R. Rajput, and submitted the same during the academic year 2026-2027 towards the partial fulfillment of the degree of B.Tech (IT) from Institute of Information and Communication Technology, MGM University, Chh. Sambhajinagar.</w:t>
       </w:r>
     </w:p>
     <w:p>
@@ -254,13 +352,7 @@
         <w:spacing w:line="360" w:lineRule="auto"/>
       </w:pPr>
       <w:r>
-        <w:t>&lt;Guide's Name&gt;</w:t>
-      </w:r>
-      <w:r>
-        <w:tab/>
-      </w:r>
-      <w:r>
-        <w:tab/>
+        <w:t>Dr. Minakshi R. Rajput</w:t>
       </w:r>
       <w:r>
         <w:tab/>
@@ -324,7 +416,7 @@
         <w:pStyle w:val="Heading1"/>
         <w:spacing w:before="240" w:after="200"/>
       </w:pPr>
-      <w:bookmarkStart w:id="0" w:name="_Toc242209390"/>
+      <w:bookmarkStart w:id="0" w:name="_Toc242518477"/>
       <w:r>
         <w:lastRenderedPageBreak/>
         <w:t>Acknowledgement</w:t>
@@ -337,7 +429,7 @@
         <w:jc w:val="both"/>
       </w:pPr>
       <w:r>
-        <w:t>We thank our guide, &lt;Name of Guide&gt;, for guidance on the project. We thank Dr. S. C. Tamane, Director, IICT, and the faculty of the Institute of Information and Communication Technology for the environment and the Project Monitoring structure in which this work was reviewed.</w:t>
+        <w:t>We thank our guide, Dr. Minakshi R. Rajput, for guidance on the project. We thank Dr. S. C. Tamane, Director, IICT, and the faculty of the Institute of Information and Communication Technology for the environment and the Project Monitoring structure in which this work was reviewed.</w:t>
       </w:r>
     </w:p>
     <w:p>
@@ -394,7 +486,7 @@
     <w:sdt>
       <w:sdtPr>
         <w:alias w:val="Contents"/>
-        <w:id w:val="-715433385"/>
+        <w:id w:val="-1220658475"/>
       </w:sdtPr>
       <w:sdtEndPr/>
       <w:sdtContent>
@@ -420,7 +512,7 @@
           <w:r>
             <w:fldChar w:fldCharType="separate"/>
           </w:r>
-          <w:hyperlink w:anchor="_Toc242209390" w:history="1">
+          <w:hyperlink w:anchor="_Toc242518477" w:history="1">
             <w:r>
               <w:rPr>
                 <w:rStyle w:val="Hyperlink"/>
@@ -444,7 +536,7 @@
               <w:rPr>
                 <w:noProof/>
               </w:rPr>
-              <w:instrText xml:space="preserve"> PAGEREF _Toc242209390 \h </w:instrText>
+              <w:instrText xml:space="preserve"> PAGEREF _Toc242518477 \h </w:instrText>
             </w:r>
             <w:r>
               <w:rPr>
@@ -484,7 +576,7 @@
               <w14:ligatures w14:val="standardContextual"/>
             </w:rPr>
           </w:pPr>
-          <w:hyperlink w:anchor="_Toc242209391" w:history="1">
+          <w:hyperlink w:anchor="_Toc242518478" w:history="1">
             <w:r>
               <w:rPr>
                 <w:rStyle w:val="Hyperlink"/>
@@ -508,7 +600,7 @@
               <w:rPr>
                 <w:noProof/>
               </w:rPr>
-              <w:instrText xml:space="preserve"> PAGEREF _Toc242209391 \h </w:instrText>
+              <w:instrText xml:space="preserve"> PAGEREF _Toc242518478 \h </w:instrText>
             </w:r>
             <w:r>
               <w:rPr>
@@ -548,7 +640,7 @@
               <w14:ligatures w14:val="standardContextual"/>
             </w:rPr>
           </w:pPr>
-          <w:hyperlink w:anchor="_Toc242209392" w:history="1">
+          <w:hyperlink w:anchor="_Toc242518479" w:history="1">
             <w:r>
               <w:rPr>
                 <w:rStyle w:val="Hyperlink"/>
@@ -572,7 +664,7 @@
               <w:rPr>
                 <w:noProof/>
               </w:rPr>
-              <w:instrText xml:space="preserve"> PAGEREF _Toc242209392 \h </w:instrText>
+              <w:instrText xml:space="preserve"> PAGEREF _Toc242518479 \h </w:instrText>
             </w:r>
             <w:r>
               <w:rPr>
@@ -612,7 +704,7 @@
               <w14:ligatures w14:val="standardContextual"/>
             </w:rPr>
           </w:pPr>
-          <w:hyperlink w:anchor="_Toc242209393" w:history="1">
+          <w:hyperlink w:anchor="_Toc242518480" w:history="1">
             <w:r>
               <w:rPr>
                 <w:rStyle w:val="Hyperlink"/>
@@ -636,7 +728,7 @@
               <w:rPr>
                 <w:noProof/>
               </w:rPr>
-              <w:instrText xml:space="preserve"> PAGEREF _Toc242209393 \h </w:instrText>
+              <w:instrText xml:space="preserve"> PAGEREF _Toc242518480 \h </w:instrText>
             </w:r>
             <w:r>
               <w:rPr>
@@ -676,7 +768,7 @@
               <w14:ligatures w14:val="standardContextual"/>
             </w:rPr>
           </w:pPr>
-          <w:hyperlink w:anchor="_Toc242209394" w:history="1">
+          <w:hyperlink w:anchor="_Toc242518481" w:history="1">
             <w:r>
               <w:rPr>
                 <w:rStyle w:val="Hyperlink"/>
@@ -700,7 +792,7 @@
               <w:rPr>
                 <w:noProof/>
               </w:rPr>
-              <w:instrText xml:space="preserve"> PAGEREF _Toc242209394 \h </w:instrText>
+              <w:instrText xml:space="preserve"> PAGEREF _Toc242518481 \h </w:instrText>
             </w:r>
             <w:r>
               <w:rPr>
@@ -740,7 +832,7 @@
               <w14:ligatures w14:val="standardContextual"/>
             </w:rPr>
           </w:pPr>
-          <w:hyperlink w:anchor="_Toc242209395" w:history="1">
+          <w:hyperlink w:anchor="_Toc242518482" w:history="1">
             <w:r>
               <w:rPr>
                 <w:rStyle w:val="Hyperlink"/>
@@ -764,7 +856,7 @@
               <w:rPr>
                 <w:noProof/>
               </w:rPr>
-              <w:instrText xml:space="preserve"> PAGEREF _Toc242209395 \h </w:instrText>
+              <w:instrText xml:space="preserve"> PAGEREF _Toc242518482 \h </w:instrText>
             </w:r>
             <w:r>
               <w:rPr>
@@ -804,7 +896,7 @@
               <w14:ligatures w14:val="standardContextual"/>
             </w:rPr>
           </w:pPr>
-          <w:hyperlink w:anchor="_Toc242209396" w:history="1">
+          <w:hyperlink w:anchor="_Toc242518483" w:history="1">
             <w:r>
               <w:rPr>
                 <w:rStyle w:val="Hyperlink"/>
@@ -828,7 +920,7 @@
               <w:rPr>
                 <w:noProof/>
               </w:rPr>
-              <w:instrText xml:space="preserve"> PAGEREF _Toc242209396 \h </w:instrText>
+              <w:instrText xml:space="preserve"> PAGEREF _Toc242518483 \h </w:instrText>
             </w:r>
             <w:r>
               <w:rPr>
@@ -868,7 +960,7 @@
               <w14:ligatures w14:val="standardContextual"/>
             </w:rPr>
           </w:pPr>
-          <w:hyperlink w:anchor="_Toc242209397" w:history="1">
+          <w:hyperlink w:anchor="_Toc242518484" w:history="1">
             <w:r>
               <w:rPr>
                 <w:rStyle w:val="Hyperlink"/>
@@ -892,7 +984,7 @@
               <w:rPr>
                 <w:noProof/>
               </w:rPr>
-              <w:instrText xml:space="preserve"> PAGEREF _Toc242209397 \h </w:instrText>
+              <w:instrText xml:space="preserve"> PAGEREF _Toc242518484 \h </w:instrText>
             </w:r>
             <w:r>
               <w:rPr>
@@ -932,7 +1024,7 @@
               <w14:ligatures w14:val="standardContextual"/>
             </w:rPr>
           </w:pPr>
-          <w:hyperlink w:anchor="_Toc242209398" w:history="1">
+          <w:hyperlink w:anchor="_Toc242518485" w:history="1">
             <w:r>
               <w:rPr>
                 <w:rStyle w:val="Hyperlink"/>
@@ -956,7 +1048,7 @@
               <w:rPr>
                 <w:noProof/>
               </w:rPr>
-              <w:instrText xml:space="preserve"> PAGEREF _Toc242209398 \h </w:instrText>
+              <w:instrText xml:space="preserve"> PAGEREF _Toc242518485 \h </w:instrText>
             </w:r>
             <w:r>
               <w:rPr>
@@ -996,7 +1088,7 @@
               <w14:ligatures w14:val="standardContextual"/>
             </w:rPr>
           </w:pPr>
-          <w:hyperlink w:anchor="_Toc242209399" w:history="1">
+          <w:hyperlink w:anchor="_Toc242518486" w:history="1">
             <w:r>
               <w:rPr>
                 <w:rStyle w:val="Hyperlink"/>
@@ -1020,7 +1112,7 @@
               <w:rPr>
                 <w:noProof/>
               </w:rPr>
-              <w:instrText xml:space="preserve"> PAGEREF _Toc242209399 \h </w:instrText>
+              <w:instrText xml:space="preserve"> PAGEREF _Toc242518486 \h </w:instrText>
             </w:r>
             <w:r>
               <w:rPr>
@@ -1060,7 +1152,7 @@
               <w14:ligatures w14:val="standardContextual"/>
             </w:rPr>
           </w:pPr>
-          <w:hyperlink w:anchor="_Toc242209400" w:history="1">
+          <w:hyperlink w:anchor="_Toc242518487" w:history="1">
             <w:r>
               <w:rPr>
                 <w:rStyle w:val="Hyperlink"/>
@@ -1084,7 +1176,7 @@
               <w:rPr>
                 <w:noProof/>
               </w:rPr>
-              <w:instrText xml:space="preserve"> PAGEREF _Toc242209400 \h </w:instrText>
+              <w:instrText xml:space="preserve"> PAGEREF _Toc242518487 \h </w:instrText>
             </w:r>
             <w:r>
               <w:rPr>
@@ -1124,7 +1216,7 @@
               <w14:ligatures w14:val="standardContextual"/>
             </w:rPr>
           </w:pPr>
-          <w:hyperlink w:anchor="_Toc242209401" w:history="1">
+          <w:hyperlink w:anchor="_Toc242518488" w:history="1">
             <w:r>
               <w:rPr>
                 <w:rStyle w:val="Hyperlink"/>
@@ -1148,7 +1240,7 @@
               <w:rPr>
                 <w:noProof/>
               </w:rPr>
-              <w:instrText xml:space="preserve"> PAGEREF _Toc242209401 \h </w:instrText>
+              <w:instrText xml:space="preserve"> PAGEREF _Toc242518488 \h </w:instrText>
             </w:r>
             <w:r>
               <w:rPr>
@@ -1188,7 +1280,7 @@
               <w14:ligatures w14:val="standardContextual"/>
             </w:rPr>
           </w:pPr>
-          <w:hyperlink w:anchor="_Toc242209402" w:history="1">
+          <w:hyperlink w:anchor="_Toc242518489" w:history="1">
             <w:r>
               <w:rPr>
                 <w:rStyle w:val="Hyperlink"/>
@@ -1212,7 +1304,7 @@
               <w:rPr>
                 <w:noProof/>
               </w:rPr>
-              <w:instrText xml:space="preserve"> PAGEREF _Toc242209402 \h </w:instrText>
+              <w:instrText xml:space="preserve"> PAGEREF _Toc242518489 \h </w:instrText>
             </w:r>
             <w:r>
               <w:rPr>
@@ -1252,7 +1344,7 @@
               <w14:ligatures w14:val="standardContextual"/>
             </w:rPr>
           </w:pPr>
-          <w:hyperlink w:anchor="_Toc242209403" w:history="1">
+          <w:hyperlink w:anchor="_Toc242518490" w:history="1">
             <w:r>
               <w:rPr>
                 <w:rStyle w:val="Hyperlink"/>
@@ -1276,7 +1368,7 @@
               <w:rPr>
                 <w:noProof/>
               </w:rPr>
-              <w:instrText xml:space="preserve"> PAGEREF _Toc242209403 \h </w:instrText>
+              <w:instrText xml:space="preserve"> PAGEREF _Toc242518490 \h </w:instrText>
             </w:r>
             <w:r>
               <w:rPr>
@@ -1316,7 +1408,7 @@
               <w14:ligatures w14:val="standardContextual"/>
             </w:rPr>
           </w:pPr>
-          <w:hyperlink w:anchor="_Toc242209404" w:history="1">
+          <w:hyperlink w:anchor="_Toc242518491" w:history="1">
             <w:r>
               <w:rPr>
                 <w:rStyle w:val="Hyperlink"/>
@@ -1340,7 +1432,7 @@
               <w:rPr>
                 <w:noProof/>
               </w:rPr>
-              <w:instrText xml:space="preserve"> PAGEREF _Toc242209404 \h </w:instrText>
+              <w:instrText xml:space="preserve"> PAGEREF _Toc242518491 \h </w:instrText>
             </w:r>
             <w:r>
               <w:rPr>
@@ -1380,7 +1472,7 @@
               <w14:ligatures w14:val="standardContextual"/>
             </w:rPr>
           </w:pPr>
-          <w:hyperlink w:anchor="_Toc242209405" w:history="1">
+          <w:hyperlink w:anchor="_Toc242518492" w:history="1">
             <w:r>
               <w:rPr>
                 <w:rStyle w:val="Hyperlink"/>
@@ -1404,7 +1496,7 @@
               <w:rPr>
                 <w:noProof/>
               </w:rPr>
-              <w:instrText xml:space="preserve"> PAGEREF _Toc242209405 \h </w:instrText>
+              <w:instrText xml:space="preserve"> PAGEREF _Toc242518492 \h </w:instrText>
             </w:r>
             <w:r>
               <w:rPr>
@@ -1444,7 +1536,7 @@
               <w14:ligatures w14:val="standardContextual"/>
             </w:rPr>
           </w:pPr>
-          <w:hyperlink w:anchor="_Toc242209406" w:history="1">
+          <w:hyperlink w:anchor="_Toc242518493" w:history="1">
             <w:r>
               <w:rPr>
                 <w:rStyle w:val="Hyperlink"/>
@@ -1468,7 +1560,7 @@
               <w:rPr>
                 <w:noProof/>
               </w:rPr>
-              <w:instrText xml:space="preserve"> PAGEREF _Toc242209406 \h </w:instrText>
+              <w:instrText xml:space="preserve"> PAGEREF _Toc242518493 \h </w:instrText>
             </w:r>
             <w:r>
               <w:rPr>
@@ -1508,7 +1600,7 @@
               <w14:ligatures w14:val="standardContextual"/>
             </w:rPr>
           </w:pPr>
-          <w:hyperlink w:anchor="_Toc242209407" w:history="1">
+          <w:hyperlink w:anchor="_Toc242518494" w:history="1">
             <w:r>
               <w:rPr>
                 <w:rStyle w:val="Hyperlink"/>
@@ -1532,7 +1624,7 @@
               <w:rPr>
                 <w:noProof/>
               </w:rPr>
-              <w:instrText xml:space="preserve"> PAGEREF _Toc242209407 \h </w:instrText>
+              <w:instrText xml:space="preserve"> PAGEREF _Toc242518494 \h </w:instrText>
             </w:r>
             <w:r>
               <w:rPr>
@@ -1572,7 +1664,7 @@
               <w14:ligatures w14:val="standardContextual"/>
             </w:rPr>
           </w:pPr>
-          <w:hyperlink w:anchor="_Toc242209408" w:history="1">
+          <w:hyperlink w:anchor="_Toc242518495" w:history="1">
             <w:r>
               <w:rPr>
                 <w:rStyle w:val="Hyperlink"/>
@@ -1596,7 +1688,7 @@
               <w:rPr>
                 <w:noProof/>
               </w:rPr>
-              <w:instrText xml:space="preserve"> PAGEREF _Toc242209408 \h </w:instrText>
+              <w:instrText xml:space="preserve"> PAGEREF _Toc242518495 \h </w:instrText>
             </w:r>
             <w:r>
               <w:rPr>
@@ -1636,7 +1728,7 @@
               <w14:ligatures w14:val="standardContextual"/>
             </w:rPr>
           </w:pPr>
-          <w:hyperlink w:anchor="_Toc242209409" w:history="1">
+          <w:hyperlink w:anchor="_Toc242518496" w:history="1">
             <w:r>
               <w:rPr>
                 <w:rStyle w:val="Hyperlink"/>
@@ -1660,7 +1752,7 @@
               <w:rPr>
                 <w:noProof/>
               </w:rPr>
-              <w:instrText xml:space="preserve"> PAGEREF _Toc242209409 \h </w:instrText>
+              <w:instrText xml:space="preserve"> PAGEREF _Toc242518496 \h </w:instrText>
             </w:r>
             <w:r>
               <w:rPr>
@@ -1700,7 +1792,7 @@
               <w14:ligatures w14:val="standardContextual"/>
             </w:rPr>
           </w:pPr>
-          <w:hyperlink w:anchor="_Toc242209410" w:history="1">
+          <w:hyperlink w:anchor="_Toc242518497" w:history="1">
             <w:r>
               <w:rPr>
                 <w:rStyle w:val="Hyperlink"/>
@@ -1724,7 +1816,7 @@
               <w:rPr>
                 <w:noProof/>
               </w:rPr>
-              <w:instrText xml:space="preserve"> PAGEREF _Toc242209410 \h </w:instrText>
+              <w:instrText xml:space="preserve"> PAGEREF _Toc242518497 \h </w:instrText>
             </w:r>
             <w:r>
               <w:rPr>
@@ -1764,7 +1856,7 @@
               <w14:ligatures w14:val="standardContextual"/>
             </w:rPr>
           </w:pPr>
-          <w:hyperlink w:anchor="_Toc242209411" w:history="1">
+          <w:hyperlink w:anchor="_Toc242518498" w:history="1">
             <w:r>
               <w:rPr>
                 <w:rStyle w:val="Hyperlink"/>
@@ -1788,7 +1880,7 @@
               <w:rPr>
                 <w:noProof/>
               </w:rPr>
-              <w:instrText xml:space="preserve"> PAGEREF _Toc242209411 \h </w:instrText>
+              <w:instrText xml:space="preserve"> PAGEREF _Toc242518498 \h </w:instrText>
             </w:r>
             <w:r>
               <w:rPr>
@@ -1828,7 +1920,7 @@
               <w14:ligatures w14:val="standardContextual"/>
             </w:rPr>
           </w:pPr>
-          <w:hyperlink w:anchor="_Toc242209412" w:history="1">
+          <w:hyperlink w:anchor="_Toc242518499" w:history="1">
             <w:r>
               <w:rPr>
                 <w:rStyle w:val="Hyperlink"/>
@@ -1852,7 +1944,7 @@
               <w:rPr>
                 <w:noProof/>
               </w:rPr>
-              <w:instrText xml:space="preserve"> PAGEREF _Toc242209412 \h </w:instrText>
+              <w:instrText xml:space="preserve"> PAGEREF _Toc242518499 \h </w:instrText>
             </w:r>
             <w:r>
               <w:rPr>
@@ -1892,7 +1984,7 @@
               <w14:ligatures w14:val="standardContextual"/>
             </w:rPr>
           </w:pPr>
-          <w:hyperlink w:anchor="_Toc242209413" w:history="1">
+          <w:hyperlink w:anchor="_Toc242518500" w:history="1">
             <w:r>
               <w:rPr>
                 <w:rStyle w:val="Hyperlink"/>
@@ -1916,7 +2008,7 @@
               <w:rPr>
                 <w:noProof/>
               </w:rPr>
-              <w:instrText xml:space="preserve"> PAGEREF _Toc242209413 \h </w:instrText>
+              <w:instrText xml:space="preserve"> PAGEREF _Toc242518500 \h </w:instrText>
             </w:r>
             <w:r>
               <w:rPr>
@@ -1956,7 +2048,7 @@
               <w14:ligatures w14:val="standardContextual"/>
             </w:rPr>
           </w:pPr>
-          <w:hyperlink w:anchor="_Toc242209414" w:history="1">
+          <w:hyperlink w:anchor="_Toc242518501" w:history="1">
             <w:r>
               <w:rPr>
                 <w:rStyle w:val="Hyperlink"/>
@@ -1980,7 +2072,7 @@
               <w:rPr>
                 <w:noProof/>
               </w:rPr>
-              <w:instrText xml:space="preserve"> PAGEREF _Toc242209414 \h </w:instrText>
+              <w:instrText xml:space="preserve"> PAGEREF _Toc242518501 \h </w:instrText>
             </w:r>
             <w:r>
               <w:rPr>
@@ -2020,7 +2112,7 @@
               <w14:ligatures w14:val="standardContextual"/>
             </w:rPr>
           </w:pPr>
-          <w:hyperlink w:anchor="_Toc242209415" w:history="1">
+          <w:hyperlink w:anchor="_Toc242518502" w:history="1">
             <w:r>
               <w:rPr>
                 <w:rStyle w:val="Hyperlink"/>
@@ -2044,7 +2136,7 @@
               <w:rPr>
                 <w:noProof/>
               </w:rPr>
-              <w:instrText xml:space="preserve"> PAGEREF _Toc242209415 \h </w:instrText>
+              <w:instrText xml:space="preserve"> PAGEREF _Toc242518502 \h </w:instrText>
             </w:r>
             <w:r>
               <w:rPr>
@@ -2084,7 +2176,7 @@
               <w14:ligatures w14:val="standardContextual"/>
             </w:rPr>
           </w:pPr>
-          <w:hyperlink w:anchor="_Toc242209416" w:history="1">
+          <w:hyperlink w:anchor="_Toc242518503" w:history="1">
             <w:r>
               <w:rPr>
                 <w:rStyle w:val="Hyperlink"/>
@@ -2108,7 +2200,7 @@
               <w:rPr>
                 <w:noProof/>
               </w:rPr>
-              <w:instrText xml:space="preserve"> PAGEREF _Toc242209416 \h </w:instrText>
+              <w:instrText xml:space="preserve"> PAGEREF _Toc242518503 \h </w:instrText>
             </w:r>
             <w:r>
               <w:rPr>
@@ -2148,7 +2240,7 @@
               <w14:ligatures w14:val="standardContextual"/>
             </w:rPr>
           </w:pPr>
-          <w:hyperlink w:anchor="_Toc242209417" w:history="1">
+          <w:hyperlink w:anchor="_Toc242518504" w:history="1">
             <w:r>
               <w:rPr>
                 <w:rStyle w:val="Hyperlink"/>
@@ -2172,7 +2264,7 @@
               <w:rPr>
                 <w:noProof/>
               </w:rPr>
-              <w:instrText xml:space="preserve"> PAGEREF _Toc242209417 \h </w:instrText>
+              <w:instrText xml:space="preserve"> PAGEREF _Toc242518504 \h </w:instrText>
             </w:r>
             <w:r>
               <w:rPr>
@@ -2212,7 +2304,7 @@
               <w14:ligatures w14:val="standardContextual"/>
             </w:rPr>
           </w:pPr>
-          <w:hyperlink w:anchor="_Toc242209418" w:history="1">
+          <w:hyperlink w:anchor="_Toc242518505" w:history="1">
             <w:r>
               <w:rPr>
                 <w:rStyle w:val="Hyperlink"/>
@@ -2236,7 +2328,7 @@
               <w:rPr>
                 <w:noProof/>
               </w:rPr>
-              <w:instrText xml:space="preserve"> PAGEREF _Toc242209418 \h </w:instrText>
+              <w:instrText xml:space="preserve"> PAGEREF _Toc242518505 \h </w:instrText>
             </w:r>
             <w:r>
               <w:rPr>
@@ -2276,7 +2368,7 @@
               <w14:ligatures w14:val="standardContextual"/>
             </w:rPr>
           </w:pPr>
-          <w:hyperlink w:anchor="_Toc242209419" w:history="1">
+          <w:hyperlink w:anchor="_Toc242518506" w:history="1">
             <w:r>
               <w:rPr>
                 <w:rStyle w:val="Hyperlink"/>
@@ -2300,7 +2392,7 @@
               <w:rPr>
                 <w:noProof/>
               </w:rPr>
-              <w:instrText xml:space="preserve"> PAGEREF _Toc242209419 \h </w:instrText>
+              <w:instrText xml:space="preserve"> PAGEREF _Toc242518506 \h </w:instrText>
             </w:r>
             <w:r>
               <w:rPr>
@@ -2340,7 +2432,7 @@
               <w14:ligatures w14:val="standardContextual"/>
             </w:rPr>
           </w:pPr>
-          <w:hyperlink w:anchor="_Toc242209420" w:history="1">
+          <w:hyperlink w:anchor="_Toc242518507" w:history="1">
             <w:r>
               <w:rPr>
                 <w:rStyle w:val="Hyperlink"/>
@@ -2364,7 +2456,7 @@
               <w:rPr>
                 <w:noProof/>
               </w:rPr>
-              <w:instrText xml:space="preserve"> PAGEREF _Toc242209420 \h </w:instrText>
+              <w:instrText xml:space="preserve"> PAGEREF _Toc242518507 \h </w:instrText>
             </w:r>
             <w:r>
               <w:rPr>
@@ -2404,7 +2496,7 @@
               <w14:ligatures w14:val="standardContextual"/>
             </w:rPr>
           </w:pPr>
-          <w:hyperlink w:anchor="_Toc242209421" w:history="1">
+          <w:hyperlink w:anchor="_Toc242518508" w:history="1">
             <w:r>
               <w:rPr>
                 <w:rStyle w:val="Hyperlink"/>
@@ -2428,7 +2520,7 @@
               <w:rPr>
                 <w:noProof/>
               </w:rPr>
-              <w:instrText xml:space="preserve"> PAGEREF _Toc242209421 \h </w:instrText>
+              <w:instrText xml:space="preserve"> PAGEREF _Toc242518508 \h </w:instrText>
             </w:r>
             <w:r>
               <w:rPr>
@@ -2468,7 +2560,7 @@
               <w14:ligatures w14:val="standardContextual"/>
             </w:rPr>
           </w:pPr>
-          <w:hyperlink w:anchor="_Toc242209422" w:history="1">
+          <w:hyperlink w:anchor="_Toc242518509" w:history="1">
             <w:r>
               <w:rPr>
                 <w:rStyle w:val="Hyperlink"/>
@@ -2492,7 +2584,7 @@
               <w:rPr>
                 <w:noProof/>
               </w:rPr>
-              <w:instrText xml:space="preserve"> PAGEREF _Toc242209422 \h </w:instrText>
+              <w:instrText xml:space="preserve"> PAGEREF _Toc242518509 \h </w:instrText>
             </w:r>
             <w:r>
               <w:rPr>
@@ -2532,7 +2624,7 @@
               <w14:ligatures w14:val="standardContextual"/>
             </w:rPr>
           </w:pPr>
-          <w:hyperlink w:anchor="_Toc242209423" w:history="1">
+          <w:hyperlink w:anchor="_Toc242518510" w:history="1">
             <w:r>
               <w:rPr>
                 <w:rStyle w:val="Hyperlink"/>
@@ -2556,7 +2648,7 @@
               <w:rPr>
                 <w:noProof/>
               </w:rPr>
-              <w:instrText xml:space="preserve"> PAGEREF _Toc242209423 \h </w:instrText>
+              <w:instrText xml:space="preserve"> PAGEREF _Toc242518510 \h </w:instrText>
             </w:r>
             <w:r>
               <w:rPr>
@@ -2596,7 +2688,7 @@
               <w14:ligatures w14:val="standardContextual"/>
             </w:rPr>
           </w:pPr>
-          <w:hyperlink w:anchor="_Toc242209424" w:history="1">
+          <w:hyperlink w:anchor="_Toc242518511" w:history="1">
             <w:r>
               <w:rPr>
                 <w:rStyle w:val="Hyperlink"/>
@@ -2620,7 +2712,7 @@
               <w:rPr>
                 <w:noProof/>
               </w:rPr>
-              <w:instrText xml:space="preserve"> PAGEREF _Toc242209424 \h </w:instrText>
+              <w:instrText xml:space="preserve"> PAGEREF _Toc242518511 \h </w:instrText>
             </w:r>
             <w:r>
               <w:rPr>
@@ -2660,7 +2752,7 @@
               <w14:ligatures w14:val="standardContextual"/>
             </w:rPr>
           </w:pPr>
-          <w:hyperlink w:anchor="_Toc242209425" w:history="1">
+          <w:hyperlink w:anchor="_Toc242518512" w:history="1">
             <w:r>
               <w:rPr>
                 <w:rStyle w:val="Hyperlink"/>
@@ -2684,7 +2776,7 @@
               <w:rPr>
                 <w:noProof/>
               </w:rPr>
-              <w:instrText xml:space="preserve"> PAGEREF _Toc242209425 \h </w:instrText>
+              <w:instrText xml:space="preserve"> PAGEREF _Toc242518512 \h </w:instrText>
             </w:r>
             <w:r>
               <w:rPr>
@@ -2724,7 +2816,7 @@
               <w14:ligatures w14:val="standardContextual"/>
             </w:rPr>
           </w:pPr>
-          <w:hyperlink w:anchor="_Toc242209426" w:history="1">
+          <w:hyperlink w:anchor="_Toc242518513" w:history="1">
             <w:r>
               <w:rPr>
                 <w:rStyle w:val="Hyperlink"/>
@@ -2748,7 +2840,7 @@
               <w:rPr>
                 <w:noProof/>
               </w:rPr>
-              <w:instrText xml:space="preserve"> PAGEREF _Toc242209426 \h </w:instrText>
+              <w:instrText xml:space="preserve"> PAGEREF _Toc242518513 \h </w:instrText>
             </w:r>
             <w:r>
               <w:rPr>
@@ -2788,7 +2880,7 @@
               <w14:ligatures w14:val="standardContextual"/>
             </w:rPr>
           </w:pPr>
-          <w:hyperlink w:anchor="_Toc242209427" w:history="1">
+          <w:hyperlink w:anchor="_Toc242518514" w:history="1">
             <w:r>
               <w:rPr>
                 <w:rStyle w:val="Hyperlink"/>
@@ -2812,7 +2904,7 @@
               <w:rPr>
                 <w:noProof/>
               </w:rPr>
-              <w:instrText xml:space="preserve"> PAGEREF _Toc242209427 \h </w:instrText>
+              <w:instrText xml:space="preserve"> PAGEREF _Toc242518514 \h </w:instrText>
             </w:r>
             <w:r>
               <w:rPr>
@@ -2852,7 +2944,7 @@
               <w14:ligatures w14:val="standardContextual"/>
             </w:rPr>
           </w:pPr>
-          <w:hyperlink w:anchor="_Toc242209428" w:history="1">
+          <w:hyperlink w:anchor="_Toc242518515" w:history="1">
             <w:r>
               <w:rPr>
                 <w:rStyle w:val="Hyperlink"/>
@@ -2876,7 +2968,7 @@
               <w:rPr>
                 <w:noProof/>
               </w:rPr>
-              <w:instrText xml:space="preserve"> PAGEREF _Toc242209428 \h </w:instrText>
+              <w:instrText xml:space="preserve"> PAGEREF _Toc242518515 \h </w:instrText>
             </w:r>
             <w:r>
               <w:rPr>
@@ -2916,7 +3008,7 @@
               <w14:ligatures w14:val="standardContextual"/>
             </w:rPr>
           </w:pPr>
-          <w:hyperlink w:anchor="_Toc242209429" w:history="1">
+          <w:hyperlink w:anchor="_Toc242518516" w:history="1">
             <w:r>
               <w:rPr>
                 <w:rStyle w:val="Hyperlink"/>
@@ -2940,7 +3032,7 @@
               <w:rPr>
                 <w:noProof/>
               </w:rPr>
-              <w:instrText xml:space="preserve"> PAGEREF _Toc242209429 \h </w:instrText>
+              <w:instrText xml:space="preserve"> PAGEREF _Toc242518516 \h </w:instrText>
             </w:r>
             <w:r>
               <w:rPr>
@@ -2980,7 +3072,7 @@
               <w14:ligatures w14:val="standardContextual"/>
             </w:rPr>
           </w:pPr>
-          <w:hyperlink w:anchor="_Toc242209430" w:history="1">
+          <w:hyperlink w:anchor="_Toc242518517" w:history="1">
             <w:r>
               <w:rPr>
                 <w:rStyle w:val="Hyperlink"/>
@@ -3004,7 +3096,7 @@
               <w:rPr>
                 <w:noProof/>
               </w:rPr>
-              <w:instrText xml:space="preserve"> PAGEREF _Toc242209430 \h </w:instrText>
+              <w:instrText xml:space="preserve"> PAGEREF _Toc242518517 \h </w:instrText>
             </w:r>
             <w:r>
               <w:rPr>
@@ -3044,7 +3136,7 @@
               <w14:ligatures w14:val="standardContextual"/>
             </w:rPr>
           </w:pPr>
-          <w:hyperlink w:anchor="_Toc242209431" w:history="1">
+          <w:hyperlink w:anchor="_Toc242518518" w:history="1">
             <w:r>
               <w:rPr>
                 <w:rStyle w:val="Hyperlink"/>
@@ -3068,7 +3160,7 @@
               <w:rPr>
                 <w:noProof/>
               </w:rPr>
-              <w:instrText xml:space="preserve"> PAGEREF _Toc242209431 \h </w:instrText>
+              <w:instrText xml:space="preserve"> PAGEREF _Toc242518518 \h </w:instrText>
             </w:r>
             <w:r>
               <w:rPr>
@@ -3108,7 +3200,7 @@
               <w14:ligatures w14:val="standardContextual"/>
             </w:rPr>
           </w:pPr>
-          <w:hyperlink w:anchor="_Toc242209432" w:history="1">
+          <w:hyperlink w:anchor="_Toc242518519" w:history="1">
             <w:r>
               <w:rPr>
                 <w:rStyle w:val="Hyperlink"/>
@@ -3132,7 +3224,7 @@
               <w:rPr>
                 <w:noProof/>
               </w:rPr>
-              <w:instrText xml:space="preserve"> PAGEREF _Toc242209432 \h </w:instrText>
+              <w:instrText xml:space="preserve"> PAGEREF _Toc242518519 \h </w:instrText>
             </w:r>
             <w:r>
               <w:rPr>
@@ -3172,7 +3264,7 @@
               <w14:ligatures w14:val="standardContextual"/>
             </w:rPr>
           </w:pPr>
-          <w:hyperlink w:anchor="_Toc242209433" w:history="1">
+          <w:hyperlink w:anchor="_Toc242518520" w:history="1">
             <w:r>
               <w:rPr>
                 <w:rStyle w:val="Hyperlink"/>
@@ -3196,7 +3288,7 @@
               <w:rPr>
                 <w:noProof/>
               </w:rPr>
-              <w:instrText xml:space="preserve"> PAGEREF _Toc242209433 \h </w:instrText>
+              <w:instrText xml:space="preserve"> PAGEREF _Toc242518520 \h </w:instrText>
             </w:r>
             <w:r>
               <w:rPr>
@@ -3236,7 +3328,7 @@
               <w14:ligatures w14:val="standardContextual"/>
             </w:rPr>
           </w:pPr>
-          <w:hyperlink w:anchor="_Toc242209434" w:history="1">
+          <w:hyperlink w:anchor="_Toc242518521" w:history="1">
             <w:r>
               <w:rPr>
                 <w:rStyle w:val="Hyperlink"/>
@@ -3260,7 +3352,7 @@
               <w:rPr>
                 <w:noProof/>
               </w:rPr>
-              <w:instrText xml:space="preserve"> PAGEREF _Toc242209434 \h </w:instrText>
+              <w:instrText xml:space="preserve"> PAGEREF _Toc242518521 \h </w:instrText>
             </w:r>
             <w:r>
               <w:rPr>
@@ -3300,7 +3392,7 @@
               <w14:ligatures w14:val="standardContextual"/>
             </w:rPr>
           </w:pPr>
-          <w:hyperlink w:anchor="_Toc242209435" w:history="1">
+          <w:hyperlink w:anchor="_Toc242518522" w:history="1">
             <w:r>
               <w:rPr>
                 <w:rStyle w:val="Hyperlink"/>
@@ -3324,7 +3416,7 @@
               <w:rPr>
                 <w:noProof/>
               </w:rPr>
-              <w:instrText xml:space="preserve"> PAGEREF _Toc242209435 \h </w:instrText>
+              <w:instrText xml:space="preserve"> PAGEREF _Toc242518522 \h </w:instrText>
             </w:r>
             <w:r>
               <w:rPr>
@@ -3364,7 +3456,7 @@
               <w14:ligatures w14:val="standardContextual"/>
             </w:rPr>
           </w:pPr>
-          <w:hyperlink w:anchor="_Toc242209436" w:history="1">
+          <w:hyperlink w:anchor="_Toc242518523" w:history="1">
             <w:r>
               <w:rPr>
                 <w:rStyle w:val="Hyperlink"/>
@@ -3388,7 +3480,7 @@
               <w:rPr>
                 <w:noProof/>
               </w:rPr>
-              <w:instrText xml:space="preserve"> PAGEREF _Toc242209436 \h </w:instrText>
+              <w:instrText xml:space="preserve"> PAGEREF _Toc242518523 \h </w:instrText>
             </w:r>
             <w:r>
               <w:rPr>
@@ -3428,7 +3520,7 @@
               <w14:ligatures w14:val="standardContextual"/>
             </w:rPr>
           </w:pPr>
-          <w:hyperlink w:anchor="_Toc242209437" w:history="1">
+          <w:hyperlink w:anchor="_Toc242518524" w:history="1">
             <w:r>
               <w:rPr>
                 <w:rStyle w:val="Hyperlink"/>
@@ -3452,7 +3544,7 @@
               <w:rPr>
                 <w:noProof/>
               </w:rPr>
-              <w:instrText xml:space="preserve"> PAGEREF _Toc242209437 \h </w:instrText>
+              <w:instrText xml:space="preserve"> PAGEREF _Toc242518524 \h </w:instrText>
             </w:r>
             <w:r>
               <w:rPr>
@@ -3492,7 +3584,7 @@
               <w14:ligatures w14:val="standardContextual"/>
             </w:rPr>
           </w:pPr>
-          <w:hyperlink w:anchor="_Toc242209438" w:history="1">
+          <w:hyperlink w:anchor="_Toc242518525" w:history="1">
             <w:r>
               <w:rPr>
                 <w:rStyle w:val="Hyperlink"/>
@@ -3516,7 +3608,7 @@
               <w:rPr>
                 <w:noProof/>
               </w:rPr>
-              <w:instrText xml:space="preserve"> PAGEREF _Toc242209438 \h </w:instrText>
+              <w:instrText xml:space="preserve"> PAGEREF _Toc242518525 \h </w:instrText>
             </w:r>
             <w:r>
               <w:rPr>
@@ -3556,7 +3648,7 @@
               <w14:ligatures w14:val="standardContextual"/>
             </w:rPr>
           </w:pPr>
-          <w:hyperlink w:anchor="_Toc242209439" w:history="1">
+          <w:hyperlink w:anchor="_Toc242518526" w:history="1">
             <w:r>
               <w:rPr>
                 <w:rStyle w:val="Hyperlink"/>
@@ -3580,7 +3672,7 @@
               <w:rPr>
                 <w:noProof/>
               </w:rPr>
-              <w:instrText xml:space="preserve"> PAGEREF _Toc242209439 \h </w:instrText>
+              <w:instrText xml:space="preserve"> PAGEREF _Toc242518526 \h </w:instrText>
             </w:r>
             <w:r>
               <w:rPr>
@@ -3620,7 +3712,7 @@
               <w14:ligatures w14:val="standardContextual"/>
             </w:rPr>
           </w:pPr>
-          <w:hyperlink w:anchor="_Toc242209440" w:history="1">
+          <w:hyperlink w:anchor="_Toc242518527" w:history="1">
             <w:r>
               <w:rPr>
                 <w:rStyle w:val="Hyperlink"/>
@@ -3644,7 +3736,7 @@
               <w:rPr>
                 <w:noProof/>
               </w:rPr>
-              <w:instrText xml:space="preserve"> PAGEREF _Toc242209440 \h </w:instrText>
+              <w:instrText xml:space="preserve"> PAGEREF _Toc242518527 \h </w:instrText>
             </w:r>
             <w:r>
               <w:rPr>
@@ -3684,7 +3776,7 @@
               <w14:ligatures w14:val="standardContextual"/>
             </w:rPr>
           </w:pPr>
-          <w:hyperlink w:anchor="_Toc242209441" w:history="1">
+          <w:hyperlink w:anchor="_Toc242518528" w:history="1">
             <w:r>
               <w:rPr>
                 <w:rStyle w:val="Hyperlink"/>
@@ -3708,7 +3800,7 @@
               <w:rPr>
                 <w:noProof/>
               </w:rPr>
-              <w:instrText xml:space="preserve"> PAGEREF _Toc242209441 \h </w:instrText>
+              <w:instrText xml:space="preserve"> PAGEREF _Toc242518528 \h </w:instrText>
             </w:r>
             <w:r>
               <w:rPr>
@@ -3748,7 +3840,7 @@
               <w14:ligatures w14:val="standardContextual"/>
             </w:rPr>
           </w:pPr>
-          <w:hyperlink w:anchor="_Toc242209442" w:history="1">
+          <w:hyperlink w:anchor="_Toc242518529" w:history="1">
             <w:r>
               <w:rPr>
                 <w:rStyle w:val="Hyperlink"/>
@@ -3772,7 +3864,7 @@
               <w:rPr>
                 <w:noProof/>
               </w:rPr>
-              <w:instrText xml:space="preserve"> PAGEREF _Toc242209442 \h </w:instrText>
+              <w:instrText xml:space="preserve"> PAGEREF _Toc242518529 \h </w:instrText>
             </w:r>
             <w:r>
               <w:rPr>
@@ -3812,7 +3904,7 @@
               <w14:ligatures w14:val="standardContextual"/>
             </w:rPr>
           </w:pPr>
-          <w:hyperlink w:anchor="_Toc242209443" w:history="1">
+          <w:hyperlink w:anchor="_Toc242518530" w:history="1">
             <w:r>
               <w:rPr>
                 <w:rStyle w:val="Hyperlink"/>
@@ -3836,7 +3928,7 @@
               <w:rPr>
                 <w:noProof/>
               </w:rPr>
-              <w:instrText xml:space="preserve"> PAGEREF _Toc242209443 \h </w:instrText>
+              <w:instrText xml:space="preserve"> PAGEREF _Toc242518530 \h </w:instrText>
             </w:r>
             <w:r>
               <w:rPr>
@@ -3876,7 +3968,7 @@
               <w14:ligatures w14:val="standardContextual"/>
             </w:rPr>
           </w:pPr>
-          <w:hyperlink w:anchor="_Toc242209444" w:history="1">
+          <w:hyperlink w:anchor="_Toc242518531" w:history="1">
             <w:r>
               <w:rPr>
                 <w:rStyle w:val="Hyperlink"/>
@@ -3900,7 +3992,7 @@
               <w:rPr>
                 <w:noProof/>
               </w:rPr>
-              <w:instrText xml:space="preserve"> PAGEREF _Toc242209444 \h </w:instrText>
+              <w:instrText xml:space="preserve"> PAGEREF _Toc242518531 \h </w:instrText>
             </w:r>
             <w:r>
               <w:rPr>
@@ -3940,7 +4032,7 @@
               <w14:ligatures w14:val="standardContextual"/>
             </w:rPr>
           </w:pPr>
-          <w:hyperlink w:anchor="_Toc242209445" w:history="1">
+          <w:hyperlink w:anchor="_Toc242518532" w:history="1">
             <w:r>
               <w:rPr>
                 <w:rStyle w:val="Hyperlink"/>
@@ -3964,7 +4056,7 @@
               <w:rPr>
                 <w:noProof/>
               </w:rPr>
-              <w:instrText xml:space="preserve"> PAGEREF _Toc242209445 \h </w:instrText>
+              <w:instrText xml:space="preserve"> PAGEREF _Toc242518532 \h </w:instrText>
             </w:r>
             <w:r>
               <w:rPr>
@@ -4008,7 +4100,7 @@
         <w:pStyle w:val="Heading1"/>
         <w:spacing w:before="240" w:after="200"/>
       </w:pPr>
-      <w:bookmarkStart w:id="1" w:name="_Toc242209391"/>
+      <w:bookmarkStart w:id="1" w:name="_Toc242518478"/>
       <w:r>
         <w:lastRenderedPageBreak/>
         <w:t>Abstract</w:t>
@@ -4067,7 +4159,7 @@
         <w:pStyle w:val="Heading1"/>
         <w:spacing w:before="240" w:after="200"/>
       </w:pPr>
-      <w:bookmarkStart w:id="2" w:name="_Toc242209392"/>
+      <w:bookmarkStart w:id="2" w:name="_Toc242518479"/>
       <w:r>
         <w:lastRenderedPageBreak/>
         <w:t>Abbreviations</w:t>
@@ -4999,7 +5091,7 @@
         <w:pStyle w:val="Heading1"/>
         <w:spacing w:before="240" w:after="200"/>
       </w:pPr>
-      <w:bookmarkStart w:id="3" w:name="_Toc242209393"/>
+      <w:bookmarkStart w:id="3" w:name="_Toc242518480"/>
       <w:r>
         <w:lastRenderedPageBreak/>
         <w:t>List of Figures</w:t>
@@ -5926,7 +6018,7 @@
         <w:pStyle w:val="Heading2"/>
         <w:spacing w:before="200" w:after="120"/>
       </w:pPr>
-      <w:bookmarkStart w:id="4" w:name="_Toc242209394"/>
+      <w:bookmarkStart w:id="4" w:name="_Toc242518481"/>
       <w:r>
         <w:t>List of Tables</w:t>
       </w:r>
@@ -6787,7 +6879,7 @@
     <w:p>
       <w:pPr>
         <w:sectPr>
-          <w:footerReference w:type="default" r:id="rId7"/>
+          <w:footerReference w:type="default" r:id="rId8"/>
           <w:pgSz w:w="11906" w:h="16838"/>
           <w:pgMar w:top="1440" w:right="1440" w:bottom="1440" w:left="1440" w:header="708" w:footer="708" w:gutter="0"/>
           <w:pgNumType w:fmt="lowerRoman" w:start="1"/>
@@ -6801,7 +6893,7 @@
         <w:pStyle w:val="Heading1"/>
         <w:spacing w:before="240" w:after="200"/>
       </w:pPr>
-      <w:bookmarkStart w:id="5" w:name="_Toc242209395"/>
+      <w:bookmarkStart w:id="5" w:name="_Toc242518482"/>
       <w:r>
         <w:lastRenderedPageBreak/>
         <w:t>Chapter 1: Introduction</w:t>
@@ -6813,7 +6905,7 @@
         <w:pStyle w:val="Heading2"/>
         <w:spacing w:before="200" w:after="120"/>
       </w:pPr>
-      <w:bookmarkStart w:id="6" w:name="_Toc242209396"/>
+      <w:bookmarkStart w:id="6" w:name="_Toc242518483"/>
       <w:r>
         <w:t>1.1 Introduction</w:t>
       </w:r>
@@ -6842,7 +6934,7 @@
         <w:pStyle w:val="Heading2"/>
         <w:spacing w:before="200" w:after="120"/>
       </w:pPr>
-      <w:bookmarkStart w:id="7" w:name="_Toc242209397"/>
+      <w:bookmarkStart w:id="7" w:name="_Toc242518484"/>
       <w:r>
         <w:t>1.2 Problem Statement</w:t>
       </w:r>
@@ -6862,7 +6954,7 @@
         <w:pStyle w:val="Heading2"/>
         <w:spacing w:before="200" w:after="120"/>
       </w:pPr>
-      <w:bookmarkStart w:id="8" w:name="_Toc242209398"/>
+      <w:bookmarkStart w:id="8" w:name="_Toc242518485"/>
       <w:r>
         <w:t>1.3 Objectives</w:t>
       </w:r>
@@ -6965,7 +7057,7 @@
         <w:pStyle w:val="Heading2"/>
         <w:spacing w:before="200" w:after="120"/>
       </w:pPr>
-      <w:bookmarkStart w:id="9" w:name="_Toc242209399"/>
+      <w:bookmarkStart w:id="9" w:name="_Toc242518486"/>
       <w:r>
         <w:t>1.4 Scope of the Project</w:t>
       </w:r>
@@ -6990,7 +7082,7 @@
         <w:pStyle w:val="Heading1"/>
         <w:spacing w:before="240" w:after="200"/>
       </w:pPr>
-      <w:bookmarkStart w:id="10" w:name="_Toc242209400"/>
+      <w:bookmarkStart w:id="10" w:name="_Toc242518487"/>
       <w:r>
         <w:lastRenderedPageBreak/>
         <w:t>Chapter 2: Literature Review</w:t>
@@ -7002,7 +7094,7 @@
         <w:pStyle w:val="Heading2"/>
         <w:spacing w:before="200" w:after="120"/>
       </w:pPr>
-      <w:bookmarkStart w:id="11" w:name="_Toc242209401"/>
+      <w:bookmarkStart w:id="11" w:name="_Toc242518488"/>
       <w:r>
         <w:t>2.1 Review of Existing Systems and Related Work</w:t>
       </w:r>
@@ -7868,7 +7960,7 @@
         <w:pStyle w:val="Heading2"/>
         <w:spacing w:before="200" w:after="120"/>
       </w:pPr>
-      <w:bookmarkStart w:id="12" w:name="_Toc242209402"/>
+      <w:bookmarkStart w:id="12" w:name="_Toc242518489"/>
       <w:r>
         <w:lastRenderedPageBreak/>
         <w:t>2.2 Research Gap</w:t>
@@ -7892,7 +7984,7 @@
         <w:pStyle w:val="Heading2"/>
         <w:spacing w:before="200" w:after="120"/>
       </w:pPr>
-      <w:bookmarkStart w:id="13" w:name="_Toc242209403"/>
+      <w:bookmarkStart w:id="13" w:name="_Toc242518490"/>
       <w:r>
         <w:t>2.3 Summary of Findings</w:t>
       </w:r>
@@ -7960,7 +8052,7 @@
         <w:pStyle w:val="Heading1"/>
         <w:spacing w:before="240" w:after="200"/>
       </w:pPr>
-      <w:bookmarkStart w:id="14" w:name="_Toc242209404"/>
+      <w:bookmarkStart w:id="14" w:name="_Toc242518491"/>
       <w:r>
         <w:lastRenderedPageBreak/>
         <w:t>Chapter 3: System Analysis</w:t>
@@ -7972,7 +8064,7 @@
         <w:pStyle w:val="Heading2"/>
         <w:spacing w:before="200" w:after="120"/>
       </w:pPr>
-      <w:bookmarkStart w:id="15" w:name="_Toc242209405"/>
+      <w:bookmarkStart w:id="15" w:name="_Toc242518492"/>
       <w:r>
         <w:t>3.1 Requirement Analysis</w:t>
       </w:r>
@@ -7983,7 +8075,7 @@
         <w:pStyle w:val="Heading3"/>
         <w:spacing w:before="160" w:after="100"/>
       </w:pPr>
-      <w:bookmarkStart w:id="16" w:name="_Toc242209406"/>
+      <w:bookmarkStart w:id="16" w:name="_Toc242518493"/>
       <w:r>
         <w:t>3.1.1 Functional requirements</w:t>
       </w:r>
@@ -9318,7 +9410,7 @@
         <w:pStyle w:val="Heading3"/>
         <w:spacing w:before="160" w:after="100"/>
       </w:pPr>
-      <w:bookmarkStart w:id="17" w:name="_Toc242209407"/>
+      <w:bookmarkStart w:id="17" w:name="_Toc242518494"/>
       <w:r>
         <w:t>3.1.2 Non-functional requirements</w:t>
       </w:r>
@@ -10065,7 +10157,7 @@
         <w:pStyle w:val="Heading2"/>
         <w:spacing w:before="200" w:after="120"/>
       </w:pPr>
-      <w:bookmarkStart w:id="18" w:name="_Toc242209408"/>
+      <w:bookmarkStart w:id="18" w:name="_Toc242518495"/>
       <w:r>
         <w:lastRenderedPageBreak/>
         <w:t>3.2 Feasibility Study</w:t>
@@ -10089,7 +10181,7 @@
         <w:pStyle w:val="Heading2"/>
         <w:spacing w:before="200" w:after="120"/>
       </w:pPr>
-      <w:bookmarkStart w:id="19" w:name="_Toc242209409"/>
+      <w:bookmarkStart w:id="19" w:name="_Toc242518496"/>
       <w:r>
         <w:t>3.3 System Specifications</w:t>
       </w:r>
@@ -10899,7 +10991,7 @@
         <w:pStyle w:val="Heading1"/>
         <w:spacing w:before="240" w:after="200"/>
       </w:pPr>
-      <w:bookmarkStart w:id="20" w:name="_Toc242209410"/>
+      <w:bookmarkStart w:id="20" w:name="_Toc242518497"/>
       <w:r>
         <w:lastRenderedPageBreak/>
         <w:t>Chapter 4: System Design</w:t>
@@ -10911,7 +11003,7 @@
         <w:pStyle w:val="Heading2"/>
         <w:spacing w:before="200" w:after="120"/>
       </w:pPr>
-      <w:bookmarkStart w:id="21" w:name="_Toc242209411"/>
+      <w:bookmarkStart w:id="21" w:name="_Toc242518498"/>
       <w:r>
         <w:t>4.1 System Architecture</w:t>
       </w:r>
@@ -10937,98 +11029,10 @@
           <w:noProof/>
         </w:rPr>
         <w:drawing>
-          <wp:inline distT="0" distB="0" distL="0" distR="0" wp14:anchorId="6EF79589" wp14:editId="2B309199">
+          <wp:inline distT="0" distB="0" distL="0" distR="0" wp14:anchorId="7FDF236A" wp14:editId="2E5EA2DA">
             <wp:extent cx="4191000" cy="2171700"/>
             <wp:effectExtent l="0" t="0" r="0" b="0"/>
-            <wp:docPr id="1" name="01_architecture.png" descr="Figure 4.1 - System architecture: desktop client, local service, local model runtime, and storage" title="Figure 4.1 - System architecture: desktop client, local service, local model runtime, and storage"/>
-            <wp:cNvGraphicFramePr>
-              <a:graphicFrameLocks xmlns:a="http://schemas.openxmlformats.org/drawingml/2006/main" noChangeAspect="1"/>
-            </wp:cNvGraphicFramePr>
-            <a:graphic xmlns:a="http://schemas.openxmlformats.org/drawingml/2006/main">
-              <a:graphicData uri="http://schemas.openxmlformats.org/drawingml/2006/picture">
-                <pic:pic xmlns:pic="http://schemas.openxmlformats.org/drawingml/2006/picture">
-                  <pic:nvPicPr>
-                    <pic:cNvPr id="0" name=""/>
-                    <pic:cNvPicPr>
-                      <a:picLocks noChangeAspect="1" noChangeArrowheads="1"/>
-                    </pic:cNvPicPr>
-                  </pic:nvPicPr>
-                  <pic:blipFill>
-                    <a:blip r:embed="rId8"/>
-                    <a:srcRect/>
-                    <a:stretch>
-                      <a:fillRect/>
-                    </a:stretch>
-                  </pic:blipFill>
-                  <pic:spPr bwMode="auto">
-                    <a:xfrm>
-                      <a:off x="0" y="0"/>
-                      <a:ext cx="4191000" cy="2171700"/>
-                    </a:xfrm>
-                    <a:prstGeom prst="rect">
-                      <a:avLst/>
-                    </a:prstGeom>
-                  </pic:spPr>
-                </pic:pic>
-              </a:graphicData>
-            </a:graphic>
-          </wp:inline>
-        </w:drawing>
-      </w:r>
-    </w:p>
-    <w:p>
-      <w:pPr>
-        <w:spacing w:before="60" w:after="240"/>
-        <w:jc w:val="center"/>
-      </w:pPr>
-      <w:r>
-        <w:rPr>
-          <w:i/>
-          <w:iCs/>
-          <w:sz w:val="22"/>
-          <w:szCs w:val="22"/>
-        </w:rPr>
-        <w:t>Figure 4.1 - System architecture: desktop client, local service, local model runtime, and storage</w:t>
-      </w:r>
-    </w:p>
-    <w:p>
-      <w:pPr>
-        <w:pStyle w:val="Heading2"/>
-        <w:spacing w:before="200" w:after="120"/>
-      </w:pPr>
-      <w:bookmarkStart w:id="22" w:name="_Toc242209412"/>
-      <w:r>
-        <w:t>4.2 Module Design</w:t>
-      </w:r>
-      <w:bookmarkEnd w:id="22"/>
-    </w:p>
-    <w:p>
-      <w:pPr>
-        <w:spacing w:after="160" w:line="360" w:lineRule="auto"/>
-        <w:jc w:val="both"/>
-      </w:pPr>
-      <w:r>
-        <w:t xml:space="preserve">The system is organised in six modules. The Natural Language Interface decides what a request means and routes it. The Semantic Search Engine returns files near the best match. The AI File Organiser proposes categories and reversible moves. The Knowledge Graph links files by similar content, by direct reference and by shared tags. The Context Memory Engine keeps the conversation so that a follow-up can be resolved, and records which files the user opens. The Workspace Manager turns the graph and usage into </w:t>
-      </w:r>
-      <w:r>
-        <w:t>explainable recommendations and creates workspaces that open together.</w:t>
-      </w:r>
-    </w:p>
-    <w:p>
-      <w:pPr>
-        <w:keepNext/>
-        <w:spacing w:before="160" w:after="60"/>
-        <w:jc w:val="center"/>
-      </w:pPr>
-      <w:r>
-        <w:rPr>
-          <w:noProof/>
-        </w:rPr>
-        <w:drawing>
-          <wp:inline distT="0" distB="0" distL="0" distR="0" wp14:anchorId="014E528F" wp14:editId="34C1DF5D">
-            <wp:extent cx="4095750" cy="866775"/>
-            <wp:effectExtent l="0" t="0" r="0" b="0"/>
-            <wp:docPr id="1437868931" name="02_module_design.png" descr="Figure 4.2 - Module design and the data each module passes to the next" title="Figure 4.2 - Module design and the data each module passes to the next"/>
+            <wp:docPr id="2001061150" name="01_architecture.png" descr="Figure 4.1 - System architecture: desktop client, local service, local model runtime, and storage" title="Figure 4.1 - System architecture: desktop client, local service, local model runtime, and storage"/>
             <wp:cNvGraphicFramePr>
               <a:graphicFrameLocks xmlns:a="http://schemas.openxmlformats.org/drawingml/2006/main" noChangeAspect="1"/>
             </wp:cNvGraphicFramePr>
@@ -11051,7 +11055,7 @@
                   <pic:spPr bwMode="auto">
                     <a:xfrm>
                       <a:off x="0" y="0"/>
-                      <a:ext cx="4095750" cy="866775"/>
+                      <a:ext cx="4191000" cy="2171700"/>
                     </a:xfrm>
                     <a:prstGeom prst="rect">
                       <a:avLst/>
@@ -11076,7 +11080,7 @@
           <w:sz w:val="22"/>
           <w:szCs w:val="22"/>
         </w:rPr>
-        <w:t>Figure 4.2 - Module design and the data each module passes to the next</w:t>
+        <w:t>Figure 4.1 - System architecture: desktop client, local service, local model runtime, and storage</w:t>
       </w:r>
     </w:p>
     <w:p>
@@ -11084,12 +11088,23 @@
         <w:pStyle w:val="Heading2"/>
         <w:spacing w:before="200" w:after="120"/>
       </w:pPr>
-      <w:bookmarkStart w:id="23" w:name="_Toc242209413"/>
-      <w:r>
-        <w:lastRenderedPageBreak/>
-        <w:t>4.3 Data Flow Diagrams</w:t>
-      </w:r>
-      <w:bookmarkEnd w:id="23"/>
+      <w:bookmarkStart w:id="22" w:name="_Toc242518499"/>
+      <w:r>
+        <w:t>4.2 Module Design</w:t>
+      </w:r>
+      <w:bookmarkEnd w:id="22"/>
+    </w:p>
+    <w:p>
+      <w:pPr>
+        <w:spacing w:after="160" w:line="360" w:lineRule="auto"/>
+        <w:jc w:val="both"/>
+      </w:pPr>
+      <w:r>
+        <w:t xml:space="preserve">The system is organised in six modules. The Natural Language Interface decides what a request means and routes it. The Semantic Search Engine returns files near the best match. The AI File Organiser proposes categories and reversible moves. The Knowledge Graph links files by similar content, by direct reference and by shared tags. The Context Memory Engine keeps the conversation so that a follow-up can be resolved, and records which files the user opens. The Workspace Manager turns the graph and usage into </w:t>
+      </w:r>
+      <w:r>
+        <w:t>explainable recommendations and creates workspaces that open together.</w:t>
+      </w:r>
     </w:p>
     <w:p>
       <w:pPr>
@@ -11102,10 +11117,10 @@
           <w:noProof/>
         </w:rPr>
         <w:drawing>
-          <wp:inline distT="0" distB="0" distL="0" distR="0" wp14:anchorId="0CA2BB18" wp14:editId="59F0518F">
-            <wp:extent cx="3810000" cy="1085850"/>
+          <wp:inline distT="0" distB="0" distL="0" distR="0" wp14:anchorId="7F9A5D15" wp14:editId="5FF1F14D">
+            <wp:extent cx="4095750" cy="866775"/>
             <wp:effectExtent l="0" t="0" r="0" b="0"/>
-            <wp:docPr id="1593462691" name="03_dfd_context.png" descr="Figure 4.3 - Data flow diagram, context level" title="Figure 4.3 - Data flow diagram, context level"/>
+            <wp:docPr id="997637845" name="02_module_design.png" descr="Figure 4.2 - Module design and the data each module passes to the next" title="Figure 4.2 - Module design and the data each module passes to the next"/>
             <wp:cNvGraphicFramePr>
               <a:graphicFrameLocks xmlns:a="http://schemas.openxmlformats.org/drawingml/2006/main" noChangeAspect="1"/>
             </wp:cNvGraphicFramePr>
@@ -11128,7 +11143,7 @@
                   <pic:spPr bwMode="auto">
                     <a:xfrm>
                       <a:off x="0" y="0"/>
-                      <a:ext cx="3810000" cy="1085850"/>
+                      <a:ext cx="4095750" cy="866775"/>
                     </a:xfrm>
                     <a:prstGeom prst="rect">
                       <a:avLst/>
@@ -11153,8 +11168,20 @@
           <w:sz w:val="22"/>
           <w:szCs w:val="22"/>
         </w:rPr>
-        <w:t>Figure 4.3 - Data flow diagram, context level</w:t>
-      </w:r>
+        <w:t>Figure 4.2 - Module design and the data each module passes to the next</w:t>
+      </w:r>
+    </w:p>
+    <w:p>
+      <w:pPr>
+        <w:pStyle w:val="Heading2"/>
+        <w:spacing w:before="200" w:after="120"/>
+      </w:pPr>
+      <w:bookmarkStart w:id="23" w:name="_Toc242518500"/>
+      <w:r>
+        <w:lastRenderedPageBreak/>
+        <w:t>4.3 Data Flow Diagrams</w:t>
+      </w:r>
+      <w:bookmarkEnd w:id="23"/>
     </w:p>
     <w:p>
       <w:pPr>
@@ -11167,10 +11194,10 @@
           <w:noProof/>
         </w:rPr>
         <w:drawing>
-          <wp:inline distT="0" distB="0" distL="0" distR="0" wp14:anchorId="7375C83B" wp14:editId="088F6989">
-            <wp:extent cx="4191000" cy="1371600"/>
+          <wp:inline distT="0" distB="0" distL="0" distR="0" wp14:anchorId="5FC30EC8" wp14:editId="591AF981">
+            <wp:extent cx="3810000" cy="1085850"/>
             <wp:effectExtent l="0" t="0" r="0" b="0"/>
-            <wp:docPr id="961349147" name="04_dfd_level1.png" descr="Figure 4.4 - Data flow diagram, level 1" title="Figure 4.4 - Data flow diagram, level 1"/>
+            <wp:docPr id="1122750907" name="03_dfd_context.png" descr="Figure 4.3 - Data flow diagram, context level" title="Figure 4.3 - Data flow diagram, context level"/>
             <wp:cNvGraphicFramePr>
               <a:graphicFrameLocks xmlns:a="http://schemas.openxmlformats.org/drawingml/2006/main" noChangeAspect="1"/>
             </wp:cNvGraphicFramePr>
@@ -11193,7 +11220,7 @@
                   <pic:spPr bwMode="auto">
                     <a:xfrm>
                       <a:off x="0" y="0"/>
-                      <a:ext cx="4191000" cy="1371600"/>
+                      <a:ext cx="3810000" cy="1085850"/>
                     </a:xfrm>
                     <a:prstGeom prst="rect">
                       <a:avLst/>
@@ -11218,19 +11245,8 @@
           <w:sz w:val="22"/>
           <w:szCs w:val="22"/>
         </w:rPr>
-        <w:t>Figure 4.4 - Data flow diagram, level 1</w:t>
-      </w:r>
-    </w:p>
-    <w:p>
-      <w:pPr>
-        <w:pStyle w:val="Heading2"/>
-        <w:spacing w:before="200" w:after="120"/>
-      </w:pPr>
-      <w:bookmarkStart w:id="24" w:name="_Toc242209414"/>
-      <w:r>
-        <w:t>4.4 UML Diagrams</w:t>
-      </w:r>
-      <w:bookmarkEnd w:id="24"/>
+        <w:t>Figure 4.3 - Data flow diagram, context level</w:t>
+      </w:r>
     </w:p>
     <w:p>
       <w:pPr>
@@ -11243,10 +11259,10 @@
           <w:noProof/>
         </w:rPr>
         <w:drawing>
-          <wp:inline distT="0" distB="0" distL="0" distR="0" wp14:anchorId="00D0680B" wp14:editId="5634151C">
-            <wp:extent cx="3429000" cy="3000375"/>
+          <wp:inline distT="0" distB="0" distL="0" distR="0" wp14:anchorId="7AE2A473" wp14:editId="63CBC0C4">
+            <wp:extent cx="4191000" cy="1371600"/>
             <wp:effectExtent l="0" t="0" r="0" b="0"/>
-            <wp:docPr id="1357433006" name="05_use_case.png" descr="Figure 4.5 - Use case diagram of user actions" title="Figure 4.5 - Use case diagram of user actions"/>
+            <wp:docPr id="667884677" name="04_dfd_level1.png" descr="Figure 4.4 - Data flow diagram, level 1" title="Figure 4.4 - Data flow diagram, level 1"/>
             <wp:cNvGraphicFramePr>
               <a:graphicFrameLocks xmlns:a="http://schemas.openxmlformats.org/drawingml/2006/main" noChangeAspect="1"/>
             </wp:cNvGraphicFramePr>
@@ -11269,7 +11285,7 @@
                   <pic:spPr bwMode="auto">
                     <a:xfrm>
                       <a:off x="0" y="0"/>
-                      <a:ext cx="3429000" cy="3000375"/>
+                      <a:ext cx="4191000" cy="1371600"/>
                     </a:xfrm>
                     <a:prstGeom prst="rect">
                       <a:avLst/>
@@ -11294,8 +11310,19 @@
           <w:sz w:val="22"/>
           <w:szCs w:val="22"/>
         </w:rPr>
-        <w:t>Figure 4.5 - Use case diagram of user actions</w:t>
-      </w:r>
+        <w:t>Figure 4.4 - Data flow diagram, level 1</w:t>
+      </w:r>
+    </w:p>
+    <w:p>
+      <w:pPr>
+        <w:pStyle w:val="Heading2"/>
+        <w:spacing w:before="200" w:after="120"/>
+      </w:pPr>
+      <w:bookmarkStart w:id="24" w:name="_Toc242518501"/>
+      <w:r>
+        <w:t>4.4 UML Diagrams</w:t>
+      </w:r>
+      <w:bookmarkEnd w:id="24"/>
     </w:p>
     <w:p>
       <w:pPr>
@@ -11307,12 +11334,11 @@
         <w:rPr>
           <w:noProof/>
         </w:rPr>
-        <w:lastRenderedPageBreak/>
         <w:drawing>
-          <wp:inline distT="0" distB="0" distL="0" distR="0" wp14:anchorId="271AA5F8" wp14:editId="445DF562">
-            <wp:extent cx="4000500" cy="2600325"/>
+          <wp:inline distT="0" distB="0" distL="0" distR="0" wp14:anchorId="1AAF1C1C" wp14:editId="4AD63025">
+            <wp:extent cx="3429000" cy="3000375"/>
             <wp:effectExtent l="0" t="0" r="0" b="0"/>
-            <wp:docPr id="1104718327" name="06_class_diagram.png" descr="Figure 4.6 - Class diagram of response and settings classes" title="Figure 4.6 - Class diagram of response and settings classes"/>
+            <wp:docPr id="650196203" name="05_use_case.png" descr="Figure 4.5 - Use case diagram of user actions" title="Figure 4.5 - Use case diagram of user actions"/>
             <wp:cNvGraphicFramePr>
               <a:graphicFrameLocks xmlns:a="http://schemas.openxmlformats.org/drawingml/2006/main" noChangeAspect="1"/>
             </wp:cNvGraphicFramePr>
@@ -11335,7 +11361,7 @@
                   <pic:spPr bwMode="auto">
                     <a:xfrm>
                       <a:off x="0" y="0"/>
-                      <a:ext cx="4000500" cy="2600325"/>
+                      <a:ext cx="3429000" cy="3000375"/>
                     </a:xfrm>
                     <a:prstGeom prst="rect">
                       <a:avLst/>
@@ -11360,7 +11386,7 @@
           <w:sz w:val="22"/>
           <w:szCs w:val="22"/>
         </w:rPr>
-        <w:t>Figure 4.6 - Class diagram of response and settings classes</w:t>
+        <w:t>Figure 4.5 - Use case diagram of user actions</w:t>
       </w:r>
     </w:p>
     <w:p>
@@ -11373,11 +11399,12 @@
         <w:rPr>
           <w:noProof/>
         </w:rPr>
+        <w:lastRenderedPageBreak/>
         <w:drawing>
-          <wp:inline distT="0" distB="0" distL="0" distR="0" wp14:anchorId="639B85B8" wp14:editId="6065CADE">
-            <wp:extent cx="4191000" cy="1628775"/>
+          <wp:inline distT="0" distB="0" distL="0" distR="0" wp14:anchorId="1601CA58" wp14:editId="5DBC4FB5">
+            <wp:extent cx="4000500" cy="2600325"/>
             <wp:effectExtent l="0" t="0" r="0" b="0"/>
-            <wp:docPr id="2036402758" name="07_sequence_open.png" descr="Figure 4.7 - Sequence diagram of an open request" title="Figure 4.7 - Sequence diagram of an open request"/>
+            <wp:docPr id="1596171789" name="06_class_diagram.png" descr="Figure 4.6 - Class diagram of response and settings classes" title="Figure 4.6 - Class diagram of response and settings classes"/>
             <wp:cNvGraphicFramePr>
               <a:graphicFrameLocks xmlns:a="http://schemas.openxmlformats.org/drawingml/2006/main" noChangeAspect="1"/>
             </wp:cNvGraphicFramePr>
@@ -11400,7 +11427,7 @@
                   <pic:spPr bwMode="auto">
                     <a:xfrm>
                       <a:off x="0" y="0"/>
-                      <a:ext cx="4191000" cy="1628775"/>
+                      <a:ext cx="4000500" cy="2600325"/>
                     </a:xfrm>
                     <a:prstGeom prst="rect">
                       <a:avLst/>
@@ -11425,7 +11452,7 @@
           <w:sz w:val="22"/>
           <w:szCs w:val="22"/>
         </w:rPr>
-        <w:t>Figure 4.7 - Sequence diagram of an open request</w:t>
+        <w:t>Figure 4.6 - Class diagram of response and settings classes</w:t>
       </w:r>
     </w:p>
     <w:p>
@@ -11439,10 +11466,10 @@
           <w:noProof/>
         </w:rPr>
         <w:drawing>
-          <wp:inline distT="0" distB="0" distL="0" distR="0" wp14:anchorId="3C249D7C" wp14:editId="63BA7B08">
-            <wp:extent cx="4191000" cy="2886075"/>
+          <wp:inline distT="0" distB="0" distL="0" distR="0" wp14:anchorId="1C4AC65F" wp14:editId="7BA8E866">
+            <wp:extent cx="4191000" cy="1628775"/>
             <wp:effectExtent l="0" t="0" r="0" b="0"/>
-            <wp:docPr id="1167421472" name="10_sequence_followup.png" descr="Figure 4.8 - Sequence diagram of a follow-up question resolved from memory" title="Figure 4.8 - Sequence diagram of a follow-up question resolved from memory"/>
+            <wp:docPr id="1848906368" name="07_sequence_open.png" descr="Figure 4.7 - Sequence diagram of an open request" title="Figure 4.7 - Sequence diagram of an open request"/>
             <wp:cNvGraphicFramePr>
               <a:graphicFrameLocks xmlns:a="http://schemas.openxmlformats.org/drawingml/2006/main" noChangeAspect="1"/>
             </wp:cNvGraphicFramePr>
@@ -11465,7 +11492,7 @@
                   <pic:spPr bwMode="auto">
                     <a:xfrm>
                       <a:off x="0" y="0"/>
-                      <a:ext cx="4191000" cy="2886075"/>
+                      <a:ext cx="4191000" cy="1628775"/>
                     </a:xfrm>
                     <a:prstGeom prst="rect">
                       <a:avLst/>
@@ -11490,28 +11517,7 @@
           <w:sz w:val="22"/>
           <w:szCs w:val="22"/>
         </w:rPr>
-        <w:t>Figure 4.8 - Sequence diagram of a follow-up question resolved from memory</w:t>
-      </w:r>
-    </w:p>
-    <w:p>
-      <w:pPr>
-        <w:pStyle w:val="Heading2"/>
-        <w:spacing w:before="200" w:after="120"/>
-      </w:pPr>
-      <w:bookmarkStart w:id="25" w:name="_Toc242209415"/>
-      <w:r>
-        <w:lastRenderedPageBreak/>
-        <w:t>4.5 Database Design</w:t>
-      </w:r>
-      <w:bookmarkEnd w:id="25"/>
-    </w:p>
-    <w:p>
-      <w:pPr>
-        <w:spacing w:after="160" w:line="360" w:lineRule="auto"/>
-        <w:jc w:val="both"/>
-      </w:pPr>
-      <w:r>
-        <w:t>File metadata is stored in SQLite and each file's text chunks are stored as vectors in ChromaDB, linked by the file path. All relationship, memory, usage and workspace tables refer to the file's numeric identifier rather than its path. The organiser renames a file when it moves it, but the identifier does not change, so no table needs rewriting after a move.</w:t>
+        <w:t>Figure 4.7 - Sequence diagram of an open request</w:t>
       </w:r>
     </w:p>
     <w:p>
@@ -11525,10 +11531,10 @@
           <w:noProof/>
         </w:rPr>
         <w:drawing>
-          <wp:inline distT="0" distB="0" distL="0" distR="0" wp14:anchorId="040ECBB5" wp14:editId="46A9A483">
-            <wp:extent cx="3810000" cy="2619375"/>
+          <wp:inline distT="0" distB="0" distL="0" distR="0" wp14:anchorId="19E8929C" wp14:editId="0A4D2066">
+            <wp:extent cx="4191000" cy="2886075"/>
             <wp:effectExtent l="0" t="0" r="0" b="0"/>
-            <wp:docPr id="754744110" name="08_er_diagram.png" descr="Figure 4.9 - Entity-relationship diagram" title="Figure 4.9 - Entity-relationship diagram"/>
+            <wp:docPr id="770108910" name="10_sequence_followup.png" descr="Figure 4.8 - Sequence diagram of a follow-up question resolved from memory" title="Figure 4.8 - Sequence diagram of a follow-up question resolved from memory"/>
             <wp:cNvGraphicFramePr>
               <a:graphicFrameLocks xmlns:a="http://schemas.openxmlformats.org/drawingml/2006/main" noChangeAspect="1"/>
             </wp:cNvGraphicFramePr>
@@ -11543,6 +11549,92 @@
                   </pic:nvPicPr>
                   <pic:blipFill>
                     <a:blip r:embed="rId16"/>
+                    <a:srcRect/>
+                    <a:stretch>
+                      <a:fillRect/>
+                    </a:stretch>
+                  </pic:blipFill>
+                  <pic:spPr bwMode="auto">
+                    <a:xfrm>
+                      <a:off x="0" y="0"/>
+                      <a:ext cx="4191000" cy="2886075"/>
+                    </a:xfrm>
+                    <a:prstGeom prst="rect">
+                      <a:avLst/>
+                    </a:prstGeom>
+                  </pic:spPr>
+                </pic:pic>
+              </a:graphicData>
+            </a:graphic>
+          </wp:inline>
+        </w:drawing>
+      </w:r>
+    </w:p>
+    <w:p>
+      <w:pPr>
+        <w:spacing w:before="60" w:after="240"/>
+        <w:jc w:val="center"/>
+      </w:pPr>
+      <w:r>
+        <w:rPr>
+          <w:i/>
+          <w:iCs/>
+          <w:sz w:val="22"/>
+          <w:szCs w:val="22"/>
+        </w:rPr>
+        <w:t>Figure 4.8 - Sequence diagram of a follow-up question resolved from memory</w:t>
+      </w:r>
+    </w:p>
+    <w:p>
+      <w:pPr>
+        <w:pStyle w:val="Heading2"/>
+        <w:spacing w:before="200" w:after="120"/>
+      </w:pPr>
+      <w:bookmarkStart w:id="25" w:name="_Toc242518502"/>
+      <w:r>
+        <w:lastRenderedPageBreak/>
+        <w:t>4.5 Database Design</w:t>
+      </w:r>
+      <w:bookmarkEnd w:id="25"/>
+    </w:p>
+    <w:p>
+      <w:pPr>
+        <w:spacing w:after="160" w:line="360" w:lineRule="auto"/>
+        <w:jc w:val="both"/>
+      </w:pPr>
+      <w:r>
+        <w:t>File metadata is stored in SQLite and each file's text chunks are stored as vectors in ChromaDB, linked by the file path. All relationship, memory, usage and workspace tables refer to the file's numeric identifier rather than its path. The organiser renames a file when it moves it, but the identifier does not change, so no table needs rewriting after a move.</w:t>
+      </w:r>
+    </w:p>
+    <w:p>
+      <w:pPr>
+        <w:keepNext/>
+        <w:spacing w:before="160" w:after="60"/>
+        <w:jc w:val="center"/>
+      </w:pPr>
+      <w:r>
+        <w:rPr>
+          <w:noProof/>
+        </w:rPr>
+        <w:drawing>
+          <wp:inline distT="0" distB="0" distL="0" distR="0" wp14:anchorId="4BE0A599" wp14:editId="043DAF6F">
+            <wp:extent cx="3810000" cy="2619375"/>
+            <wp:effectExtent l="0" t="0" r="0" b="0"/>
+            <wp:docPr id="882862920" name="08_er_diagram.png" descr="Figure 4.9 - Entity-relationship diagram" title="Figure 4.9 - Entity-relationship diagram"/>
+            <wp:cNvGraphicFramePr>
+              <a:graphicFrameLocks xmlns:a="http://schemas.openxmlformats.org/drawingml/2006/main" noChangeAspect="1"/>
+            </wp:cNvGraphicFramePr>
+            <a:graphic xmlns:a="http://schemas.openxmlformats.org/drawingml/2006/main">
+              <a:graphicData uri="http://schemas.openxmlformats.org/drawingml/2006/picture">
+                <pic:pic xmlns:pic="http://schemas.openxmlformats.org/drawingml/2006/picture">
+                  <pic:nvPicPr>
+                    <pic:cNvPr id="0" name=""/>
+                    <pic:cNvPicPr>
+                      <a:picLocks noChangeAspect="1" noChangeArrowheads="1"/>
+                    </pic:cNvPicPr>
+                  </pic:nvPicPr>
+                  <pic:blipFill>
+                    <a:blip r:embed="rId17"/>
                     <a:srcRect/>
                     <a:stretch>
                       <a:fillRect/>
@@ -12860,7 +12952,7 @@
         <w:pStyle w:val="Heading2"/>
         <w:spacing w:before="200" w:after="120"/>
       </w:pPr>
-      <w:bookmarkStart w:id="26" w:name="_Toc242209416"/>
+      <w:bookmarkStart w:id="26" w:name="_Toc242518503"/>
       <w:r>
         <w:lastRenderedPageBreak/>
         <w:t>4.6 UI / UX Design</w:t>
@@ -12887,1007 +12979,10 @@
           <w:noProof/>
         </w:rPr>
         <w:drawing>
-          <wp:inline distT="0" distB="0" distL="0" distR="0" wp14:anchorId="7519138C" wp14:editId="5E0FD985">
+          <wp:inline distT="0" distB="0" distL="0" distR="0" wp14:anchorId="4D7FE86D" wp14:editId="3F0472CB">
             <wp:extent cx="4095750" cy="3200400"/>
             <wp:effectExtent l="0" t="0" r="0" b="0"/>
-            <wp:docPr id="1846992829" name="ui-chat.png" descr="Figure 4.10 - Chat view: related files with the reason each is linked" title="Figure 4.10 - Chat view: related files with the reason each is linked"/>
-            <wp:cNvGraphicFramePr>
-              <a:graphicFrameLocks xmlns:a="http://schemas.openxmlformats.org/drawingml/2006/main" noChangeAspect="1"/>
-            </wp:cNvGraphicFramePr>
-            <a:graphic xmlns:a="http://schemas.openxmlformats.org/drawingml/2006/main">
-              <a:graphicData uri="http://schemas.openxmlformats.org/drawingml/2006/picture">
-                <pic:pic xmlns:pic="http://schemas.openxmlformats.org/drawingml/2006/picture">
-                  <pic:nvPicPr>
-                    <pic:cNvPr id="0" name=""/>
-                    <pic:cNvPicPr>
-                      <a:picLocks noChangeAspect="1" noChangeArrowheads="1"/>
-                    </pic:cNvPicPr>
-                  </pic:nvPicPr>
-                  <pic:blipFill>
-                    <a:blip r:embed="rId17"/>
-                    <a:srcRect/>
-                    <a:stretch>
-                      <a:fillRect/>
-                    </a:stretch>
-                  </pic:blipFill>
-                  <pic:spPr bwMode="auto">
-                    <a:xfrm>
-                      <a:off x="0" y="0"/>
-                      <a:ext cx="4095750" cy="3200400"/>
-                    </a:xfrm>
-                    <a:prstGeom prst="rect">
-                      <a:avLst/>
-                    </a:prstGeom>
-                  </pic:spPr>
-                </pic:pic>
-              </a:graphicData>
-            </a:graphic>
-          </wp:inline>
-        </w:drawing>
-      </w:r>
-    </w:p>
-    <w:p>
-      <w:pPr>
-        <w:spacing w:before="60" w:after="240"/>
-        <w:jc w:val="center"/>
-      </w:pPr>
-      <w:r>
-        <w:rPr>
-          <w:i/>
-          <w:iCs/>
-          <w:sz w:val="22"/>
-          <w:szCs w:val="22"/>
-        </w:rPr>
-        <w:t>Figure 4.10 - Chat view: related files with the reason each is linked</w:t>
-      </w:r>
-    </w:p>
-    <w:p>
-      <w:pPr>
-        <w:pStyle w:val="Heading2"/>
-        <w:spacing w:before="200" w:after="120"/>
-      </w:pPr>
-      <w:bookmarkStart w:id="27" w:name="_Toc242209417"/>
-      <w:r>
-        <w:t>4.7 Technology Stack</w:t>
-      </w:r>
-      <w:bookmarkEnd w:id="27"/>
-    </w:p>
-    <w:p>
-      <w:pPr>
-        <w:keepNext/>
-        <w:spacing w:before="200" w:after="100"/>
-      </w:pPr>
-      <w:r>
-        <w:rPr>
-          <w:b/>
-          <w:bCs/>
-          <w:sz w:val="22"/>
-          <w:szCs w:val="22"/>
-        </w:rPr>
-        <w:t>Table 4.3: Technology stack by layer</w:t>
-      </w:r>
-    </w:p>
-    <w:tbl>
-      <w:tblPr>
-        <w:tblW w:w="9026" w:type="dxa"/>
-        <w:tblBorders>
-          <w:top w:val="single" w:sz="4" w:space="0" w:color="auto"/>
-          <w:left w:val="single" w:sz="4" w:space="0" w:color="auto"/>
-          <w:bottom w:val="single" w:sz="4" w:space="0" w:color="auto"/>
-          <w:right w:val="single" w:sz="4" w:space="0" w:color="auto"/>
-          <w:insideH w:val="single" w:sz="4" w:space="0" w:color="auto"/>
-          <w:insideV w:val="single" w:sz="4" w:space="0" w:color="auto"/>
-        </w:tblBorders>
-        <w:tblCellMar>
-          <w:left w:w="10" w:type="dxa"/>
-          <w:right w:w="10" w:type="dxa"/>
-        </w:tblCellMar>
-        <w:tblLook w:val="04A0" w:firstRow="1" w:lastRow="0" w:firstColumn="1" w:lastColumn="0" w:noHBand="0" w:noVBand="1"/>
-      </w:tblPr>
-      <w:tblGrid>
-        <w:gridCol w:w="2200"/>
-        <w:gridCol w:w="6826"/>
-      </w:tblGrid>
-      <w:tr>
-        <w:tblPrEx>
-          <w:tblCellMar>
-            <w:top w:w="0" w:type="dxa"/>
-            <w:bottom w:w="0" w:type="dxa"/>
-          </w:tblCellMar>
-        </w:tblPrEx>
-        <w:trPr>
-          <w:tblHeader/>
-        </w:trPr>
-        <w:tc>
-          <w:tcPr>
-            <w:tcW w:w="2200" w:type="dxa"/>
-            <w:tcBorders>
-              <w:top w:val="single" w:sz="4" w:space="0" w:color="808080"/>
-              <w:left w:val="single" w:sz="4" w:space="0" w:color="808080"/>
-              <w:bottom w:val="single" w:sz="4" w:space="0" w:color="808080"/>
-              <w:right w:val="single" w:sz="4" w:space="0" w:color="808080"/>
-            </w:tcBorders>
-            <w:shd w:val="clear" w:color="auto" w:fill="D9D9D9"/>
-            <w:tcMar>
-              <w:top w:w="60" w:type="dxa"/>
-              <w:left w:w="100" w:type="dxa"/>
-              <w:bottom w:w="60" w:type="dxa"/>
-              <w:right w:w="100" w:type="dxa"/>
-            </w:tcMar>
-            <w:vAlign w:val="center"/>
-          </w:tcPr>
-          <w:p>
-            <w:pPr>
-              <w:spacing w:line="276" w:lineRule="auto"/>
-            </w:pPr>
-            <w:r>
-              <w:rPr>
-                <w:b/>
-                <w:bCs/>
-                <w:sz w:val="21"/>
-                <w:szCs w:val="21"/>
-              </w:rPr>
-              <w:t>Layer</w:t>
-            </w:r>
-          </w:p>
-        </w:tc>
-        <w:tc>
-          <w:tcPr>
-            <w:tcW w:w="6826" w:type="dxa"/>
-            <w:tcBorders>
-              <w:top w:val="single" w:sz="4" w:space="0" w:color="808080"/>
-              <w:left w:val="single" w:sz="4" w:space="0" w:color="808080"/>
-              <w:bottom w:val="single" w:sz="4" w:space="0" w:color="808080"/>
-              <w:right w:val="single" w:sz="4" w:space="0" w:color="808080"/>
-            </w:tcBorders>
-            <w:shd w:val="clear" w:color="auto" w:fill="D9D9D9"/>
-            <w:tcMar>
-              <w:top w:w="60" w:type="dxa"/>
-              <w:left w:w="100" w:type="dxa"/>
-              <w:bottom w:w="60" w:type="dxa"/>
-              <w:right w:w="100" w:type="dxa"/>
-            </w:tcMar>
-            <w:vAlign w:val="center"/>
-          </w:tcPr>
-          <w:p>
-            <w:pPr>
-              <w:spacing w:line="276" w:lineRule="auto"/>
-            </w:pPr>
-            <w:r>
-              <w:rPr>
-                <w:b/>
-                <w:bCs/>
-                <w:sz w:val="21"/>
-                <w:szCs w:val="21"/>
-              </w:rPr>
-              <w:t>Technology</w:t>
-            </w:r>
-          </w:p>
-        </w:tc>
-      </w:tr>
-      <w:tr>
-        <w:tblPrEx>
-          <w:tblCellMar>
-            <w:top w:w="0" w:type="dxa"/>
-            <w:bottom w:w="0" w:type="dxa"/>
-          </w:tblCellMar>
-        </w:tblPrEx>
-        <w:tc>
-          <w:tcPr>
-            <w:tcW w:w="2200" w:type="dxa"/>
-            <w:tcBorders>
-              <w:top w:val="single" w:sz="4" w:space="0" w:color="808080"/>
-              <w:left w:val="single" w:sz="4" w:space="0" w:color="808080"/>
-              <w:bottom w:val="single" w:sz="4" w:space="0" w:color="808080"/>
-              <w:right w:val="single" w:sz="4" w:space="0" w:color="808080"/>
-            </w:tcBorders>
-            <w:tcMar>
-              <w:top w:w="60" w:type="dxa"/>
-              <w:left w:w="100" w:type="dxa"/>
-              <w:bottom w:w="60" w:type="dxa"/>
-              <w:right w:w="100" w:type="dxa"/>
-            </w:tcMar>
-            <w:vAlign w:val="center"/>
-          </w:tcPr>
-          <w:p>
-            <w:pPr>
-              <w:spacing w:line="276" w:lineRule="auto"/>
-            </w:pPr>
-            <w:r>
-              <w:rPr>
-                <w:sz w:val="21"/>
-                <w:szCs w:val="21"/>
-              </w:rPr>
-              <w:t>Interface</w:t>
-            </w:r>
-          </w:p>
-        </w:tc>
-        <w:tc>
-          <w:tcPr>
-            <w:tcW w:w="6826" w:type="dxa"/>
-            <w:tcBorders>
-              <w:top w:val="single" w:sz="4" w:space="0" w:color="808080"/>
-              <w:left w:val="single" w:sz="4" w:space="0" w:color="808080"/>
-              <w:bottom w:val="single" w:sz="4" w:space="0" w:color="808080"/>
-              <w:right w:val="single" w:sz="4" w:space="0" w:color="808080"/>
-            </w:tcBorders>
-            <w:tcMar>
-              <w:top w:w="60" w:type="dxa"/>
-              <w:left w:w="100" w:type="dxa"/>
-              <w:bottom w:w="60" w:type="dxa"/>
-              <w:right w:w="100" w:type="dxa"/>
-            </w:tcMar>
-            <w:vAlign w:val="center"/>
-          </w:tcPr>
-          <w:p>
-            <w:pPr>
-              <w:spacing w:line="276" w:lineRule="auto"/>
-            </w:pPr>
-            <w:r>
-              <w:rPr>
-                <w:sz w:val="21"/>
-                <w:szCs w:val="21"/>
-              </w:rPr>
-              <w:t>React 19, TypeScript, Vite, d3-force for the graph layout, Tauri 2 shell</w:t>
-            </w:r>
-          </w:p>
-        </w:tc>
-      </w:tr>
-      <w:tr>
-        <w:tblPrEx>
-          <w:tblCellMar>
-            <w:top w:w="0" w:type="dxa"/>
-            <w:bottom w:w="0" w:type="dxa"/>
-          </w:tblCellMar>
-        </w:tblPrEx>
-        <w:tc>
-          <w:tcPr>
-            <w:tcW w:w="2200" w:type="dxa"/>
-            <w:tcBorders>
-              <w:top w:val="single" w:sz="4" w:space="0" w:color="808080"/>
-              <w:left w:val="single" w:sz="4" w:space="0" w:color="808080"/>
-              <w:bottom w:val="single" w:sz="4" w:space="0" w:color="808080"/>
-              <w:right w:val="single" w:sz="4" w:space="0" w:color="808080"/>
-            </w:tcBorders>
-            <w:tcMar>
-              <w:top w:w="60" w:type="dxa"/>
-              <w:left w:w="100" w:type="dxa"/>
-              <w:bottom w:w="60" w:type="dxa"/>
-              <w:right w:w="100" w:type="dxa"/>
-            </w:tcMar>
-            <w:vAlign w:val="center"/>
-          </w:tcPr>
-          <w:p>
-            <w:pPr>
-              <w:spacing w:line="276" w:lineRule="auto"/>
-            </w:pPr>
-            <w:r>
-              <w:rPr>
-                <w:sz w:val="21"/>
-                <w:szCs w:val="21"/>
-              </w:rPr>
-              <w:t>Service</w:t>
-            </w:r>
-          </w:p>
-        </w:tc>
-        <w:tc>
-          <w:tcPr>
-            <w:tcW w:w="6826" w:type="dxa"/>
-            <w:tcBorders>
-              <w:top w:val="single" w:sz="4" w:space="0" w:color="808080"/>
-              <w:left w:val="single" w:sz="4" w:space="0" w:color="808080"/>
-              <w:bottom w:val="single" w:sz="4" w:space="0" w:color="808080"/>
-              <w:right w:val="single" w:sz="4" w:space="0" w:color="808080"/>
-            </w:tcBorders>
-            <w:tcMar>
-              <w:top w:w="60" w:type="dxa"/>
-              <w:left w:w="100" w:type="dxa"/>
-              <w:bottom w:w="60" w:type="dxa"/>
-              <w:right w:w="100" w:type="dxa"/>
-            </w:tcMar>
-            <w:vAlign w:val="center"/>
-          </w:tcPr>
-          <w:p>
-            <w:pPr>
-              <w:spacing w:line="276" w:lineRule="auto"/>
-            </w:pPr>
-            <w:r>
-              <w:rPr>
-                <w:sz w:val="21"/>
-                <w:szCs w:val="21"/>
-              </w:rPr>
-              <w:t>Python 3.12, FastAPI, Uvicorn, Pydantic</w:t>
-            </w:r>
-          </w:p>
-        </w:tc>
-      </w:tr>
-      <w:tr>
-        <w:tblPrEx>
-          <w:tblCellMar>
-            <w:top w:w="0" w:type="dxa"/>
-            <w:bottom w:w="0" w:type="dxa"/>
-          </w:tblCellMar>
-        </w:tblPrEx>
-        <w:tc>
-          <w:tcPr>
-            <w:tcW w:w="2200" w:type="dxa"/>
-            <w:tcBorders>
-              <w:top w:val="single" w:sz="4" w:space="0" w:color="808080"/>
-              <w:left w:val="single" w:sz="4" w:space="0" w:color="808080"/>
-              <w:bottom w:val="single" w:sz="4" w:space="0" w:color="808080"/>
-              <w:right w:val="single" w:sz="4" w:space="0" w:color="808080"/>
-            </w:tcBorders>
-            <w:tcMar>
-              <w:top w:w="60" w:type="dxa"/>
-              <w:left w:w="100" w:type="dxa"/>
-              <w:bottom w:w="60" w:type="dxa"/>
-              <w:right w:w="100" w:type="dxa"/>
-            </w:tcMar>
-            <w:vAlign w:val="center"/>
-          </w:tcPr>
-          <w:p>
-            <w:pPr>
-              <w:spacing w:line="276" w:lineRule="auto"/>
-            </w:pPr>
-            <w:r>
-              <w:rPr>
-                <w:sz w:val="21"/>
-                <w:szCs w:val="21"/>
-              </w:rPr>
-              <w:t>Understanding</w:t>
-            </w:r>
-          </w:p>
-        </w:tc>
-        <w:tc>
-          <w:tcPr>
-            <w:tcW w:w="6826" w:type="dxa"/>
-            <w:tcBorders>
-              <w:top w:val="single" w:sz="4" w:space="0" w:color="808080"/>
-              <w:left w:val="single" w:sz="4" w:space="0" w:color="808080"/>
-              <w:bottom w:val="single" w:sz="4" w:space="0" w:color="808080"/>
-              <w:right w:val="single" w:sz="4" w:space="0" w:color="808080"/>
-            </w:tcBorders>
-            <w:tcMar>
-              <w:top w:w="60" w:type="dxa"/>
-              <w:left w:w="100" w:type="dxa"/>
-              <w:bottom w:w="60" w:type="dxa"/>
-              <w:right w:w="100" w:type="dxa"/>
-            </w:tcMar>
-            <w:vAlign w:val="center"/>
-          </w:tcPr>
-          <w:p>
-            <w:pPr>
-              <w:spacing w:line="276" w:lineRule="auto"/>
-            </w:pPr>
-            <w:r>
-              <w:rPr>
-                <w:sz w:val="21"/>
-                <w:szCs w:val="21"/>
-              </w:rPr>
-              <w:t>Ollama runtime with nomic-embed-text and llama3.2</w:t>
-            </w:r>
-          </w:p>
-        </w:tc>
-      </w:tr>
-      <w:tr>
-        <w:tblPrEx>
-          <w:tblCellMar>
-            <w:top w:w="0" w:type="dxa"/>
-            <w:bottom w:w="0" w:type="dxa"/>
-          </w:tblCellMar>
-        </w:tblPrEx>
-        <w:tc>
-          <w:tcPr>
-            <w:tcW w:w="2200" w:type="dxa"/>
-            <w:tcBorders>
-              <w:top w:val="single" w:sz="4" w:space="0" w:color="808080"/>
-              <w:left w:val="single" w:sz="4" w:space="0" w:color="808080"/>
-              <w:bottom w:val="single" w:sz="4" w:space="0" w:color="808080"/>
-              <w:right w:val="single" w:sz="4" w:space="0" w:color="808080"/>
-            </w:tcBorders>
-            <w:tcMar>
-              <w:top w:w="60" w:type="dxa"/>
-              <w:left w:w="100" w:type="dxa"/>
-              <w:bottom w:w="60" w:type="dxa"/>
-              <w:right w:w="100" w:type="dxa"/>
-            </w:tcMar>
-            <w:vAlign w:val="center"/>
-          </w:tcPr>
-          <w:p>
-            <w:pPr>
-              <w:spacing w:line="276" w:lineRule="auto"/>
-            </w:pPr>
-            <w:r>
-              <w:rPr>
-                <w:sz w:val="21"/>
-                <w:szCs w:val="21"/>
-              </w:rPr>
-              <w:t>Storage</w:t>
-            </w:r>
-          </w:p>
-        </w:tc>
-        <w:tc>
-          <w:tcPr>
-            <w:tcW w:w="6826" w:type="dxa"/>
-            <w:tcBorders>
-              <w:top w:val="single" w:sz="4" w:space="0" w:color="808080"/>
-              <w:left w:val="single" w:sz="4" w:space="0" w:color="808080"/>
-              <w:bottom w:val="single" w:sz="4" w:space="0" w:color="808080"/>
-              <w:right w:val="single" w:sz="4" w:space="0" w:color="808080"/>
-            </w:tcBorders>
-            <w:tcMar>
-              <w:top w:w="60" w:type="dxa"/>
-              <w:left w:w="100" w:type="dxa"/>
-              <w:bottom w:w="60" w:type="dxa"/>
-              <w:right w:w="100" w:type="dxa"/>
-            </w:tcMar>
-            <w:vAlign w:val="center"/>
-          </w:tcPr>
-          <w:p>
-            <w:pPr>
-              <w:spacing w:line="276" w:lineRule="auto"/>
-            </w:pPr>
-            <w:r>
-              <w:rPr>
-                <w:sz w:val="21"/>
-                <w:szCs w:val="21"/>
-              </w:rPr>
-              <w:t>SQLite for relational data; ChromaDB for vectors</w:t>
-            </w:r>
-          </w:p>
-        </w:tc>
-      </w:tr>
-      <w:tr>
-        <w:tblPrEx>
-          <w:tblCellMar>
-            <w:top w:w="0" w:type="dxa"/>
-            <w:bottom w:w="0" w:type="dxa"/>
-          </w:tblCellMar>
-        </w:tblPrEx>
-        <w:tc>
-          <w:tcPr>
-            <w:tcW w:w="2200" w:type="dxa"/>
-            <w:tcBorders>
-              <w:top w:val="single" w:sz="4" w:space="0" w:color="808080"/>
-              <w:left w:val="single" w:sz="4" w:space="0" w:color="808080"/>
-              <w:bottom w:val="single" w:sz="4" w:space="0" w:color="808080"/>
-              <w:right w:val="single" w:sz="4" w:space="0" w:color="808080"/>
-            </w:tcBorders>
-            <w:tcMar>
-              <w:top w:w="60" w:type="dxa"/>
-              <w:left w:w="100" w:type="dxa"/>
-              <w:bottom w:w="60" w:type="dxa"/>
-              <w:right w:w="100" w:type="dxa"/>
-            </w:tcMar>
-            <w:vAlign w:val="center"/>
-          </w:tcPr>
-          <w:p>
-            <w:pPr>
-              <w:spacing w:line="276" w:lineRule="auto"/>
-            </w:pPr>
-            <w:r>
-              <w:rPr>
-                <w:sz w:val="21"/>
-                <w:szCs w:val="21"/>
-              </w:rPr>
-              <w:t>Numerics</w:t>
-            </w:r>
-          </w:p>
-        </w:tc>
-        <w:tc>
-          <w:tcPr>
-            <w:tcW w:w="6826" w:type="dxa"/>
-            <w:tcBorders>
-              <w:top w:val="single" w:sz="4" w:space="0" w:color="808080"/>
-              <w:left w:val="single" w:sz="4" w:space="0" w:color="808080"/>
-              <w:bottom w:val="single" w:sz="4" w:space="0" w:color="808080"/>
-              <w:right w:val="single" w:sz="4" w:space="0" w:color="808080"/>
-            </w:tcBorders>
-            <w:tcMar>
-              <w:top w:w="60" w:type="dxa"/>
-              <w:left w:w="100" w:type="dxa"/>
-              <w:bottom w:w="60" w:type="dxa"/>
-              <w:right w:w="100" w:type="dxa"/>
-            </w:tcMar>
-            <w:vAlign w:val="center"/>
-          </w:tcPr>
-          <w:p>
-            <w:pPr>
-              <w:spacing w:line="276" w:lineRule="auto"/>
-            </w:pPr>
-            <w:r>
-              <w:rPr>
-                <w:sz w:val="21"/>
-                <w:szCs w:val="21"/>
-              </w:rPr>
-              <w:t>NumPy for vectorised similarity</w:t>
-            </w:r>
-          </w:p>
-        </w:tc>
-      </w:tr>
-      <w:tr>
-        <w:tblPrEx>
-          <w:tblCellMar>
-            <w:top w:w="0" w:type="dxa"/>
-            <w:bottom w:w="0" w:type="dxa"/>
-          </w:tblCellMar>
-        </w:tblPrEx>
-        <w:tc>
-          <w:tcPr>
-            <w:tcW w:w="2200" w:type="dxa"/>
-            <w:tcBorders>
-              <w:top w:val="single" w:sz="4" w:space="0" w:color="808080"/>
-              <w:left w:val="single" w:sz="4" w:space="0" w:color="808080"/>
-              <w:bottom w:val="single" w:sz="4" w:space="0" w:color="808080"/>
-              <w:right w:val="single" w:sz="4" w:space="0" w:color="808080"/>
-            </w:tcBorders>
-            <w:tcMar>
-              <w:top w:w="60" w:type="dxa"/>
-              <w:left w:w="100" w:type="dxa"/>
-              <w:bottom w:w="60" w:type="dxa"/>
-              <w:right w:w="100" w:type="dxa"/>
-            </w:tcMar>
-            <w:vAlign w:val="center"/>
-          </w:tcPr>
-          <w:p>
-            <w:pPr>
-              <w:spacing w:line="276" w:lineRule="auto"/>
-            </w:pPr>
-            <w:r>
-              <w:rPr>
-                <w:sz w:val="21"/>
-                <w:szCs w:val="21"/>
-              </w:rPr>
-              <w:t>Quality</w:t>
-            </w:r>
-          </w:p>
-        </w:tc>
-        <w:tc>
-          <w:tcPr>
-            <w:tcW w:w="6826" w:type="dxa"/>
-            <w:tcBorders>
-              <w:top w:val="single" w:sz="4" w:space="0" w:color="808080"/>
-              <w:left w:val="single" w:sz="4" w:space="0" w:color="808080"/>
-              <w:bottom w:val="single" w:sz="4" w:space="0" w:color="808080"/>
-              <w:right w:val="single" w:sz="4" w:space="0" w:color="808080"/>
-            </w:tcBorders>
-            <w:tcMar>
-              <w:top w:w="60" w:type="dxa"/>
-              <w:left w:w="100" w:type="dxa"/>
-              <w:bottom w:w="60" w:type="dxa"/>
-              <w:right w:w="100" w:type="dxa"/>
-            </w:tcMar>
-            <w:vAlign w:val="center"/>
-          </w:tcPr>
-          <w:p>
-            <w:pPr>
-              <w:spacing w:line="276" w:lineRule="auto"/>
-            </w:pPr>
-            <w:r>
-              <w:rPr>
-                <w:sz w:val="21"/>
-                <w:szCs w:val="21"/>
-              </w:rPr>
-              <w:t>pytest, GitHub Actions, Playwright and the WebView2 debug protocol for end-to-end checks</w:t>
-            </w:r>
-          </w:p>
-        </w:tc>
-      </w:tr>
-    </w:tbl>
-    <w:p>
-      <w:r>
-        <w:br w:type="page"/>
-      </w:r>
-    </w:p>
-    <w:p>
-      <w:pPr>
-        <w:pStyle w:val="Heading1"/>
-        <w:spacing w:before="240" w:after="200"/>
-      </w:pPr>
-      <w:bookmarkStart w:id="28" w:name="_Toc242209418"/>
-      <w:r>
-        <w:lastRenderedPageBreak/>
-        <w:t>Chapter 5: Implementation</w:t>
-      </w:r>
-      <w:bookmarkEnd w:id="28"/>
-    </w:p>
-    <w:p>
-      <w:pPr>
-        <w:pStyle w:val="Heading2"/>
-        <w:spacing w:before="200" w:after="120"/>
-      </w:pPr>
-      <w:bookmarkStart w:id="29" w:name="_Toc242209419"/>
-      <w:r>
-        <w:t>5.1 Module-wise Description</w:t>
-      </w:r>
-      <w:bookmarkEnd w:id="29"/>
-    </w:p>
-    <w:p>
-      <w:pPr>
-        <w:pStyle w:val="Heading3"/>
-        <w:spacing w:before="160" w:after="100"/>
-      </w:pPr>
-      <w:bookmarkStart w:id="30" w:name="_Toc242209420"/>
-      <w:r>
-        <w:t>5.1.1 Natural Language Interface</w:t>
-      </w:r>
-      <w:bookmarkEnd w:id="30"/>
-    </w:p>
-    <w:p>
-      <w:pPr>
-        <w:spacing w:after="160" w:line="360" w:lineRule="auto"/>
-        <w:jc w:val="both"/>
-      </w:pPr>
-      <w:r>
-        <w:t>Each message is sent to the local model with a short description of the four levels of intent, and the model returns JSON with the intent, the topic to search for, and a flag for whether the message refers back to earlier conversation. Requests are routed deterministically after that. The interface reports a low-confidence result as a guess and never launches a file on a weak match.</w:t>
-      </w:r>
-    </w:p>
-    <w:p>
-      <w:pPr>
-        <w:pStyle w:val="Heading3"/>
-        <w:spacing w:before="160" w:after="100"/>
-      </w:pPr>
-      <w:bookmarkStart w:id="31" w:name="_Toc242209421"/>
-      <w:r>
-        <w:t>5.1.2 Semantic Search Engine</w:t>
-      </w:r>
-      <w:bookmarkEnd w:id="31"/>
-    </w:p>
-    <w:p>
-      <w:pPr>
-        <w:spacing w:after="160" w:line="360" w:lineRule="auto"/>
-        <w:jc w:val="both"/>
-      </w:pPr>
-      <w:r>
-        <w:t>A query is embedded and compared with every chunk. Results are grouped by file. A file is kept if it lies within a margin of the best hit and above a floor, and a small boost is added where the query's words appear in the file's text or name. This replaced a fixed cut-off, which had returned nothing for short queries such as “meeting”.</w:t>
-      </w:r>
-    </w:p>
-    <w:p>
-      <w:pPr>
-        <w:pStyle w:val="Heading3"/>
-        <w:spacing w:before="160" w:after="100"/>
-      </w:pPr>
-      <w:bookmarkStart w:id="32" w:name="_Toc242209422"/>
-      <w:r>
-        <w:t>5.1.3 AI File Organiser</w:t>
-      </w:r>
-      <w:bookmarkEnd w:id="32"/>
-    </w:p>
-    <w:p>
-      <w:pPr>
-        <w:spacing w:after="160" w:line="360" w:lineRule="auto"/>
-        <w:jc w:val="both"/>
-      </w:pPr>
-      <w:r>
-        <w:t>For each file the model proposes a summary, tags, a category and the reason for the category. The user applies or refuses each proposal. Applying moves the file into a folder named after the category and records the original path. Reverting moves it back and removes the folder if it is empty.</w:t>
-      </w:r>
-    </w:p>
-    <w:p>
-      <w:pPr>
-        <w:pStyle w:val="Heading3"/>
-        <w:spacing w:before="160" w:after="100"/>
-      </w:pPr>
-      <w:bookmarkStart w:id="33" w:name="_Toc242209423"/>
-      <w:r>
-        <w:t>5.1.4 Knowledge Graph</w:t>
-      </w:r>
-      <w:bookmarkEnd w:id="33"/>
-    </w:p>
-    <w:p>
-      <w:pPr>
-        <w:spacing w:after="160" w:line="360" w:lineRule="auto"/>
-        <w:jc w:val="both"/>
-      </w:pPr>
-      <w:r>
-        <w:t>Three kinds of edge are computed: similar content, from the cosine similarity of the centred mean embedding of each file; direct reference, when one file's text names another file; and shared tags, when two files share at least two tags. Each file keeps its three strongest neighbours. Clusters are built by average-linkage merging, which joins two groups only while the average weight between their members stays above a threshold.</w:t>
-      </w:r>
-    </w:p>
-    <w:p>
-      <w:pPr>
-        <w:pStyle w:val="Heading3"/>
-        <w:spacing w:before="160" w:after="100"/>
-      </w:pPr>
-      <w:bookmarkStart w:id="34" w:name="_Toc242209424"/>
-      <w:r>
-        <w:t>5.1.5 Context Memory Engine</w:t>
-      </w:r>
-      <w:bookmarkEnd w:id="34"/>
-    </w:p>
-    <w:p>
-      <w:pPr>
-        <w:spacing w:after="160" w:line="360" w:lineRule="auto"/>
-        <w:jc w:val="both"/>
-      </w:pPr>
-      <w:r>
-        <w:t>Every turn is stored with the identifiers of the files it showed. A follow-up such as “open the second one” or “open it” resolves to a file by rule. Only when no rule applies, and no confident search matches the request, is the model's own judgement used. This ordering was introduced after a live failure described in Section 7.3.</w:t>
-      </w:r>
-    </w:p>
-    <w:p>
-      <w:pPr>
-        <w:pStyle w:val="Heading3"/>
-        <w:spacing w:before="160" w:after="100"/>
-      </w:pPr>
-      <w:bookmarkStart w:id="35" w:name="_Toc242209425"/>
-      <w:r>
-        <w:lastRenderedPageBreak/>
-        <w:t>5.1.6 Intelligent Workspace Manager</w:t>
-      </w:r>
-      <w:bookmarkEnd w:id="35"/>
-    </w:p>
-    <w:p>
-      <w:pPr>
-        <w:spacing w:after="160" w:line="360" w:lineRule="auto"/>
-        <w:jc w:val="both"/>
-      </w:pPr>
-      <w:r>
-        <w:t>Recommendations come from rules, not from the language model, so they are reproducible and explainable. They include related groups, frequently opened files, possible duplicates, files without a category and stale files. A workspace is a named group whose files open together.</w:t>
-      </w:r>
-    </w:p>
-    <w:p>
-      <w:pPr>
-        <w:pStyle w:val="Heading3"/>
-        <w:spacing w:before="160" w:after="100"/>
-      </w:pPr>
-      <w:bookmarkStart w:id="36" w:name="_Toc242209426"/>
-      <w:r>
-        <w:t>5.1.7 Privacy audit</w:t>
-      </w:r>
-      <w:bookmarkEnd w:id="36"/>
-    </w:p>
-    <w:p>
-      <w:pPr>
-        <w:spacing w:after="160" w:line="360" w:lineRule="auto"/>
-        <w:jc w:val="both"/>
-      </w:pPr>
-      <w:r>
-        <w:t>The audit reads the live configuration and lists each network endpoint the service uses, whether it is on this computer, what it is used for, and what is stored locally. It says plainly that it checks configuration, not network traffic, and shows how to confirm the listening address with netstat.</w:t>
-      </w:r>
-    </w:p>
-    <w:p>
-      <w:pPr>
-        <w:pStyle w:val="Heading2"/>
-        <w:spacing w:before="200" w:after="120"/>
-      </w:pPr>
-      <w:bookmarkStart w:id="37" w:name="_Toc242209427"/>
-      <w:r>
-        <w:t>5.2 Technologies Used</w:t>
-      </w:r>
-      <w:bookmarkEnd w:id="37"/>
-    </w:p>
-    <w:p>
-      <w:pPr>
-        <w:spacing w:after="160" w:line="360" w:lineRule="auto"/>
-        <w:jc w:val="both"/>
-      </w:pPr>
-      <w:r>
-        <w:t>The service is written in Python with FastAPI, which provides typed request models and an automatic test client. ChromaDB stores vectors on disk, and SQLite stores everything relational. NumPy performs the pairwise similarity computation as a single matrix product. The desktop shell is Tauri, which hosts a React interface and runs the operating-system file opener under an explicit permission scope. The language model runtime is Ollama, which serves both models over a local HTTP interface.</w:t>
-      </w:r>
-    </w:p>
-    <w:p>
-      <w:pPr>
-        <w:pStyle w:val="Heading2"/>
-        <w:spacing w:before="200" w:after="120"/>
-      </w:pPr>
-      <w:bookmarkStart w:id="38" w:name="_Toc242209428"/>
-      <w:r>
-        <w:t>5.3 Code Snippets</w:t>
-      </w:r>
-      <w:bookmarkEnd w:id="38"/>
-    </w:p>
-    <w:p>
-      <w:pPr>
-        <w:spacing w:after="160" w:line="360" w:lineRule="auto"/>
-        <w:jc w:val="both"/>
-      </w:pPr>
-      <w:r>
-        <w:t>The following excerpt is the vectorised similarity computation. One matrix product gives every pairwise cosine similarity, and the strongest neighbours of each file are selected in one pass. The original version compared each pair in a Python loop.</w:t>
-      </w:r>
-    </w:p>
-    <w:p>
-      <w:pPr>
-        <w:shd w:val="clear" w:color="auto" w:fill="F2F2F2"/>
-      </w:pPr>
-      <w:r>
-        <w:rPr>
-          <w:rFonts w:ascii="Courier New" w:eastAsia="Courier New" w:hAnsi="Courier New" w:cs="Courier New"/>
-          <w:sz w:val="18"/>
-          <w:szCs w:val="18"/>
-        </w:rPr>
-        <w:t>unit = matrix / norms[:, None]</w:t>
-      </w:r>
-    </w:p>
-    <w:p>
-      <w:pPr>
-        <w:shd w:val="clear" w:color="auto" w:fill="F2F2F2"/>
-      </w:pPr>
-      <w:r>
-        <w:rPr>
-          <w:rFonts w:ascii="Courier New" w:eastAsia="Courier New" w:hAnsi="Courier New" w:cs="Courier New"/>
-          <w:sz w:val="18"/>
-          <w:szCs w:val="18"/>
-        </w:rPr>
-        <w:t>sims = unit @ unit.T</w:t>
-      </w:r>
-    </w:p>
-    <w:p>
-      <w:pPr>
-        <w:shd w:val="clear" w:color="auto" w:fill="F2F2F2"/>
-      </w:pPr>
-      <w:r>
-        <w:rPr>
-          <w:rFonts w:ascii="Courier New" w:eastAsia="Courier New" w:hAnsi="Courier New" w:cs="Courier New"/>
-          <w:sz w:val="18"/>
-          <w:szCs w:val="18"/>
-        </w:rPr>
-        <w:t>np.fill_diagonal(sims, -np.inf)</w:t>
-      </w:r>
-    </w:p>
-    <w:p>
-      <w:pPr>
-        <w:shd w:val="clear" w:color="auto" w:fill="F2F2F2"/>
-      </w:pPr>
-      <w:r>
-        <w:rPr>
-          <w:rFonts w:ascii="Courier New" w:eastAsia="Courier New" w:hAnsi="Courier New" w:cs="Courier New"/>
-          <w:sz w:val="18"/>
-          <w:szCs w:val="18"/>
-        </w:rPr>
-        <w:t>k = min(settings.graph_top_k, len(paths) - 1)</w:t>
-      </w:r>
-    </w:p>
-    <w:p>
-      <w:pPr>
-        <w:shd w:val="clear" w:color="auto" w:fill="F2F2F2"/>
-      </w:pPr>
-      <w:r>
-        <w:rPr>
-          <w:rFonts w:ascii="Courier New" w:eastAsia="Courier New" w:hAnsi="Courier New" w:cs="Courier New"/>
-          <w:sz w:val="18"/>
-          <w:szCs w:val="18"/>
-        </w:rPr>
-        <w:t>neighbours = np.argpartition(-sims, k - 1, axis=1)[:, :k]</w:t>
-      </w:r>
-    </w:p>
-    <w:p>
-      <w:pPr>
-        <w:spacing w:after="160" w:line="360" w:lineRule="auto"/>
-        <w:jc w:val="both"/>
-      </w:pPr>
-      <w:r>
-        <w:t>The excerpt below is the rule that decides whether a follow-up refers to earlier results. Deterministic evidence is checked first, and the model's flag is only a last resort.</w:t>
-      </w:r>
-    </w:p>
-    <w:p>
-      <w:pPr>
-        <w:shd w:val="clear" w:color="auto" w:fill="F2F2F2"/>
-      </w:pPr>
-      <w:r>
-        <w:rPr>
-          <w:rFonts w:ascii="Courier New" w:eastAsia="Courier New" w:hAnsi="Courier New" w:cs="Courier New"/>
-          <w:sz w:val="18"/>
-          <w:szCs w:val="18"/>
-        </w:rPr>
-        <w:t>def _open(query, referenced, weak_referenced=None):</w:t>
-      </w:r>
-    </w:p>
-    <w:p>
-      <w:pPr>
-        <w:shd w:val="clear" w:color="auto" w:fill="F2F2F2"/>
-      </w:pPr>
-      <w:r>
-        <w:rPr>
-          <w:rFonts w:ascii="Courier New" w:eastAsia="Courier New" w:hAnsi="Courier New" w:cs="Courier New"/>
-          <w:sz w:val="18"/>
-          <w:szCs w:val="18"/>
-        </w:rPr>
-        <w:t xml:space="preserve">    if referenced:                       # rule-based: ordinal or bare "it"</w:t>
-      </w:r>
-    </w:p>
-    <w:p>
-      <w:pPr>
-        <w:shd w:val="clear" w:color="auto" w:fill="F2F2F2"/>
-      </w:pPr>
-      <w:r>
-        <w:rPr>
-          <w:rFonts w:ascii="Courier New" w:eastAsia="Courier New" w:hAnsi="Courier New" w:cs="Courier New"/>
-          <w:sz w:val="18"/>
-          <w:szCs w:val="18"/>
-        </w:rPr>
-        <w:t xml:space="preserve">        return _open_response(search.hit_for_path(referenced))</w:t>
-      </w:r>
-    </w:p>
-    <w:p>
-      <w:pPr>
-        <w:shd w:val="clear" w:color="auto" w:fill="F2F2F2"/>
-      </w:pPr>
-      <w:r>
-        <w:rPr>
-          <w:rFonts w:ascii="Courier New" w:eastAsia="Courier New" w:hAnsi="Courier New" w:cs="Courier New"/>
-          <w:sz w:val="18"/>
-          <w:szCs w:val="18"/>
-        </w:rPr>
-        <w:t xml:space="preserve">    hits = search.semantic_search(query, top_k=3)</w:t>
-      </w:r>
-    </w:p>
-    <w:p>
-      <w:pPr>
-        <w:shd w:val="clear" w:color="auto" w:fill="F2F2F2"/>
-      </w:pPr>
-      <w:r>
-        <w:rPr>
-          <w:rFonts w:ascii="Courier New" w:eastAsia="Courier New" w:hAnsi="Courier New" w:cs="Courier New"/>
-          <w:sz w:val="18"/>
-          <w:szCs w:val="18"/>
-        </w:rPr>
-        <w:t xml:space="preserve">    best = hits[0] if hits else None</w:t>
-      </w:r>
-    </w:p>
-    <w:p>
-      <w:pPr>
-        <w:shd w:val="clear" w:color="auto" w:fill="F2F2F2"/>
-      </w:pPr>
-      <w:r>
-        <w:rPr>
-          <w:rFonts w:ascii="Courier New" w:eastAsia="Courier New" w:hAnsi="Courier New" w:cs="Courier New"/>
-          <w:sz w:val="18"/>
-          <w:szCs w:val="18"/>
-        </w:rPr>
-        <w:t xml:space="preserve">    if not best or best.similarity &lt; settings.search_similarity_threshold:</w:t>
-      </w:r>
-    </w:p>
-    <w:p>
-      <w:pPr>
-        <w:shd w:val="clear" w:color="auto" w:fill="F2F2F2"/>
-      </w:pPr>
-      <w:r>
-        <w:rPr>
-          <w:rFonts w:ascii="Courier New" w:eastAsia="Courier New" w:hAnsi="Courier New" w:cs="Courier New"/>
-          <w:sz w:val="18"/>
-          <w:szCs w:val="18"/>
-        </w:rPr>
-        <w:t xml:space="preserve">        if weak_referenced:              # model's guess, last resort only</w:t>
-      </w:r>
-    </w:p>
-    <w:p>
-      <w:pPr>
-        <w:shd w:val="clear" w:color="auto" w:fill="F2F2F2"/>
-      </w:pPr>
-      <w:r>
-        <w:rPr>
-          <w:rFonts w:ascii="Courier New" w:eastAsia="Courier New" w:hAnsi="Courier New" w:cs="Courier New"/>
-          <w:sz w:val="18"/>
-          <w:szCs w:val="18"/>
-        </w:rPr>
-        <w:t xml:space="preserve">            return _open_response(search.hit_for_path(weak_referenced))</w:t>
-      </w:r>
-    </w:p>
-    <w:p>
-      <w:pPr>
-        <w:pStyle w:val="Heading2"/>
-        <w:spacing w:before="200" w:after="120"/>
-      </w:pPr>
-      <w:bookmarkStart w:id="39" w:name="_Toc242209429"/>
-      <w:r>
-        <w:lastRenderedPageBreak/>
-        <w:t>5.4 Screenshots of Outputs</w:t>
-      </w:r>
-      <w:bookmarkEnd w:id="39"/>
-    </w:p>
-    <w:p>
-      <w:pPr>
-        <w:keepNext/>
-        <w:spacing w:before="160" w:after="60"/>
-        <w:jc w:val="center"/>
-      </w:pPr>
-      <w:r>
-        <w:rPr>
-          <w:noProof/>
-        </w:rPr>
-        <w:drawing>
-          <wp:inline distT="0" distB="0" distL="0" distR="0" wp14:anchorId="2118A04E" wp14:editId="48CA93C5">
-            <wp:extent cx="4095750" cy="3200400"/>
-            <wp:effectExtent l="0" t="0" r="0" b="0"/>
-            <wp:docPr id="1438150636" name="ui-knowledge-graph.png" descr="Figure 5.1 - Knowledge-graph view with a selected file and its neighbours" title="Figure 5.1 - Knowledge-graph view with a selected file and its neighbours"/>
+            <wp:docPr id="59676725" name="ui-chat.png" descr="Figure 4.10 - Chat view: related files with the reason each is linked" title="Figure 4.10 - Chat view: related files with the reason each is linked"/>
             <wp:cNvGraphicFramePr>
               <a:graphicFrameLocks xmlns:a="http://schemas.openxmlformats.org/drawingml/2006/main" noChangeAspect="1"/>
             </wp:cNvGraphicFramePr>
@@ -13935,8 +13030,940 @@
           <w:sz w:val="22"/>
           <w:szCs w:val="22"/>
         </w:rPr>
-        <w:t>Figure 5.1 - Knowledge-graph view with a selected file and its neighbours</w:t>
-      </w:r>
+        <w:t>Figure 4.10 - Chat view: related files with the reason each is linked</w:t>
+      </w:r>
+    </w:p>
+    <w:p>
+      <w:pPr>
+        <w:pStyle w:val="Heading2"/>
+        <w:spacing w:before="200" w:after="120"/>
+      </w:pPr>
+      <w:bookmarkStart w:id="27" w:name="_Toc242518504"/>
+      <w:r>
+        <w:t>4.7 Technology Stack</w:t>
+      </w:r>
+      <w:bookmarkEnd w:id="27"/>
+    </w:p>
+    <w:p>
+      <w:pPr>
+        <w:keepNext/>
+        <w:spacing w:before="200" w:after="100"/>
+      </w:pPr>
+      <w:r>
+        <w:rPr>
+          <w:b/>
+          <w:bCs/>
+          <w:sz w:val="22"/>
+          <w:szCs w:val="22"/>
+        </w:rPr>
+        <w:t>Table 4.3: Technology stack by layer</w:t>
+      </w:r>
+    </w:p>
+    <w:tbl>
+      <w:tblPr>
+        <w:tblW w:w="9026" w:type="dxa"/>
+        <w:tblBorders>
+          <w:top w:val="single" w:sz="4" w:space="0" w:color="auto"/>
+          <w:left w:val="single" w:sz="4" w:space="0" w:color="auto"/>
+          <w:bottom w:val="single" w:sz="4" w:space="0" w:color="auto"/>
+          <w:right w:val="single" w:sz="4" w:space="0" w:color="auto"/>
+          <w:insideH w:val="single" w:sz="4" w:space="0" w:color="auto"/>
+          <w:insideV w:val="single" w:sz="4" w:space="0" w:color="auto"/>
+        </w:tblBorders>
+        <w:tblCellMar>
+          <w:left w:w="10" w:type="dxa"/>
+          <w:right w:w="10" w:type="dxa"/>
+        </w:tblCellMar>
+        <w:tblLook w:val="04A0" w:firstRow="1" w:lastRow="0" w:firstColumn="1" w:lastColumn="0" w:noHBand="0" w:noVBand="1"/>
+      </w:tblPr>
+      <w:tblGrid>
+        <w:gridCol w:w="2200"/>
+        <w:gridCol w:w="6826"/>
+      </w:tblGrid>
+      <w:tr>
+        <w:tblPrEx>
+          <w:tblCellMar>
+            <w:top w:w="0" w:type="dxa"/>
+            <w:bottom w:w="0" w:type="dxa"/>
+          </w:tblCellMar>
+        </w:tblPrEx>
+        <w:trPr>
+          <w:tblHeader/>
+        </w:trPr>
+        <w:tc>
+          <w:tcPr>
+            <w:tcW w:w="2200" w:type="dxa"/>
+            <w:tcBorders>
+              <w:top w:val="single" w:sz="4" w:space="0" w:color="808080"/>
+              <w:left w:val="single" w:sz="4" w:space="0" w:color="808080"/>
+              <w:bottom w:val="single" w:sz="4" w:space="0" w:color="808080"/>
+              <w:right w:val="single" w:sz="4" w:space="0" w:color="808080"/>
+            </w:tcBorders>
+            <w:shd w:val="clear" w:color="auto" w:fill="D9D9D9"/>
+            <w:tcMar>
+              <w:top w:w="60" w:type="dxa"/>
+              <w:left w:w="100" w:type="dxa"/>
+              <w:bottom w:w="60" w:type="dxa"/>
+              <w:right w:w="100" w:type="dxa"/>
+            </w:tcMar>
+            <w:vAlign w:val="center"/>
+          </w:tcPr>
+          <w:p>
+            <w:pPr>
+              <w:spacing w:line="276" w:lineRule="auto"/>
+            </w:pPr>
+            <w:r>
+              <w:rPr>
+                <w:b/>
+                <w:bCs/>
+                <w:sz w:val="21"/>
+                <w:szCs w:val="21"/>
+              </w:rPr>
+              <w:t>Layer</w:t>
+            </w:r>
+          </w:p>
+        </w:tc>
+        <w:tc>
+          <w:tcPr>
+            <w:tcW w:w="6826" w:type="dxa"/>
+            <w:tcBorders>
+              <w:top w:val="single" w:sz="4" w:space="0" w:color="808080"/>
+              <w:left w:val="single" w:sz="4" w:space="0" w:color="808080"/>
+              <w:bottom w:val="single" w:sz="4" w:space="0" w:color="808080"/>
+              <w:right w:val="single" w:sz="4" w:space="0" w:color="808080"/>
+            </w:tcBorders>
+            <w:shd w:val="clear" w:color="auto" w:fill="D9D9D9"/>
+            <w:tcMar>
+              <w:top w:w="60" w:type="dxa"/>
+              <w:left w:w="100" w:type="dxa"/>
+              <w:bottom w:w="60" w:type="dxa"/>
+              <w:right w:w="100" w:type="dxa"/>
+            </w:tcMar>
+            <w:vAlign w:val="center"/>
+          </w:tcPr>
+          <w:p>
+            <w:pPr>
+              <w:spacing w:line="276" w:lineRule="auto"/>
+            </w:pPr>
+            <w:r>
+              <w:rPr>
+                <w:b/>
+                <w:bCs/>
+                <w:sz w:val="21"/>
+                <w:szCs w:val="21"/>
+              </w:rPr>
+              <w:t>Technology</w:t>
+            </w:r>
+          </w:p>
+        </w:tc>
+      </w:tr>
+      <w:tr>
+        <w:tblPrEx>
+          <w:tblCellMar>
+            <w:top w:w="0" w:type="dxa"/>
+            <w:bottom w:w="0" w:type="dxa"/>
+          </w:tblCellMar>
+        </w:tblPrEx>
+        <w:tc>
+          <w:tcPr>
+            <w:tcW w:w="2200" w:type="dxa"/>
+            <w:tcBorders>
+              <w:top w:val="single" w:sz="4" w:space="0" w:color="808080"/>
+              <w:left w:val="single" w:sz="4" w:space="0" w:color="808080"/>
+              <w:bottom w:val="single" w:sz="4" w:space="0" w:color="808080"/>
+              <w:right w:val="single" w:sz="4" w:space="0" w:color="808080"/>
+            </w:tcBorders>
+            <w:tcMar>
+              <w:top w:w="60" w:type="dxa"/>
+              <w:left w:w="100" w:type="dxa"/>
+              <w:bottom w:w="60" w:type="dxa"/>
+              <w:right w:w="100" w:type="dxa"/>
+            </w:tcMar>
+            <w:vAlign w:val="center"/>
+          </w:tcPr>
+          <w:p>
+            <w:pPr>
+              <w:spacing w:line="276" w:lineRule="auto"/>
+            </w:pPr>
+            <w:r>
+              <w:rPr>
+                <w:sz w:val="21"/>
+                <w:szCs w:val="21"/>
+              </w:rPr>
+              <w:t>Interface</w:t>
+            </w:r>
+          </w:p>
+        </w:tc>
+        <w:tc>
+          <w:tcPr>
+            <w:tcW w:w="6826" w:type="dxa"/>
+            <w:tcBorders>
+              <w:top w:val="single" w:sz="4" w:space="0" w:color="808080"/>
+              <w:left w:val="single" w:sz="4" w:space="0" w:color="808080"/>
+              <w:bottom w:val="single" w:sz="4" w:space="0" w:color="808080"/>
+              <w:right w:val="single" w:sz="4" w:space="0" w:color="808080"/>
+            </w:tcBorders>
+            <w:tcMar>
+              <w:top w:w="60" w:type="dxa"/>
+              <w:left w:w="100" w:type="dxa"/>
+              <w:bottom w:w="60" w:type="dxa"/>
+              <w:right w:w="100" w:type="dxa"/>
+            </w:tcMar>
+            <w:vAlign w:val="center"/>
+          </w:tcPr>
+          <w:p>
+            <w:pPr>
+              <w:spacing w:line="276" w:lineRule="auto"/>
+            </w:pPr>
+            <w:r>
+              <w:rPr>
+                <w:sz w:val="21"/>
+                <w:szCs w:val="21"/>
+              </w:rPr>
+              <w:t>React 19, TypeScript, Vite, d3-force for the graph layout, Tauri 2 shell</w:t>
+            </w:r>
+          </w:p>
+        </w:tc>
+      </w:tr>
+      <w:tr>
+        <w:tblPrEx>
+          <w:tblCellMar>
+            <w:top w:w="0" w:type="dxa"/>
+            <w:bottom w:w="0" w:type="dxa"/>
+          </w:tblCellMar>
+        </w:tblPrEx>
+        <w:tc>
+          <w:tcPr>
+            <w:tcW w:w="2200" w:type="dxa"/>
+            <w:tcBorders>
+              <w:top w:val="single" w:sz="4" w:space="0" w:color="808080"/>
+              <w:left w:val="single" w:sz="4" w:space="0" w:color="808080"/>
+              <w:bottom w:val="single" w:sz="4" w:space="0" w:color="808080"/>
+              <w:right w:val="single" w:sz="4" w:space="0" w:color="808080"/>
+            </w:tcBorders>
+            <w:tcMar>
+              <w:top w:w="60" w:type="dxa"/>
+              <w:left w:w="100" w:type="dxa"/>
+              <w:bottom w:w="60" w:type="dxa"/>
+              <w:right w:w="100" w:type="dxa"/>
+            </w:tcMar>
+            <w:vAlign w:val="center"/>
+          </w:tcPr>
+          <w:p>
+            <w:pPr>
+              <w:spacing w:line="276" w:lineRule="auto"/>
+            </w:pPr>
+            <w:r>
+              <w:rPr>
+                <w:sz w:val="21"/>
+                <w:szCs w:val="21"/>
+              </w:rPr>
+              <w:t>Service</w:t>
+            </w:r>
+          </w:p>
+        </w:tc>
+        <w:tc>
+          <w:tcPr>
+            <w:tcW w:w="6826" w:type="dxa"/>
+            <w:tcBorders>
+              <w:top w:val="single" w:sz="4" w:space="0" w:color="808080"/>
+              <w:left w:val="single" w:sz="4" w:space="0" w:color="808080"/>
+              <w:bottom w:val="single" w:sz="4" w:space="0" w:color="808080"/>
+              <w:right w:val="single" w:sz="4" w:space="0" w:color="808080"/>
+            </w:tcBorders>
+            <w:tcMar>
+              <w:top w:w="60" w:type="dxa"/>
+              <w:left w:w="100" w:type="dxa"/>
+              <w:bottom w:w="60" w:type="dxa"/>
+              <w:right w:w="100" w:type="dxa"/>
+            </w:tcMar>
+            <w:vAlign w:val="center"/>
+          </w:tcPr>
+          <w:p>
+            <w:pPr>
+              <w:spacing w:line="276" w:lineRule="auto"/>
+            </w:pPr>
+            <w:r>
+              <w:rPr>
+                <w:sz w:val="21"/>
+                <w:szCs w:val="21"/>
+              </w:rPr>
+              <w:t>Python 3.12, FastAPI, Uvicorn, Pydantic</w:t>
+            </w:r>
+          </w:p>
+        </w:tc>
+      </w:tr>
+      <w:tr>
+        <w:tblPrEx>
+          <w:tblCellMar>
+            <w:top w:w="0" w:type="dxa"/>
+            <w:bottom w:w="0" w:type="dxa"/>
+          </w:tblCellMar>
+        </w:tblPrEx>
+        <w:tc>
+          <w:tcPr>
+            <w:tcW w:w="2200" w:type="dxa"/>
+            <w:tcBorders>
+              <w:top w:val="single" w:sz="4" w:space="0" w:color="808080"/>
+              <w:left w:val="single" w:sz="4" w:space="0" w:color="808080"/>
+              <w:bottom w:val="single" w:sz="4" w:space="0" w:color="808080"/>
+              <w:right w:val="single" w:sz="4" w:space="0" w:color="808080"/>
+            </w:tcBorders>
+            <w:tcMar>
+              <w:top w:w="60" w:type="dxa"/>
+              <w:left w:w="100" w:type="dxa"/>
+              <w:bottom w:w="60" w:type="dxa"/>
+              <w:right w:w="100" w:type="dxa"/>
+            </w:tcMar>
+            <w:vAlign w:val="center"/>
+          </w:tcPr>
+          <w:p>
+            <w:pPr>
+              <w:spacing w:line="276" w:lineRule="auto"/>
+            </w:pPr>
+            <w:r>
+              <w:rPr>
+                <w:sz w:val="21"/>
+                <w:szCs w:val="21"/>
+              </w:rPr>
+              <w:t>Understanding</w:t>
+            </w:r>
+          </w:p>
+        </w:tc>
+        <w:tc>
+          <w:tcPr>
+            <w:tcW w:w="6826" w:type="dxa"/>
+            <w:tcBorders>
+              <w:top w:val="single" w:sz="4" w:space="0" w:color="808080"/>
+              <w:left w:val="single" w:sz="4" w:space="0" w:color="808080"/>
+              <w:bottom w:val="single" w:sz="4" w:space="0" w:color="808080"/>
+              <w:right w:val="single" w:sz="4" w:space="0" w:color="808080"/>
+            </w:tcBorders>
+            <w:tcMar>
+              <w:top w:w="60" w:type="dxa"/>
+              <w:left w:w="100" w:type="dxa"/>
+              <w:bottom w:w="60" w:type="dxa"/>
+              <w:right w:w="100" w:type="dxa"/>
+            </w:tcMar>
+            <w:vAlign w:val="center"/>
+          </w:tcPr>
+          <w:p>
+            <w:pPr>
+              <w:spacing w:line="276" w:lineRule="auto"/>
+            </w:pPr>
+            <w:r>
+              <w:rPr>
+                <w:sz w:val="21"/>
+                <w:szCs w:val="21"/>
+              </w:rPr>
+              <w:t>Ollama runtime with nomic-embed-text and llama3.2</w:t>
+            </w:r>
+          </w:p>
+        </w:tc>
+      </w:tr>
+      <w:tr>
+        <w:tblPrEx>
+          <w:tblCellMar>
+            <w:top w:w="0" w:type="dxa"/>
+            <w:bottom w:w="0" w:type="dxa"/>
+          </w:tblCellMar>
+        </w:tblPrEx>
+        <w:tc>
+          <w:tcPr>
+            <w:tcW w:w="2200" w:type="dxa"/>
+            <w:tcBorders>
+              <w:top w:val="single" w:sz="4" w:space="0" w:color="808080"/>
+              <w:left w:val="single" w:sz="4" w:space="0" w:color="808080"/>
+              <w:bottom w:val="single" w:sz="4" w:space="0" w:color="808080"/>
+              <w:right w:val="single" w:sz="4" w:space="0" w:color="808080"/>
+            </w:tcBorders>
+            <w:tcMar>
+              <w:top w:w="60" w:type="dxa"/>
+              <w:left w:w="100" w:type="dxa"/>
+              <w:bottom w:w="60" w:type="dxa"/>
+              <w:right w:w="100" w:type="dxa"/>
+            </w:tcMar>
+            <w:vAlign w:val="center"/>
+          </w:tcPr>
+          <w:p>
+            <w:pPr>
+              <w:spacing w:line="276" w:lineRule="auto"/>
+            </w:pPr>
+            <w:r>
+              <w:rPr>
+                <w:sz w:val="21"/>
+                <w:szCs w:val="21"/>
+              </w:rPr>
+              <w:t>Storage</w:t>
+            </w:r>
+          </w:p>
+        </w:tc>
+        <w:tc>
+          <w:tcPr>
+            <w:tcW w:w="6826" w:type="dxa"/>
+            <w:tcBorders>
+              <w:top w:val="single" w:sz="4" w:space="0" w:color="808080"/>
+              <w:left w:val="single" w:sz="4" w:space="0" w:color="808080"/>
+              <w:bottom w:val="single" w:sz="4" w:space="0" w:color="808080"/>
+              <w:right w:val="single" w:sz="4" w:space="0" w:color="808080"/>
+            </w:tcBorders>
+            <w:tcMar>
+              <w:top w:w="60" w:type="dxa"/>
+              <w:left w:w="100" w:type="dxa"/>
+              <w:bottom w:w="60" w:type="dxa"/>
+              <w:right w:w="100" w:type="dxa"/>
+            </w:tcMar>
+            <w:vAlign w:val="center"/>
+          </w:tcPr>
+          <w:p>
+            <w:pPr>
+              <w:spacing w:line="276" w:lineRule="auto"/>
+            </w:pPr>
+            <w:r>
+              <w:rPr>
+                <w:sz w:val="21"/>
+                <w:szCs w:val="21"/>
+              </w:rPr>
+              <w:t>SQLite for relational data; ChromaDB for vectors</w:t>
+            </w:r>
+          </w:p>
+        </w:tc>
+      </w:tr>
+      <w:tr>
+        <w:tblPrEx>
+          <w:tblCellMar>
+            <w:top w:w="0" w:type="dxa"/>
+            <w:bottom w:w="0" w:type="dxa"/>
+          </w:tblCellMar>
+        </w:tblPrEx>
+        <w:tc>
+          <w:tcPr>
+            <w:tcW w:w="2200" w:type="dxa"/>
+            <w:tcBorders>
+              <w:top w:val="single" w:sz="4" w:space="0" w:color="808080"/>
+              <w:left w:val="single" w:sz="4" w:space="0" w:color="808080"/>
+              <w:bottom w:val="single" w:sz="4" w:space="0" w:color="808080"/>
+              <w:right w:val="single" w:sz="4" w:space="0" w:color="808080"/>
+            </w:tcBorders>
+            <w:tcMar>
+              <w:top w:w="60" w:type="dxa"/>
+              <w:left w:w="100" w:type="dxa"/>
+              <w:bottom w:w="60" w:type="dxa"/>
+              <w:right w:w="100" w:type="dxa"/>
+            </w:tcMar>
+            <w:vAlign w:val="center"/>
+          </w:tcPr>
+          <w:p>
+            <w:pPr>
+              <w:spacing w:line="276" w:lineRule="auto"/>
+            </w:pPr>
+            <w:r>
+              <w:rPr>
+                <w:sz w:val="21"/>
+                <w:szCs w:val="21"/>
+              </w:rPr>
+              <w:t>Numerics</w:t>
+            </w:r>
+          </w:p>
+        </w:tc>
+        <w:tc>
+          <w:tcPr>
+            <w:tcW w:w="6826" w:type="dxa"/>
+            <w:tcBorders>
+              <w:top w:val="single" w:sz="4" w:space="0" w:color="808080"/>
+              <w:left w:val="single" w:sz="4" w:space="0" w:color="808080"/>
+              <w:bottom w:val="single" w:sz="4" w:space="0" w:color="808080"/>
+              <w:right w:val="single" w:sz="4" w:space="0" w:color="808080"/>
+            </w:tcBorders>
+            <w:tcMar>
+              <w:top w:w="60" w:type="dxa"/>
+              <w:left w:w="100" w:type="dxa"/>
+              <w:bottom w:w="60" w:type="dxa"/>
+              <w:right w:w="100" w:type="dxa"/>
+            </w:tcMar>
+            <w:vAlign w:val="center"/>
+          </w:tcPr>
+          <w:p>
+            <w:pPr>
+              <w:spacing w:line="276" w:lineRule="auto"/>
+            </w:pPr>
+            <w:r>
+              <w:rPr>
+                <w:sz w:val="21"/>
+                <w:szCs w:val="21"/>
+              </w:rPr>
+              <w:t>NumPy for vectorised similarity</w:t>
+            </w:r>
+          </w:p>
+        </w:tc>
+      </w:tr>
+      <w:tr>
+        <w:tblPrEx>
+          <w:tblCellMar>
+            <w:top w:w="0" w:type="dxa"/>
+            <w:bottom w:w="0" w:type="dxa"/>
+          </w:tblCellMar>
+        </w:tblPrEx>
+        <w:tc>
+          <w:tcPr>
+            <w:tcW w:w="2200" w:type="dxa"/>
+            <w:tcBorders>
+              <w:top w:val="single" w:sz="4" w:space="0" w:color="808080"/>
+              <w:left w:val="single" w:sz="4" w:space="0" w:color="808080"/>
+              <w:bottom w:val="single" w:sz="4" w:space="0" w:color="808080"/>
+              <w:right w:val="single" w:sz="4" w:space="0" w:color="808080"/>
+            </w:tcBorders>
+            <w:tcMar>
+              <w:top w:w="60" w:type="dxa"/>
+              <w:left w:w="100" w:type="dxa"/>
+              <w:bottom w:w="60" w:type="dxa"/>
+              <w:right w:w="100" w:type="dxa"/>
+            </w:tcMar>
+            <w:vAlign w:val="center"/>
+          </w:tcPr>
+          <w:p>
+            <w:pPr>
+              <w:spacing w:line="276" w:lineRule="auto"/>
+            </w:pPr>
+            <w:r>
+              <w:rPr>
+                <w:sz w:val="21"/>
+                <w:szCs w:val="21"/>
+              </w:rPr>
+              <w:t>Quality</w:t>
+            </w:r>
+          </w:p>
+        </w:tc>
+        <w:tc>
+          <w:tcPr>
+            <w:tcW w:w="6826" w:type="dxa"/>
+            <w:tcBorders>
+              <w:top w:val="single" w:sz="4" w:space="0" w:color="808080"/>
+              <w:left w:val="single" w:sz="4" w:space="0" w:color="808080"/>
+              <w:bottom w:val="single" w:sz="4" w:space="0" w:color="808080"/>
+              <w:right w:val="single" w:sz="4" w:space="0" w:color="808080"/>
+            </w:tcBorders>
+            <w:tcMar>
+              <w:top w:w="60" w:type="dxa"/>
+              <w:left w:w="100" w:type="dxa"/>
+              <w:bottom w:w="60" w:type="dxa"/>
+              <w:right w:w="100" w:type="dxa"/>
+            </w:tcMar>
+            <w:vAlign w:val="center"/>
+          </w:tcPr>
+          <w:p>
+            <w:pPr>
+              <w:spacing w:line="276" w:lineRule="auto"/>
+            </w:pPr>
+            <w:r>
+              <w:rPr>
+                <w:sz w:val="21"/>
+                <w:szCs w:val="21"/>
+              </w:rPr>
+              <w:t>pytest, GitHub Actions, Playwright and the WebView2 debug protocol for end-to-end checks</w:t>
+            </w:r>
+          </w:p>
+        </w:tc>
+      </w:tr>
+    </w:tbl>
+    <w:p>
+      <w:r>
+        <w:br w:type="page"/>
+      </w:r>
+    </w:p>
+    <w:p>
+      <w:pPr>
+        <w:pStyle w:val="Heading1"/>
+        <w:spacing w:before="240" w:after="200"/>
+      </w:pPr>
+      <w:bookmarkStart w:id="28" w:name="_Toc242518505"/>
+      <w:r>
+        <w:lastRenderedPageBreak/>
+        <w:t>Chapter 5: Implementation</w:t>
+      </w:r>
+      <w:bookmarkEnd w:id="28"/>
+    </w:p>
+    <w:p>
+      <w:pPr>
+        <w:pStyle w:val="Heading2"/>
+        <w:spacing w:before="200" w:after="120"/>
+      </w:pPr>
+      <w:bookmarkStart w:id="29" w:name="_Toc242518506"/>
+      <w:r>
+        <w:t>5.1 Module-wise Description</w:t>
+      </w:r>
+      <w:bookmarkEnd w:id="29"/>
+    </w:p>
+    <w:p>
+      <w:pPr>
+        <w:pStyle w:val="Heading3"/>
+        <w:spacing w:before="160" w:after="100"/>
+      </w:pPr>
+      <w:bookmarkStart w:id="30" w:name="_Toc242518507"/>
+      <w:r>
+        <w:t>5.1.1 Natural Language Interface</w:t>
+      </w:r>
+      <w:bookmarkEnd w:id="30"/>
+    </w:p>
+    <w:p>
+      <w:pPr>
+        <w:spacing w:after="160" w:line="360" w:lineRule="auto"/>
+        <w:jc w:val="both"/>
+      </w:pPr>
+      <w:r>
+        <w:t>Each message is sent to the local model with a short description of the four levels of intent, and the model returns JSON with the intent, the topic to search for, and a flag for whether the message refers back to earlier conversation. Requests are routed deterministically after that. The interface reports a low-confidence result as a guess and never launches a file on a weak match.</w:t>
+      </w:r>
+    </w:p>
+    <w:p>
+      <w:pPr>
+        <w:pStyle w:val="Heading3"/>
+        <w:spacing w:before="160" w:after="100"/>
+      </w:pPr>
+      <w:bookmarkStart w:id="31" w:name="_Toc242518508"/>
+      <w:r>
+        <w:t>5.1.2 Semantic Search Engine</w:t>
+      </w:r>
+      <w:bookmarkEnd w:id="31"/>
+    </w:p>
+    <w:p>
+      <w:pPr>
+        <w:spacing w:after="160" w:line="360" w:lineRule="auto"/>
+        <w:jc w:val="both"/>
+      </w:pPr>
+      <w:r>
+        <w:t>A query is embedded and compared with every chunk. Results are grouped by file. A file is kept if it lies within a margin of the best hit and above a floor, and a small boost is added where the query's words appear in the file's text or name. This replaced a fixed cut-off, which had returned nothing for short queries such as “meeting”.</w:t>
+      </w:r>
+    </w:p>
+    <w:p>
+      <w:pPr>
+        <w:pStyle w:val="Heading3"/>
+        <w:spacing w:before="160" w:after="100"/>
+      </w:pPr>
+      <w:bookmarkStart w:id="32" w:name="_Toc242518509"/>
+      <w:r>
+        <w:t>5.1.3 AI File Organiser</w:t>
+      </w:r>
+      <w:bookmarkEnd w:id="32"/>
+    </w:p>
+    <w:p>
+      <w:pPr>
+        <w:spacing w:after="160" w:line="360" w:lineRule="auto"/>
+        <w:jc w:val="both"/>
+      </w:pPr>
+      <w:r>
+        <w:t>For each file the model proposes a summary, tags, a category and the reason for the category. The user applies or refuses each proposal. Applying moves the file into a folder named after the category and records the original path. Reverting moves it back and removes the folder if it is empty.</w:t>
+      </w:r>
+    </w:p>
+    <w:p>
+      <w:pPr>
+        <w:pStyle w:val="Heading3"/>
+        <w:spacing w:before="160" w:after="100"/>
+      </w:pPr>
+      <w:bookmarkStart w:id="33" w:name="_Toc242518510"/>
+      <w:r>
+        <w:t>5.1.4 Knowledge Graph</w:t>
+      </w:r>
+      <w:bookmarkEnd w:id="33"/>
+    </w:p>
+    <w:p>
+      <w:pPr>
+        <w:spacing w:after="160" w:line="360" w:lineRule="auto"/>
+        <w:jc w:val="both"/>
+      </w:pPr>
+      <w:r>
+        <w:t>Three kinds of edge are computed: similar content, from the cosine similarity of the centred mean embedding of each file; direct reference, when one file's text names another file; and shared tags, when two files share at least two tags. Each file keeps its three strongest neighbours. Clusters are built by average-linkage merging, which joins two groups only while the average weight between their members stays above a threshold.</w:t>
+      </w:r>
+    </w:p>
+    <w:p>
+      <w:pPr>
+        <w:pStyle w:val="Heading3"/>
+        <w:spacing w:before="160" w:after="100"/>
+      </w:pPr>
+      <w:bookmarkStart w:id="34" w:name="_Toc242518511"/>
+      <w:r>
+        <w:t>5.1.5 Context Memory Engine</w:t>
+      </w:r>
+      <w:bookmarkEnd w:id="34"/>
+    </w:p>
+    <w:p>
+      <w:pPr>
+        <w:spacing w:after="160" w:line="360" w:lineRule="auto"/>
+        <w:jc w:val="both"/>
+      </w:pPr>
+      <w:r>
+        <w:t>Every turn is stored with the identifiers of the files it showed. A follow-up such as “open the second one” or “open it” resolves to a file by rule. Only when no rule applies, and no confident search matches the request, is the model's own judgement used. This ordering was introduced after a live failure described in Section 7.3.</w:t>
+      </w:r>
+    </w:p>
+    <w:p>
+      <w:pPr>
+        <w:pStyle w:val="Heading3"/>
+        <w:spacing w:before="160" w:after="100"/>
+      </w:pPr>
+      <w:bookmarkStart w:id="35" w:name="_Toc242518512"/>
+      <w:r>
+        <w:lastRenderedPageBreak/>
+        <w:t>5.1.6 Intelligent Workspace Manager</w:t>
+      </w:r>
+      <w:bookmarkEnd w:id="35"/>
+    </w:p>
+    <w:p>
+      <w:pPr>
+        <w:spacing w:after="160" w:line="360" w:lineRule="auto"/>
+        <w:jc w:val="both"/>
+      </w:pPr>
+      <w:r>
+        <w:t>Recommendations come from rules, not from the language model, so they are reproducible and explainable. They include related groups, frequently opened files, possible duplicates, files without a category and stale files. A workspace is a named group whose files open together.</w:t>
+      </w:r>
+    </w:p>
+    <w:p>
+      <w:pPr>
+        <w:pStyle w:val="Heading3"/>
+        <w:spacing w:before="160" w:after="100"/>
+      </w:pPr>
+      <w:bookmarkStart w:id="36" w:name="_Toc242518513"/>
+      <w:r>
+        <w:t>5.1.7 Privacy audit</w:t>
+      </w:r>
+      <w:bookmarkEnd w:id="36"/>
+    </w:p>
+    <w:p>
+      <w:pPr>
+        <w:spacing w:after="160" w:line="360" w:lineRule="auto"/>
+        <w:jc w:val="both"/>
+      </w:pPr>
+      <w:r>
+        <w:t>The audit reads the live configuration and lists each network endpoint the service uses, whether it is on this computer, what it is used for, and what is stored locally. It says plainly that it checks configuration, not network traffic, and shows how to confirm the listening address with netstat.</w:t>
+      </w:r>
+    </w:p>
+    <w:p>
+      <w:pPr>
+        <w:pStyle w:val="Heading2"/>
+        <w:spacing w:before="200" w:after="120"/>
+      </w:pPr>
+      <w:bookmarkStart w:id="37" w:name="_Toc242518514"/>
+      <w:r>
+        <w:t>5.2 Technologies Used</w:t>
+      </w:r>
+      <w:bookmarkEnd w:id="37"/>
+    </w:p>
+    <w:p>
+      <w:pPr>
+        <w:spacing w:after="160" w:line="360" w:lineRule="auto"/>
+        <w:jc w:val="both"/>
+      </w:pPr>
+      <w:r>
+        <w:t>The service is written in Python with FastAPI, which provides typed request models and an automatic test client. ChromaDB stores vectors on disk, and SQLite stores everything relational. NumPy performs the pairwise similarity computation as a single matrix product. The desktop shell is Tauri, which hosts a React interface and runs the operating-system file opener under an explicit permission scope. The language model runtime is Ollama, which serves both models over a local HTTP interface.</w:t>
+      </w:r>
+    </w:p>
+    <w:p>
+      <w:pPr>
+        <w:pStyle w:val="Heading2"/>
+        <w:spacing w:before="200" w:after="120"/>
+      </w:pPr>
+      <w:bookmarkStart w:id="38" w:name="_Toc242518515"/>
+      <w:r>
+        <w:t>5.3 Code Snippets</w:t>
+      </w:r>
+      <w:bookmarkEnd w:id="38"/>
+    </w:p>
+    <w:p>
+      <w:pPr>
+        <w:spacing w:after="160" w:line="360" w:lineRule="auto"/>
+        <w:jc w:val="both"/>
+      </w:pPr>
+      <w:r>
+        <w:t>The following excerpt is the vectorised similarity computation. One matrix product gives every pairwise cosine similarity, and the strongest neighbours of each file are selected in one pass. The original version compared each pair in a Python loop.</w:t>
+      </w:r>
+    </w:p>
+    <w:p>
+      <w:pPr>
+        <w:shd w:val="clear" w:color="auto" w:fill="F2F2F2"/>
+      </w:pPr>
+      <w:r>
+        <w:rPr>
+          <w:rFonts w:ascii="Courier New" w:eastAsia="Courier New" w:hAnsi="Courier New" w:cs="Courier New"/>
+          <w:sz w:val="18"/>
+          <w:szCs w:val="18"/>
+        </w:rPr>
+        <w:t>unit = matrix / norms[:, None]</w:t>
+      </w:r>
+    </w:p>
+    <w:p>
+      <w:pPr>
+        <w:shd w:val="clear" w:color="auto" w:fill="F2F2F2"/>
+      </w:pPr>
+      <w:r>
+        <w:rPr>
+          <w:rFonts w:ascii="Courier New" w:eastAsia="Courier New" w:hAnsi="Courier New" w:cs="Courier New"/>
+          <w:sz w:val="18"/>
+          <w:szCs w:val="18"/>
+        </w:rPr>
+        <w:t>sims = unit @ unit.T</w:t>
+      </w:r>
+    </w:p>
+    <w:p>
+      <w:pPr>
+        <w:shd w:val="clear" w:color="auto" w:fill="F2F2F2"/>
+      </w:pPr>
+      <w:r>
+        <w:rPr>
+          <w:rFonts w:ascii="Courier New" w:eastAsia="Courier New" w:hAnsi="Courier New" w:cs="Courier New"/>
+          <w:sz w:val="18"/>
+          <w:szCs w:val="18"/>
+        </w:rPr>
+        <w:t>np.fill_diagonal(sims, -np.inf)</w:t>
+      </w:r>
+    </w:p>
+    <w:p>
+      <w:pPr>
+        <w:shd w:val="clear" w:color="auto" w:fill="F2F2F2"/>
+      </w:pPr>
+      <w:r>
+        <w:rPr>
+          <w:rFonts w:ascii="Courier New" w:eastAsia="Courier New" w:hAnsi="Courier New" w:cs="Courier New"/>
+          <w:sz w:val="18"/>
+          <w:szCs w:val="18"/>
+        </w:rPr>
+        <w:t>k = min(settings.graph_top_k, len(paths) - 1)</w:t>
+      </w:r>
+    </w:p>
+    <w:p>
+      <w:pPr>
+        <w:shd w:val="clear" w:color="auto" w:fill="F2F2F2"/>
+      </w:pPr>
+      <w:r>
+        <w:rPr>
+          <w:rFonts w:ascii="Courier New" w:eastAsia="Courier New" w:hAnsi="Courier New" w:cs="Courier New"/>
+          <w:sz w:val="18"/>
+          <w:szCs w:val="18"/>
+        </w:rPr>
+        <w:t>neighbours = np.argpartition(-sims, k - 1, axis=1)[:, :k]</w:t>
+      </w:r>
+    </w:p>
+    <w:p>
+      <w:pPr>
+        <w:spacing w:after="160" w:line="360" w:lineRule="auto"/>
+        <w:jc w:val="both"/>
+      </w:pPr>
+      <w:r>
+        <w:t>The excerpt below is the rule that decides whether a follow-up refers to earlier results. Deterministic evidence is checked first, and the model's flag is only a last resort.</w:t>
+      </w:r>
+    </w:p>
+    <w:p>
+      <w:pPr>
+        <w:shd w:val="clear" w:color="auto" w:fill="F2F2F2"/>
+      </w:pPr>
+      <w:r>
+        <w:rPr>
+          <w:rFonts w:ascii="Courier New" w:eastAsia="Courier New" w:hAnsi="Courier New" w:cs="Courier New"/>
+          <w:sz w:val="18"/>
+          <w:szCs w:val="18"/>
+        </w:rPr>
+        <w:t>def _open(query, referenced, weak_referenced=None):</w:t>
+      </w:r>
+    </w:p>
+    <w:p>
+      <w:pPr>
+        <w:shd w:val="clear" w:color="auto" w:fill="F2F2F2"/>
+      </w:pPr>
+      <w:r>
+        <w:rPr>
+          <w:rFonts w:ascii="Courier New" w:eastAsia="Courier New" w:hAnsi="Courier New" w:cs="Courier New"/>
+          <w:sz w:val="18"/>
+          <w:szCs w:val="18"/>
+        </w:rPr>
+        <w:t xml:space="preserve">    if referenced:                       # rule-based: ordinal or bare "it"</w:t>
+      </w:r>
+    </w:p>
+    <w:p>
+      <w:pPr>
+        <w:shd w:val="clear" w:color="auto" w:fill="F2F2F2"/>
+      </w:pPr>
+      <w:r>
+        <w:rPr>
+          <w:rFonts w:ascii="Courier New" w:eastAsia="Courier New" w:hAnsi="Courier New" w:cs="Courier New"/>
+          <w:sz w:val="18"/>
+          <w:szCs w:val="18"/>
+        </w:rPr>
+        <w:t xml:space="preserve">        return _open_response(search.hit_for_path(referenced))</w:t>
+      </w:r>
+    </w:p>
+    <w:p>
+      <w:pPr>
+        <w:shd w:val="clear" w:color="auto" w:fill="F2F2F2"/>
+      </w:pPr>
+      <w:r>
+        <w:rPr>
+          <w:rFonts w:ascii="Courier New" w:eastAsia="Courier New" w:hAnsi="Courier New" w:cs="Courier New"/>
+          <w:sz w:val="18"/>
+          <w:szCs w:val="18"/>
+        </w:rPr>
+        <w:t xml:space="preserve">    hits = search.semantic_search(query, top_k=3)</w:t>
+      </w:r>
+    </w:p>
+    <w:p>
+      <w:pPr>
+        <w:shd w:val="clear" w:color="auto" w:fill="F2F2F2"/>
+      </w:pPr>
+      <w:r>
+        <w:rPr>
+          <w:rFonts w:ascii="Courier New" w:eastAsia="Courier New" w:hAnsi="Courier New" w:cs="Courier New"/>
+          <w:sz w:val="18"/>
+          <w:szCs w:val="18"/>
+        </w:rPr>
+        <w:t xml:space="preserve">    best = hits[0] if hits else None</w:t>
+      </w:r>
+    </w:p>
+    <w:p>
+      <w:pPr>
+        <w:shd w:val="clear" w:color="auto" w:fill="F2F2F2"/>
+      </w:pPr>
+      <w:r>
+        <w:rPr>
+          <w:rFonts w:ascii="Courier New" w:eastAsia="Courier New" w:hAnsi="Courier New" w:cs="Courier New"/>
+          <w:sz w:val="18"/>
+          <w:szCs w:val="18"/>
+        </w:rPr>
+        <w:t xml:space="preserve">    if not best or best.similarity &lt; settings.search_similarity_threshold:</w:t>
+      </w:r>
+    </w:p>
+    <w:p>
+      <w:pPr>
+        <w:shd w:val="clear" w:color="auto" w:fill="F2F2F2"/>
+      </w:pPr>
+      <w:r>
+        <w:rPr>
+          <w:rFonts w:ascii="Courier New" w:eastAsia="Courier New" w:hAnsi="Courier New" w:cs="Courier New"/>
+          <w:sz w:val="18"/>
+          <w:szCs w:val="18"/>
+        </w:rPr>
+        <w:t xml:space="preserve">        if weak_referenced:              # model's guess, last resort only</w:t>
+      </w:r>
+    </w:p>
+    <w:p>
+      <w:pPr>
+        <w:shd w:val="clear" w:color="auto" w:fill="F2F2F2"/>
+      </w:pPr>
+      <w:r>
+        <w:rPr>
+          <w:rFonts w:ascii="Courier New" w:eastAsia="Courier New" w:hAnsi="Courier New" w:cs="Courier New"/>
+          <w:sz w:val="18"/>
+          <w:szCs w:val="18"/>
+        </w:rPr>
+        <w:t xml:space="preserve">            return _open_response(search.hit_for_path(weak_referenced))</w:t>
+      </w:r>
+    </w:p>
+    <w:p>
+      <w:pPr>
+        <w:pStyle w:val="Heading2"/>
+        <w:spacing w:before="200" w:after="120"/>
+      </w:pPr>
+      <w:bookmarkStart w:id="39" w:name="_Toc242518516"/>
+      <w:r>
+        <w:lastRenderedPageBreak/>
+        <w:t>5.4 Screenshots of Outputs</w:t>
+      </w:r>
+      <w:bookmarkEnd w:id="39"/>
     </w:p>
     <w:p>
       <w:pPr>
@@ -13949,10 +13976,10 @@
           <w:noProof/>
         </w:rPr>
         <w:drawing>
-          <wp:inline distT="0" distB="0" distL="0" distR="0" wp14:anchorId="1E93D8B1" wp14:editId="28ECB5E6">
+          <wp:inline distT="0" distB="0" distL="0" distR="0" wp14:anchorId="28B49D61" wp14:editId="34065E97">
             <wp:extent cx="4095750" cy="3200400"/>
             <wp:effectExtent l="0" t="0" r="0" b="0"/>
-            <wp:docPr id="597684364" name="ui-workspaces.png" descr="Figure 5.2 - Workspace view with a created workspace and suggestions" title="Figure 5.2 - Workspace view with a created workspace and suggestions"/>
+            <wp:docPr id="1000757866" name="ui-knowledge-graph.png" descr="Figure 5.1 - Knowledge-graph view with a selected file and its neighbours" title="Figure 5.1 - Knowledge-graph view with a selected file and its neighbours"/>
             <wp:cNvGraphicFramePr>
               <a:graphicFrameLocks xmlns:a="http://schemas.openxmlformats.org/drawingml/2006/main" noChangeAspect="1"/>
             </wp:cNvGraphicFramePr>
@@ -14000,6 +14027,71 @@
           <w:sz w:val="22"/>
           <w:szCs w:val="22"/>
         </w:rPr>
+        <w:t>Figure 5.1 - Knowledge-graph view with a selected file and its neighbours</w:t>
+      </w:r>
+    </w:p>
+    <w:p>
+      <w:pPr>
+        <w:keepNext/>
+        <w:spacing w:before="160" w:after="60"/>
+        <w:jc w:val="center"/>
+      </w:pPr>
+      <w:r>
+        <w:rPr>
+          <w:noProof/>
+        </w:rPr>
+        <w:drawing>
+          <wp:inline distT="0" distB="0" distL="0" distR="0" wp14:anchorId="7367A437" wp14:editId="6A13B841">
+            <wp:extent cx="4095750" cy="3200400"/>
+            <wp:effectExtent l="0" t="0" r="0" b="0"/>
+            <wp:docPr id="1972230735" name="ui-workspaces.png" descr="Figure 5.2 - Workspace view with a created workspace and suggestions" title="Figure 5.2 - Workspace view with a created workspace and suggestions"/>
+            <wp:cNvGraphicFramePr>
+              <a:graphicFrameLocks xmlns:a="http://schemas.openxmlformats.org/drawingml/2006/main" noChangeAspect="1"/>
+            </wp:cNvGraphicFramePr>
+            <a:graphic xmlns:a="http://schemas.openxmlformats.org/drawingml/2006/main">
+              <a:graphicData uri="http://schemas.openxmlformats.org/drawingml/2006/picture">
+                <pic:pic xmlns:pic="http://schemas.openxmlformats.org/drawingml/2006/picture">
+                  <pic:nvPicPr>
+                    <pic:cNvPr id="0" name=""/>
+                    <pic:cNvPicPr>
+                      <a:picLocks noChangeAspect="1" noChangeArrowheads="1"/>
+                    </pic:cNvPicPr>
+                  </pic:nvPicPr>
+                  <pic:blipFill>
+                    <a:blip r:embed="rId20"/>
+                    <a:srcRect/>
+                    <a:stretch>
+                      <a:fillRect/>
+                    </a:stretch>
+                  </pic:blipFill>
+                  <pic:spPr bwMode="auto">
+                    <a:xfrm>
+                      <a:off x="0" y="0"/>
+                      <a:ext cx="4095750" cy="3200400"/>
+                    </a:xfrm>
+                    <a:prstGeom prst="rect">
+                      <a:avLst/>
+                    </a:prstGeom>
+                  </pic:spPr>
+                </pic:pic>
+              </a:graphicData>
+            </a:graphic>
+          </wp:inline>
+        </w:drawing>
+      </w:r>
+    </w:p>
+    <w:p>
+      <w:pPr>
+        <w:spacing w:before="60" w:after="240"/>
+        <w:jc w:val="center"/>
+      </w:pPr>
+      <w:r>
+        <w:rPr>
+          <w:i/>
+          <w:iCs/>
+          <w:sz w:val="22"/>
+          <w:szCs w:val="22"/>
+        </w:rPr>
         <w:t>Figure 5.2 - Workspace view with a created workspace and suggestions</w:t>
       </w:r>
     </w:p>
@@ -14013,7 +14105,7 @@
         <w:pStyle w:val="Heading1"/>
         <w:spacing w:before="240" w:after="200"/>
       </w:pPr>
-      <w:bookmarkStart w:id="40" w:name="_Toc242209430"/>
+      <w:bookmarkStart w:id="40" w:name="_Toc242518517"/>
       <w:r>
         <w:lastRenderedPageBreak/>
         <w:t>Chapter 6: Testing and Validation</w:t>
@@ -14025,7 +14117,7 @@
         <w:pStyle w:val="Heading2"/>
         <w:spacing w:before="200" w:after="120"/>
       </w:pPr>
-      <w:bookmarkStart w:id="41" w:name="_Toc242209431"/>
+      <w:bookmarkStart w:id="41" w:name="_Toc242518518"/>
       <w:r>
         <w:t>6.1 Testing Types</w:t>
       </w:r>
@@ -14674,7 +14766,7 @@
         <w:pStyle w:val="Heading2"/>
         <w:spacing w:before="200" w:after="120"/>
       </w:pPr>
-      <w:bookmarkStart w:id="42" w:name="_Toc242209432"/>
+      <w:bookmarkStart w:id="42" w:name="_Toc242518519"/>
       <w:r>
         <w:t>6.2 Test Cases and Results</w:t>
       </w:r>
@@ -15828,7 +15920,7 @@
         <w:pStyle w:val="Heading1"/>
         <w:spacing w:before="240" w:after="200"/>
       </w:pPr>
-      <w:bookmarkStart w:id="43" w:name="_Toc242209433"/>
+      <w:bookmarkStart w:id="43" w:name="_Toc242518520"/>
       <w:r>
         <w:lastRenderedPageBreak/>
         <w:t>Chapter 7: Results and Discussion</w:t>
@@ -15840,7 +15932,7 @@
         <w:pStyle w:val="Heading2"/>
         <w:spacing w:before="200" w:after="120"/>
       </w:pPr>
-      <w:bookmarkStart w:id="44" w:name="_Toc242209434"/>
+      <w:bookmarkStart w:id="44" w:name="_Toc242518521"/>
       <w:r>
         <w:t>7.1 Performance Evaluation</w:t>
       </w:r>
@@ -17261,7 +17353,7 @@
         <w:pStyle w:val="Heading2"/>
         <w:spacing w:before="200" w:after="120"/>
       </w:pPr>
-      <w:bookmarkStart w:id="45" w:name="_Toc242209435"/>
+      <w:bookmarkStart w:id="45" w:name="_Toc242518522"/>
       <w:r>
         <w:lastRenderedPageBreak/>
         <w:t>7.2 Comparison with Existing Systems</w:t>
@@ -18104,7 +18196,7 @@
         <w:pStyle w:val="Heading2"/>
         <w:spacing w:before="200" w:after="120"/>
       </w:pPr>
-      <w:bookmarkStart w:id="46" w:name="_Toc242209436"/>
+      <w:bookmarkStart w:id="46" w:name="_Toc242518523"/>
       <w:r>
         <w:t>7.3 Observations</w:t>
       </w:r>
@@ -18967,7 +19059,7 @@
         <w:pStyle w:val="Heading1"/>
         <w:spacing w:before="240" w:after="200"/>
       </w:pPr>
-      <w:bookmarkStart w:id="47" w:name="_Toc242209437"/>
+      <w:bookmarkStart w:id="47" w:name="_Toc242518524"/>
       <w:r>
         <w:lastRenderedPageBreak/>
         <w:t>Chapter 8: Conclusion and Future Scope</w:t>
@@ -18979,7 +19071,7 @@
         <w:pStyle w:val="Heading2"/>
         <w:spacing w:before="200" w:after="120"/>
       </w:pPr>
-      <w:bookmarkStart w:id="48" w:name="_Toc242209438"/>
+      <w:bookmarkStart w:id="48" w:name="_Toc242518525"/>
       <w:r>
         <w:t>8.1 Summary of Work</w:t>
       </w:r>
@@ -19002,7 +19094,7 @@
         <w:pStyle w:val="Heading2"/>
         <w:spacing w:before="200" w:after="120"/>
       </w:pPr>
-      <w:bookmarkStart w:id="49" w:name="_Toc242209439"/>
+      <w:bookmarkStart w:id="49" w:name="_Toc242518526"/>
       <w:r>
         <w:t>8.2 Limitations</w:t>
       </w:r>
@@ -19091,7 +19183,7 @@
         <w:pStyle w:val="Heading2"/>
         <w:spacing w:before="200" w:after="120"/>
       </w:pPr>
-      <w:bookmarkStart w:id="50" w:name="_Toc242209440"/>
+      <w:bookmarkStart w:id="50" w:name="_Toc242518527"/>
       <w:r>
         <w:t>8.3 Future Enhancement</w:t>
       </w:r>
@@ -19173,7 +19265,7 @@
         <w:pStyle w:val="Heading1"/>
         <w:spacing w:before="240" w:after="200"/>
       </w:pPr>
-      <w:bookmarkStart w:id="51" w:name="_Toc242209441"/>
+      <w:bookmarkStart w:id="51" w:name="_Toc242518528"/>
       <w:r>
         <w:lastRenderedPageBreak/>
         <w:t>References</w:t>
@@ -19254,7 +19346,7 @@
         <w:pStyle w:val="Heading1"/>
         <w:spacing w:before="240" w:after="200"/>
       </w:pPr>
-      <w:bookmarkStart w:id="52" w:name="_Toc242209442"/>
+      <w:bookmarkStart w:id="52" w:name="_Toc242518529"/>
       <w:r>
         <w:lastRenderedPageBreak/>
         <w:t>Appendices</w:t>
@@ -19266,7 +19358,7 @@
         <w:pStyle w:val="Heading2"/>
         <w:spacing w:before="200" w:after="120"/>
       </w:pPr>
-      <w:bookmarkStart w:id="53" w:name="_Toc242209443"/>
+      <w:bookmarkStart w:id="53" w:name="_Toc242518530"/>
       <w:r>
         <w:t>Appendix A: Source code</w:t>
       </w:r>
@@ -19286,7 +19378,7 @@
         <w:pStyle w:val="Heading2"/>
         <w:spacing w:before="200" w:after="120"/>
       </w:pPr>
-      <w:bookmarkStart w:id="54" w:name="_Toc242209444"/>
+      <w:bookmarkStart w:id="54" w:name="_Toc242518531"/>
       <w:r>
         <w:t>Appendix B: Scale benchmark raw results</w:t>
       </w:r>
@@ -20119,7 +20211,7 @@
         <w:pStyle w:val="Heading2"/>
         <w:spacing w:before="200" w:after="120"/>
       </w:pPr>
-      <w:bookmarkStart w:id="55" w:name="_Toc242209445"/>
+      <w:bookmarkStart w:id="55" w:name="_Toc242518532"/>
       <w:r>
         <w:t>Appendix C: Papers and certificates</w:t>
       </w:r>
@@ -20135,8 +20227,8 @@
       </w:r>
     </w:p>
     <w:sectPr>
-      <w:headerReference w:type="default" r:id="rId20"/>
-      <w:footerReference w:type="default" r:id="rId21"/>
+      <w:headerReference w:type="default" r:id="rId21"/>
+      <w:footerReference w:type="default" r:id="rId22"/>
       <w:pgSz w:w="11906" w:h="16838"/>
       <w:pgMar w:top="1440" w:right="1440" w:bottom="1440" w:left="1440" w:header="708" w:footer="708" w:gutter="0"/>
       <w:pgNumType w:start="1"/>
@@ -20311,10 +20403,64 @@
 <file path=word/numbering.xml><?xml version="1.0" encoding="utf-8"?>
 <w:numbering xmlns:wpc="http://schemas.microsoft.com/office/word/2010/wordprocessingCanvas" xmlns:cx="http://schemas.microsoft.com/office/drawing/2014/chartex" xmlns:cx1="http://schemas.microsoft.com/office/drawing/2015/9/8/chartex" xmlns:cx2="http://schemas.microsoft.com/office/drawing/2015/10/21/chartex" xmlns:cx3="http://schemas.microsoft.com/office/drawing/2016/5/9/chartex" xmlns:cx4="http://schemas.microsoft.com/office/drawing/2016/5/10/chartex" xmlns:cx5="http://schemas.microsoft.com/office/drawing/2016/5/11/chartex" xmlns:cx6="http://schemas.microsoft.com/office/drawing/2016/5/12/chartex" xmlns:cx7="http://schemas.microsoft.com/office/drawing/2016/5/13/chartex" xmlns:cx8="http://schemas.microsoft.com/office/drawing/2016/5/14/chartex" xmlns:mc="http://schemas.openxmlformats.org/markup-compatibility/2006" xmlns:aink="http://schemas.microsoft.com/office/drawing/2016/ink" xmlns:am3d="http://schemas.microsoft.com/office/drawing/2017/model3d" xmlns:o="urn:schemas-microsoft-com:office:office" xmlns:oel="http://schemas.microsoft.com/office/2019/extlst" xmlns:r="http://schemas.openxmlformats.org/officeDocument/2006/relationships" xmlns:m="http://schemas.openxmlformats.org/officeDocument/2006/math" xmlns:v="urn:schemas-microsoft-com:vml" xmlns:wp14="http://schemas.microsoft.com/office/word/2010/wordprocessingDrawing" xmlns:wp="http://schemas.openxmlformats.org/drawingml/2006/wordprocessingDrawing" xmlns:w10="urn:schemas-microsoft-com:office:word" xmlns:w="http://schemas.openxmlformats.org/wordprocessingml/2006/main" xmlns:w14="http://schemas.microsoft.com/office/word/2010/wordml" xmlns:w15="http://schemas.microsoft.com/office/word/2012/wordml" xmlns:w16cex="http://schemas.microsoft.com/office/word/2018/wordml/cex" xmlns:w16cid="http://schemas.microsoft.com/office/word/2016/wordml/cid" xmlns:w16="http://schemas.microsoft.com/office/word/2018/wordml" xmlns:w16du="http://schemas.microsoft.com/office/word/2023/wordml/word16du" xmlns:w16sdtdh="http://schemas.microsoft.com/office/word/2020/wordml/sdtdatahash" xmlns:w16sdtfl="http://schemas.microsoft.com/office/word/2024/wordml/sdtformatlock" xmlns:w16se="http://schemas.microsoft.com/office/word/2015/wordml/symex" xmlns:wpg="http://schemas.microsoft.com/office/word/2010/wordprocessingGroup" xmlns:wpi="http://schemas.microsoft.com/office/word/2010/wordprocessingInk" xmlns:wne="http://schemas.microsoft.com/office/word/2006/wordml" xmlns:wps="http://schemas.microsoft.com/office/word/2010/wordprocessingShape" mc:Ignorable="w14 w15 w16se w16cid w16 w16cex w16sdtdh w16sdtfl w16du wp14">
   <w:abstractNum w:abstractNumId="0" w15:restartNumberingAfterBreak="0">
-    <w:nsid w:val="6EEE02A0"/>
+    <w:nsid w:val="032C66CD"/>
     <w:multiLevelType w:val="hybridMultilevel"/>
-    <w:tmpl w:val="02E6AB28"/>
-    <w:lvl w:ilvl="0" w:tplc="A8204250">
+    <w:tmpl w:val="42A8A560"/>
+    <w:lvl w:ilvl="0" w:tplc="D4264552">
+      <w:start w:val="1"/>
+      <w:numFmt w:val="bullet"/>
+      <w:lvlText w:val="•"/>
+      <w:lvlJc w:val="left"/>
+      <w:pPr>
+        <w:ind w:left="720" w:hanging="360"/>
+      </w:pPr>
+    </w:lvl>
+    <w:lvl w:ilvl="1" w:tplc="E7544986">
+      <w:numFmt w:val="decimal"/>
+      <w:lvlText w:val=""/>
+      <w:lvlJc w:val="left"/>
+    </w:lvl>
+    <w:lvl w:ilvl="2" w:tplc="0CA69D02">
+      <w:numFmt w:val="decimal"/>
+      <w:lvlText w:val=""/>
+      <w:lvlJc w:val="left"/>
+    </w:lvl>
+    <w:lvl w:ilvl="3" w:tplc="D2C8DBA8">
+      <w:numFmt w:val="decimal"/>
+      <w:lvlText w:val=""/>
+      <w:lvlJc w:val="left"/>
+    </w:lvl>
+    <w:lvl w:ilvl="4" w:tplc="4A3EB964">
+      <w:numFmt w:val="decimal"/>
+      <w:lvlText w:val=""/>
+      <w:lvlJc w:val="left"/>
+    </w:lvl>
+    <w:lvl w:ilvl="5" w:tplc="AB681F06">
+      <w:numFmt w:val="decimal"/>
+      <w:lvlText w:val=""/>
+      <w:lvlJc w:val="left"/>
+    </w:lvl>
+    <w:lvl w:ilvl="6" w:tplc="936AEACC">
+      <w:numFmt w:val="decimal"/>
+      <w:lvlText w:val=""/>
+      <w:lvlJc w:val="left"/>
+    </w:lvl>
+    <w:lvl w:ilvl="7" w:tplc="3E0A56B2">
+      <w:numFmt w:val="decimal"/>
+      <w:lvlText w:val=""/>
+      <w:lvlJc w:val="left"/>
+    </w:lvl>
+    <w:lvl w:ilvl="8" w:tplc="6F6CFFF2">
+      <w:numFmt w:val="decimal"/>
+      <w:lvlText w:val=""/>
+      <w:lvlJc w:val="left"/>
+    </w:lvl>
+  </w:abstractNum>
+  <w:abstractNum w:abstractNumId="1" w15:restartNumberingAfterBreak="0">
+    <w:nsid w:val="49823F6C"/>
+    <w:multiLevelType w:val="hybridMultilevel"/>
+    <w:tmpl w:val="994A53AA"/>
+    <w:lvl w:ilvl="0" w:tplc="384C153C">
       <w:start w:val="1"/>
       <w:numFmt w:val="bullet"/>
       <w:lvlText w:val="●"/>
@@ -20323,7 +20469,7 @@
         <w:ind w:left="720" w:hanging="360"/>
       </w:pPr>
     </w:lvl>
-    <w:lvl w:ilvl="1" w:tplc="532AD838">
+    <w:lvl w:ilvl="1" w:tplc="14323892">
       <w:start w:val="1"/>
       <w:numFmt w:val="bullet"/>
       <w:lvlText w:val="○"/>
@@ -20332,7 +20478,7 @@
         <w:ind w:left="1440" w:hanging="360"/>
       </w:pPr>
     </w:lvl>
-    <w:lvl w:ilvl="2" w:tplc="6C324838">
+    <w:lvl w:ilvl="2" w:tplc="9794B4AC">
       <w:start w:val="1"/>
       <w:numFmt w:val="bullet"/>
       <w:lvlText w:val="■"/>
@@ -20341,7 +20487,7 @@
         <w:ind w:left="2160" w:hanging="360"/>
       </w:pPr>
     </w:lvl>
-    <w:lvl w:ilvl="3" w:tplc="11228228">
+    <w:lvl w:ilvl="3" w:tplc="C7129560">
       <w:start w:val="1"/>
       <w:numFmt w:val="bullet"/>
       <w:lvlText w:val="●"/>
@@ -20350,7 +20496,7 @@
         <w:ind w:left="2880" w:hanging="360"/>
       </w:pPr>
     </w:lvl>
-    <w:lvl w:ilvl="4" w:tplc="D7209818">
+    <w:lvl w:ilvl="4" w:tplc="EE583AB0">
       <w:start w:val="1"/>
       <w:numFmt w:val="bullet"/>
       <w:lvlText w:val="○"/>
@@ -20359,7 +20505,7 @@
         <w:ind w:left="3600" w:hanging="360"/>
       </w:pPr>
     </w:lvl>
-    <w:lvl w:ilvl="5" w:tplc="7BD4E6A2">
+    <w:lvl w:ilvl="5" w:tplc="E28CBF62">
       <w:start w:val="1"/>
       <w:numFmt w:val="bullet"/>
       <w:lvlText w:val="■"/>
@@ -20368,7 +20514,7 @@
         <w:ind w:left="4320" w:hanging="360"/>
       </w:pPr>
     </w:lvl>
-    <w:lvl w:ilvl="6" w:tplc="7F88E520">
+    <w:lvl w:ilvl="6" w:tplc="A9BC3C38">
       <w:start w:val="1"/>
       <w:numFmt w:val="bullet"/>
       <w:lvlText w:val="●"/>
@@ -20377,7 +20523,7 @@
         <w:ind w:left="5040" w:hanging="360"/>
       </w:pPr>
     </w:lvl>
-    <w:lvl w:ilvl="7" w:tplc="ADA405E6">
+    <w:lvl w:ilvl="7" w:tplc="BC98BBC4">
       <w:start w:val="1"/>
       <w:numFmt w:val="bullet"/>
       <w:lvlText w:val="●"/>
@@ -20386,7 +20532,7 @@
         <w:ind w:left="5760" w:hanging="360"/>
       </w:pPr>
     </w:lvl>
-    <w:lvl w:ilvl="8" w:tplc="B22CB67C">
+    <w:lvl w:ilvl="8" w:tplc="E34463C4">
       <w:start w:val="1"/>
       <w:numFmt w:val="bullet"/>
       <w:lvlText w:val="●"/>
@@ -20396,68 +20542,14 @@
       </w:pPr>
     </w:lvl>
   </w:abstractNum>
-  <w:abstractNum w:abstractNumId="1" w15:restartNumberingAfterBreak="0">
-    <w:nsid w:val="760206BE"/>
-    <w:multiLevelType w:val="hybridMultilevel"/>
-    <w:tmpl w:val="B4BE7264"/>
-    <w:lvl w:ilvl="0" w:tplc="EB5CA582">
-      <w:start w:val="1"/>
-      <w:numFmt w:val="bullet"/>
-      <w:lvlText w:val="•"/>
-      <w:lvlJc w:val="left"/>
-      <w:pPr>
-        <w:ind w:left="720" w:hanging="360"/>
-      </w:pPr>
-    </w:lvl>
-    <w:lvl w:ilvl="1" w:tplc="04EE84A6">
-      <w:numFmt w:val="decimal"/>
-      <w:lvlText w:val=""/>
-      <w:lvlJc w:val="left"/>
-    </w:lvl>
-    <w:lvl w:ilvl="2" w:tplc="69DA59E2">
-      <w:numFmt w:val="decimal"/>
-      <w:lvlText w:val=""/>
-      <w:lvlJc w:val="left"/>
-    </w:lvl>
-    <w:lvl w:ilvl="3" w:tplc="9648B206">
-      <w:numFmt w:val="decimal"/>
-      <w:lvlText w:val=""/>
-      <w:lvlJc w:val="left"/>
-    </w:lvl>
-    <w:lvl w:ilvl="4" w:tplc="3F84160A">
-      <w:numFmt w:val="decimal"/>
-      <w:lvlText w:val=""/>
-      <w:lvlJc w:val="left"/>
-    </w:lvl>
-    <w:lvl w:ilvl="5" w:tplc="CACA486C">
-      <w:numFmt w:val="decimal"/>
-      <w:lvlText w:val=""/>
-      <w:lvlJc w:val="left"/>
-    </w:lvl>
-    <w:lvl w:ilvl="6" w:tplc="AD8EB3D4">
-      <w:numFmt w:val="decimal"/>
-      <w:lvlText w:val=""/>
-      <w:lvlJc w:val="left"/>
-    </w:lvl>
-    <w:lvl w:ilvl="7" w:tplc="463AB62C">
-      <w:numFmt w:val="decimal"/>
-      <w:lvlText w:val=""/>
-      <w:lvlJc w:val="left"/>
-    </w:lvl>
-    <w:lvl w:ilvl="8" w:tplc="52027BCA">
-      <w:numFmt w:val="decimal"/>
-      <w:lvlText w:val=""/>
-      <w:lvlJc w:val="left"/>
-    </w:lvl>
-  </w:abstractNum>
-  <w:num w:numId="1" w16cid:durableId="1529877116">
-    <w:abstractNumId w:val="0"/>
+  <w:num w:numId="1" w16cid:durableId="989407155">
+    <w:abstractNumId w:val="1"/>
     <w:lvlOverride w:ilvl="0">
       <w:startOverride w:val="1"/>
     </w:lvlOverride>
   </w:num>
-  <w:num w:numId="2" w16cid:durableId="1307395690">
-    <w:abstractNumId w:val="1"/>
+  <w:num w:numId="2" w16cid:durableId="287853669">
+    <w:abstractNumId w:val="0"/>
     <w:lvlOverride w:ilvl="0">
       <w:startOverride w:val="1"/>
     </w:lvlOverride>
@@ -21072,7 +21164,7 @@
     <w:autoRedefine/>
     <w:uiPriority w:val="39"/>
     <w:unhideWhenUsed/>
-    <w:rsid w:val="00753140"/>
+    <w:rsid w:val="004D4C9D"/>
     <w:pPr>
       <w:spacing w:after="100"/>
     </w:pPr>
@@ -21084,7 +21176,7 @@
     <w:autoRedefine/>
     <w:uiPriority w:val="39"/>
     <w:unhideWhenUsed/>
-    <w:rsid w:val="00753140"/>
+    <w:rsid w:val="004D4C9D"/>
     <w:pPr>
       <w:spacing w:after="100"/>
       <w:ind w:left="240"/>
@@ -21097,7 +21189,7 @@
     <w:autoRedefine/>
     <w:uiPriority w:val="39"/>
     <w:unhideWhenUsed/>
-    <w:rsid w:val="00753140"/>
+    <w:rsid w:val="004D4C9D"/>
     <w:pPr>
       <w:spacing w:after="100"/>
       <w:ind w:left="480"/>

</xml_diff>

<commit_message>
Final polish: 3.2 s graph rebuild at 5,000 files, prune deleted files, Ollama model preflight, graph label overlap fix; refresh paper and report
</commit_message>
<xml_diff>
--- a/docs/blackbook/DreamOS-Final-Year-Project-Report.docx
+++ b/docs/blackbook/DreamOS-Final-Year-Project-Report.docx
@@ -17,7 +17,7 @@
           <w:left w:w="10" w:type="dxa"/>
           <w:right w:w="10" w:type="dxa"/>
         </w:tblCellMar>
-        <w:tblLook w:val="04A0" w:firstRow="1" w:lastRow="0" w:firstColumn="1" w:lastColumn="0" w:noHBand="0" w:noVBand="1"/>
+        <w:tblLook w:val="0000" w:firstRow="0" w:lastRow="0" w:firstColumn="0" w:lastColumn="0" w:noHBand="0" w:noVBand="0"/>
       </w:tblPr>
       <w:tblGrid>
         <w:gridCol w:w="1500"/>
@@ -53,7 +53,7 @@
                 <w:noProof/>
               </w:rPr>
               <w:drawing>
-                <wp:inline distT="0" distB="0" distL="0" distR="0" wp14:anchorId="70839D10" wp14:editId="042D5B04">
+                <wp:inline distT="0" distB="0" distL="0" distR="0" wp14:anchorId="5061FD6A" wp14:editId="5A439A08">
                   <wp:extent cx="2476500" cy="1419225"/>
                   <wp:effectExtent l="0" t="0" r="0" b="0"/>
                   <wp:docPr id="1" name="mgm-logo.png" descr="MGM University logo" title="MGM University logo"/>
@@ -666,10 +666,10 @@
         </w:rPr>
         <w:lastRenderedPageBreak/>
         <w:drawing>
-          <wp:inline distT="0" distB="0" distL="0" distR="0" wp14:anchorId="5B094C31" wp14:editId="0EBCE64B">
+          <wp:inline distT="0" distB="0" distL="0" distR="0" wp14:anchorId="6E790C88" wp14:editId="34E29F43">
             <wp:extent cx="1428750" cy="819150"/>
             <wp:effectExtent l="0" t="0" r="0" b="0"/>
-            <wp:docPr id="88343567" name="mgm-logo.png" descr="MGM University logo" title="MGM University logo"/>
+            <wp:docPr id="1458223873" name="mgm-logo.png" descr="MGM University logo" title="MGM University logo"/>
             <wp:cNvGraphicFramePr>
               <a:graphicFrameLocks xmlns:a="http://schemas.openxmlformats.org/drawingml/2006/main" noChangeAspect="1"/>
             </wp:cNvGraphicFramePr>
@@ -770,7 +770,7 @@
           <w:left w:w="10" w:type="dxa"/>
           <w:right w:w="10" w:type="dxa"/>
         </w:tblCellMar>
-        <w:tblLook w:val="04A0" w:firstRow="1" w:lastRow="0" w:firstColumn="1" w:lastColumn="0" w:noHBand="0" w:noVBand="1"/>
+        <w:tblLook w:val="0000" w:firstRow="0" w:lastRow="0" w:firstColumn="0" w:lastColumn="0" w:noHBand="0" w:noVBand="0"/>
       </w:tblPr>
       <w:tblGrid>
         <w:gridCol w:w="4513"/>
@@ -876,7 +876,7 @@
         <w:spacing w:before="240" w:after="280"/>
         <w:jc w:val="center"/>
       </w:pPr>
-      <w:bookmarkStart w:id="0" w:name="_Toc242618159"/>
+      <w:bookmarkStart w:id="0" w:name="_Toc242795795"/>
       <w:r>
         <w:lastRenderedPageBreak/>
         <w:t>ACKNOWLEDGEMENT</w:t>
@@ -943,7 +943,7 @@
           <w:left w:w="10" w:type="dxa"/>
           <w:right w:w="10" w:type="dxa"/>
         </w:tblCellMar>
-        <w:tblLook w:val="04A0" w:firstRow="1" w:lastRow="0" w:firstColumn="1" w:lastColumn="0" w:noHBand="0" w:noVBand="1"/>
+        <w:tblLook w:val="0000" w:firstRow="0" w:lastRow="0" w:firstColumn="0" w:lastColumn="0" w:noHBand="0" w:noVBand="0"/>
       </w:tblPr>
       <w:tblGrid>
         <w:gridCol w:w="3008"/>
@@ -1127,7 +1127,7 @@
     <w:sdt>
       <w:sdtPr>
         <w:alias w:val="Contents"/>
-        <w:id w:val="1571078224"/>
+        <w:id w:val="1352067861"/>
       </w:sdtPr>
       <w:sdtEndPr/>
       <w:sdtContent>
@@ -1153,7 +1153,7 @@
           <w:r>
             <w:fldChar w:fldCharType="separate"/>
           </w:r>
-          <w:hyperlink w:anchor="_Toc242618159" w:history="1">
+          <w:hyperlink w:anchor="_Toc242795795" w:history="1">
             <w:r>
               <w:rPr>
                 <w:rStyle w:val="Hyperlink"/>
@@ -1177,7 +1177,7 @@
               <w:rPr>
                 <w:noProof/>
               </w:rPr>
-              <w:instrText xml:space="preserve"> PAGEREF _Toc242618159 \h </w:instrText>
+              <w:instrText xml:space="preserve"> PAGEREF _Toc242795795 \h </w:instrText>
             </w:r>
             <w:r>
               <w:rPr>
@@ -1217,7 +1217,7 @@
               <w14:ligatures w14:val="standardContextual"/>
             </w:rPr>
           </w:pPr>
-          <w:hyperlink w:anchor="_Toc242618160" w:history="1">
+          <w:hyperlink w:anchor="_Toc242795796" w:history="1">
             <w:r>
               <w:rPr>
                 <w:rStyle w:val="Hyperlink"/>
@@ -1241,7 +1241,7 @@
               <w:rPr>
                 <w:noProof/>
               </w:rPr>
-              <w:instrText xml:space="preserve"> PAGEREF _Toc242618160 \h </w:instrText>
+              <w:instrText xml:space="preserve"> PAGEREF _Toc242795796 \h </w:instrText>
             </w:r>
             <w:r>
               <w:rPr>
@@ -1281,7 +1281,7 @@
               <w14:ligatures w14:val="standardContextual"/>
             </w:rPr>
           </w:pPr>
-          <w:hyperlink w:anchor="_Toc242618161" w:history="1">
+          <w:hyperlink w:anchor="_Toc242795797" w:history="1">
             <w:r>
               <w:rPr>
                 <w:rStyle w:val="Hyperlink"/>
@@ -1305,7 +1305,7 @@
               <w:rPr>
                 <w:noProof/>
               </w:rPr>
-              <w:instrText xml:space="preserve"> PAGEREF _Toc242618161 \h </w:instrText>
+              <w:instrText xml:space="preserve"> PAGEREF _Toc242795797 \h </w:instrText>
             </w:r>
             <w:r>
               <w:rPr>
@@ -1345,7 +1345,7 @@
               <w14:ligatures w14:val="standardContextual"/>
             </w:rPr>
           </w:pPr>
-          <w:hyperlink w:anchor="_Toc242618162" w:history="1">
+          <w:hyperlink w:anchor="_Toc242795798" w:history="1">
             <w:r>
               <w:rPr>
                 <w:rStyle w:val="Hyperlink"/>
@@ -1369,7 +1369,7 @@
               <w:rPr>
                 <w:noProof/>
               </w:rPr>
-              <w:instrText xml:space="preserve"> PAGEREF _Toc242618162 \h </w:instrText>
+              <w:instrText xml:space="preserve"> PAGEREF _Toc242795798 \h </w:instrText>
             </w:r>
             <w:r>
               <w:rPr>
@@ -1409,7 +1409,7 @@
               <w14:ligatures w14:val="standardContextual"/>
             </w:rPr>
           </w:pPr>
-          <w:hyperlink w:anchor="_Toc242618163" w:history="1">
+          <w:hyperlink w:anchor="_Toc242795799" w:history="1">
             <w:r>
               <w:rPr>
                 <w:rStyle w:val="Hyperlink"/>
@@ -1433,7 +1433,7 @@
               <w:rPr>
                 <w:noProof/>
               </w:rPr>
-              <w:instrText xml:space="preserve"> PAGEREF _Toc242618163 \h </w:instrText>
+              <w:instrText xml:space="preserve"> PAGEREF _Toc242795799 \h </w:instrText>
             </w:r>
             <w:r>
               <w:rPr>
@@ -1473,7 +1473,7 @@
               <w14:ligatures w14:val="standardContextual"/>
             </w:rPr>
           </w:pPr>
-          <w:hyperlink w:anchor="_Toc242618164" w:history="1">
+          <w:hyperlink w:anchor="_Toc242795800" w:history="1">
             <w:r>
               <w:rPr>
                 <w:rStyle w:val="Hyperlink"/>
@@ -1497,7 +1497,7 @@
               <w:rPr>
                 <w:noProof/>
               </w:rPr>
-              <w:instrText xml:space="preserve"> PAGEREF _Toc242618164 \h </w:instrText>
+              <w:instrText xml:space="preserve"> PAGEREF _Toc242795800 \h </w:instrText>
             </w:r>
             <w:r>
               <w:rPr>
@@ -1537,7 +1537,7 @@
               <w14:ligatures w14:val="standardContextual"/>
             </w:rPr>
           </w:pPr>
-          <w:hyperlink w:anchor="_Toc242618165" w:history="1">
+          <w:hyperlink w:anchor="_Toc242795801" w:history="1">
             <w:r>
               <w:rPr>
                 <w:rStyle w:val="Hyperlink"/>
@@ -1561,7 +1561,7 @@
               <w:rPr>
                 <w:noProof/>
               </w:rPr>
-              <w:instrText xml:space="preserve"> PAGEREF _Toc242618165 \h </w:instrText>
+              <w:instrText xml:space="preserve"> PAGEREF _Toc242795801 \h </w:instrText>
             </w:r>
             <w:r>
               <w:rPr>
@@ -1601,7 +1601,7 @@
               <w14:ligatures w14:val="standardContextual"/>
             </w:rPr>
           </w:pPr>
-          <w:hyperlink w:anchor="_Toc242618166" w:history="1">
+          <w:hyperlink w:anchor="_Toc242795802" w:history="1">
             <w:r>
               <w:rPr>
                 <w:rStyle w:val="Hyperlink"/>
@@ -1625,7 +1625,7 @@
               <w:rPr>
                 <w:noProof/>
               </w:rPr>
-              <w:instrText xml:space="preserve"> PAGEREF _Toc242618166 \h </w:instrText>
+              <w:instrText xml:space="preserve"> PAGEREF _Toc242795802 \h </w:instrText>
             </w:r>
             <w:r>
               <w:rPr>
@@ -1665,7 +1665,7 @@
               <w14:ligatures w14:val="standardContextual"/>
             </w:rPr>
           </w:pPr>
-          <w:hyperlink w:anchor="_Toc242618167" w:history="1">
+          <w:hyperlink w:anchor="_Toc242795803" w:history="1">
             <w:r>
               <w:rPr>
                 <w:rStyle w:val="Hyperlink"/>
@@ -1689,7 +1689,7 @@
               <w:rPr>
                 <w:noProof/>
               </w:rPr>
-              <w:instrText xml:space="preserve"> PAGEREF _Toc242618167 \h </w:instrText>
+              <w:instrText xml:space="preserve"> PAGEREF _Toc242795803 \h </w:instrText>
             </w:r>
             <w:r>
               <w:rPr>
@@ -1729,7 +1729,7 @@
               <w14:ligatures w14:val="standardContextual"/>
             </w:rPr>
           </w:pPr>
-          <w:hyperlink w:anchor="_Toc242618168" w:history="1">
+          <w:hyperlink w:anchor="_Toc242795804" w:history="1">
             <w:r>
               <w:rPr>
                 <w:rStyle w:val="Hyperlink"/>
@@ -1753,7 +1753,7 @@
               <w:rPr>
                 <w:noProof/>
               </w:rPr>
-              <w:instrText xml:space="preserve"> PAGEREF _Toc242618168 \h </w:instrText>
+              <w:instrText xml:space="preserve"> PAGEREF _Toc242795804 \h </w:instrText>
             </w:r>
             <w:r>
               <w:rPr>
@@ -1793,7 +1793,7 @@
               <w14:ligatures w14:val="standardContextual"/>
             </w:rPr>
           </w:pPr>
-          <w:hyperlink w:anchor="_Toc242618169" w:history="1">
+          <w:hyperlink w:anchor="_Toc242795805" w:history="1">
             <w:r>
               <w:rPr>
                 <w:rStyle w:val="Hyperlink"/>
@@ -1817,7 +1817,7 @@
               <w:rPr>
                 <w:noProof/>
               </w:rPr>
-              <w:instrText xml:space="preserve"> PAGEREF _Toc242618169 \h </w:instrText>
+              <w:instrText xml:space="preserve"> PAGEREF _Toc242795805 \h </w:instrText>
             </w:r>
             <w:r>
               <w:rPr>
@@ -1857,7 +1857,7 @@
               <w14:ligatures w14:val="standardContextual"/>
             </w:rPr>
           </w:pPr>
-          <w:hyperlink w:anchor="_Toc242618170" w:history="1">
+          <w:hyperlink w:anchor="_Toc242795806" w:history="1">
             <w:r>
               <w:rPr>
                 <w:rStyle w:val="Hyperlink"/>
@@ -1881,7 +1881,7 @@
               <w:rPr>
                 <w:noProof/>
               </w:rPr>
-              <w:instrText xml:space="preserve"> PAGEREF _Toc242618170 \h </w:instrText>
+              <w:instrText xml:space="preserve"> PAGEREF _Toc242795806 \h </w:instrText>
             </w:r>
             <w:r>
               <w:rPr>
@@ -1921,7 +1921,7 @@
               <w14:ligatures w14:val="standardContextual"/>
             </w:rPr>
           </w:pPr>
-          <w:hyperlink w:anchor="_Toc242618171" w:history="1">
+          <w:hyperlink w:anchor="_Toc242795807" w:history="1">
             <w:r>
               <w:rPr>
                 <w:rStyle w:val="Hyperlink"/>
@@ -1945,7 +1945,7 @@
               <w:rPr>
                 <w:noProof/>
               </w:rPr>
-              <w:instrText xml:space="preserve"> PAGEREF _Toc242618171 \h </w:instrText>
+              <w:instrText xml:space="preserve"> PAGEREF _Toc242795807 \h </w:instrText>
             </w:r>
             <w:r>
               <w:rPr>
@@ -1985,7 +1985,7 @@
               <w14:ligatures w14:val="standardContextual"/>
             </w:rPr>
           </w:pPr>
-          <w:hyperlink w:anchor="_Toc242618172" w:history="1">
+          <w:hyperlink w:anchor="_Toc242795808" w:history="1">
             <w:r>
               <w:rPr>
                 <w:rStyle w:val="Hyperlink"/>
@@ -2009,7 +2009,7 @@
               <w:rPr>
                 <w:noProof/>
               </w:rPr>
-              <w:instrText xml:space="preserve"> PAGEREF _Toc242618172 \h </w:instrText>
+              <w:instrText xml:space="preserve"> PAGEREF _Toc242795808 \h </w:instrText>
             </w:r>
             <w:r>
               <w:rPr>
@@ -2049,7 +2049,7 @@
               <w14:ligatures w14:val="standardContextual"/>
             </w:rPr>
           </w:pPr>
-          <w:hyperlink w:anchor="_Toc242618173" w:history="1">
+          <w:hyperlink w:anchor="_Toc242795809" w:history="1">
             <w:r>
               <w:rPr>
                 <w:rStyle w:val="Hyperlink"/>
@@ -2073,7 +2073,7 @@
               <w:rPr>
                 <w:noProof/>
               </w:rPr>
-              <w:instrText xml:space="preserve"> PAGEREF _Toc242618173 \h </w:instrText>
+              <w:instrText xml:space="preserve"> PAGEREF _Toc242795809 \h </w:instrText>
             </w:r>
             <w:r>
               <w:rPr>
@@ -2113,7 +2113,7 @@
               <w14:ligatures w14:val="standardContextual"/>
             </w:rPr>
           </w:pPr>
-          <w:hyperlink w:anchor="_Toc242618174" w:history="1">
+          <w:hyperlink w:anchor="_Toc242795810" w:history="1">
             <w:r>
               <w:rPr>
                 <w:rStyle w:val="Hyperlink"/>
@@ -2137,7 +2137,7 @@
               <w:rPr>
                 <w:noProof/>
               </w:rPr>
-              <w:instrText xml:space="preserve"> PAGEREF _Toc242618174 \h </w:instrText>
+              <w:instrText xml:space="preserve"> PAGEREF _Toc242795810 \h </w:instrText>
             </w:r>
             <w:r>
               <w:rPr>
@@ -2177,7 +2177,7 @@
               <w14:ligatures w14:val="standardContextual"/>
             </w:rPr>
           </w:pPr>
-          <w:hyperlink w:anchor="_Toc242618175" w:history="1">
+          <w:hyperlink w:anchor="_Toc242795811" w:history="1">
             <w:r>
               <w:rPr>
                 <w:rStyle w:val="Hyperlink"/>
@@ -2201,7 +2201,7 @@
               <w:rPr>
                 <w:noProof/>
               </w:rPr>
-              <w:instrText xml:space="preserve"> PAGEREF _Toc242618175 \h </w:instrText>
+              <w:instrText xml:space="preserve"> PAGEREF _Toc242795811 \h </w:instrText>
             </w:r>
             <w:r>
               <w:rPr>
@@ -2241,7 +2241,7 @@
               <w14:ligatures w14:val="standardContextual"/>
             </w:rPr>
           </w:pPr>
-          <w:hyperlink w:anchor="_Toc242618176" w:history="1">
+          <w:hyperlink w:anchor="_Toc242795812" w:history="1">
             <w:r>
               <w:rPr>
                 <w:rStyle w:val="Hyperlink"/>
@@ -2265,7 +2265,7 @@
               <w:rPr>
                 <w:noProof/>
               </w:rPr>
-              <w:instrText xml:space="preserve"> PAGEREF _Toc242618176 \h </w:instrText>
+              <w:instrText xml:space="preserve"> PAGEREF _Toc242795812 \h </w:instrText>
             </w:r>
             <w:r>
               <w:rPr>
@@ -2305,7 +2305,7 @@
               <w14:ligatures w14:val="standardContextual"/>
             </w:rPr>
           </w:pPr>
-          <w:hyperlink w:anchor="_Toc242618177" w:history="1">
+          <w:hyperlink w:anchor="_Toc242795813" w:history="1">
             <w:r>
               <w:rPr>
                 <w:rStyle w:val="Hyperlink"/>
@@ -2329,7 +2329,7 @@
               <w:rPr>
                 <w:noProof/>
               </w:rPr>
-              <w:instrText xml:space="preserve"> PAGEREF _Toc242618177 \h </w:instrText>
+              <w:instrText xml:space="preserve"> PAGEREF _Toc242795813 \h </w:instrText>
             </w:r>
             <w:r>
               <w:rPr>
@@ -2369,7 +2369,7 @@
               <w14:ligatures w14:val="standardContextual"/>
             </w:rPr>
           </w:pPr>
-          <w:hyperlink w:anchor="_Toc242618178" w:history="1">
+          <w:hyperlink w:anchor="_Toc242795814" w:history="1">
             <w:r>
               <w:rPr>
                 <w:rStyle w:val="Hyperlink"/>
@@ -2393,7 +2393,7 @@
               <w:rPr>
                 <w:noProof/>
               </w:rPr>
-              <w:instrText xml:space="preserve"> PAGEREF _Toc242618178 \h </w:instrText>
+              <w:instrText xml:space="preserve"> PAGEREF _Toc242795814 \h </w:instrText>
             </w:r>
             <w:r>
               <w:rPr>
@@ -2433,7 +2433,7 @@
               <w14:ligatures w14:val="standardContextual"/>
             </w:rPr>
           </w:pPr>
-          <w:hyperlink w:anchor="_Toc242618179" w:history="1">
+          <w:hyperlink w:anchor="_Toc242795815" w:history="1">
             <w:r>
               <w:rPr>
                 <w:rStyle w:val="Hyperlink"/>
@@ -2457,7 +2457,7 @@
               <w:rPr>
                 <w:noProof/>
               </w:rPr>
-              <w:instrText xml:space="preserve"> PAGEREF _Toc242618179 \h </w:instrText>
+              <w:instrText xml:space="preserve"> PAGEREF _Toc242795815 \h </w:instrText>
             </w:r>
             <w:r>
               <w:rPr>
@@ -2497,7 +2497,7 @@
               <w14:ligatures w14:val="standardContextual"/>
             </w:rPr>
           </w:pPr>
-          <w:hyperlink w:anchor="_Toc242618180" w:history="1">
+          <w:hyperlink w:anchor="_Toc242795816" w:history="1">
             <w:r>
               <w:rPr>
                 <w:rStyle w:val="Hyperlink"/>
@@ -2521,7 +2521,7 @@
               <w:rPr>
                 <w:noProof/>
               </w:rPr>
-              <w:instrText xml:space="preserve"> PAGEREF _Toc242618180 \h </w:instrText>
+              <w:instrText xml:space="preserve"> PAGEREF _Toc242795816 \h </w:instrText>
             </w:r>
             <w:r>
               <w:rPr>
@@ -2561,7 +2561,7 @@
               <w14:ligatures w14:val="standardContextual"/>
             </w:rPr>
           </w:pPr>
-          <w:hyperlink w:anchor="_Toc242618181" w:history="1">
+          <w:hyperlink w:anchor="_Toc242795817" w:history="1">
             <w:r>
               <w:rPr>
                 <w:rStyle w:val="Hyperlink"/>
@@ -2585,7 +2585,7 @@
               <w:rPr>
                 <w:noProof/>
               </w:rPr>
-              <w:instrText xml:space="preserve"> PAGEREF _Toc242618181 \h </w:instrText>
+              <w:instrText xml:space="preserve"> PAGEREF _Toc242795817 \h </w:instrText>
             </w:r>
             <w:r>
               <w:rPr>
@@ -2625,7 +2625,7 @@
               <w14:ligatures w14:val="standardContextual"/>
             </w:rPr>
           </w:pPr>
-          <w:hyperlink w:anchor="_Toc242618182" w:history="1">
+          <w:hyperlink w:anchor="_Toc242795818" w:history="1">
             <w:r>
               <w:rPr>
                 <w:rStyle w:val="Hyperlink"/>
@@ -2649,7 +2649,7 @@
               <w:rPr>
                 <w:noProof/>
               </w:rPr>
-              <w:instrText xml:space="preserve"> PAGEREF _Toc242618182 \h </w:instrText>
+              <w:instrText xml:space="preserve"> PAGEREF _Toc242795818 \h </w:instrText>
             </w:r>
             <w:r>
               <w:rPr>
@@ -2689,7 +2689,7 @@
               <w14:ligatures w14:val="standardContextual"/>
             </w:rPr>
           </w:pPr>
-          <w:hyperlink w:anchor="_Toc242618183" w:history="1">
+          <w:hyperlink w:anchor="_Toc242795819" w:history="1">
             <w:r>
               <w:rPr>
                 <w:rStyle w:val="Hyperlink"/>
@@ -2713,7 +2713,7 @@
               <w:rPr>
                 <w:noProof/>
               </w:rPr>
-              <w:instrText xml:space="preserve"> PAGEREF _Toc242618183 \h </w:instrText>
+              <w:instrText xml:space="preserve"> PAGEREF _Toc242795819 \h </w:instrText>
             </w:r>
             <w:r>
               <w:rPr>
@@ -2753,7 +2753,7 @@
               <w14:ligatures w14:val="standardContextual"/>
             </w:rPr>
           </w:pPr>
-          <w:hyperlink w:anchor="_Toc242618184" w:history="1">
+          <w:hyperlink w:anchor="_Toc242795820" w:history="1">
             <w:r>
               <w:rPr>
                 <w:rStyle w:val="Hyperlink"/>
@@ -2777,7 +2777,7 @@
               <w:rPr>
                 <w:noProof/>
               </w:rPr>
-              <w:instrText xml:space="preserve"> PAGEREF _Toc242618184 \h </w:instrText>
+              <w:instrText xml:space="preserve"> PAGEREF _Toc242795820 \h </w:instrText>
             </w:r>
             <w:r>
               <w:rPr>
@@ -2817,7 +2817,7 @@
               <w14:ligatures w14:val="standardContextual"/>
             </w:rPr>
           </w:pPr>
-          <w:hyperlink w:anchor="_Toc242618185" w:history="1">
+          <w:hyperlink w:anchor="_Toc242795821" w:history="1">
             <w:r>
               <w:rPr>
                 <w:rStyle w:val="Hyperlink"/>
@@ -2841,7 +2841,7 @@
               <w:rPr>
                 <w:noProof/>
               </w:rPr>
-              <w:instrText xml:space="preserve"> PAGEREF _Toc242618185 \h </w:instrText>
+              <w:instrText xml:space="preserve"> PAGEREF _Toc242795821 \h </w:instrText>
             </w:r>
             <w:r>
               <w:rPr>
@@ -2881,7 +2881,7 @@
               <w14:ligatures w14:val="standardContextual"/>
             </w:rPr>
           </w:pPr>
-          <w:hyperlink w:anchor="_Toc242618186" w:history="1">
+          <w:hyperlink w:anchor="_Toc242795822" w:history="1">
             <w:r>
               <w:rPr>
                 <w:rStyle w:val="Hyperlink"/>
@@ -2905,7 +2905,7 @@
               <w:rPr>
                 <w:noProof/>
               </w:rPr>
-              <w:instrText xml:space="preserve"> PAGEREF _Toc242618186 \h </w:instrText>
+              <w:instrText xml:space="preserve"> PAGEREF _Toc242795822 \h </w:instrText>
             </w:r>
             <w:r>
               <w:rPr>
@@ -2945,7 +2945,7 @@
               <w14:ligatures w14:val="standardContextual"/>
             </w:rPr>
           </w:pPr>
-          <w:hyperlink w:anchor="_Toc242618187" w:history="1">
+          <w:hyperlink w:anchor="_Toc242795823" w:history="1">
             <w:r>
               <w:rPr>
                 <w:rStyle w:val="Hyperlink"/>
@@ -2969,7 +2969,7 @@
               <w:rPr>
                 <w:noProof/>
               </w:rPr>
-              <w:instrText xml:space="preserve"> PAGEREF _Toc242618187 \h </w:instrText>
+              <w:instrText xml:space="preserve"> PAGEREF _Toc242795823 \h </w:instrText>
             </w:r>
             <w:r>
               <w:rPr>
@@ -3009,7 +3009,7 @@
               <w14:ligatures w14:val="standardContextual"/>
             </w:rPr>
           </w:pPr>
-          <w:hyperlink w:anchor="_Toc242618188" w:history="1">
+          <w:hyperlink w:anchor="_Toc242795824" w:history="1">
             <w:r>
               <w:rPr>
                 <w:rStyle w:val="Hyperlink"/>
@@ -3033,7 +3033,7 @@
               <w:rPr>
                 <w:noProof/>
               </w:rPr>
-              <w:instrText xml:space="preserve"> PAGEREF _Toc242618188 \h </w:instrText>
+              <w:instrText xml:space="preserve"> PAGEREF _Toc242795824 \h </w:instrText>
             </w:r>
             <w:r>
               <w:rPr>
@@ -3073,7 +3073,7 @@
               <w14:ligatures w14:val="standardContextual"/>
             </w:rPr>
           </w:pPr>
-          <w:hyperlink w:anchor="_Toc242618189" w:history="1">
+          <w:hyperlink w:anchor="_Toc242795825" w:history="1">
             <w:r>
               <w:rPr>
                 <w:rStyle w:val="Hyperlink"/>
@@ -3097,7 +3097,7 @@
               <w:rPr>
                 <w:noProof/>
               </w:rPr>
-              <w:instrText xml:space="preserve"> PAGEREF _Toc242618189 \h </w:instrText>
+              <w:instrText xml:space="preserve"> PAGEREF _Toc242795825 \h </w:instrText>
             </w:r>
             <w:r>
               <w:rPr>
@@ -3137,7 +3137,7 @@
               <w14:ligatures w14:val="standardContextual"/>
             </w:rPr>
           </w:pPr>
-          <w:hyperlink w:anchor="_Toc242618190" w:history="1">
+          <w:hyperlink w:anchor="_Toc242795826" w:history="1">
             <w:r>
               <w:rPr>
                 <w:rStyle w:val="Hyperlink"/>
@@ -3161,7 +3161,7 @@
               <w:rPr>
                 <w:noProof/>
               </w:rPr>
-              <w:instrText xml:space="preserve"> PAGEREF _Toc242618190 \h </w:instrText>
+              <w:instrText xml:space="preserve"> PAGEREF _Toc242795826 \h </w:instrText>
             </w:r>
             <w:r>
               <w:rPr>
@@ -3201,7 +3201,7 @@
               <w14:ligatures w14:val="standardContextual"/>
             </w:rPr>
           </w:pPr>
-          <w:hyperlink w:anchor="_Toc242618191" w:history="1">
+          <w:hyperlink w:anchor="_Toc242795827" w:history="1">
             <w:r>
               <w:rPr>
                 <w:rStyle w:val="Hyperlink"/>
@@ -3225,7 +3225,7 @@
               <w:rPr>
                 <w:noProof/>
               </w:rPr>
-              <w:instrText xml:space="preserve"> PAGEREF _Toc242618191 \h </w:instrText>
+              <w:instrText xml:space="preserve"> PAGEREF _Toc242795827 \h </w:instrText>
             </w:r>
             <w:r>
               <w:rPr>
@@ -3265,7 +3265,7 @@
               <w14:ligatures w14:val="standardContextual"/>
             </w:rPr>
           </w:pPr>
-          <w:hyperlink w:anchor="_Toc242618192" w:history="1">
+          <w:hyperlink w:anchor="_Toc242795828" w:history="1">
             <w:r>
               <w:rPr>
                 <w:rStyle w:val="Hyperlink"/>
@@ -3289,7 +3289,7 @@
               <w:rPr>
                 <w:noProof/>
               </w:rPr>
-              <w:instrText xml:space="preserve"> PAGEREF _Toc242618192 \h </w:instrText>
+              <w:instrText xml:space="preserve"> PAGEREF _Toc242795828 \h </w:instrText>
             </w:r>
             <w:r>
               <w:rPr>
@@ -3329,7 +3329,7 @@
               <w14:ligatures w14:val="standardContextual"/>
             </w:rPr>
           </w:pPr>
-          <w:hyperlink w:anchor="_Toc242618193" w:history="1">
+          <w:hyperlink w:anchor="_Toc242795829" w:history="1">
             <w:r>
               <w:rPr>
                 <w:rStyle w:val="Hyperlink"/>
@@ -3353,7 +3353,7 @@
               <w:rPr>
                 <w:noProof/>
               </w:rPr>
-              <w:instrText xml:space="preserve"> PAGEREF _Toc242618193 \h </w:instrText>
+              <w:instrText xml:space="preserve"> PAGEREF _Toc242795829 \h </w:instrText>
             </w:r>
             <w:r>
               <w:rPr>
@@ -3393,7 +3393,7 @@
               <w14:ligatures w14:val="standardContextual"/>
             </w:rPr>
           </w:pPr>
-          <w:hyperlink w:anchor="_Toc242618194" w:history="1">
+          <w:hyperlink w:anchor="_Toc242795830" w:history="1">
             <w:r>
               <w:rPr>
                 <w:rStyle w:val="Hyperlink"/>
@@ -3417,7 +3417,7 @@
               <w:rPr>
                 <w:noProof/>
               </w:rPr>
-              <w:instrText xml:space="preserve"> PAGEREF _Toc242618194 \h </w:instrText>
+              <w:instrText xml:space="preserve"> PAGEREF _Toc242795830 \h </w:instrText>
             </w:r>
             <w:r>
               <w:rPr>
@@ -3457,7 +3457,7 @@
               <w14:ligatures w14:val="standardContextual"/>
             </w:rPr>
           </w:pPr>
-          <w:hyperlink w:anchor="_Toc242618195" w:history="1">
+          <w:hyperlink w:anchor="_Toc242795831" w:history="1">
             <w:r>
               <w:rPr>
                 <w:rStyle w:val="Hyperlink"/>
@@ -3481,7 +3481,7 @@
               <w:rPr>
                 <w:noProof/>
               </w:rPr>
-              <w:instrText xml:space="preserve"> PAGEREF _Toc242618195 \h </w:instrText>
+              <w:instrText xml:space="preserve"> PAGEREF _Toc242795831 \h </w:instrText>
             </w:r>
             <w:r>
               <w:rPr>
@@ -3521,7 +3521,7 @@
               <w14:ligatures w14:val="standardContextual"/>
             </w:rPr>
           </w:pPr>
-          <w:hyperlink w:anchor="_Toc242618196" w:history="1">
+          <w:hyperlink w:anchor="_Toc242795832" w:history="1">
             <w:r>
               <w:rPr>
                 <w:rStyle w:val="Hyperlink"/>
@@ -3545,7 +3545,7 @@
               <w:rPr>
                 <w:noProof/>
               </w:rPr>
-              <w:instrText xml:space="preserve"> PAGEREF _Toc242618196 \h </w:instrText>
+              <w:instrText xml:space="preserve"> PAGEREF _Toc242795832 \h </w:instrText>
             </w:r>
             <w:r>
               <w:rPr>
@@ -3585,7 +3585,7 @@
               <w14:ligatures w14:val="standardContextual"/>
             </w:rPr>
           </w:pPr>
-          <w:hyperlink w:anchor="_Toc242618197" w:history="1">
+          <w:hyperlink w:anchor="_Toc242795833" w:history="1">
             <w:r>
               <w:rPr>
                 <w:rStyle w:val="Hyperlink"/>
@@ -3609,7 +3609,7 @@
               <w:rPr>
                 <w:noProof/>
               </w:rPr>
-              <w:instrText xml:space="preserve"> PAGEREF _Toc242618197 \h </w:instrText>
+              <w:instrText xml:space="preserve"> PAGEREF _Toc242795833 \h </w:instrText>
             </w:r>
             <w:r>
               <w:rPr>
@@ -3649,7 +3649,7 @@
               <w14:ligatures w14:val="standardContextual"/>
             </w:rPr>
           </w:pPr>
-          <w:hyperlink w:anchor="_Toc242618198" w:history="1">
+          <w:hyperlink w:anchor="_Toc242795834" w:history="1">
             <w:r>
               <w:rPr>
                 <w:rStyle w:val="Hyperlink"/>
@@ -3673,7 +3673,7 @@
               <w:rPr>
                 <w:noProof/>
               </w:rPr>
-              <w:instrText xml:space="preserve"> PAGEREF _Toc242618198 \h </w:instrText>
+              <w:instrText xml:space="preserve"> PAGEREF _Toc242795834 \h </w:instrText>
             </w:r>
             <w:r>
               <w:rPr>
@@ -3713,7 +3713,7 @@
               <w14:ligatures w14:val="standardContextual"/>
             </w:rPr>
           </w:pPr>
-          <w:hyperlink w:anchor="_Toc242618199" w:history="1">
+          <w:hyperlink w:anchor="_Toc242795835" w:history="1">
             <w:r>
               <w:rPr>
                 <w:rStyle w:val="Hyperlink"/>
@@ -3737,7 +3737,7 @@
               <w:rPr>
                 <w:noProof/>
               </w:rPr>
-              <w:instrText xml:space="preserve"> PAGEREF _Toc242618199 \h </w:instrText>
+              <w:instrText xml:space="preserve"> PAGEREF _Toc242795835 \h </w:instrText>
             </w:r>
             <w:r>
               <w:rPr>
@@ -3777,7 +3777,7 @@
               <w14:ligatures w14:val="standardContextual"/>
             </w:rPr>
           </w:pPr>
-          <w:hyperlink w:anchor="_Toc242618200" w:history="1">
+          <w:hyperlink w:anchor="_Toc242795836" w:history="1">
             <w:r>
               <w:rPr>
                 <w:rStyle w:val="Hyperlink"/>
@@ -3801,7 +3801,7 @@
               <w:rPr>
                 <w:noProof/>
               </w:rPr>
-              <w:instrText xml:space="preserve"> PAGEREF _Toc242618200 \h </w:instrText>
+              <w:instrText xml:space="preserve"> PAGEREF _Toc242795836 \h </w:instrText>
             </w:r>
             <w:r>
               <w:rPr>
@@ -3841,7 +3841,7 @@
               <w14:ligatures w14:val="standardContextual"/>
             </w:rPr>
           </w:pPr>
-          <w:hyperlink w:anchor="_Toc242618201" w:history="1">
+          <w:hyperlink w:anchor="_Toc242795837" w:history="1">
             <w:r>
               <w:rPr>
                 <w:rStyle w:val="Hyperlink"/>
@@ -3865,7 +3865,7 @@
               <w:rPr>
                 <w:noProof/>
               </w:rPr>
-              <w:instrText xml:space="preserve"> PAGEREF _Toc242618201 \h </w:instrText>
+              <w:instrText xml:space="preserve"> PAGEREF _Toc242795837 \h </w:instrText>
             </w:r>
             <w:r>
               <w:rPr>
@@ -3905,7 +3905,7 @@
               <w14:ligatures w14:val="standardContextual"/>
             </w:rPr>
           </w:pPr>
-          <w:hyperlink w:anchor="_Toc242618202" w:history="1">
+          <w:hyperlink w:anchor="_Toc242795838" w:history="1">
             <w:r>
               <w:rPr>
                 <w:rStyle w:val="Hyperlink"/>
@@ -3929,7 +3929,7 @@
               <w:rPr>
                 <w:noProof/>
               </w:rPr>
-              <w:instrText xml:space="preserve"> PAGEREF _Toc242618202 \h </w:instrText>
+              <w:instrText xml:space="preserve"> PAGEREF _Toc242795838 \h </w:instrText>
             </w:r>
             <w:r>
               <w:rPr>
@@ -3969,7 +3969,7 @@
               <w14:ligatures w14:val="standardContextual"/>
             </w:rPr>
           </w:pPr>
-          <w:hyperlink w:anchor="_Toc242618203" w:history="1">
+          <w:hyperlink w:anchor="_Toc242795839" w:history="1">
             <w:r>
               <w:rPr>
                 <w:rStyle w:val="Hyperlink"/>
@@ -3993,7 +3993,7 @@
               <w:rPr>
                 <w:noProof/>
               </w:rPr>
-              <w:instrText xml:space="preserve"> PAGEREF _Toc242618203 \h </w:instrText>
+              <w:instrText xml:space="preserve"> PAGEREF _Toc242795839 \h </w:instrText>
             </w:r>
             <w:r>
               <w:rPr>
@@ -4033,7 +4033,7 @@
               <w14:ligatures w14:val="standardContextual"/>
             </w:rPr>
           </w:pPr>
-          <w:hyperlink w:anchor="_Toc242618204" w:history="1">
+          <w:hyperlink w:anchor="_Toc242795840" w:history="1">
             <w:r>
               <w:rPr>
                 <w:rStyle w:val="Hyperlink"/>
@@ -4057,7 +4057,7 @@
               <w:rPr>
                 <w:noProof/>
               </w:rPr>
-              <w:instrText xml:space="preserve"> PAGEREF _Toc242618204 \h </w:instrText>
+              <w:instrText xml:space="preserve"> PAGEREF _Toc242795840 \h </w:instrText>
             </w:r>
             <w:r>
               <w:rPr>
@@ -4097,7 +4097,7 @@
               <w14:ligatures w14:val="standardContextual"/>
             </w:rPr>
           </w:pPr>
-          <w:hyperlink w:anchor="_Toc242618205" w:history="1">
+          <w:hyperlink w:anchor="_Toc242795841" w:history="1">
             <w:r>
               <w:rPr>
                 <w:rStyle w:val="Hyperlink"/>
@@ -4121,7 +4121,7 @@
               <w:rPr>
                 <w:noProof/>
               </w:rPr>
-              <w:instrText xml:space="preserve"> PAGEREF _Toc242618205 \h </w:instrText>
+              <w:instrText xml:space="preserve"> PAGEREF _Toc242795841 \h </w:instrText>
             </w:r>
             <w:r>
               <w:rPr>
@@ -4161,7 +4161,7 @@
               <w14:ligatures w14:val="standardContextual"/>
             </w:rPr>
           </w:pPr>
-          <w:hyperlink w:anchor="_Toc242618206" w:history="1">
+          <w:hyperlink w:anchor="_Toc242795842" w:history="1">
             <w:r>
               <w:rPr>
                 <w:rStyle w:val="Hyperlink"/>
@@ -4185,7 +4185,7 @@
               <w:rPr>
                 <w:noProof/>
               </w:rPr>
-              <w:instrText xml:space="preserve"> PAGEREF _Toc242618206 \h </w:instrText>
+              <w:instrText xml:space="preserve"> PAGEREF _Toc242795842 \h </w:instrText>
             </w:r>
             <w:r>
               <w:rPr>
@@ -4225,7 +4225,7 @@
               <w14:ligatures w14:val="standardContextual"/>
             </w:rPr>
           </w:pPr>
-          <w:hyperlink w:anchor="_Toc242618207" w:history="1">
+          <w:hyperlink w:anchor="_Toc242795843" w:history="1">
             <w:r>
               <w:rPr>
                 <w:rStyle w:val="Hyperlink"/>
@@ -4249,7 +4249,7 @@
               <w:rPr>
                 <w:noProof/>
               </w:rPr>
-              <w:instrText xml:space="preserve"> PAGEREF _Toc242618207 \h </w:instrText>
+              <w:instrText xml:space="preserve"> PAGEREF _Toc242795843 \h </w:instrText>
             </w:r>
             <w:r>
               <w:rPr>
@@ -4289,7 +4289,7 @@
               <w14:ligatures w14:val="standardContextual"/>
             </w:rPr>
           </w:pPr>
-          <w:hyperlink w:anchor="_Toc242618208" w:history="1">
+          <w:hyperlink w:anchor="_Toc242795844" w:history="1">
             <w:r>
               <w:rPr>
                 <w:rStyle w:val="Hyperlink"/>
@@ -4313,7 +4313,7 @@
               <w:rPr>
                 <w:noProof/>
               </w:rPr>
-              <w:instrText xml:space="preserve"> PAGEREF _Toc242618208 \h </w:instrText>
+              <w:instrText xml:space="preserve"> PAGEREF _Toc242795844 \h </w:instrText>
             </w:r>
             <w:r>
               <w:rPr>
@@ -4353,7 +4353,7 @@
               <w14:ligatures w14:val="standardContextual"/>
             </w:rPr>
           </w:pPr>
-          <w:hyperlink w:anchor="_Toc242618209" w:history="1">
+          <w:hyperlink w:anchor="_Toc242795845" w:history="1">
             <w:r>
               <w:rPr>
                 <w:rStyle w:val="Hyperlink"/>
@@ -4377,7 +4377,7 @@
               <w:rPr>
                 <w:noProof/>
               </w:rPr>
-              <w:instrText xml:space="preserve"> PAGEREF _Toc242618209 \h </w:instrText>
+              <w:instrText xml:space="preserve"> PAGEREF _Toc242795845 \h </w:instrText>
             </w:r>
             <w:r>
               <w:rPr>
@@ -4394,7 +4394,7 @@
               <w:rPr>
                 <w:noProof/>
               </w:rPr>
-              <w:t>29</w:t>
+              <w:t>30</w:t>
             </w:r>
             <w:r>
               <w:rPr>
@@ -4417,7 +4417,7 @@
               <w14:ligatures w14:val="standardContextual"/>
             </w:rPr>
           </w:pPr>
-          <w:hyperlink w:anchor="_Toc242618210" w:history="1">
+          <w:hyperlink w:anchor="_Toc242795846" w:history="1">
             <w:r>
               <w:rPr>
                 <w:rStyle w:val="Hyperlink"/>
@@ -4441,7 +4441,7 @@
               <w:rPr>
                 <w:noProof/>
               </w:rPr>
-              <w:instrText xml:space="preserve"> PAGEREF _Toc242618210 \h </w:instrText>
+              <w:instrText xml:space="preserve"> PAGEREF _Toc242795846 \h </w:instrText>
             </w:r>
             <w:r>
               <w:rPr>
@@ -4458,7 +4458,7 @@
               <w:rPr>
                 <w:noProof/>
               </w:rPr>
-              <w:t>29</w:t>
+              <w:t>30</w:t>
             </w:r>
             <w:r>
               <w:rPr>
@@ -4481,7 +4481,7 @@
               <w14:ligatures w14:val="standardContextual"/>
             </w:rPr>
           </w:pPr>
-          <w:hyperlink w:anchor="_Toc242618211" w:history="1">
+          <w:hyperlink w:anchor="_Toc242795847" w:history="1">
             <w:r>
               <w:rPr>
                 <w:rStyle w:val="Hyperlink"/>
@@ -4505,7 +4505,7 @@
               <w:rPr>
                 <w:noProof/>
               </w:rPr>
-              <w:instrText xml:space="preserve"> PAGEREF _Toc242618211 \h </w:instrText>
+              <w:instrText xml:space="preserve"> PAGEREF _Toc242795847 \h </w:instrText>
             </w:r>
             <w:r>
               <w:rPr>
@@ -4522,7 +4522,7 @@
               <w:rPr>
                 <w:noProof/>
               </w:rPr>
-              <w:t>29</w:t>
+              <w:t>30</w:t>
             </w:r>
             <w:r>
               <w:rPr>
@@ -4545,7 +4545,7 @@
               <w14:ligatures w14:val="standardContextual"/>
             </w:rPr>
           </w:pPr>
-          <w:hyperlink w:anchor="_Toc242618212" w:history="1">
+          <w:hyperlink w:anchor="_Toc242795848" w:history="1">
             <w:r>
               <w:rPr>
                 <w:rStyle w:val="Hyperlink"/>
@@ -4569,7 +4569,7 @@
               <w:rPr>
                 <w:noProof/>
               </w:rPr>
-              <w:instrText xml:space="preserve"> PAGEREF _Toc242618212 \h </w:instrText>
+              <w:instrText xml:space="preserve"> PAGEREF _Toc242795848 \h </w:instrText>
             </w:r>
             <w:r>
               <w:rPr>
@@ -4586,7 +4586,7 @@
               <w:rPr>
                 <w:noProof/>
               </w:rPr>
-              <w:t>29</w:t>
+              <w:t>30</w:t>
             </w:r>
             <w:r>
               <w:rPr>
@@ -4609,7 +4609,7 @@
               <w14:ligatures w14:val="standardContextual"/>
             </w:rPr>
           </w:pPr>
-          <w:hyperlink w:anchor="_Toc242618213" w:history="1">
+          <w:hyperlink w:anchor="_Toc242795849" w:history="1">
             <w:r>
               <w:rPr>
                 <w:rStyle w:val="Hyperlink"/>
@@ -4633,7 +4633,7 @@
               <w:rPr>
                 <w:noProof/>
               </w:rPr>
-              <w:instrText xml:space="preserve"> PAGEREF _Toc242618213 \h </w:instrText>
+              <w:instrText xml:space="preserve"> PAGEREF _Toc242795849 \h </w:instrText>
             </w:r>
             <w:r>
               <w:rPr>
@@ -4650,7 +4650,7 @@
               <w:rPr>
                 <w:noProof/>
               </w:rPr>
-              <w:t>31</w:t>
+              <w:t>32</w:t>
             </w:r>
             <w:r>
               <w:rPr>
@@ -4673,7 +4673,7 @@
               <w14:ligatures w14:val="standardContextual"/>
             </w:rPr>
           </w:pPr>
-          <w:hyperlink w:anchor="_Toc242618214" w:history="1">
+          <w:hyperlink w:anchor="_Toc242795850" w:history="1">
             <w:r>
               <w:rPr>
                 <w:rStyle w:val="Hyperlink"/>
@@ -4697,7 +4697,7 @@
               <w:rPr>
                 <w:noProof/>
               </w:rPr>
-              <w:instrText xml:space="preserve"> PAGEREF _Toc242618214 \h </w:instrText>
+              <w:instrText xml:space="preserve"> PAGEREF _Toc242795850 \h </w:instrText>
             </w:r>
             <w:r>
               <w:rPr>
@@ -4714,7 +4714,7 @@
               <w:rPr>
                 <w:noProof/>
               </w:rPr>
-              <w:t>32</w:t>
+              <w:t>33</w:t>
             </w:r>
             <w:r>
               <w:rPr>
@@ -4737,7 +4737,7 @@
               <w14:ligatures w14:val="standardContextual"/>
             </w:rPr>
           </w:pPr>
-          <w:hyperlink w:anchor="_Toc242618215" w:history="1">
+          <w:hyperlink w:anchor="_Toc242795851" w:history="1">
             <w:r>
               <w:rPr>
                 <w:rStyle w:val="Hyperlink"/>
@@ -4761,7 +4761,7 @@
               <w:rPr>
                 <w:noProof/>
               </w:rPr>
-              <w:instrText xml:space="preserve"> PAGEREF _Toc242618215 \h </w:instrText>
+              <w:instrText xml:space="preserve"> PAGEREF _Toc242795851 \h </w:instrText>
             </w:r>
             <w:r>
               <w:rPr>
@@ -4778,7 +4778,7 @@
               <w:rPr>
                 <w:noProof/>
               </w:rPr>
-              <w:t>32</w:t>
+              <w:t>33</w:t>
             </w:r>
             <w:r>
               <w:rPr>
@@ -4801,7 +4801,7 @@
               <w14:ligatures w14:val="standardContextual"/>
             </w:rPr>
           </w:pPr>
-          <w:hyperlink w:anchor="_Toc242618216" w:history="1">
+          <w:hyperlink w:anchor="_Toc242795852" w:history="1">
             <w:r>
               <w:rPr>
                 <w:rStyle w:val="Hyperlink"/>
@@ -4825,7 +4825,7 @@
               <w:rPr>
                 <w:noProof/>
               </w:rPr>
-              <w:instrText xml:space="preserve"> PAGEREF _Toc242618216 \h </w:instrText>
+              <w:instrText xml:space="preserve"> PAGEREF _Toc242795852 \h </w:instrText>
             </w:r>
             <w:r>
               <w:rPr>
@@ -4842,7 +4842,7 @@
               <w:rPr>
                 <w:noProof/>
               </w:rPr>
-              <w:t>32</w:t>
+              <w:t>33</w:t>
             </w:r>
             <w:r>
               <w:rPr>
@@ -4865,7 +4865,7 @@
               <w14:ligatures w14:val="standardContextual"/>
             </w:rPr>
           </w:pPr>
-          <w:hyperlink w:anchor="_Toc242618217" w:history="1">
+          <w:hyperlink w:anchor="_Toc242795853" w:history="1">
             <w:r>
               <w:rPr>
                 <w:rStyle w:val="Hyperlink"/>
@@ -4889,7 +4889,7 @@
               <w:rPr>
                 <w:noProof/>
               </w:rPr>
-              <w:instrText xml:space="preserve"> PAGEREF _Toc242618217 \h </w:instrText>
+              <w:instrText xml:space="preserve"> PAGEREF _Toc242795853 \h </w:instrText>
             </w:r>
             <w:r>
               <w:rPr>
@@ -4906,7 +4906,7 @@
               <w:rPr>
                 <w:noProof/>
               </w:rPr>
-              <w:t>32</w:t>
+              <w:t>33</w:t>
             </w:r>
             <w:r>
               <w:rPr>
@@ -4929,7 +4929,7 @@
               <w14:ligatures w14:val="standardContextual"/>
             </w:rPr>
           </w:pPr>
-          <w:hyperlink w:anchor="_Toc242618218" w:history="1">
+          <w:hyperlink w:anchor="_Toc242795854" w:history="1">
             <w:r>
               <w:rPr>
                 <w:rStyle w:val="Hyperlink"/>
@@ -4953,7 +4953,7 @@
               <w:rPr>
                 <w:noProof/>
               </w:rPr>
-              <w:instrText xml:space="preserve"> PAGEREF _Toc242618218 \h </w:instrText>
+              <w:instrText xml:space="preserve"> PAGEREF _Toc242795854 \h </w:instrText>
             </w:r>
             <w:r>
               <w:rPr>
@@ -4970,7 +4970,7 @@
               <w:rPr>
                 <w:noProof/>
               </w:rPr>
-              <w:t>32</w:t>
+              <w:t>33</w:t>
             </w:r>
             <w:r>
               <w:rPr>
@@ -4998,7 +4998,7 @@
         <w:spacing w:before="240" w:after="280"/>
         <w:jc w:val="center"/>
       </w:pPr>
-      <w:bookmarkStart w:id="1" w:name="_Toc242618160"/>
+      <w:bookmarkStart w:id="1" w:name="_Toc242795796"/>
       <w:r>
         <w:lastRenderedPageBreak/>
         <w:t>ABSTRACT</w:t>
@@ -5032,10 +5032,10 @@
         <w:jc w:val="both"/>
       </w:pPr>
       <w:r>
-        <w:t>Two evaluations were run. In a controlled retrieval comparison on 36 labelled queries, DreamOS placed the intended file first for 94% of queries, against 56% for a BM25 content index and 33% for filename matching; on the 10 queries that share no word with their target, both lexical baselines scored 0.00 and DreamOS scored 0.80. In a scale evaluation on synthetic vaults of 500, 2,000 and 5,000 files, indexing ran at 19.4 files per second at 500 files, search answered in a median of 50.7 ms, and the knowledge</w:t>
-      </w:r>
-      <w:r>
-        <w:t xml:space="preserve"> graph rebuilt in 143.3 seconds at 5,000 files after vectorisation; the original method took 246.1 seconds at only 2,000 files. Two defects found during measurement, a name-resolution delay on the test machine and a quadratic graph computation, were fixed and re-measured. The report states what the measurements do and do not show, including the small size of the labelled set and the synthetic nature of the scale data.</w:t>
+        <w:t>Two evaluations were run. In a controlled retrieval comparison on 36 labelled queries, DreamOS placed the intended file first for 94% of queries, against 56% for a BM25 content index and 33% for filename matching; on the 10 queries that share no word with their target, both lexical baselines scored 0.00 and DreamOS scored 0.80. In a scale evaluation on synthetic vaults of 500, 2,000 and 5,000 files, indexing ran at 19.9 files per second at 500 files, search answered in a median of 34.5 ms, and the knowledge</w:t>
+      </w:r>
+      <w:r>
+        <w:t xml:space="preserve"> graph rebuilt in 3.2 seconds at 5,000 files; the original method took 246.1 seconds at only 2,000 files, and an intermediate version 143.3 seconds at 5,000. Defects found during measurement, a name-resolution delay on the test machine and three all-pairs computations in graph construction, were fixed and re-measured. The report states what the measurements do and do not show, including the small size of the labelled set and the synthetic nature of the scale data.</w:t>
       </w:r>
     </w:p>
     <w:p>
@@ -5058,7 +5058,7 @@
         <w:spacing w:before="240" w:after="280"/>
         <w:jc w:val="center"/>
       </w:pPr>
-      <w:bookmarkStart w:id="2" w:name="_Toc242618161"/>
+      <w:bookmarkStart w:id="2" w:name="_Toc242795797"/>
       <w:r>
         <w:lastRenderedPageBreak/>
         <w:t>ABBREVIATIONS</w:t>
@@ -5080,7 +5080,7 @@
           <w:left w:w="10" w:type="dxa"/>
           <w:right w:w="10" w:type="dxa"/>
         </w:tblCellMar>
-        <w:tblLook w:val="04A0" w:firstRow="1" w:lastRow="0" w:firstColumn="1" w:lastColumn="0" w:noHBand="0" w:noVBand="1"/>
+        <w:tblLook w:val="0000" w:firstRow="0" w:lastRow="0" w:firstColumn="0" w:lastColumn="0" w:noHBand="0" w:noVBand="0"/>
       </w:tblPr>
       <w:tblGrid>
         <w:gridCol w:w="2200"/>
@@ -6056,7 +6056,7 @@
         <w:spacing w:before="240" w:after="280"/>
         <w:jc w:val="center"/>
       </w:pPr>
-      <w:bookmarkStart w:id="3" w:name="_Toc242618162"/>
+      <w:bookmarkStart w:id="3" w:name="_Toc242795798"/>
       <w:r>
         <w:lastRenderedPageBreak/>
         <w:t>LIST OF FIGURES</w:t>
@@ -6078,7 +6078,7 @@
           <w:left w:w="10" w:type="dxa"/>
           <w:right w:w="10" w:type="dxa"/>
         </w:tblCellMar>
-        <w:tblLook w:val="04A0" w:firstRow="1" w:lastRow="0" w:firstColumn="1" w:lastColumn="0" w:noHBand="0" w:noVBand="1"/>
+        <w:tblLook w:val="0000" w:firstRow="0" w:lastRow="0" w:firstColumn="0" w:lastColumn="0" w:noHBand="0" w:noVBand="0"/>
       </w:tblPr>
       <w:tblGrid>
         <w:gridCol w:w="1400"/>
@@ -7451,7 +7451,7 @@
         <w:spacing w:before="240" w:after="280"/>
         <w:jc w:val="center"/>
       </w:pPr>
-      <w:bookmarkStart w:id="4" w:name="_Toc242618163"/>
+      <w:bookmarkStart w:id="4" w:name="_Toc242795799"/>
       <w:r>
         <w:lastRenderedPageBreak/>
         <w:t>LIST OF TABLES</w:t>
@@ -7473,7 +7473,7 @@
           <w:left w:w="10" w:type="dxa"/>
           <w:right w:w="10" w:type="dxa"/>
         </w:tblCellMar>
-        <w:tblLook w:val="04A0" w:firstRow="1" w:lastRow="0" w:firstColumn="1" w:lastColumn="0" w:noHBand="0" w:noVBand="1"/>
+        <w:tblLook w:val="0000" w:firstRow="0" w:lastRow="0" w:firstColumn="0" w:lastColumn="0" w:noHBand="0" w:noVBand="0"/>
       </w:tblPr>
       <w:tblGrid>
         <w:gridCol w:w="1400"/>
@@ -8740,7 +8740,7 @@
               <w:spacing w:line="276" w:lineRule="auto"/>
             </w:pPr>
             <w:r>
-              <w:t>26</w:t>
+              <w:t>27</w:t>
             </w:r>
           </w:p>
         </w:tc>
@@ -8918,7 +8918,7 @@
               <w:spacing w:line="276" w:lineRule="auto"/>
             </w:pPr>
             <w:r>
-              <w:t>32</w:t>
+              <w:t>33</w:t>
             </w:r>
           </w:p>
         </w:tc>
@@ -8947,7 +8947,7 @@
         <w:spacing w:before="240" w:after="280"/>
         <w:jc w:val="center"/>
       </w:pPr>
-      <w:bookmarkStart w:id="5" w:name="_Toc242618164"/>
+      <w:bookmarkStart w:id="5" w:name="_Toc242795800"/>
       <w:r>
         <w:lastRenderedPageBreak/>
         <w:t>INTRODUCTION</w:t>
@@ -8959,7 +8959,7 @@
         <w:pStyle w:val="Heading2"/>
         <w:spacing w:before="240" w:after="120"/>
       </w:pPr>
-      <w:bookmarkStart w:id="6" w:name="_Toc242618165"/>
+      <w:bookmarkStart w:id="6" w:name="_Toc242795801"/>
       <w:r>
         <w:t>1.1 Introduction</w:t>
       </w:r>
@@ -8988,7 +8988,7 @@
         <w:pStyle w:val="Heading2"/>
         <w:spacing w:before="240" w:after="120"/>
       </w:pPr>
-      <w:bookmarkStart w:id="7" w:name="_Toc242618166"/>
+      <w:bookmarkStart w:id="7" w:name="_Toc242795802"/>
       <w:r>
         <w:t>1.2 Problem Statement</w:t>
       </w:r>
@@ -9008,7 +9008,7 @@
         <w:pStyle w:val="Heading2"/>
         <w:spacing w:before="240" w:after="120"/>
       </w:pPr>
-      <w:bookmarkStart w:id="8" w:name="_Toc242618167"/>
+      <w:bookmarkStart w:id="8" w:name="_Toc242795803"/>
       <w:r>
         <w:t>1.3 Objectives</w:t>
       </w:r>
@@ -9111,7 +9111,7 @@
         <w:pStyle w:val="Heading2"/>
         <w:spacing w:before="240" w:after="120"/>
       </w:pPr>
-      <w:bookmarkStart w:id="9" w:name="_Toc242618168"/>
+      <w:bookmarkStart w:id="9" w:name="_Toc242795804"/>
       <w:r>
         <w:t>1.4 Scope of the Project</w:t>
       </w:r>
@@ -9140,7 +9140,7 @@
         <w:spacing w:before="240" w:after="280"/>
         <w:jc w:val="center"/>
       </w:pPr>
-      <w:bookmarkStart w:id="10" w:name="_Toc242618169"/>
+      <w:bookmarkStart w:id="10" w:name="_Toc242795805"/>
       <w:r>
         <w:lastRenderedPageBreak/>
         <w:t>LITERATURE REVIEW</w:t>
@@ -9152,7 +9152,7 @@
         <w:pStyle w:val="Heading2"/>
         <w:spacing w:before="240" w:after="120"/>
       </w:pPr>
-      <w:bookmarkStart w:id="11" w:name="_Toc242618170"/>
+      <w:bookmarkStart w:id="11" w:name="_Toc242795806"/>
       <w:r>
         <w:t>2.1 Review of Existing Systems and Related Work</w:t>
       </w:r>
@@ -9230,7 +9230,7 @@
           <w:left w:w="10" w:type="dxa"/>
           <w:right w:w="10" w:type="dxa"/>
         </w:tblCellMar>
-        <w:tblLook w:val="04A0" w:firstRow="1" w:lastRow="0" w:firstColumn="1" w:lastColumn="0" w:noHBand="0" w:noVBand="1"/>
+        <w:tblLook w:val="0000" w:firstRow="0" w:lastRow="0" w:firstColumn="0" w:lastColumn="0" w:noHBand="0" w:noVBand="0"/>
       </w:tblPr>
       <w:tblGrid>
         <w:gridCol w:w="1421"/>
@@ -10286,7 +10286,7 @@
         <w:pStyle w:val="Heading2"/>
         <w:spacing w:before="240" w:after="120"/>
       </w:pPr>
-      <w:bookmarkStart w:id="12" w:name="_Toc242618171"/>
+      <w:bookmarkStart w:id="12" w:name="_Toc242795807"/>
       <w:r>
         <w:t>2.2 Research Gap</w:t>
       </w:r>
@@ -10309,7 +10309,7 @@
         <w:pStyle w:val="Heading2"/>
         <w:spacing w:before="240" w:after="120"/>
       </w:pPr>
-      <w:bookmarkStart w:id="13" w:name="_Toc242618172"/>
+      <w:bookmarkStart w:id="13" w:name="_Toc242795808"/>
       <w:r>
         <w:t>2.3 Summary of Findings</w:t>
       </w:r>
@@ -10379,7 +10379,7 @@
         <w:spacing w:before="240" w:after="280"/>
         <w:jc w:val="center"/>
       </w:pPr>
-      <w:bookmarkStart w:id="14" w:name="_Toc242618173"/>
+      <w:bookmarkStart w:id="14" w:name="_Toc242795809"/>
       <w:r>
         <w:lastRenderedPageBreak/>
         <w:t>SYSTEM ANALYSIS</w:t>
@@ -10391,7 +10391,7 @@
         <w:pStyle w:val="Heading2"/>
         <w:spacing w:before="240" w:after="120"/>
       </w:pPr>
-      <w:bookmarkStart w:id="15" w:name="_Toc242618174"/>
+      <w:bookmarkStart w:id="15" w:name="_Toc242795810"/>
       <w:r>
         <w:t>3.1 Requirement Analysis</w:t>
       </w:r>
@@ -10411,7 +10411,7 @@
         <w:pStyle w:val="Heading3"/>
         <w:spacing w:before="200" w:after="100"/>
       </w:pPr>
-      <w:bookmarkStart w:id="16" w:name="_Toc242618175"/>
+      <w:bookmarkStart w:id="16" w:name="_Toc242795811"/>
       <w:r>
         <w:t>3.1.1 Functional requirements</w:t>
       </w:r>
@@ -10456,7 +10456,7 @@
           <w:left w:w="10" w:type="dxa"/>
           <w:right w:w="10" w:type="dxa"/>
         </w:tblCellMar>
-        <w:tblLook w:val="04A0" w:firstRow="1" w:lastRow="0" w:firstColumn="1" w:lastColumn="0" w:noHBand="0" w:noVBand="1"/>
+        <w:tblLook w:val="0000" w:firstRow="0" w:lastRow="0" w:firstColumn="0" w:lastColumn="0" w:noHBand="0" w:noVBand="0"/>
       </w:tblPr>
       <w:tblGrid>
         <w:gridCol w:w="800"/>
@@ -11991,7 +11991,7 @@
         <w:pStyle w:val="Heading3"/>
         <w:spacing w:before="200" w:after="100"/>
       </w:pPr>
-      <w:bookmarkStart w:id="17" w:name="_Toc242618176"/>
+      <w:bookmarkStart w:id="17" w:name="_Toc242795812"/>
       <w:r>
         <w:t>3.1.2 Non-functional requirements</w:t>
       </w:r>
@@ -12036,7 +12036,7 @@
           <w:left w:w="10" w:type="dxa"/>
           <w:right w:w="10" w:type="dxa"/>
         </w:tblCellMar>
-        <w:tblLook w:val="04A0" w:firstRow="1" w:lastRow="0" w:firstColumn="1" w:lastColumn="0" w:noHBand="0" w:noVBand="1"/>
+        <w:tblLook w:val="0000" w:firstRow="0" w:lastRow="0" w:firstColumn="0" w:lastColumn="0" w:noHBand="0" w:noVBand="0"/>
       </w:tblPr>
       <w:tblGrid>
         <w:gridCol w:w="1680"/>
@@ -12870,7 +12870,7 @@
               <w:spacing w:line="276" w:lineRule="auto"/>
             </w:pPr>
             <w:r>
-              <w:t>116 automated tests, CI on every push</w:t>
+              <w:t>123 automated tests, CI on every push</w:t>
             </w:r>
           </w:p>
         </w:tc>
@@ -12881,7 +12881,7 @@
         <w:pStyle w:val="Heading2"/>
         <w:spacing w:before="240" w:after="120"/>
       </w:pPr>
-      <w:bookmarkStart w:id="18" w:name="_Toc242618177"/>
+      <w:bookmarkStart w:id="18" w:name="_Toc242795813"/>
       <w:r>
         <w:t>3.2 Feasibility Study</w:t>
       </w:r>
@@ -12904,7 +12904,7 @@
         <w:pStyle w:val="Heading2"/>
         <w:spacing w:before="240" w:after="120"/>
       </w:pPr>
-      <w:bookmarkStart w:id="19" w:name="_Toc242618178"/>
+      <w:bookmarkStart w:id="19" w:name="_Toc242795814"/>
       <w:r>
         <w:t>3.3 System Specifications</w:t>
       </w:r>
@@ -12949,7 +12949,7 @@
           <w:left w:w="10" w:type="dxa"/>
           <w:right w:w="10" w:type="dxa"/>
         </w:tblCellMar>
-        <w:tblLook w:val="04A0" w:firstRow="1" w:lastRow="0" w:firstColumn="1" w:lastColumn="0" w:noHBand="0" w:noVBand="1"/>
+        <w:tblLook w:val="0000" w:firstRow="0" w:lastRow="0" w:firstColumn="0" w:lastColumn="0" w:noHBand="0" w:noVBand="0"/>
       </w:tblPr>
       <w:tblGrid>
         <w:gridCol w:w="2600"/>
@@ -13674,7 +13674,7 @@
         <w:spacing w:before="240" w:after="280"/>
         <w:jc w:val="center"/>
       </w:pPr>
-      <w:bookmarkStart w:id="20" w:name="_Toc242618179"/>
+      <w:bookmarkStart w:id="20" w:name="_Toc242795815"/>
       <w:r>
         <w:lastRenderedPageBreak/>
         <w:t>SYSTEM DESIGN</w:t>
@@ -13686,7 +13686,7 @@
         <w:pStyle w:val="Heading2"/>
         <w:spacing w:before="240" w:after="120"/>
       </w:pPr>
-      <w:bookmarkStart w:id="21" w:name="_Toc242618180"/>
+      <w:bookmarkStart w:id="21" w:name="_Toc242795816"/>
       <w:r>
         <w:t>4.1 System Architecture</w:t>
       </w:r>
@@ -13712,10 +13712,10 @@
           <w:noProof/>
         </w:rPr>
         <w:drawing>
-          <wp:inline distT="0" distB="0" distL="0" distR="0" wp14:anchorId="7FDB93B3" wp14:editId="25BE2CAB">
+          <wp:inline distT="0" distB="0" distL="0" distR="0" wp14:anchorId="7504AFDE" wp14:editId="4FDBD261">
             <wp:extent cx="4191000" cy="2171700"/>
             <wp:effectExtent l="0" t="0" r="0" b="0"/>
-            <wp:docPr id="667264396" name="01_architecture.png" descr="System architecture: desktop client, local service, local model runtime and storage" title="Figure 4.1 System architecture: desktop client, local service, local model runtime and storage"/>
+            <wp:docPr id="1874791649" name="01_architecture.png" descr="System architecture: desktop client, local service, local model runtime and storage" title="Figure 4.1 System architecture: desktop client, local service, local model runtime and storage"/>
             <wp:cNvGraphicFramePr>
               <a:graphicFrameLocks xmlns:a="http://schemas.openxmlformats.org/drawingml/2006/main" noChangeAspect="1"/>
             </wp:cNvGraphicFramePr>
@@ -13781,7 +13781,7 @@
         <w:pStyle w:val="Heading2"/>
         <w:spacing w:before="240" w:after="120"/>
       </w:pPr>
-      <w:bookmarkStart w:id="22" w:name="_Toc242618181"/>
+      <w:bookmarkStart w:id="22" w:name="_Toc242795817"/>
       <w:r>
         <w:t>4.2 Module Design</w:t>
       </w:r>
@@ -13811,10 +13811,10 @@
           <w:noProof/>
         </w:rPr>
         <w:drawing>
-          <wp:inline distT="0" distB="0" distL="0" distR="0" wp14:anchorId="0BC472AB" wp14:editId="0A6FB5BC">
+          <wp:inline distT="0" distB="0" distL="0" distR="0" wp14:anchorId="3F22C175" wp14:editId="336486C3">
             <wp:extent cx="4095750" cy="866775"/>
             <wp:effectExtent l="0" t="0" r="0" b="0"/>
-            <wp:docPr id="1560996019" name="02_module_design.png" descr="Module design and the data each module passes to the next" title="Figure 4.2 Module design and the data each module passes to the next"/>
+            <wp:docPr id="1099774602" name="02_module_design.png" descr="Module design and the data each module passes to the next" title="Figure 4.2 Module design and the data each module passes to the next"/>
             <wp:cNvGraphicFramePr>
               <a:graphicFrameLocks xmlns:a="http://schemas.openxmlformats.org/drawingml/2006/main" noChangeAspect="1"/>
             </wp:cNvGraphicFramePr>
@@ -13877,7 +13877,7 @@
         <w:pStyle w:val="Heading2"/>
         <w:spacing w:before="240" w:after="120"/>
       </w:pPr>
-      <w:bookmarkStart w:id="23" w:name="_Toc242618182"/>
+      <w:bookmarkStart w:id="23" w:name="_Toc242795818"/>
       <w:r>
         <w:t>4.3 Data Flow Diagrams and UML Diagrams</w:t>
       </w:r>
@@ -13888,7 +13888,7 @@
         <w:pStyle w:val="Heading3"/>
         <w:spacing w:before="200" w:after="100"/>
       </w:pPr>
-      <w:bookmarkStart w:id="24" w:name="_Toc242618183"/>
+      <w:bookmarkStart w:id="24" w:name="_Toc242795819"/>
       <w:r>
         <w:t>4.3.1 Data flow diagrams</w:t>
       </w:r>
@@ -13905,10 +13905,10 @@
           <w:noProof/>
         </w:rPr>
         <w:drawing>
-          <wp:inline distT="0" distB="0" distL="0" distR="0" wp14:anchorId="7A9B95D4" wp14:editId="3DCFF07C">
+          <wp:inline distT="0" distB="0" distL="0" distR="0" wp14:anchorId="3292B7D7" wp14:editId="41A37425">
             <wp:extent cx="3810000" cy="1085850"/>
             <wp:effectExtent l="0" t="0" r="0" b="0"/>
-            <wp:docPr id="560484544" name="03_dfd_context.png" descr="Data flow diagram, context level" title="Figure 4.3 Data flow diagram, context level"/>
+            <wp:docPr id="1936336902" name="03_dfd_context.png" descr="Data flow diagram, context level" title="Figure 4.3 Data flow diagram, context level"/>
             <wp:cNvGraphicFramePr>
               <a:graphicFrameLocks xmlns:a="http://schemas.openxmlformats.org/drawingml/2006/main" noChangeAspect="1"/>
             </wp:cNvGraphicFramePr>
@@ -13977,10 +13977,10 @@
           <w:noProof/>
         </w:rPr>
         <w:drawing>
-          <wp:inline distT="0" distB="0" distL="0" distR="0" wp14:anchorId="6D49924C" wp14:editId="3A7E51DD">
+          <wp:inline distT="0" distB="0" distL="0" distR="0" wp14:anchorId="36AB7C65" wp14:editId="6BCFF712">
             <wp:extent cx="4191000" cy="1371600"/>
             <wp:effectExtent l="0" t="0" r="0" b="0"/>
-            <wp:docPr id="1676217662" name="04_dfd_level1.png" descr="Data flow diagram, level 1" title="Figure 4.4 Data flow diagram, level 1"/>
+            <wp:docPr id="1384734648" name="04_dfd_level1.png" descr="Data flow diagram, level 1" title="Figure 4.4 Data flow diagram, level 1"/>
             <wp:cNvGraphicFramePr>
               <a:graphicFrameLocks xmlns:a="http://schemas.openxmlformats.org/drawingml/2006/main" noChangeAspect="1"/>
             </wp:cNvGraphicFramePr>
@@ -14047,7 +14047,7 @@
         <w:pStyle w:val="Heading3"/>
         <w:spacing w:before="200" w:after="100"/>
       </w:pPr>
-      <w:bookmarkStart w:id="25" w:name="_Toc242618184"/>
+      <w:bookmarkStart w:id="25" w:name="_Toc242795820"/>
       <w:r>
         <w:t>4.3.2 UML diagrams</w:t>
       </w:r>
@@ -14064,10 +14064,10 @@
           <w:noProof/>
         </w:rPr>
         <w:drawing>
-          <wp:inline distT="0" distB="0" distL="0" distR="0" wp14:anchorId="1B1766A0" wp14:editId="6BC8CBB5">
+          <wp:inline distT="0" distB="0" distL="0" distR="0" wp14:anchorId="24465937" wp14:editId="39D94735">
             <wp:extent cx="3429000" cy="3000375"/>
             <wp:effectExtent l="0" t="0" r="0" b="0"/>
-            <wp:docPr id="214555224" name="05_use_case.png" descr="Use case diagram of user actions" title="Figure 4.5 Use case diagram of user actions"/>
+            <wp:docPr id="1586591001" name="05_use_case.png" descr="Use case diagram of user actions" title="Figure 4.5 Use case diagram of user actions"/>
             <wp:cNvGraphicFramePr>
               <a:graphicFrameLocks xmlns:a="http://schemas.openxmlformats.org/drawingml/2006/main" noChangeAspect="1"/>
             </wp:cNvGraphicFramePr>
@@ -14140,10 +14140,10 @@
         </w:rPr>
         <w:lastRenderedPageBreak/>
         <w:drawing>
-          <wp:inline distT="0" distB="0" distL="0" distR="0" wp14:anchorId="113BD8D1" wp14:editId="3FF9795B">
+          <wp:inline distT="0" distB="0" distL="0" distR="0" wp14:anchorId="5F8D86E2" wp14:editId="537C62A5">
             <wp:extent cx="4000500" cy="2600325"/>
             <wp:effectExtent l="0" t="0" r="0" b="0"/>
-            <wp:docPr id="1224917331" name="06_class_diagram.png" descr="Class diagram of response and settings classes" title="Figure 4.6 Class diagram of response and settings classes"/>
+            <wp:docPr id="1824792348" name="06_class_diagram.png" descr="Class diagram of response and settings classes" title="Figure 4.6 Class diagram of response and settings classes"/>
             <wp:cNvGraphicFramePr>
               <a:graphicFrameLocks xmlns:a="http://schemas.openxmlformats.org/drawingml/2006/main" noChangeAspect="1"/>
             </wp:cNvGraphicFramePr>
@@ -14215,10 +14215,10 @@
           <w:noProof/>
         </w:rPr>
         <w:drawing>
-          <wp:inline distT="0" distB="0" distL="0" distR="0" wp14:anchorId="60B17112" wp14:editId="124BB7A7">
+          <wp:inline distT="0" distB="0" distL="0" distR="0" wp14:anchorId="65E125E9" wp14:editId="097850E9">
             <wp:extent cx="4191000" cy="1628775"/>
             <wp:effectExtent l="0" t="0" r="0" b="0"/>
-            <wp:docPr id="1563969876" name="07_sequence_open.png" descr="Sequence diagram of an open request" title="Figure 4.7 Sequence diagram of an open request"/>
+            <wp:docPr id="1251098563" name="07_sequence_open.png" descr="Sequence diagram of an open request" title="Figure 4.7 Sequence diagram of an open request"/>
             <wp:cNvGraphicFramePr>
               <a:graphicFrameLocks xmlns:a="http://schemas.openxmlformats.org/drawingml/2006/main" noChangeAspect="1"/>
             </wp:cNvGraphicFramePr>
@@ -14288,10 +14288,10 @@
         </w:rPr>
         <w:lastRenderedPageBreak/>
         <w:drawing>
-          <wp:inline distT="0" distB="0" distL="0" distR="0" wp14:anchorId="7DD13BA9" wp14:editId="5EEAB2DC">
+          <wp:inline distT="0" distB="0" distL="0" distR="0" wp14:anchorId="67C4B862" wp14:editId="00E27B38">
             <wp:extent cx="4191000" cy="2886075"/>
             <wp:effectExtent l="0" t="0" r="0" b="0"/>
-            <wp:docPr id="699661801" name="10_sequence_followup.png" descr="Sequence diagram of a follow-up question resolved from memory" title="Figure 4.8 Sequence diagram of a follow-up question resolved from memory"/>
+            <wp:docPr id="1342830502" name="10_sequence_followup.png" descr="Sequence diagram of a follow-up question resolved from memory" title="Figure 4.8 Sequence diagram of a follow-up question resolved from memory"/>
             <wp:cNvGraphicFramePr>
               <a:graphicFrameLocks xmlns:a="http://schemas.openxmlformats.org/drawingml/2006/main" noChangeAspect="1"/>
             </wp:cNvGraphicFramePr>
@@ -14354,7 +14354,7 @@
         <w:pStyle w:val="Heading2"/>
         <w:spacing w:before="240" w:after="120"/>
       </w:pPr>
-      <w:bookmarkStart w:id="26" w:name="_Toc242618185"/>
+      <w:bookmarkStart w:id="26" w:name="_Toc242795821"/>
       <w:r>
         <w:t>4.4 Database Design</w:t>
       </w:r>
@@ -14381,10 +14381,10 @@
         </w:rPr>
         <w:lastRenderedPageBreak/>
         <w:drawing>
-          <wp:inline distT="0" distB="0" distL="0" distR="0" wp14:anchorId="6CDC947C" wp14:editId="65394ED5">
+          <wp:inline distT="0" distB="0" distL="0" distR="0" wp14:anchorId="0B9DD13D" wp14:editId="4070C5FC">
             <wp:extent cx="3810000" cy="2619375"/>
             <wp:effectExtent l="0" t="0" r="0" b="0"/>
-            <wp:docPr id="1397570843" name="08_er_diagram.png" descr="Entity-relationship diagram" title="Figure 4.9 Entity-relationship diagram"/>
+            <wp:docPr id="1450052579" name="08_er_diagram.png" descr="Entity-relationship diagram" title="Figure 4.9 Entity-relationship diagram"/>
             <wp:cNvGraphicFramePr>
               <a:graphicFrameLocks xmlns:a="http://schemas.openxmlformats.org/drawingml/2006/main" noChangeAspect="1"/>
             </wp:cNvGraphicFramePr>
@@ -14481,7 +14481,7 @@
           <w:left w:w="10" w:type="dxa"/>
           <w:right w:w="10" w:type="dxa"/>
         </w:tblCellMar>
-        <w:tblLook w:val="04A0" w:firstRow="1" w:lastRow="0" w:firstColumn="1" w:lastColumn="0" w:noHBand="0" w:noVBand="1"/>
+        <w:tblLook w:val="0000" w:firstRow="0" w:lastRow="0" w:firstColumn="0" w:lastColumn="0" w:noHBand="0" w:noVBand="0"/>
       </w:tblPr>
       <w:tblGrid>
         <w:gridCol w:w="2600"/>
@@ -15171,7 +15171,7 @@
           <w:left w:w="10" w:type="dxa"/>
           <w:right w:w="10" w:type="dxa"/>
         </w:tblCellMar>
-        <w:tblLook w:val="04A0" w:firstRow="1" w:lastRow="0" w:firstColumn="1" w:lastColumn="0" w:noHBand="0" w:noVBand="1"/>
+        <w:tblLook w:val="0000" w:firstRow="0" w:lastRow="0" w:firstColumn="0" w:lastColumn="0" w:noHBand="0" w:noVBand="0"/>
       </w:tblPr>
       <w:tblGrid>
         <w:gridCol w:w="2600"/>
@@ -15648,7 +15648,7 @@
         <w:pStyle w:val="Heading2"/>
         <w:spacing w:before="240" w:after="120"/>
       </w:pPr>
-      <w:bookmarkStart w:id="27" w:name="_Toc242618186"/>
+      <w:bookmarkStart w:id="27" w:name="_Toc242795822"/>
       <w:r>
         <w:t>4.5 UI / UX Design</w:t>
       </w:r>
@@ -15674,10 +15674,10 @@
           <w:noProof/>
         </w:rPr>
         <w:drawing>
-          <wp:inline distT="0" distB="0" distL="0" distR="0" wp14:anchorId="62922FE5" wp14:editId="1D446153">
+          <wp:inline distT="0" distB="0" distL="0" distR="0" wp14:anchorId="41683C0F" wp14:editId="56D4F5FF">
             <wp:extent cx="4095750" cy="3200400"/>
             <wp:effectExtent l="0" t="0" r="0" b="0"/>
-            <wp:docPr id="37520373" name="ui-chat.png" descr="Chat view: related files with the reason each is linked" title="Figure 4.10 Chat view: related files with the reason each is linked"/>
+            <wp:docPr id="234286648" name="ui-chat.png" descr="Chat view: related files with the reason each is linked" title="Figure 4.10 Chat view: related files with the reason each is linked"/>
             <wp:cNvGraphicFramePr>
               <a:graphicFrameLocks xmlns:a="http://schemas.openxmlformats.org/drawingml/2006/main" noChangeAspect="1"/>
             </wp:cNvGraphicFramePr>
@@ -15744,7 +15744,7 @@
         <w:pStyle w:val="Heading2"/>
         <w:spacing w:before="240" w:after="120"/>
       </w:pPr>
-      <w:bookmarkStart w:id="28" w:name="_Toc242618187"/>
+      <w:bookmarkStart w:id="28" w:name="_Toc242795823"/>
       <w:r>
         <w:t>4.6 Technology Stack</w:t>
       </w:r>
@@ -15789,7 +15789,7 @@
           <w:left w:w="10" w:type="dxa"/>
           <w:right w:w="10" w:type="dxa"/>
         </w:tblCellMar>
-        <w:tblLook w:val="04A0" w:firstRow="1" w:lastRow="0" w:firstColumn="1" w:lastColumn="0" w:noHBand="0" w:noVBand="1"/>
+        <w:tblLook w:val="0000" w:firstRow="0" w:lastRow="0" w:firstColumn="0" w:lastColumn="0" w:noHBand="0" w:noVBand="0"/>
       </w:tblPr>
       <w:tblGrid>
         <w:gridCol w:w="2200"/>
@@ -16261,7 +16261,7 @@
         <w:spacing w:before="240" w:after="280"/>
         <w:jc w:val="center"/>
       </w:pPr>
-      <w:bookmarkStart w:id="29" w:name="_Toc242618188"/>
+      <w:bookmarkStart w:id="29" w:name="_Toc242795824"/>
       <w:r>
         <w:lastRenderedPageBreak/>
         <w:t>IMPLEMENTATION</w:t>
@@ -16273,7 +16273,7 @@
         <w:pStyle w:val="Heading2"/>
         <w:spacing w:before="240" w:after="120"/>
       </w:pPr>
-      <w:bookmarkStart w:id="30" w:name="_Toc242618189"/>
+      <w:bookmarkStart w:id="30" w:name="_Toc242795825"/>
       <w:r>
         <w:t>5.1 Module-wise Description</w:t>
       </w:r>
@@ -16284,7 +16284,7 @@
         <w:pStyle w:val="Heading3"/>
         <w:spacing w:before="200" w:after="100"/>
       </w:pPr>
-      <w:bookmarkStart w:id="31" w:name="_Toc242618190"/>
+      <w:bookmarkStart w:id="31" w:name="_Toc242795826"/>
       <w:r>
         <w:t>5.1.1 Natural Language Interface</w:t>
       </w:r>
@@ -16304,7 +16304,7 @@
         <w:pStyle w:val="Heading3"/>
         <w:spacing w:before="200" w:after="100"/>
       </w:pPr>
-      <w:bookmarkStart w:id="32" w:name="_Toc242618191"/>
+      <w:bookmarkStart w:id="32" w:name="_Toc242795827"/>
       <w:r>
         <w:t>5.1.2 Semantic Search Engine</w:t>
       </w:r>
@@ -16324,7 +16324,7 @@
         <w:pStyle w:val="Heading3"/>
         <w:spacing w:before="200" w:after="100"/>
       </w:pPr>
-      <w:bookmarkStart w:id="33" w:name="_Toc242618192"/>
+      <w:bookmarkStart w:id="33" w:name="_Toc242795828"/>
       <w:r>
         <w:t>5.1.3 AI File Organiser</w:t>
       </w:r>
@@ -16344,7 +16344,7 @@
         <w:pStyle w:val="Heading3"/>
         <w:spacing w:before="200" w:after="100"/>
       </w:pPr>
-      <w:bookmarkStart w:id="34" w:name="_Toc242618193"/>
+      <w:bookmarkStart w:id="34" w:name="_Toc242795829"/>
       <w:r>
         <w:t>5.1.4 Knowledge Graph</w:t>
       </w:r>
@@ -16356,7 +16356,10 @@
         <w:jc w:val="both"/>
       </w:pPr>
       <w:r>
-        <w:t>Three kinds of edge are computed: similar content, from the cosine similarity of the centred mean embedding of each file; direct reference, when one file's text names another file; and shared tags, when two files share at least two tags. Each file keeps its three strongest neighbours. Clusters are built by average-linkage merging, which joins two groups only while the average weight between their members stays above a threshold.</w:t>
+        <w:t>Three kinds of edge are computed: similar content, from the cosine similarity of the centred mean embedding of each file; direct reference, when one file's text names another file; and shared tags, when two files share at least two tags. Each file keeps its three strongest neighbours. Clusters are built by average-linkage merging, which joins two groups only while the average weight between their members stays above a threshold. Two steps were made fast enough for thousands of files: the reference check fil</w:t>
+      </w:r>
+      <w:r>
+        <w:t>es each file name under its rarest alphanumeric token so that a text is searched only for the names whose token it contains, and the clustering keeps its candidate merges in a heap over per-group adjacency instead of rescanning every link after each merge.</w:t>
       </w:r>
     </w:p>
     <w:p>
@@ -16364,7 +16367,7 @@
         <w:pStyle w:val="Heading3"/>
         <w:spacing w:before="200" w:after="100"/>
       </w:pPr>
-      <w:bookmarkStart w:id="35" w:name="_Toc242618194"/>
+      <w:bookmarkStart w:id="35" w:name="_Toc242795830"/>
       <w:r>
         <w:t>5.1.5 Context Memory Engine</w:t>
       </w:r>
@@ -16376,7 +16379,11 @@
         <w:jc w:val="both"/>
       </w:pPr>
       <w:r>
-        <w:t>Every turn is stored with the identifiers of the files it showed. A follow-up such as “open the second one” or “open it” resolves to a file by rule. Only when no rule applies, and no confident search matches the request, is the model's own judgement used. This ordering was introduced after a live failure described in Section 7.3.</w:t>
+        <w:t xml:space="preserve">Every turn is stored with the identifiers of the files it showed. A follow-up such as “open the second one” or “open it” resolves to a file by rule. Only when no rule applies, and no confident </w:t>
+      </w:r>
+      <w:r>
+        <w:lastRenderedPageBreak/>
+        <w:t>search matches the request, is the model's own judgement used. This ordering was introduced after a live failure described in Section 7.3.</w:t>
       </w:r>
     </w:p>
     <w:p>
@@ -16384,9 +16391,8 @@
         <w:pStyle w:val="Heading3"/>
         <w:spacing w:before="200" w:after="100"/>
       </w:pPr>
-      <w:bookmarkStart w:id="36" w:name="_Toc242618195"/>
-      <w:r>
-        <w:lastRenderedPageBreak/>
+      <w:bookmarkStart w:id="36" w:name="_Toc242795831"/>
+      <w:r>
         <w:t>5.1.6 Intelligent Workspace Manager</w:t>
       </w:r>
       <w:bookmarkEnd w:id="36"/>
@@ -16405,7 +16411,7 @@
         <w:pStyle w:val="Heading3"/>
         <w:spacing w:before="200" w:after="100"/>
       </w:pPr>
-      <w:bookmarkStart w:id="37" w:name="_Toc242618196"/>
+      <w:bookmarkStart w:id="37" w:name="_Toc242795832"/>
       <w:r>
         <w:t>5.1.7 Privacy audit</w:t>
       </w:r>
@@ -16425,7 +16431,7 @@
         <w:pStyle w:val="Heading2"/>
         <w:spacing w:before="240" w:after="120"/>
       </w:pPr>
-      <w:bookmarkStart w:id="38" w:name="_Toc242618197"/>
+      <w:bookmarkStart w:id="38" w:name="_Toc242795833"/>
       <w:r>
         <w:t>5.2 Technologies Used</w:t>
       </w:r>
@@ -16445,7 +16451,7 @@
         <w:pStyle w:val="Heading2"/>
         <w:spacing w:before="240" w:after="120"/>
       </w:pPr>
-      <w:bookmarkStart w:id="39" w:name="_Toc242618198"/>
+      <w:bookmarkStart w:id="39" w:name="_Toc242795834"/>
       <w:r>
         <w:t>5.3 Code Snippets</w:t>
       </w:r>
@@ -16643,7 +16649,7 @@
         <w:pStyle w:val="Heading2"/>
         <w:spacing w:before="240" w:after="120"/>
       </w:pPr>
-      <w:bookmarkStart w:id="40" w:name="_Toc242618199"/>
+      <w:bookmarkStart w:id="40" w:name="_Toc242795835"/>
       <w:r>
         <w:lastRenderedPageBreak/>
         <w:t>5.4 Screenshots of Outputs</w:t>
@@ -16661,10 +16667,10 @@
           <w:noProof/>
         </w:rPr>
         <w:drawing>
-          <wp:inline distT="0" distB="0" distL="0" distR="0" wp14:anchorId="63566DAA" wp14:editId="05B9FBA9">
+          <wp:inline distT="0" distB="0" distL="0" distR="0" wp14:anchorId="42EE1CB7" wp14:editId="43D07398">
             <wp:extent cx="4095750" cy="3200400"/>
             <wp:effectExtent l="0" t="0" r="0" b="0"/>
-            <wp:docPr id="811744748" name="ui-knowledge-graph.png" descr="Knowledge-graph view with a selected file and its neighbours" title="Figure 5.1 Knowledge-graph view with a selected file and its neighbours"/>
+            <wp:docPr id="578096056" name="ui-knowledge-graph.png" descr="Knowledge-graph view with a selected file and its neighbours" title="Figure 5.1 Knowledge-graph view with a selected file and its neighbours"/>
             <wp:cNvGraphicFramePr>
               <a:graphicFrameLocks xmlns:a="http://schemas.openxmlformats.org/drawingml/2006/main" noChangeAspect="1"/>
             </wp:cNvGraphicFramePr>
@@ -16733,10 +16739,10 @@
           <w:noProof/>
         </w:rPr>
         <w:drawing>
-          <wp:inline distT="0" distB="0" distL="0" distR="0" wp14:anchorId="4AF84142" wp14:editId="30EC6A07">
+          <wp:inline distT="0" distB="0" distL="0" distR="0" wp14:anchorId="2EEF6344" wp14:editId="30BFE166">
             <wp:extent cx="4095750" cy="3200400"/>
             <wp:effectExtent l="0" t="0" r="0" b="0"/>
-            <wp:docPr id="839417624" name="ui-workspaces.png" descr="Workspace view with a created workspace and suggestions" title="Figure 5.2 Workspace view with a created workspace and suggestions"/>
+            <wp:docPr id="1708260658" name="ui-workspaces.png" descr="Workspace view with a created workspace and suggestions" title="Figure 5.2 Workspace view with a created workspace and suggestions"/>
             <wp:cNvGraphicFramePr>
               <a:graphicFrameLocks xmlns:a="http://schemas.openxmlformats.org/drawingml/2006/main" noChangeAspect="1"/>
             </wp:cNvGraphicFramePr>
@@ -16806,7 +16812,7 @@
         <w:spacing w:before="240" w:after="280"/>
         <w:jc w:val="center"/>
       </w:pPr>
-      <w:bookmarkStart w:id="41" w:name="_Toc242618200"/>
+      <w:bookmarkStart w:id="41" w:name="_Toc242795836"/>
       <w:r>
         <w:lastRenderedPageBreak/>
         <w:t>TESTING AND VALIDATION</w:t>
@@ -16818,7 +16824,7 @@
         <w:pStyle w:val="Heading2"/>
         <w:spacing w:before="240" w:after="120"/>
       </w:pPr>
-      <w:bookmarkStart w:id="42" w:name="_Toc242618201"/>
+      <w:bookmarkStart w:id="42" w:name="_Toc242795837"/>
       <w:r>
         <w:t>6.1 Testing Types</w:t>
       </w:r>
@@ -16863,7 +16869,7 @@
           <w:left w:w="10" w:type="dxa"/>
           <w:right w:w="10" w:type="dxa"/>
         </w:tblCellMar>
-        <w:tblLook w:val="04A0" w:firstRow="1" w:lastRow="0" w:firstColumn="1" w:lastColumn="0" w:noHBand="0" w:noVBand="1"/>
+        <w:tblLook w:val="0000" w:firstRow="0" w:lastRow="0" w:firstColumn="0" w:lastColumn="0" w:noHBand="0" w:noVBand="0"/>
       </w:tblPr>
       <w:tblGrid>
         <w:gridCol w:w="1678"/>
@@ -17303,7 +17309,7 @@
               <w:spacing w:line="276" w:lineRule="auto"/>
             </w:pPr>
             <w:r>
-              <w:t>The vectorised similarity against the original pairwise loop on random data</w:t>
+              <w:t>The vectorised similarity, the token-indexed reference check and the heap clustering against their original all-pairs definitions on random data</w:t>
             </w:r>
           </w:p>
         </w:tc>
@@ -17429,7 +17435,7 @@
         <w:pStyle w:val="Heading2"/>
         <w:spacing w:before="240" w:after="120"/>
       </w:pPr>
-      <w:bookmarkStart w:id="43" w:name="_Toc242618202"/>
+      <w:bookmarkStart w:id="43" w:name="_Toc242795838"/>
       <w:r>
         <w:t>6.2 Test Cases and Results</w:t>
       </w:r>
@@ -17441,7 +17447,7 @@
         <w:jc w:val="both"/>
       </w:pPr>
       <w:r>
-        <w:t>The automated suite runs offline: model calls are replaced by fixtures that return fixed vectors, so the suite needs no model runtime and runs in well under a minute. It runs on every push in continuous integration, and all 116 tests passed at the time of writing. The table shows selected cases; each one was also run against the live models.</w:t>
+        <w:t>The automated suite runs offline: model calls are replaced by fixtures that return fixed vectors, so the suite needs no model runtime and runs in well under a minute. It runs on every push in continuous integration, and all 123 tests passed at the time of writing. The table shows selected cases; each one was also run against the live models.</w:t>
       </w:r>
     </w:p>
     <w:p>
@@ -17483,7 +17489,7 @@
           <w:left w:w="10" w:type="dxa"/>
           <w:right w:w="10" w:type="dxa"/>
         </w:tblCellMar>
-        <w:tblLook w:val="04A0" w:firstRow="1" w:lastRow="0" w:firstColumn="1" w:lastColumn="0" w:noHBand="0" w:noVBand="1"/>
+        <w:tblLook w:val="0000" w:firstRow="0" w:lastRow="0" w:firstColumn="0" w:lastColumn="0" w:noHBand="0" w:noVBand="0"/>
       </w:tblPr>
       <w:tblGrid>
         <w:gridCol w:w="3000"/>
@@ -17808,6 +17814,7 @@
               <w:spacing w:line="276" w:lineRule="auto"/>
             </w:pPr>
             <w:r>
+              <w:lastRenderedPageBreak/>
               <w:t>Open a weak match</w:t>
             </w:r>
           </w:p>
@@ -17897,7 +17904,6 @@
               <w:spacing w:line="276" w:lineRule="auto"/>
             </w:pPr>
             <w:r>
-              <w:lastRenderedPageBreak/>
               <w:t>Open “the second one” after a search</w:t>
             </w:r>
           </w:p>
@@ -18501,7 +18507,7 @@
         <w:spacing w:before="240" w:after="280"/>
         <w:jc w:val="center"/>
       </w:pPr>
-      <w:bookmarkStart w:id="44" w:name="_Toc242618203"/>
+      <w:bookmarkStart w:id="44" w:name="_Toc242795839"/>
       <w:r>
         <w:lastRenderedPageBreak/>
         <w:t>RESULTS AND DISCUSSION</w:t>
@@ -18513,7 +18519,7 @@
         <w:pStyle w:val="Heading2"/>
         <w:spacing w:before="240" w:after="120"/>
       </w:pPr>
-      <w:bookmarkStart w:id="45" w:name="_Toc242618204"/>
+      <w:bookmarkStart w:id="45" w:name="_Toc242795840"/>
       <w:r>
         <w:t>7.1 Performance Evaluation</w:t>
       </w:r>
@@ -18570,7 +18576,7 @@
           <w:left w:w="10" w:type="dxa"/>
           <w:right w:w="10" w:type="dxa"/>
         </w:tblCellMar>
-        <w:tblLook w:val="04A0" w:firstRow="1" w:lastRow="0" w:firstColumn="1" w:lastColumn="0" w:noHBand="0" w:noVBand="1"/>
+        <w:tblLook w:val="0000" w:firstRow="0" w:lastRow="0" w:firstColumn="0" w:lastColumn="0" w:noHBand="0" w:noVBand="0"/>
       </w:tblPr>
       <w:tblGrid>
         <w:gridCol w:w="1300"/>
@@ -18809,7 +18815,7 @@
               <w:spacing w:line="276" w:lineRule="auto"/>
             </w:pPr>
             <w:r>
-              <w:t>25.7</w:t>
+              <w:t>25.2</w:t>
             </w:r>
           </w:p>
         </w:tc>
@@ -18835,7 +18841,7 @@
               <w:spacing w:line="276" w:lineRule="auto"/>
             </w:pPr>
             <w:r>
-              <w:t>19.4</w:t>
+              <w:t>19.9</w:t>
             </w:r>
           </w:p>
         </w:tc>
@@ -18861,7 +18867,7 @@
               <w:spacing w:line="276" w:lineRule="auto"/>
             </w:pPr>
             <w:r>
-              <w:t>1.7</w:t>
+              <w:t>0.4</w:t>
             </w:r>
           </w:p>
         </w:tc>
@@ -18950,7 +18956,7 @@
               <w:spacing w:line="276" w:lineRule="auto"/>
             </w:pPr>
             <w:r>
-              <w:t>129.0</w:t>
+              <w:t>86.1</w:t>
             </w:r>
           </w:p>
         </w:tc>
@@ -18976,7 +18982,7 @@
               <w:spacing w:line="276" w:lineRule="auto"/>
             </w:pPr>
             <w:r>
-              <w:t>15.5</w:t>
+              <w:t>23.2</w:t>
             </w:r>
           </w:p>
         </w:tc>
@@ -19002,7 +19008,7 @@
               <w:spacing w:line="276" w:lineRule="auto"/>
             </w:pPr>
             <w:r>
-              <w:t>24.8</w:t>
+              <w:t>1.3</w:t>
             </w:r>
           </w:p>
         </w:tc>
@@ -19091,7 +19097,7 @@
               <w:spacing w:line="276" w:lineRule="auto"/>
             </w:pPr>
             <w:r>
-              <w:t>446.5</w:t>
+              <w:t>276.3</w:t>
             </w:r>
           </w:p>
         </w:tc>
@@ -19117,7 +19123,7 @@
               <w:spacing w:line="276" w:lineRule="auto"/>
             </w:pPr>
             <w:r>
-              <w:t>11.2</w:t>
+              <w:t>18.1</w:t>
             </w:r>
           </w:p>
         </w:tc>
@@ -19143,7 +19149,7 @@
               <w:spacing w:line="276" w:lineRule="auto"/>
             </w:pPr>
             <w:r>
-              <w:t>143.3</w:t>
+              <w:t>3.2</w:t>
             </w:r>
           </w:p>
         </w:tc>
@@ -19181,7 +19187,10 @@
         <w:jc w:val="both"/>
       </w:pPr>
       <w:r>
-        <w:t>Index time includes the knowledge-graph rebuild, which runs after each indexing pass that changed something. Before the vectorisation the same measurement at 2,000 files was 372.5 seconds for indexing, including a graph rebuild of 246.1 seconds. The 5,000-file graph rebuild of 143.3 seconds shows that the pairwise reference check and the clustering step still grow faster than linearly; the report treats this as a limitation rather than a solved problem.</w:t>
+        <w:t>Index time includes the knowledge-graph rebuild, which runs after each indexing pass that changed something. Before the vectorisation the same measurement at 2,000 files was 372.5 seconds for indexing, including a graph rebuild of 246.1 seconds. After vectorising the similarity step the 5,000-file rebuild was still 143.3 seconds, and profiling showed that 98% of it was the reference check, an all-pairs regular-expression search. Filing each file name under its rarest alphanumeric token, so that a text is on</w:t>
+      </w:r>
+      <w:r>
+        <w:t>ly searched for names whose token it contains, and replacing the clustering rescan with a heap over per-group adjacency, brought the 5,000-file rebuild to 3.2 seconds with the same 11938 links. At that size the graph is 1% of the 276.3 second index pass; embedding the files now dominates.</w:t>
       </w:r>
     </w:p>
     <w:p>
@@ -19223,7 +19232,7 @@
           <w:left w:w="10" w:type="dxa"/>
           <w:right w:w="10" w:type="dxa"/>
         </w:tblCellMar>
-        <w:tblLook w:val="04A0" w:firstRow="1" w:lastRow="0" w:firstColumn="1" w:lastColumn="0" w:noHBand="0" w:noVBand="1"/>
+        <w:tblLook w:val="0000" w:firstRow="0" w:lastRow="0" w:firstColumn="0" w:lastColumn="0" w:noHBand="0" w:noVBand="0"/>
       </w:tblPr>
       <w:tblGrid>
         <w:gridCol w:w="1300"/>
@@ -19462,7 +19471,7 @@
               <w:spacing w:line="276" w:lineRule="auto"/>
             </w:pPr>
             <w:r>
-              <w:t>50.7</w:t>
+              <w:t>34.5</w:t>
             </w:r>
           </w:p>
         </w:tc>
@@ -19488,7 +19497,7 @@
               <w:spacing w:line="276" w:lineRule="auto"/>
             </w:pPr>
             <w:r>
-              <w:t>61.3</w:t>
+              <w:t>60.7</w:t>
             </w:r>
           </w:p>
         </w:tc>
@@ -19577,6 +19586,7 @@
               <w:spacing w:line="276" w:lineRule="auto"/>
             </w:pPr>
             <w:r>
+              <w:lastRenderedPageBreak/>
               <w:t>2,000</w:t>
             </w:r>
           </w:p>
@@ -19603,7 +19613,7 @@
               <w:spacing w:line="276" w:lineRule="auto"/>
             </w:pPr>
             <w:r>
-              <w:t>121.0</w:t>
+              <w:t>106.5</w:t>
             </w:r>
           </w:p>
         </w:tc>
@@ -19629,7 +19639,7 @@
               <w:spacing w:line="276" w:lineRule="auto"/>
             </w:pPr>
             <w:r>
-              <w:t>140.3</w:t>
+              <w:t>126.7</w:t>
             </w:r>
           </w:p>
         </w:tc>
@@ -19744,7 +19754,7 @@
               <w:spacing w:line="276" w:lineRule="auto"/>
             </w:pPr>
             <w:r>
-              <w:t>203.5</w:t>
+              <w:t>204.7</w:t>
             </w:r>
           </w:p>
         </w:tc>
@@ -19770,7 +19780,7 @@
               <w:spacing w:line="276" w:lineRule="auto"/>
             </w:pPr>
             <w:r>
-              <w:t>239.0</w:t>
+              <w:t>232.7</w:t>
             </w:r>
           </w:p>
         </w:tc>
@@ -19834,11 +19844,7 @@
         <w:jc w:val="both"/>
       </w:pPr>
       <w:r>
-        <w:t xml:space="preserve">Precision@5 is the share of the five best results that come from the topic the query describes. On this synthetic data it stays at the maximum, so it shows that the topics separate, but it does </w:t>
-      </w:r>
-      <w:r>
-        <w:lastRenderedPageBreak/>
-        <w:t>not measure retrieval on real documents. The controlled comparison in Section 7.2 addresses that on the demonstration vault.</w:t>
+        <w:t>Precision@5 is the share of the five best results that come from the topic the query describes. On this synthetic data it stays at the maximum, so it shows that the topics separate, but it does not measure retrieval on real documents. The controlled comparison in Section 7.2 addresses that on the demonstration vault.</w:t>
       </w:r>
     </w:p>
     <w:p>
@@ -19852,10 +19858,10 @@
           <w:noProof/>
         </w:rPr>
         <w:drawing>
-          <wp:inline distT="0" distB="0" distL="0" distR="0" wp14:anchorId="78AC5B57" wp14:editId="07391FC8">
+          <wp:inline distT="0" distB="0" distL="0" distR="0" wp14:anchorId="4C36DAA6" wp14:editId="6F6EEEEA">
             <wp:extent cx="4191000" cy="1257300"/>
             <wp:effectExtent l="0" t="0" r="0" b="0"/>
-            <wp:docPr id="728322961" name="fig_scale.png" descr="Scale results: graph rebuild time, indexing throughput and search latency" title="Figure 7.1 Scale results: graph rebuild time, indexing throughput and search latency"/>
+            <wp:docPr id="392475381" name="fig_scale.png" descr="Scale results: graph rebuild time, indexing throughput and search latency" title="Figure 7.1 Scale results: graph rebuild time, indexing throughput and search latency"/>
             <wp:cNvGraphicFramePr>
               <a:graphicFrameLocks xmlns:a="http://schemas.openxmlformats.org/drawingml/2006/main" noChangeAspect="1"/>
             </wp:cNvGraphicFramePr>
@@ -19910,7 +19916,7 @@
         <w:jc w:val="both"/>
       </w:pPr>
       <w:r>
-        <w:t>Figure 7.1 plots the same runs as Tables 7.1 and 7.2. Panel (a) shows the knowledge-graph rebuild time on a logarithmic scale, with the original pairwise loop and the vectorised version side by side; the 5,000-file loop was not measured. Panel (b) shows indexing throughput, which includes the graph rebuild. Panel (c) shows median and 95th-percentile search latency, which grows with the number of stored vectors.</w:t>
+        <w:t>Figure 7.1 plots the same runs as Tables 7.1 and 7.2. Panel (a) shows the knowledge-graph rebuild time on a logarithmic scale, with the original pairwise loop, the vectorised-similarity version and the final version side by side; the 5,000-file loop was not measured. Panel (b) shows indexing throughput, which includes the graph rebuild. Panel (c) shows median and 95th-percentile search latency, which grows with the number of stored vectors.</w:t>
       </w:r>
     </w:p>
     <w:p>
@@ -19918,7 +19924,7 @@
         <w:pStyle w:val="Heading2"/>
         <w:spacing w:before="240" w:after="120"/>
       </w:pPr>
-      <w:bookmarkStart w:id="46" w:name="_Toc242618205"/>
+      <w:bookmarkStart w:id="46" w:name="_Toc242795841"/>
       <w:r>
         <w:t>7.2 Comparison with Existing Systems</w:t>
       </w:r>
@@ -19929,7 +19935,7 @@
         <w:pStyle w:val="Heading3"/>
         <w:spacing w:before="200" w:after="100"/>
       </w:pPr>
-      <w:bookmarkStart w:id="47" w:name="_Toc242618206"/>
+      <w:bookmarkStart w:id="47" w:name="_Toc242795842"/>
       <w:r>
         <w:t>7.2.1 Capability comparison</w:t>
       </w:r>
@@ -19974,7 +19980,7 @@
           <w:left w:w="10" w:type="dxa"/>
           <w:right w:w="10" w:type="dxa"/>
         </w:tblCellMar>
-        <w:tblLook w:val="04A0" w:firstRow="1" w:lastRow="0" w:firstColumn="1" w:lastColumn="0" w:noHBand="0" w:noVBand="1"/>
+        <w:tblLook w:val="0000" w:firstRow="0" w:lastRow="0" w:firstColumn="0" w:lastColumn="0" w:noHBand="0" w:noVBand="0"/>
       </w:tblPr>
       <w:tblGrid>
         <w:gridCol w:w="1710"/>
@@ -20387,6 +20393,7 @@
               <w:spacing w:line="276" w:lineRule="auto"/>
             </w:pPr>
             <w:r>
+              <w:lastRenderedPageBreak/>
               <w:t>Indexes file content</w:t>
             </w:r>
           </w:p>
@@ -20888,7 +20895,6 @@
               <w:spacing w:line="276" w:lineRule="auto"/>
             </w:pPr>
             <w:r>
-              <w:lastRenderedPageBreak/>
               <w:t>Acts on results (organise, reverse)</w:t>
             </w:r>
           </w:p>
@@ -21531,7 +21537,7 @@
         <w:pStyle w:val="Heading3"/>
         <w:spacing w:before="200" w:after="100"/>
       </w:pPr>
-      <w:bookmarkStart w:id="48" w:name="_Toc242618207"/>
+      <w:bookmarkStart w:id="48" w:name="_Toc242795843"/>
       <w:r>
         <w:t>7.2.2 Measured retrieval comparison</w:t>
       </w:r>
@@ -21556,7 +21562,8 @@
         <w:jc w:val="both"/>
       </w:pPr>
       <w:r>
-        <w:t>Table 7.4 (page 26) gives the results.</w:t>
+        <w:lastRenderedPageBreak/>
+        <w:t>Table 7.4 (page 27) gives the results.</w:t>
       </w:r>
     </w:p>
     <w:p>
@@ -21588,7 +21595,7 @@
           <w:left w:w="10" w:type="dxa"/>
           <w:right w:w="10" w:type="dxa"/>
         </w:tblCellMar>
-        <w:tblLook w:val="04A0" w:firstRow="1" w:lastRow="0" w:firstColumn="1" w:lastColumn="0" w:noHBand="0" w:noVBand="1"/>
+        <w:tblLook w:val="0000" w:firstRow="0" w:lastRow="0" w:firstColumn="0" w:lastColumn="0" w:noHBand="0" w:noVBand="0"/>
       </w:tblPr>
       <w:tblGrid>
         <w:gridCol w:w="2200"/>
@@ -22253,7 +22260,6 @@
               <w:spacing w:line="276" w:lineRule="auto"/>
             </w:pPr>
             <w:r>
-              <w:lastRenderedPageBreak/>
               <w:t>Embedding only</w:t>
             </w:r>
           </w:p>
@@ -22632,10 +22638,10 @@
           <w:noProof/>
         </w:rPr>
         <w:drawing>
-          <wp:inline distT="0" distB="0" distL="0" distR="0" wp14:anchorId="3584E2D8" wp14:editId="45FF523C">
+          <wp:inline distT="0" distB="0" distL="0" distR="0" wp14:anchorId="0DD07455" wp14:editId="110B94F5">
             <wp:extent cx="3429000" cy="2066925"/>
             <wp:effectExtent l="0" t="0" r="0" b="0"/>
-            <wp:docPr id="714089197" name="fig_retrieval.png" descr="Hit@1 by system and query group, with 95% Wilson intervals" title="Figure 7.2 Hit@1 by system and query group, with 95% Wilson intervals"/>
+            <wp:docPr id="144650485" name="fig_retrieval.png" descr="Hit@1 by system and query group, with 95% Wilson intervals" title="Figure 7.2 Hit@1 by system and query group, with 95% Wilson intervals"/>
             <wp:cNvGraphicFramePr>
               <a:graphicFrameLocks xmlns:a="http://schemas.openxmlformats.org/drawingml/2006/main" noChangeAspect="1"/>
             </wp:cNvGraphicFramePr>
@@ -22699,10 +22705,11 @@
         <w:jc w:val="both"/>
       </w:pPr>
       <w:r>
-        <w:t>Two results are less favourable and are reported as measured. First, the keyword boost helps queries that share words (Hit@1 0.92 to 1.00) but costs one of the 10 paraphrase queries (0.90 to 0.80); the intervals overlap, so the data cannot separate the two configurations. Second, DreamOS missed rank 1 on two queries (“remarks from our mentor about what to improve” and “spending breakdown for the semester”), both of which placed an unrelated quotes file first with the correct file second. The baselines are r</w:t>
-      </w:r>
-      <w:r>
-        <w:t>eference implementations of the lexical class, not the Windows Search, Spotlight or Everything products, so the table supports a claim about lexical versus embedding retrieval, not about any named product.</w:t>
+        <w:t xml:space="preserve">Two results are less favourable and are reported as measured. First, the keyword boost helps queries that share words (Hit@1 0.92 to 1.00) but costs one of the 10 paraphrase queries (0.90 to 0.80); the intervals overlap, so the data cannot separate the two configurations. Second, </w:t>
+      </w:r>
+      <w:r>
+        <w:lastRenderedPageBreak/>
+        <w:t>DreamOS missed rank 1 on two queries (“remarks from our mentor about what to improve” and “spending breakdown for the semester”), both of which placed an unrelated quotes file first with the correct file second. The baselines are reference implementations of the lexical class, not the Windows Search, Spotlight or Everything products, so the table supports a claim about lexical versus embedding retrieval, not about any named product.</w:t>
       </w:r>
     </w:p>
     <w:p>
@@ -22710,9 +22717,8 @@
         <w:pStyle w:val="Heading2"/>
         <w:spacing w:before="240" w:after="120"/>
       </w:pPr>
-      <w:bookmarkStart w:id="49" w:name="_Toc242618208"/>
-      <w:r>
-        <w:lastRenderedPageBreak/>
+      <w:bookmarkStart w:id="49" w:name="_Toc242795844"/>
+      <w:r>
         <w:t>7.3 Observations</w:t>
       </w:r>
       <w:bookmarkEnd w:id="49"/>
@@ -22756,7 +22762,7 @@
           <w:left w:w="10" w:type="dxa"/>
           <w:right w:w="10" w:type="dxa"/>
         </w:tblCellMar>
-        <w:tblLook w:val="04A0" w:firstRow="1" w:lastRow="0" w:firstColumn="1" w:lastColumn="0" w:noHBand="0" w:noVBand="1"/>
+        <w:tblLook w:val="0000" w:firstRow="0" w:lastRow="0" w:firstColumn="0" w:lastColumn="0" w:noHBand="0" w:noVBand="0"/>
       </w:tblPr>
       <w:tblGrid>
         <w:gridCol w:w="2900"/>
@@ -23218,7 +23224,7 @@
               <w:spacing w:line="276" w:lineRule="auto"/>
             </w:pPr>
             <w:r>
-              <w:t>19.4</w:t>
+              <w:t>19.9</w:t>
             </w:r>
           </w:p>
         </w:tc>
@@ -23333,7 +23339,7 @@
               <w:spacing w:line="276" w:lineRule="auto"/>
             </w:pPr>
             <w:r>
-              <w:t>24.8</w:t>
+              <w:t>1.3</w:t>
             </w:r>
           </w:p>
         </w:tc>
@@ -23359,7 +23365,7 @@
               <w:spacing w:line="276" w:lineRule="auto"/>
             </w:pPr>
             <w:r>
-              <w:t>about 10 times faster</w:t>
+              <w:t>about 195 times faster</w:t>
             </w:r>
           </w:p>
         </w:tc>
@@ -23422,7 +23428,7 @@
               <w:spacing w:line="276" w:lineRule="auto"/>
             </w:pPr>
             <w:r>
-              <w:t>not measured (projected to be hours)</w:t>
+              <w:t>143.3 (vectorised similarity only)</w:t>
             </w:r>
           </w:p>
         </w:tc>
@@ -23448,7 +23454,7 @@
               <w:spacing w:line="276" w:lineRule="auto"/>
             </w:pPr>
             <w:r>
-              <w:t>143.3</w:t>
+              <w:t>3.2</w:t>
             </w:r>
           </w:p>
         </w:tc>
@@ -23474,7 +23480,7 @@
               <w:spacing w:line="276" w:lineRule="auto"/>
             </w:pPr>
             <w:r>
-              <w:t>now measurable; still the main limit</w:t>
+              <w:t>about 45 times faster</w:t>
             </w:r>
           </w:p>
         </w:tc>
@@ -23486,10 +23492,13 @@
         <w:jc w:val="both"/>
       </w:pPr>
       <w:r>
-        <w:t>Three findings from the work matter beyond the code itself. First, a delay of about one second on every model call was caused by the way the machine resolved the name localhost, which tries an IPv6 address first. The fix was to use the IPv4 loopback address directly. Without measurement this would have been blamed on the model. Second, the graph computation was quadratic in the number of files: at 2,000 files it took about fourteen times as long as at 500 files for four times the files, and it would have be</w:t>
-      </w:r>
-      <w:r>
-        <w:t>en unusable at the scale required. Vectorisation, with an equivalence test against the original loop, resolved it. Third, a live rehearsal exposed a failure that the automated tests had not covered: a follow-up question about a new topic was answered with an old result, because the model judged the sentence to refer back to the conversation. The fix gives direct evidence precedence over the model's judgement, and a regression test was written that fails on the old behaviour.</w:t>
+        <w:t>Three findings from the work matter beyond the code itself. First, a delay of about one second on every model call was caused by the way the machine resolved the name localhost, which tries an IPv6 address first. The fix was to use the IPv4 loopback address directly. Without measurement this would have been blamed on the model. Second, the graph computation was quadratic in the number of files: at 2,000 files it took about fourteen times as long as at 500 files for four times the files. Vectorising the simi</w:t>
+      </w:r>
+      <w:r>
+        <w:t>larity step helped, but profiling the 5,000-file run showed that nearly all of the remaining time was a different all-pairs step, the reference check, and then the clustering rescan; each was replaced and checked against the original by a test. Without profiling, the first fix would have been declared enough. Third, a live rehearsal exposed a failure that the automated tests had not covered: a follow-up question about a new topic was answered with an old result, because the model judged the sentence to refe</w:t>
+      </w:r>
+      <w:r>
+        <w:t>r back to the conversation. The fix gives direct evidence precedence over the model's judgement, and a regression test was written that fails on the old behaviour.</w:t>
       </w:r>
     </w:p>
     <w:p>
@@ -23498,6 +23507,7 @@
         <w:jc w:val="both"/>
       </w:pPr>
       <w:r>
+        <w:lastRenderedPageBreak/>
         <w:t>Retrieval on short queries remains the weakest part. A one-word query can rank a file that merely contains the word above the file the user meant. The system reports such results with a confidence label instead of acting on them, which keeps the user in control.</w:t>
       </w:r>
     </w:p>
@@ -23512,7 +23522,7 @@
         <w:spacing w:before="240" w:after="280"/>
         <w:jc w:val="center"/>
       </w:pPr>
-      <w:bookmarkStart w:id="50" w:name="_Toc242618209"/>
+      <w:bookmarkStart w:id="50" w:name="_Toc242795845"/>
       <w:r>
         <w:lastRenderedPageBreak/>
         <w:t>CONCLUSION AND FUTURE SCOPE</w:t>
@@ -23524,7 +23534,7 @@
         <w:pStyle w:val="Heading2"/>
         <w:spacing w:before="240" w:after="120"/>
       </w:pPr>
-      <w:bookmarkStart w:id="51" w:name="_Toc242618210"/>
+      <w:bookmarkStart w:id="51" w:name="_Toc242795846"/>
       <w:r>
         <w:t>8.1 Summary of Work</w:t>
       </w:r>
@@ -23539,7 +23549,7 @@
         <w:t xml:space="preserve">DreamOS was built as a local, meaning-based file manager with six modules, a desktop interface and a privacy audit. It indexes a folder with local embeddings, answers natural-language requests, opens files only on confident matches, organises files reversibly, relates files through a knowledge graph, remembers conversation so that follow-ups work, and recommends workspaces. In a controlled comparison it placed the intended file first for 94% of 36 labelled queries, against 56% for a BM25 content index, and </w:t>
       </w:r>
       <w:r>
-        <w:t>answered paraphrased queries that lexical indexes cannot. It was measured on collections of up to 5,000 files, and the measurements led to two defect fixes and one behavioural fix, each covered by a test.</w:t>
+        <w:t>answered paraphrased queries that lexical indexes cannot. It was measured on collections of up to 5,000 files, and the measurements led to fixes for the name-resolution delay, three all-pairs graph computations and one behavioural defect, each covered by a test.</w:t>
       </w:r>
     </w:p>
     <w:p>
@@ -23547,7 +23557,7 @@
         <w:pStyle w:val="Heading2"/>
         <w:spacing w:before="240" w:after="120"/>
       </w:pPr>
-      <w:bookmarkStart w:id="52" w:name="_Toc242618211"/>
+      <w:bookmarkStart w:id="52" w:name="_Toc242795847"/>
       <w:r>
         <w:t>8.2 Limitations</w:t>
       </w:r>
@@ -23615,7 +23625,7 @@
         <w:spacing w:after="80" w:line="360" w:lineRule="auto"/>
       </w:pPr>
       <w:r>
-        <w:t>The graph rebuild still grows faster than linearly: 143 seconds at 5,000 files. Very large collections would need an approximate nearest-neighbour index and a cheaper reference check.</w:t>
+        <w:t>The similarity step builds a dense matrix of every pair of files, so its memory grows with the square of the collection (about 200 MB at 5,000 files). Collections beyond roughly ten thousand files would need an approximate nearest-neighbour index.</w:t>
       </w:r>
     </w:p>
     <w:p>
@@ -23649,7 +23659,7 @@
         <w:pStyle w:val="Heading2"/>
         <w:spacing w:before="240" w:after="120"/>
       </w:pPr>
-      <w:bookmarkStart w:id="53" w:name="_Toc242618212"/>
+      <w:bookmarkStart w:id="53" w:name="_Toc242795848"/>
       <w:r>
         <w:t>8.3 Future Enhancement</w:t>
       </w:r>
@@ -23745,7 +23755,7 @@
         <w:spacing w:before="240" w:after="280"/>
         <w:jc w:val="center"/>
       </w:pPr>
-      <w:bookmarkStart w:id="54" w:name="_Toc242618213"/>
+      <w:bookmarkStart w:id="54" w:name="_Toc242795849"/>
       <w:r>
         <w:lastRenderedPageBreak/>
         <w:t>REFERENCES</w:t>
@@ -23843,7 +23853,7 @@
         <w:spacing w:before="240" w:after="280"/>
         <w:jc w:val="center"/>
       </w:pPr>
-      <w:bookmarkStart w:id="55" w:name="_Toc242618214"/>
+      <w:bookmarkStart w:id="55" w:name="_Toc242795850"/>
       <w:r>
         <w:lastRenderedPageBreak/>
         <w:t>APPENDICES</w:t>
@@ -23855,7 +23865,7 @@
         <w:pStyle w:val="Heading2"/>
         <w:spacing w:before="240" w:after="120"/>
       </w:pPr>
-      <w:bookmarkStart w:id="56" w:name="_Toc242618215"/>
+      <w:bookmarkStart w:id="56" w:name="_Toc242795851"/>
       <w:r>
         <w:t>Appendix A Source code</w:t>
       </w:r>
@@ -23875,7 +23885,7 @@
         <w:pStyle w:val="Heading2"/>
         <w:spacing w:before="240" w:after="120"/>
       </w:pPr>
-      <w:bookmarkStart w:id="57" w:name="_Toc242618216"/>
+      <w:bookmarkStart w:id="57" w:name="_Toc242795852"/>
       <w:r>
         <w:t>Appendix B Scale benchmark raw results</w:t>
       </w:r>
@@ -23888,7 +23898,7 @@
         <w:jc w:val="both"/>
       </w:pPr>
       <w:r>
-        <w:t>Table B.1 (page 32) gives the raw benchmark output at each size.</w:t>
+        <w:t>Table B.1 (page 33) gives the raw benchmark output at each size.</w:t>
       </w:r>
     </w:p>
     <w:p>
@@ -23920,7 +23930,7 @@
           <w:left w:w="10" w:type="dxa"/>
           <w:right w:w="10" w:type="dxa"/>
         </w:tblCellMar>
-        <w:tblLook w:val="04A0" w:firstRow="1" w:lastRow="0" w:firstColumn="1" w:lastColumn="0" w:noHBand="0" w:noVBand="1"/>
+        <w:tblLook w:val="0000" w:firstRow="0" w:lastRow="0" w:firstColumn="0" w:lastColumn="0" w:noHBand="0" w:noVBand="0"/>
       </w:tblPr>
       <w:tblGrid>
         <w:gridCol w:w="3000"/>
@@ -24241,7 +24251,7 @@
               <w:spacing w:line="276" w:lineRule="auto"/>
             </w:pPr>
             <w:r>
-              <w:t>25.7</w:t>
+              <w:t>25.2</w:t>
             </w:r>
           </w:p>
         </w:tc>
@@ -24267,7 +24277,7 @@
               <w:spacing w:line="276" w:lineRule="auto"/>
             </w:pPr>
             <w:r>
-              <w:t>129.0</w:t>
+              <w:t>86.1</w:t>
             </w:r>
           </w:p>
         </w:tc>
@@ -24293,7 +24303,7 @@
               <w:spacing w:line="276" w:lineRule="auto"/>
             </w:pPr>
             <w:r>
-              <w:t>446.5</w:t>
+              <w:t>276.3</w:t>
             </w:r>
           </w:p>
         </w:tc>
@@ -24356,7 +24366,7 @@
               <w:spacing w:line="276" w:lineRule="auto"/>
             </w:pPr>
             <w:r>
-              <w:t>1.7</w:t>
+              <w:t>0.4</w:t>
             </w:r>
           </w:p>
         </w:tc>
@@ -24382,7 +24392,7 @@
               <w:spacing w:line="276" w:lineRule="auto"/>
             </w:pPr>
             <w:r>
-              <w:t>24.8</w:t>
+              <w:t>1.3</w:t>
             </w:r>
           </w:p>
         </w:tc>
@@ -24408,7 +24418,7 @@
               <w:spacing w:line="276" w:lineRule="auto"/>
             </w:pPr>
             <w:r>
-              <w:t>143.3</w:t>
+              <w:t>3.2</w:t>
             </w:r>
           </w:p>
         </w:tc>
@@ -24586,7 +24596,7 @@
               <w:spacing w:line="276" w:lineRule="auto"/>
             </w:pPr>
             <w:r>
-              <w:t>50.7 / 61.3</w:t>
+              <w:t>34.5 / 60.7</w:t>
             </w:r>
           </w:p>
         </w:tc>
@@ -24612,7 +24622,7 @@
               <w:spacing w:line="276" w:lineRule="auto"/>
             </w:pPr>
             <w:r>
-              <w:t>121.0 / 140.3</w:t>
+              <w:t>106.5 / 126.7</w:t>
             </w:r>
           </w:p>
         </w:tc>
@@ -24638,7 +24648,7 @@
               <w:spacing w:line="276" w:lineRule="auto"/>
             </w:pPr>
             <w:r>
-              <w:t>203.5 / 239.0</w:t>
+              <w:t>204.7 / 232.7</w:t>
             </w:r>
           </w:p>
         </w:tc>
@@ -24649,7 +24659,7 @@
         <w:pStyle w:val="Heading2"/>
         <w:spacing w:before="240" w:after="120"/>
       </w:pPr>
-      <w:bookmarkStart w:id="58" w:name="_Toc242618217"/>
+      <w:bookmarkStart w:id="58" w:name="_Toc242795853"/>
       <w:r>
         <w:t>Appendix C Research paper</w:t>
       </w:r>
@@ -24669,7 +24679,7 @@
         <w:pStyle w:val="Heading2"/>
         <w:spacing w:before="240" w:after="120"/>
       </w:pPr>
-      <w:bookmarkStart w:id="59" w:name="_Toc242618218"/>
+      <w:bookmarkStart w:id="59" w:name="_Toc242795854"/>
       <w:r>
         <w:t>Appendix D Papers and certificates</w:t>
       </w:r>
@@ -24861,10 +24871,10 @@
 <file path=word/numbering.xml><?xml version="1.0" encoding="utf-8"?>
 <w:numbering xmlns:wpc="http://schemas.microsoft.com/office/word/2010/wordprocessingCanvas" xmlns:cx="http://schemas.microsoft.com/office/drawing/2014/chartex" xmlns:cx1="http://schemas.microsoft.com/office/drawing/2015/9/8/chartex" xmlns:cx2="http://schemas.microsoft.com/office/drawing/2015/10/21/chartex" xmlns:cx3="http://schemas.microsoft.com/office/drawing/2016/5/9/chartex" xmlns:cx4="http://schemas.microsoft.com/office/drawing/2016/5/10/chartex" xmlns:cx5="http://schemas.microsoft.com/office/drawing/2016/5/11/chartex" xmlns:cx6="http://schemas.microsoft.com/office/drawing/2016/5/12/chartex" xmlns:cx7="http://schemas.microsoft.com/office/drawing/2016/5/13/chartex" xmlns:cx8="http://schemas.microsoft.com/office/drawing/2016/5/14/chartex" xmlns:mc="http://schemas.openxmlformats.org/markup-compatibility/2006" xmlns:aink="http://schemas.microsoft.com/office/drawing/2016/ink" xmlns:am3d="http://schemas.microsoft.com/office/drawing/2017/model3d" xmlns:o="urn:schemas-microsoft-com:office:office" xmlns:oel="http://schemas.microsoft.com/office/2019/extlst" xmlns:r="http://schemas.openxmlformats.org/officeDocument/2006/relationships" xmlns:m="http://schemas.openxmlformats.org/officeDocument/2006/math" xmlns:v="urn:schemas-microsoft-com:vml" xmlns:wp14="http://schemas.microsoft.com/office/word/2010/wordprocessingDrawing" xmlns:wp="http://schemas.openxmlformats.org/drawingml/2006/wordprocessingDrawing" xmlns:w10="urn:schemas-microsoft-com:office:word" xmlns:w="http://schemas.openxmlformats.org/wordprocessingml/2006/main" xmlns:w14="http://schemas.microsoft.com/office/word/2010/wordml" xmlns:w15="http://schemas.microsoft.com/office/word/2012/wordml" xmlns:w16cex="http://schemas.microsoft.com/office/word/2018/wordml/cex" xmlns:w16cid="http://schemas.microsoft.com/office/word/2016/wordml/cid" xmlns:w16="http://schemas.microsoft.com/office/word/2018/wordml" xmlns:w16du="http://schemas.microsoft.com/office/word/2023/wordml/word16du" xmlns:w16sdtdh="http://schemas.microsoft.com/office/word/2020/wordml/sdtdatahash" xmlns:w16sdtfl="http://schemas.microsoft.com/office/word/2024/wordml/sdtformatlock" xmlns:w16se="http://schemas.microsoft.com/office/word/2015/wordml/symex" xmlns:wpg="http://schemas.microsoft.com/office/word/2010/wordprocessingGroup" xmlns:wpi="http://schemas.microsoft.com/office/word/2010/wordprocessingInk" xmlns:wne="http://schemas.microsoft.com/office/word/2006/wordml" xmlns:wps="http://schemas.microsoft.com/office/word/2010/wordprocessingShape" mc:Ignorable="w14 w15 w16se w16cid w16 w16cex w16sdtdh w16sdtfl w16du wp14">
   <w:abstractNum w:abstractNumId="0" w15:restartNumberingAfterBreak="0">
-    <w:nsid w:val="73C35149"/>
+    <w:nsid w:val="2C3D6779"/>
     <w:multiLevelType w:val="hybridMultilevel"/>
-    <w:tmpl w:val="DB04DC52"/>
-    <w:lvl w:ilvl="0" w:tplc="CE7A938A">
+    <w:tmpl w:val="C3926202"/>
+    <w:lvl w:ilvl="0" w:tplc="77B4AA50">
       <w:start w:val="1"/>
       <w:numFmt w:val="bullet"/>
       <w:lvlText w:val="●"/>
@@ -24873,7 +24883,7 @@
         <w:ind w:left="720" w:hanging="360"/>
       </w:pPr>
     </w:lvl>
-    <w:lvl w:ilvl="1" w:tplc="8D14D346">
+    <w:lvl w:ilvl="1" w:tplc="6A20AFE8">
       <w:start w:val="1"/>
       <w:numFmt w:val="bullet"/>
       <w:lvlText w:val="○"/>
@@ -24882,7 +24892,7 @@
         <w:ind w:left="1440" w:hanging="360"/>
       </w:pPr>
     </w:lvl>
-    <w:lvl w:ilvl="2" w:tplc="E3062032">
+    <w:lvl w:ilvl="2" w:tplc="09845B5C">
       <w:start w:val="1"/>
       <w:numFmt w:val="bullet"/>
       <w:lvlText w:val="■"/>
@@ -24891,7 +24901,7 @@
         <w:ind w:left="2160" w:hanging="360"/>
       </w:pPr>
     </w:lvl>
-    <w:lvl w:ilvl="3" w:tplc="77127464">
+    <w:lvl w:ilvl="3" w:tplc="76320236">
       <w:start w:val="1"/>
       <w:numFmt w:val="bullet"/>
       <w:lvlText w:val="●"/>
@@ -24900,7 +24910,7 @@
         <w:ind w:left="2880" w:hanging="360"/>
       </w:pPr>
     </w:lvl>
-    <w:lvl w:ilvl="4" w:tplc="A228669A">
+    <w:lvl w:ilvl="4" w:tplc="2EFA84E4">
       <w:start w:val="1"/>
       <w:numFmt w:val="bullet"/>
       <w:lvlText w:val="○"/>
@@ -24909,7 +24919,7 @@
         <w:ind w:left="3600" w:hanging="360"/>
       </w:pPr>
     </w:lvl>
-    <w:lvl w:ilvl="5" w:tplc="9648E82A">
+    <w:lvl w:ilvl="5" w:tplc="95ECF396">
       <w:start w:val="1"/>
       <w:numFmt w:val="bullet"/>
       <w:lvlText w:val="■"/>
@@ -24918,7 +24928,7 @@
         <w:ind w:left="4320" w:hanging="360"/>
       </w:pPr>
     </w:lvl>
-    <w:lvl w:ilvl="6" w:tplc="125E2332">
+    <w:lvl w:ilvl="6" w:tplc="844004D0">
       <w:start w:val="1"/>
       <w:numFmt w:val="bullet"/>
       <w:lvlText w:val="●"/>
@@ -24927,7 +24937,7 @@
         <w:ind w:left="5040" w:hanging="360"/>
       </w:pPr>
     </w:lvl>
-    <w:lvl w:ilvl="7" w:tplc="7B10A566">
+    <w:lvl w:ilvl="7" w:tplc="D7A67282">
       <w:start w:val="1"/>
       <w:numFmt w:val="bullet"/>
       <w:lvlText w:val="●"/>
@@ -24936,7 +24946,7 @@
         <w:ind w:left="5760" w:hanging="360"/>
       </w:pPr>
     </w:lvl>
-    <w:lvl w:ilvl="8" w:tplc="E27090CA">
+    <w:lvl w:ilvl="8" w:tplc="4AEE0898">
       <w:start w:val="1"/>
       <w:numFmt w:val="bullet"/>
       <w:lvlText w:val="●"/>
@@ -24947,10 +24957,10 @@
     </w:lvl>
   </w:abstractNum>
   <w:abstractNum w:abstractNumId="1" w15:restartNumberingAfterBreak="0">
-    <w:nsid w:val="7F3E30A2"/>
+    <w:nsid w:val="3D1C0FE8"/>
     <w:multiLevelType w:val="hybridMultilevel"/>
-    <w:tmpl w:val="E1CC0C60"/>
-    <w:lvl w:ilvl="0" w:tplc="0BF2B49A">
+    <w:tmpl w:val="C76E3966"/>
+    <w:lvl w:ilvl="0" w:tplc="86BA11CE">
       <w:start w:val="1"/>
       <w:numFmt w:val="bullet"/>
       <w:lvlText w:val="•"/>
@@ -24959,54 +24969,54 @@
         <w:ind w:left="720" w:hanging="360"/>
       </w:pPr>
     </w:lvl>
-    <w:lvl w:ilvl="1" w:tplc="EEF4B85C">
+    <w:lvl w:ilvl="1" w:tplc="934E987C">
       <w:numFmt w:val="decimal"/>
       <w:lvlText w:val=""/>
       <w:lvlJc w:val="left"/>
     </w:lvl>
-    <w:lvl w:ilvl="2" w:tplc="253A96C4">
+    <w:lvl w:ilvl="2" w:tplc="37926A2C">
       <w:numFmt w:val="decimal"/>
       <w:lvlText w:val=""/>
       <w:lvlJc w:val="left"/>
     </w:lvl>
-    <w:lvl w:ilvl="3" w:tplc="5C988922">
+    <w:lvl w:ilvl="3" w:tplc="99443B34">
       <w:numFmt w:val="decimal"/>
       <w:lvlText w:val=""/>
       <w:lvlJc w:val="left"/>
     </w:lvl>
-    <w:lvl w:ilvl="4" w:tplc="4056B754">
+    <w:lvl w:ilvl="4" w:tplc="8620EC2A">
       <w:numFmt w:val="decimal"/>
       <w:lvlText w:val=""/>
       <w:lvlJc w:val="left"/>
     </w:lvl>
-    <w:lvl w:ilvl="5" w:tplc="C69C03EC">
+    <w:lvl w:ilvl="5" w:tplc="C442A690">
       <w:numFmt w:val="decimal"/>
       <w:lvlText w:val=""/>
       <w:lvlJc w:val="left"/>
     </w:lvl>
-    <w:lvl w:ilvl="6" w:tplc="CD40C426">
+    <w:lvl w:ilvl="6" w:tplc="5A806390">
       <w:numFmt w:val="decimal"/>
       <w:lvlText w:val=""/>
       <w:lvlJc w:val="left"/>
     </w:lvl>
-    <w:lvl w:ilvl="7" w:tplc="7D9C31E2">
+    <w:lvl w:ilvl="7" w:tplc="FFB6A036">
       <w:numFmt w:val="decimal"/>
       <w:lvlText w:val=""/>
       <w:lvlJc w:val="left"/>
     </w:lvl>
-    <w:lvl w:ilvl="8" w:tplc="32C4D206">
+    <w:lvl w:ilvl="8" w:tplc="E0BE64CE">
       <w:numFmt w:val="decimal"/>
       <w:lvlText w:val=""/>
       <w:lvlJc w:val="left"/>
     </w:lvl>
   </w:abstractNum>
-  <w:num w:numId="1" w16cid:durableId="423183481">
+  <w:num w:numId="1" w16cid:durableId="873271226">
     <w:abstractNumId w:val="0"/>
     <w:lvlOverride w:ilvl="0">
       <w:startOverride w:val="1"/>
     </w:lvlOverride>
   </w:num>
-  <w:num w:numId="2" w16cid:durableId="990212777">
+  <w:num w:numId="2" w16cid:durableId="1745952328">
     <w:abstractNumId w:val="1"/>
     <w:lvlOverride w:ilvl="0">
       <w:startOverride w:val="1"/>
@@ -25620,7 +25630,7 @@
     <w:autoRedefine/>
     <w:uiPriority w:val="39"/>
     <w:unhideWhenUsed/>
-    <w:rsid w:val="00C11871"/>
+    <w:rsid w:val="00EB4F84"/>
     <w:pPr>
       <w:spacing w:after="100"/>
     </w:pPr>
@@ -25632,7 +25642,7 @@
     <w:autoRedefine/>
     <w:uiPriority w:val="39"/>
     <w:unhideWhenUsed/>
-    <w:rsid w:val="00C11871"/>
+    <w:rsid w:val="00EB4F84"/>
     <w:pPr>
       <w:spacing w:after="100"/>
       <w:ind w:left="240"/>
@@ -25645,7 +25655,7 @@
     <w:autoRedefine/>
     <w:uiPriority w:val="39"/>
     <w:unhideWhenUsed/>
-    <w:rsid w:val="00C11871"/>
+    <w:rsid w:val="00EB4F84"/>
     <w:pPr>
       <w:spacing w:after="100"/>
       <w:ind w:left="480"/>

</xml_diff>

<commit_message>
Monitoring pack: final deck with results validation and individual contribution, report appendix D, checklist, demo script update
</commit_message>
<xml_diff>
--- a/docs/blackbook/DreamOS-Final-Year-Project-Report.docx
+++ b/docs/blackbook/DreamOS-Final-Year-Project-Report.docx
@@ -17,7 +17,7 @@
           <w:left w:w="10" w:type="dxa"/>
           <w:right w:w="10" w:type="dxa"/>
         </w:tblCellMar>
-        <w:tblLook w:val="0000" w:firstRow="0" w:lastRow="0" w:firstColumn="0" w:lastColumn="0" w:noHBand="0" w:noVBand="0"/>
+        <w:tblLook w:val="04A0" w:firstRow="1" w:lastRow="0" w:firstColumn="1" w:lastColumn="0" w:noHBand="0" w:noVBand="1"/>
       </w:tblPr>
       <w:tblGrid>
         <w:gridCol w:w="1500"/>
@@ -53,7 +53,7 @@
                 <w:noProof/>
               </w:rPr>
               <w:drawing>
-                <wp:inline distT="0" distB="0" distL="0" distR="0" wp14:anchorId="5061FD6A" wp14:editId="5A439A08">
+                <wp:inline distT="0" distB="0" distL="0" distR="0" wp14:anchorId="29D25300" wp14:editId="04C6E319">
                   <wp:extent cx="2476500" cy="1419225"/>
                   <wp:effectExtent l="0" t="0" r="0" b="0"/>
                   <wp:docPr id="1" name="mgm-logo.png" descr="MGM University logo" title="MGM University logo"/>
@@ -666,10 +666,10 @@
         </w:rPr>
         <w:lastRenderedPageBreak/>
         <w:drawing>
-          <wp:inline distT="0" distB="0" distL="0" distR="0" wp14:anchorId="6E790C88" wp14:editId="34E29F43">
+          <wp:inline distT="0" distB="0" distL="0" distR="0" wp14:anchorId="5D02DD1E" wp14:editId="51E9BA17">
             <wp:extent cx="1428750" cy="819150"/>
             <wp:effectExtent l="0" t="0" r="0" b="0"/>
-            <wp:docPr id="1458223873" name="mgm-logo.png" descr="MGM University logo" title="MGM University logo"/>
+            <wp:docPr id="1196149391" name="mgm-logo.png" descr="MGM University logo" title="MGM University logo"/>
             <wp:cNvGraphicFramePr>
               <a:graphicFrameLocks xmlns:a="http://schemas.openxmlformats.org/drawingml/2006/main" noChangeAspect="1"/>
             </wp:cNvGraphicFramePr>
@@ -770,7 +770,7 @@
           <w:left w:w="10" w:type="dxa"/>
           <w:right w:w="10" w:type="dxa"/>
         </w:tblCellMar>
-        <w:tblLook w:val="0000" w:firstRow="0" w:lastRow="0" w:firstColumn="0" w:lastColumn="0" w:noHBand="0" w:noVBand="0"/>
+        <w:tblLook w:val="04A0" w:firstRow="1" w:lastRow="0" w:firstColumn="1" w:lastColumn="0" w:noHBand="0" w:noVBand="1"/>
       </w:tblPr>
       <w:tblGrid>
         <w:gridCol w:w="4513"/>
@@ -876,7 +876,7 @@
         <w:spacing w:before="240" w:after="280"/>
         <w:jc w:val="center"/>
       </w:pPr>
-      <w:bookmarkStart w:id="0" w:name="_Toc242795795"/>
+      <w:bookmarkStart w:id="0" w:name="_Toc242867880"/>
       <w:r>
         <w:lastRenderedPageBreak/>
         <w:t>ACKNOWLEDGEMENT</w:t>
@@ -943,7 +943,7 @@
           <w:left w:w="10" w:type="dxa"/>
           <w:right w:w="10" w:type="dxa"/>
         </w:tblCellMar>
-        <w:tblLook w:val="0000" w:firstRow="0" w:lastRow="0" w:firstColumn="0" w:lastColumn="0" w:noHBand="0" w:noVBand="0"/>
+        <w:tblLook w:val="04A0" w:firstRow="1" w:lastRow="0" w:firstColumn="1" w:lastColumn="0" w:noHBand="0" w:noVBand="1"/>
       </w:tblPr>
       <w:tblGrid>
         <w:gridCol w:w="3008"/>
@@ -1127,7 +1127,7 @@
     <w:sdt>
       <w:sdtPr>
         <w:alias w:val="Contents"/>
-        <w:id w:val="1352067861"/>
+        <w:id w:val="590279580"/>
       </w:sdtPr>
       <w:sdtEndPr/>
       <w:sdtContent>
@@ -1153,7 +1153,7 @@
           <w:r>
             <w:fldChar w:fldCharType="separate"/>
           </w:r>
-          <w:hyperlink w:anchor="_Toc242795795" w:history="1">
+          <w:hyperlink w:anchor="_Toc242867880" w:history="1">
             <w:r>
               <w:rPr>
                 <w:rStyle w:val="Hyperlink"/>
@@ -1177,7 +1177,7 @@
               <w:rPr>
                 <w:noProof/>
               </w:rPr>
-              <w:instrText xml:space="preserve"> PAGEREF _Toc242795795 \h </w:instrText>
+              <w:instrText xml:space="preserve"> PAGEREF _Toc242867880 \h </w:instrText>
             </w:r>
             <w:r>
               <w:rPr>
@@ -1217,7 +1217,7 @@
               <w14:ligatures w14:val="standardContextual"/>
             </w:rPr>
           </w:pPr>
-          <w:hyperlink w:anchor="_Toc242795796" w:history="1">
+          <w:hyperlink w:anchor="_Toc242867881" w:history="1">
             <w:r>
               <w:rPr>
                 <w:rStyle w:val="Hyperlink"/>
@@ -1241,7 +1241,7 @@
               <w:rPr>
                 <w:noProof/>
               </w:rPr>
-              <w:instrText xml:space="preserve"> PAGEREF _Toc242795796 \h </w:instrText>
+              <w:instrText xml:space="preserve"> PAGEREF _Toc242867881 \h </w:instrText>
             </w:r>
             <w:r>
               <w:rPr>
@@ -1281,7 +1281,7 @@
               <w14:ligatures w14:val="standardContextual"/>
             </w:rPr>
           </w:pPr>
-          <w:hyperlink w:anchor="_Toc242795797" w:history="1">
+          <w:hyperlink w:anchor="_Toc242867882" w:history="1">
             <w:r>
               <w:rPr>
                 <w:rStyle w:val="Hyperlink"/>
@@ -1305,7 +1305,7 @@
               <w:rPr>
                 <w:noProof/>
               </w:rPr>
-              <w:instrText xml:space="preserve"> PAGEREF _Toc242795797 \h </w:instrText>
+              <w:instrText xml:space="preserve"> PAGEREF _Toc242867882 \h </w:instrText>
             </w:r>
             <w:r>
               <w:rPr>
@@ -1345,7 +1345,7 @@
               <w14:ligatures w14:val="standardContextual"/>
             </w:rPr>
           </w:pPr>
-          <w:hyperlink w:anchor="_Toc242795798" w:history="1">
+          <w:hyperlink w:anchor="_Toc242867883" w:history="1">
             <w:r>
               <w:rPr>
                 <w:rStyle w:val="Hyperlink"/>
@@ -1369,7 +1369,7 @@
               <w:rPr>
                 <w:noProof/>
               </w:rPr>
-              <w:instrText xml:space="preserve"> PAGEREF _Toc242795798 \h </w:instrText>
+              <w:instrText xml:space="preserve"> PAGEREF _Toc242867883 \h </w:instrText>
             </w:r>
             <w:r>
               <w:rPr>
@@ -1409,7 +1409,7 @@
               <w14:ligatures w14:val="standardContextual"/>
             </w:rPr>
           </w:pPr>
-          <w:hyperlink w:anchor="_Toc242795799" w:history="1">
+          <w:hyperlink w:anchor="_Toc242867884" w:history="1">
             <w:r>
               <w:rPr>
                 <w:rStyle w:val="Hyperlink"/>
@@ -1433,7 +1433,7 @@
               <w:rPr>
                 <w:noProof/>
               </w:rPr>
-              <w:instrText xml:space="preserve"> PAGEREF _Toc242795799 \h </w:instrText>
+              <w:instrText xml:space="preserve"> PAGEREF _Toc242867884 \h </w:instrText>
             </w:r>
             <w:r>
               <w:rPr>
@@ -1473,7 +1473,7 @@
               <w14:ligatures w14:val="standardContextual"/>
             </w:rPr>
           </w:pPr>
-          <w:hyperlink w:anchor="_Toc242795800" w:history="1">
+          <w:hyperlink w:anchor="_Toc242867885" w:history="1">
             <w:r>
               <w:rPr>
                 <w:rStyle w:val="Hyperlink"/>
@@ -1497,7 +1497,7 @@
               <w:rPr>
                 <w:noProof/>
               </w:rPr>
-              <w:instrText xml:space="preserve"> PAGEREF _Toc242795800 \h </w:instrText>
+              <w:instrText xml:space="preserve"> PAGEREF _Toc242867885 \h </w:instrText>
             </w:r>
             <w:r>
               <w:rPr>
@@ -1537,7 +1537,7 @@
               <w14:ligatures w14:val="standardContextual"/>
             </w:rPr>
           </w:pPr>
-          <w:hyperlink w:anchor="_Toc242795801" w:history="1">
+          <w:hyperlink w:anchor="_Toc242867886" w:history="1">
             <w:r>
               <w:rPr>
                 <w:rStyle w:val="Hyperlink"/>
@@ -1561,7 +1561,7 @@
               <w:rPr>
                 <w:noProof/>
               </w:rPr>
-              <w:instrText xml:space="preserve"> PAGEREF _Toc242795801 \h </w:instrText>
+              <w:instrText xml:space="preserve"> PAGEREF _Toc242867886 \h </w:instrText>
             </w:r>
             <w:r>
               <w:rPr>
@@ -1601,7 +1601,7 @@
               <w14:ligatures w14:val="standardContextual"/>
             </w:rPr>
           </w:pPr>
-          <w:hyperlink w:anchor="_Toc242795802" w:history="1">
+          <w:hyperlink w:anchor="_Toc242867887" w:history="1">
             <w:r>
               <w:rPr>
                 <w:rStyle w:val="Hyperlink"/>
@@ -1625,7 +1625,7 @@
               <w:rPr>
                 <w:noProof/>
               </w:rPr>
-              <w:instrText xml:space="preserve"> PAGEREF _Toc242795802 \h </w:instrText>
+              <w:instrText xml:space="preserve"> PAGEREF _Toc242867887 \h </w:instrText>
             </w:r>
             <w:r>
               <w:rPr>
@@ -1665,7 +1665,7 @@
               <w14:ligatures w14:val="standardContextual"/>
             </w:rPr>
           </w:pPr>
-          <w:hyperlink w:anchor="_Toc242795803" w:history="1">
+          <w:hyperlink w:anchor="_Toc242867888" w:history="1">
             <w:r>
               <w:rPr>
                 <w:rStyle w:val="Hyperlink"/>
@@ -1689,7 +1689,7 @@
               <w:rPr>
                 <w:noProof/>
               </w:rPr>
-              <w:instrText xml:space="preserve"> PAGEREF _Toc242795803 \h </w:instrText>
+              <w:instrText xml:space="preserve"> PAGEREF _Toc242867888 \h </w:instrText>
             </w:r>
             <w:r>
               <w:rPr>
@@ -1729,7 +1729,7 @@
               <w14:ligatures w14:val="standardContextual"/>
             </w:rPr>
           </w:pPr>
-          <w:hyperlink w:anchor="_Toc242795804" w:history="1">
+          <w:hyperlink w:anchor="_Toc242867889" w:history="1">
             <w:r>
               <w:rPr>
                 <w:rStyle w:val="Hyperlink"/>
@@ -1753,7 +1753,7 @@
               <w:rPr>
                 <w:noProof/>
               </w:rPr>
-              <w:instrText xml:space="preserve"> PAGEREF _Toc242795804 \h </w:instrText>
+              <w:instrText xml:space="preserve"> PAGEREF _Toc242867889 \h </w:instrText>
             </w:r>
             <w:r>
               <w:rPr>
@@ -1793,7 +1793,7 @@
               <w14:ligatures w14:val="standardContextual"/>
             </w:rPr>
           </w:pPr>
-          <w:hyperlink w:anchor="_Toc242795805" w:history="1">
+          <w:hyperlink w:anchor="_Toc242867890" w:history="1">
             <w:r>
               <w:rPr>
                 <w:rStyle w:val="Hyperlink"/>
@@ -1817,7 +1817,7 @@
               <w:rPr>
                 <w:noProof/>
               </w:rPr>
-              <w:instrText xml:space="preserve"> PAGEREF _Toc242795805 \h </w:instrText>
+              <w:instrText xml:space="preserve"> PAGEREF _Toc242867890 \h </w:instrText>
             </w:r>
             <w:r>
               <w:rPr>
@@ -1857,7 +1857,7 @@
               <w14:ligatures w14:val="standardContextual"/>
             </w:rPr>
           </w:pPr>
-          <w:hyperlink w:anchor="_Toc242795806" w:history="1">
+          <w:hyperlink w:anchor="_Toc242867891" w:history="1">
             <w:r>
               <w:rPr>
                 <w:rStyle w:val="Hyperlink"/>
@@ -1881,7 +1881,7 @@
               <w:rPr>
                 <w:noProof/>
               </w:rPr>
-              <w:instrText xml:space="preserve"> PAGEREF _Toc242795806 \h </w:instrText>
+              <w:instrText xml:space="preserve"> PAGEREF _Toc242867891 \h </w:instrText>
             </w:r>
             <w:r>
               <w:rPr>
@@ -1921,7 +1921,7 @@
               <w14:ligatures w14:val="standardContextual"/>
             </w:rPr>
           </w:pPr>
-          <w:hyperlink w:anchor="_Toc242795807" w:history="1">
+          <w:hyperlink w:anchor="_Toc242867892" w:history="1">
             <w:r>
               <w:rPr>
                 <w:rStyle w:val="Hyperlink"/>
@@ -1945,7 +1945,7 @@
               <w:rPr>
                 <w:noProof/>
               </w:rPr>
-              <w:instrText xml:space="preserve"> PAGEREF _Toc242795807 \h </w:instrText>
+              <w:instrText xml:space="preserve"> PAGEREF _Toc242867892 \h </w:instrText>
             </w:r>
             <w:r>
               <w:rPr>
@@ -1985,7 +1985,7 @@
               <w14:ligatures w14:val="standardContextual"/>
             </w:rPr>
           </w:pPr>
-          <w:hyperlink w:anchor="_Toc242795808" w:history="1">
+          <w:hyperlink w:anchor="_Toc242867893" w:history="1">
             <w:r>
               <w:rPr>
                 <w:rStyle w:val="Hyperlink"/>
@@ -2009,7 +2009,7 @@
               <w:rPr>
                 <w:noProof/>
               </w:rPr>
-              <w:instrText xml:space="preserve"> PAGEREF _Toc242795808 \h </w:instrText>
+              <w:instrText xml:space="preserve"> PAGEREF _Toc242867893 \h </w:instrText>
             </w:r>
             <w:r>
               <w:rPr>
@@ -2049,7 +2049,7 @@
               <w14:ligatures w14:val="standardContextual"/>
             </w:rPr>
           </w:pPr>
-          <w:hyperlink w:anchor="_Toc242795809" w:history="1">
+          <w:hyperlink w:anchor="_Toc242867894" w:history="1">
             <w:r>
               <w:rPr>
                 <w:rStyle w:val="Hyperlink"/>
@@ -2073,7 +2073,7 @@
               <w:rPr>
                 <w:noProof/>
               </w:rPr>
-              <w:instrText xml:space="preserve"> PAGEREF _Toc242795809 \h </w:instrText>
+              <w:instrText xml:space="preserve"> PAGEREF _Toc242867894 \h </w:instrText>
             </w:r>
             <w:r>
               <w:rPr>
@@ -2113,7 +2113,7 @@
               <w14:ligatures w14:val="standardContextual"/>
             </w:rPr>
           </w:pPr>
-          <w:hyperlink w:anchor="_Toc242795810" w:history="1">
+          <w:hyperlink w:anchor="_Toc242867895" w:history="1">
             <w:r>
               <w:rPr>
                 <w:rStyle w:val="Hyperlink"/>
@@ -2137,7 +2137,7 @@
               <w:rPr>
                 <w:noProof/>
               </w:rPr>
-              <w:instrText xml:space="preserve"> PAGEREF _Toc242795810 \h </w:instrText>
+              <w:instrText xml:space="preserve"> PAGEREF _Toc242867895 \h </w:instrText>
             </w:r>
             <w:r>
               <w:rPr>
@@ -2177,7 +2177,7 @@
               <w14:ligatures w14:val="standardContextual"/>
             </w:rPr>
           </w:pPr>
-          <w:hyperlink w:anchor="_Toc242795811" w:history="1">
+          <w:hyperlink w:anchor="_Toc242867896" w:history="1">
             <w:r>
               <w:rPr>
                 <w:rStyle w:val="Hyperlink"/>
@@ -2201,7 +2201,7 @@
               <w:rPr>
                 <w:noProof/>
               </w:rPr>
-              <w:instrText xml:space="preserve"> PAGEREF _Toc242795811 \h </w:instrText>
+              <w:instrText xml:space="preserve"> PAGEREF _Toc242867896 \h </w:instrText>
             </w:r>
             <w:r>
               <w:rPr>
@@ -2241,7 +2241,7 @@
               <w14:ligatures w14:val="standardContextual"/>
             </w:rPr>
           </w:pPr>
-          <w:hyperlink w:anchor="_Toc242795812" w:history="1">
+          <w:hyperlink w:anchor="_Toc242867897" w:history="1">
             <w:r>
               <w:rPr>
                 <w:rStyle w:val="Hyperlink"/>
@@ -2265,7 +2265,7 @@
               <w:rPr>
                 <w:noProof/>
               </w:rPr>
-              <w:instrText xml:space="preserve"> PAGEREF _Toc242795812 \h </w:instrText>
+              <w:instrText xml:space="preserve"> PAGEREF _Toc242867897 \h </w:instrText>
             </w:r>
             <w:r>
               <w:rPr>
@@ -2305,7 +2305,7 @@
               <w14:ligatures w14:val="standardContextual"/>
             </w:rPr>
           </w:pPr>
-          <w:hyperlink w:anchor="_Toc242795813" w:history="1">
+          <w:hyperlink w:anchor="_Toc242867898" w:history="1">
             <w:r>
               <w:rPr>
                 <w:rStyle w:val="Hyperlink"/>
@@ -2329,7 +2329,7 @@
               <w:rPr>
                 <w:noProof/>
               </w:rPr>
-              <w:instrText xml:space="preserve"> PAGEREF _Toc242795813 \h </w:instrText>
+              <w:instrText xml:space="preserve"> PAGEREF _Toc242867898 \h </w:instrText>
             </w:r>
             <w:r>
               <w:rPr>
@@ -2369,7 +2369,7 @@
               <w14:ligatures w14:val="standardContextual"/>
             </w:rPr>
           </w:pPr>
-          <w:hyperlink w:anchor="_Toc242795814" w:history="1">
+          <w:hyperlink w:anchor="_Toc242867899" w:history="1">
             <w:r>
               <w:rPr>
                 <w:rStyle w:val="Hyperlink"/>
@@ -2393,7 +2393,7 @@
               <w:rPr>
                 <w:noProof/>
               </w:rPr>
-              <w:instrText xml:space="preserve"> PAGEREF _Toc242795814 \h </w:instrText>
+              <w:instrText xml:space="preserve"> PAGEREF _Toc242867899 \h </w:instrText>
             </w:r>
             <w:r>
               <w:rPr>
@@ -2433,7 +2433,7 @@
               <w14:ligatures w14:val="standardContextual"/>
             </w:rPr>
           </w:pPr>
-          <w:hyperlink w:anchor="_Toc242795815" w:history="1">
+          <w:hyperlink w:anchor="_Toc242867900" w:history="1">
             <w:r>
               <w:rPr>
                 <w:rStyle w:val="Hyperlink"/>
@@ -2457,7 +2457,7 @@
               <w:rPr>
                 <w:noProof/>
               </w:rPr>
-              <w:instrText xml:space="preserve"> PAGEREF _Toc242795815 \h </w:instrText>
+              <w:instrText xml:space="preserve"> PAGEREF _Toc242867900 \h </w:instrText>
             </w:r>
             <w:r>
               <w:rPr>
@@ -2497,7 +2497,7 @@
               <w14:ligatures w14:val="standardContextual"/>
             </w:rPr>
           </w:pPr>
-          <w:hyperlink w:anchor="_Toc242795816" w:history="1">
+          <w:hyperlink w:anchor="_Toc242867901" w:history="1">
             <w:r>
               <w:rPr>
                 <w:rStyle w:val="Hyperlink"/>
@@ -2521,7 +2521,7 @@
               <w:rPr>
                 <w:noProof/>
               </w:rPr>
-              <w:instrText xml:space="preserve"> PAGEREF _Toc242795816 \h </w:instrText>
+              <w:instrText xml:space="preserve"> PAGEREF _Toc242867901 \h </w:instrText>
             </w:r>
             <w:r>
               <w:rPr>
@@ -2561,7 +2561,7 @@
               <w14:ligatures w14:val="standardContextual"/>
             </w:rPr>
           </w:pPr>
-          <w:hyperlink w:anchor="_Toc242795817" w:history="1">
+          <w:hyperlink w:anchor="_Toc242867902" w:history="1">
             <w:r>
               <w:rPr>
                 <w:rStyle w:val="Hyperlink"/>
@@ -2585,7 +2585,7 @@
               <w:rPr>
                 <w:noProof/>
               </w:rPr>
-              <w:instrText xml:space="preserve"> PAGEREF _Toc242795817 \h </w:instrText>
+              <w:instrText xml:space="preserve"> PAGEREF _Toc242867902 \h </w:instrText>
             </w:r>
             <w:r>
               <w:rPr>
@@ -2625,7 +2625,7 @@
               <w14:ligatures w14:val="standardContextual"/>
             </w:rPr>
           </w:pPr>
-          <w:hyperlink w:anchor="_Toc242795818" w:history="1">
+          <w:hyperlink w:anchor="_Toc242867903" w:history="1">
             <w:r>
               <w:rPr>
                 <w:rStyle w:val="Hyperlink"/>
@@ -2649,7 +2649,7 @@
               <w:rPr>
                 <w:noProof/>
               </w:rPr>
-              <w:instrText xml:space="preserve"> PAGEREF _Toc242795818 \h </w:instrText>
+              <w:instrText xml:space="preserve"> PAGEREF _Toc242867903 \h </w:instrText>
             </w:r>
             <w:r>
               <w:rPr>
@@ -2689,7 +2689,7 @@
               <w14:ligatures w14:val="standardContextual"/>
             </w:rPr>
           </w:pPr>
-          <w:hyperlink w:anchor="_Toc242795819" w:history="1">
+          <w:hyperlink w:anchor="_Toc242867904" w:history="1">
             <w:r>
               <w:rPr>
                 <w:rStyle w:val="Hyperlink"/>
@@ -2713,7 +2713,7 @@
               <w:rPr>
                 <w:noProof/>
               </w:rPr>
-              <w:instrText xml:space="preserve"> PAGEREF _Toc242795819 \h </w:instrText>
+              <w:instrText xml:space="preserve"> PAGEREF _Toc242867904 \h </w:instrText>
             </w:r>
             <w:r>
               <w:rPr>
@@ -2753,7 +2753,7 @@
               <w14:ligatures w14:val="standardContextual"/>
             </w:rPr>
           </w:pPr>
-          <w:hyperlink w:anchor="_Toc242795820" w:history="1">
+          <w:hyperlink w:anchor="_Toc242867905" w:history="1">
             <w:r>
               <w:rPr>
                 <w:rStyle w:val="Hyperlink"/>
@@ -2777,7 +2777,7 @@
               <w:rPr>
                 <w:noProof/>
               </w:rPr>
-              <w:instrText xml:space="preserve"> PAGEREF _Toc242795820 \h </w:instrText>
+              <w:instrText xml:space="preserve"> PAGEREF _Toc242867905 \h </w:instrText>
             </w:r>
             <w:r>
               <w:rPr>
@@ -2817,7 +2817,7 @@
               <w14:ligatures w14:val="standardContextual"/>
             </w:rPr>
           </w:pPr>
-          <w:hyperlink w:anchor="_Toc242795821" w:history="1">
+          <w:hyperlink w:anchor="_Toc242867906" w:history="1">
             <w:r>
               <w:rPr>
                 <w:rStyle w:val="Hyperlink"/>
@@ -2841,7 +2841,7 @@
               <w:rPr>
                 <w:noProof/>
               </w:rPr>
-              <w:instrText xml:space="preserve"> PAGEREF _Toc242795821 \h </w:instrText>
+              <w:instrText xml:space="preserve"> PAGEREF _Toc242867906 \h </w:instrText>
             </w:r>
             <w:r>
               <w:rPr>
@@ -2881,7 +2881,7 @@
               <w14:ligatures w14:val="standardContextual"/>
             </w:rPr>
           </w:pPr>
-          <w:hyperlink w:anchor="_Toc242795822" w:history="1">
+          <w:hyperlink w:anchor="_Toc242867907" w:history="1">
             <w:r>
               <w:rPr>
                 <w:rStyle w:val="Hyperlink"/>
@@ -2905,7 +2905,7 @@
               <w:rPr>
                 <w:noProof/>
               </w:rPr>
-              <w:instrText xml:space="preserve"> PAGEREF _Toc242795822 \h </w:instrText>
+              <w:instrText xml:space="preserve"> PAGEREF _Toc242867907 \h </w:instrText>
             </w:r>
             <w:r>
               <w:rPr>
@@ -2945,7 +2945,7 @@
               <w14:ligatures w14:val="standardContextual"/>
             </w:rPr>
           </w:pPr>
-          <w:hyperlink w:anchor="_Toc242795823" w:history="1">
+          <w:hyperlink w:anchor="_Toc242867908" w:history="1">
             <w:r>
               <w:rPr>
                 <w:rStyle w:val="Hyperlink"/>
@@ -2969,7 +2969,7 @@
               <w:rPr>
                 <w:noProof/>
               </w:rPr>
-              <w:instrText xml:space="preserve"> PAGEREF _Toc242795823 \h </w:instrText>
+              <w:instrText xml:space="preserve"> PAGEREF _Toc242867908 \h </w:instrText>
             </w:r>
             <w:r>
               <w:rPr>
@@ -3009,7 +3009,7 @@
               <w14:ligatures w14:val="standardContextual"/>
             </w:rPr>
           </w:pPr>
-          <w:hyperlink w:anchor="_Toc242795824" w:history="1">
+          <w:hyperlink w:anchor="_Toc242867909" w:history="1">
             <w:r>
               <w:rPr>
                 <w:rStyle w:val="Hyperlink"/>
@@ -3033,7 +3033,7 @@
               <w:rPr>
                 <w:noProof/>
               </w:rPr>
-              <w:instrText xml:space="preserve"> PAGEREF _Toc242795824 \h </w:instrText>
+              <w:instrText xml:space="preserve"> PAGEREF _Toc242867909 \h </w:instrText>
             </w:r>
             <w:r>
               <w:rPr>
@@ -3073,7 +3073,7 @@
               <w14:ligatures w14:val="standardContextual"/>
             </w:rPr>
           </w:pPr>
-          <w:hyperlink w:anchor="_Toc242795825" w:history="1">
+          <w:hyperlink w:anchor="_Toc242867910" w:history="1">
             <w:r>
               <w:rPr>
                 <w:rStyle w:val="Hyperlink"/>
@@ -3097,7 +3097,7 @@
               <w:rPr>
                 <w:noProof/>
               </w:rPr>
-              <w:instrText xml:space="preserve"> PAGEREF _Toc242795825 \h </w:instrText>
+              <w:instrText xml:space="preserve"> PAGEREF _Toc242867910 \h </w:instrText>
             </w:r>
             <w:r>
               <w:rPr>
@@ -3137,7 +3137,7 @@
               <w14:ligatures w14:val="standardContextual"/>
             </w:rPr>
           </w:pPr>
-          <w:hyperlink w:anchor="_Toc242795826" w:history="1">
+          <w:hyperlink w:anchor="_Toc242867911" w:history="1">
             <w:r>
               <w:rPr>
                 <w:rStyle w:val="Hyperlink"/>
@@ -3161,7 +3161,7 @@
               <w:rPr>
                 <w:noProof/>
               </w:rPr>
-              <w:instrText xml:space="preserve"> PAGEREF _Toc242795826 \h </w:instrText>
+              <w:instrText xml:space="preserve"> PAGEREF _Toc242867911 \h </w:instrText>
             </w:r>
             <w:r>
               <w:rPr>
@@ -3201,7 +3201,7 @@
               <w14:ligatures w14:val="standardContextual"/>
             </w:rPr>
           </w:pPr>
-          <w:hyperlink w:anchor="_Toc242795827" w:history="1">
+          <w:hyperlink w:anchor="_Toc242867912" w:history="1">
             <w:r>
               <w:rPr>
                 <w:rStyle w:val="Hyperlink"/>
@@ -3225,7 +3225,7 @@
               <w:rPr>
                 <w:noProof/>
               </w:rPr>
-              <w:instrText xml:space="preserve"> PAGEREF _Toc242795827 \h </w:instrText>
+              <w:instrText xml:space="preserve"> PAGEREF _Toc242867912 \h </w:instrText>
             </w:r>
             <w:r>
               <w:rPr>
@@ -3265,7 +3265,7 @@
               <w14:ligatures w14:val="standardContextual"/>
             </w:rPr>
           </w:pPr>
-          <w:hyperlink w:anchor="_Toc242795828" w:history="1">
+          <w:hyperlink w:anchor="_Toc242867913" w:history="1">
             <w:r>
               <w:rPr>
                 <w:rStyle w:val="Hyperlink"/>
@@ -3289,7 +3289,7 @@
               <w:rPr>
                 <w:noProof/>
               </w:rPr>
-              <w:instrText xml:space="preserve"> PAGEREF _Toc242795828 \h </w:instrText>
+              <w:instrText xml:space="preserve"> PAGEREF _Toc242867913 \h </w:instrText>
             </w:r>
             <w:r>
               <w:rPr>
@@ -3329,7 +3329,7 @@
               <w14:ligatures w14:val="standardContextual"/>
             </w:rPr>
           </w:pPr>
-          <w:hyperlink w:anchor="_Toc242795829" w:history="1">
+          <w:hyperlink w:anchor="_Toc242867914" w:history="1">
             <w:r>
               <w:rPr>
                 <w:rStyle w:val="Hyperlink"/>
@@ -3353,7 +3353,7 @@
               <w:rPr>
                 <w:noProof/>
               </w:rPr>
-              <w:instrText xml:space="preserve"> PAGEREF _Toc242795829 \h </w:instrText>
+              <w:instrText xml:space="preserve"> PAGEREF _Toc242867914 \h </w:instrText>
             </w:r>
             <w:r>
               <w:rPr>
@@ -3393,7 +3393,7 @@
               <w14:ligatures w14:val="standardContextual"/>
             </w:rPr>
           </w:pPr>
-          <w:hyperlink w:anchor="_Toc242795830" w:history="1">
+          <w:hyperlink w:anchor="_Toc242867915" w:history="1">
             <w:r>
               <w:rPr>
                 <w:rStyle w:val="Hyperlink"/>
@@ -3417,7 +3417,7 @@
               <w:rPr>
                 <w:noProof/>
               </w:rPr>
-              <w:instrText xml:space="preserve"> PAGEREF _Toc242795830 \h </w:instrText>
+              <w:instrText xml:space="preserve"> PAGEREF _Toc242867915 \h </w:instrText>
             </w:r>
             <w:r>
               <w:rPr>
@@ -3457,7 +3457,7 @@
               <w14:ligatures w14:val="standardContextual"/>
             </w:rPr>
           </w:pPr>
-          <w:hyperlink w:anchor="_Toc242795831" w:history="1">
+          <w:hyperlink w:anchor="_Toc242867916" w:history="1">
             <w:r>
               <w:rPr>
                 <w:rStyle w:val="Hyperlink"/>
@@ -3481,7 +3481,7 @@
               <w:rPr>
                 <w:noProof/>
               </w:rPr>
-              <w:instrText xml:space="preserve"> PAGEREF _Toc242795831 \h </w:instrText>
+              <w:instrText xml:space="preserve"> PAGEREF _Toc242867916 \h </w:instrText>
             </w:r>
             <w:r>
               <w:rPr>
@@ -3521,7 +3521,7 @@
               <w14:ligatures w14:val="standardContextual"/>
             </w:rPr>
           </w:pPr>
-          <w:hyperlink w:anchor="_Toc242795832" w:history="1">
+          <w:hyperlink w:anchor="_Toc242867917" w:history="1">
             <w:r>
               <w:rPr>
                 <w:rStyle w:val="Hyperlink"/>
@@ -3545,7 +3545,7 @@
               <w:rPr>
                 <w:noProof/>
               </w:rPr>
-              <w:instrText xml:space="preserve"> PAGEREF _Toc242795832 \h </w:instrText>
+              <w:instrText xml:space="preserve"> PAGEREF _Toc242867917 \h </w:instrText>
             </w:r>
             <w:r>
               <w:rPr>
@@ -3585,7 +3585,7 @@
               <w14:ligatures w14:val="standardContextual"/>
             </w:rPr>
           </w:pPr>
-          <w:hyperlink w:anchor="_Toc242795833" w:history="1">
+          <w:hyperlink w:anchor="_Toc242867918" w:history="1">
             <w:r>
               <w:rPr>
                 <w:rStyle w:val="Hyperlink"/>
@@ -3609,7 +3609,7 @@
               <w:rPr>
                 <w:noProof/>
               </w:rPr>
-              <w:instrText xml:space="preserve"> PAGEREF _Toc242795833 \h </w:instrText>
+              <w:instrText xml:space="preserve"> PAGEREF _Toc242867918 \h </w:instrText>
             </w:r>
             <w:r>
               <w:rPr>
@@ -3649,7 +3649,7 @@
               <w14:ligatures w14:val="standardContextual"/>
             </w:rPr>
           </w:pPr>
-          <w:hyperlink w:anchor="_Toc242795834" w:history="1">
+          <w:hyperlink w:anchor="_Toc242867919" w:history="1">
             <w:r>
               <w:rPr>
                 <w:rStyle w:val="Hyperlink"/>
@@ -3673,7 +3673,7 @@
               <w:rPr>
                 <w:noProof/>
               </w:rPr>
-              <w:instrText xml:space="preserve"> PAGEREF _Toc242795834 \h </w:instrText>
+              <w:instrText xml:space="preserve"> PAGEREF _Toc242867919 \h </w:instrText>
             </w:r>
             <w:r>
               <w:rPr>
@@ -3713,7 +3713,7 @@
               <w14:ligatures w14:val="standardContextual"/>
             </w:rPr>
           </w:pPr>
-          <w:hyperlink w:anchor="_Toc242795835" w:history="1">
+          <w:hyperlink w:anchor="_Toc242867920" w:history="1">
             <w:r>
               <w:rPr>
                 <w:rStyle w:val="Hyperlink"/>
@@ -3737,7 +3737,7 @@
               <w:rPr>
                 <w:noProof/>
               </w:rPr>
-              <w:instrText xml:space="preserve"> PAGEREF _Toc242795835 \h </w:instrText>
+              <w:instrText xml:space="preserve"> PAGEREF _Toc242867920 \h </w:instrText>
             </w:r>
             <w:r>
               <w:rPr>
@@ -3777,7 +3777,7 @@
               <w14:ligatures w14:val="standardContextual"/>
             </w:rPr>
           </w:pPr>
-          <w:hyperlink w:anchor="_Toc242795836" w:history="1">
+          <w:hyperlink w:anchor="_Toc242867921" w:history="1">
             <w:r>
               <w:rPr>
                 <w:rStyle w:val="Hyperlink"/>
@@ -3801,7 +3801,7 @@
               <w:rPr>
                 <w:noProof/>
               </w:rPr>
-              <w:instrText xml:space="preserve"> PAGEREF _Toc242795836 \h </w:instrText>
+              <w:instrText xml:space="preserve"> PAGEREF _Toc242867921 \h </w:instrText>
             </w:r>
             <w:r>
               <w:rPr>
@@ -3841,7 +3841,7 @@
               <w14:ligatures w14:val="standardContextual"/>
             </w:rPr>
           </w:pPr>
-          <w:hyperlink w:anchor="_Toc242795837" w:history="1">
+          <w:hyperlink w:anchor="_Toc242867922" w:history="1">
             <w:r>
               <w:rPr>
                 <w:rStyle w:val="Hyperlink"/>
@@ -3865,7 +3865,7 @@
               <w:rPr>
                 <w:noProof/>
               </w:rPr>
-              <w:instrText xml:space="preserve"> PAGEREF _Toc242795837 \h </w:instrText>
+              <w:instrText xml:space="preserve"> PAGEREF _Toc242867922 \h </w:instrText>
             </w:r>
             <w:r>
               <w:rPr>
@@ -3905,7 +3905,7 @@
               <w14:ligatures w14:val="standardContextual"/>
             </w:rPr>
           </w:pPr>
-          <w:hyperlink w:anchor="_Toc242795838" w:history="1">
+          <w:hyperlink w:anchor="_Toc242867923" w:history="1">
             <w:r>
               <w:rPr>
                 <w:rStyle w:val="Hyperlink"/>
@@ -3929,7 +3929,7 @@
               <w:rPr>
                 <w:noProof/>
               </w:rPr>
-              <w:instrText xml:space="preserve"> PAGEREF _Toc242795838 \h </w:instrText>
+              <w:instrText xml:space="preserve"> PAGEREF _Toc242867923 \h </w:instrText>
             </w:r>
             <w:r>
               <w:rPr>
@@ -3969,7 +3969,7 @@
               <w14:ligatures w14:val="standardContextual"/>
             </w:rPr>
           </w:pPr>
-          <w:hyperlink w:anchor="_Toc242795839" w:history="1">
+          <w:hyperlink w:anchor="_Toc242867924" w:history="1">
             <w:r>
               <w:rPr>
                 <w:rStyle w:val="Hyperlink"/>
@@ -3993,7 +3993,7 @@
               <w:rPr>
                 <w:noProof/>
               </w:rPr>
-              <w:instrText xml:space="preserve"> PAGEREF _Toc242795839 \h </w:instrText>
+              <w:instrText xml:space="preserve"> PAGEREF _Toc242867924 \h </w:instrText>
             </w:r>
             <w:r>
               <w:rPr>
@@ -4033,7 +4033,7 @@
               <w14:ligatures w14:val="standardContextual"/>
             </w:rPr>
           </w:pPr>
-          <w:hyperlink w:anchor="_Toc242795840" w:history="1">
+          <w:hyperlink w:anchor="_Toc242867925" w:history="1">
             <w:r>
               <w:rPr>
                 <w:rStyle w:val="Hyperlink"/>
@@ -4057,7 +4057,7 @@
               <w:rPr>
                 <w:noProof/>
               </w:rPr>
-              <w:instrText xml:space="preserve"> PAGEREF _Toc242795840 \h </w:instrText>
+              <w:instrText xml:space="preserve"> PAGEREF _Toc242867925 \h </w:instrText>
             </w:r>
             <w:r>
               <w:rPr>
@@ -4097,7 +4097,7 @@
               <w14:ligatures w14:val="standardContextual"/>
             </w:rPr>
           </w:pPr>
-          <w:hyperlink w:anchor="_Toc242795841" w:history="1">
+          <w:hyperlink w:anchor="_Toc242867926" w:history="1">
             <w:r>
               <w:rPr>
                 <w:rStyle w:val="Hyperlink"/>
@@ -4121,7 +4121,7 @@
               <w:rPr>
                 <w:noProof/>
               </w:rPr>
-              <w:instrText xml:space="preserve"> PAGEREF _Toc242795841 \h </w:instrText>
+              <w:instrText xml:space="preserve"> PAGEREF _Toc242867926 \h </w:instrText>
             </w:r>
             <w:r>
               <w:rPr>
@@ -4161,7 +4161,7 @@
               <w14:ligatures w14:val="standardContextual"/>
             </w:rPr>
           </w:pPr>
-          <w:hyperlink w:anchor="_Toc242795842" w:history="1">
+          <w:hyperlink w:anchor="_Toc242867927" w:history="1">
             <w:r>
               <w:rPr>
                 <w:rStyle w:val="Hyperlink"/>
@@ -4185,7 +4185,7 @@
               <w:rPr>
                 <w:noProof/>
               </w:rPr>
-              <w:instrText xml:space="preserve"> PAGEREF _Toc242795842 \h </w:instrText>
+              <w:instrText xml:space="preserve"> PAGEREF _Toc242867927 \h </w:instrText>
             </w:r>
             <w:r>
               <w:rPr>
@@ -4225,7 +4225,7 @@
               <w14:ligatures w14:val="standardContextual"/>
             </w:rPr>
           </w:pPr>
-          <w:hyperlink w:anchor="_Toc242795843" w:history="1">
+          <w:hyperlink w:anchor="_Toc242867928" w:history="1">
             <w:r>
               <w:rPr>
                 <w:rStyle w:val="Hyperlink"/>
@@ -4249,7 +4249,7 @@
               <w:rPr>
                 <w:noProof/>
               </w:rPr>
-              <w:instrText xml:space="preserve"> PAGEREF _Toc242795843 \h </w:instrText>
+              <w:instrText xml:space="preserve"> PAGEREF _Toc242867928 \h </w:instrText>
             </w:r>
             <w:r>
               <w:rPr>
@@ -4289,7 +4289,7 @@
               <w14:ligatures w14:val="standardContextual"/>
             </w:rPr>
           </w:pPr>
-          <w:hyperlink w:anchor="_Toc242795844" w:history="1">
+          <w:hyperlink w:anchor="_Toc242867929" w:history="1">
             <w:r>
               <w:rPr>
                 <w:rStyle w:val="Hyperlink"/>
@@ -4313,7 +4313,7 @@
               <w:rPr>
                 <w:noProof/>
               </w:rPr>
-              <w:instrText xml:space="preserve"> PAGEREF _Toc242795844 \h </w:instrText>
+              <w:instrText xml:space="preserve"> PAGEREF _Toc242867929 \h </w:instrText>
             </w:r>
             <w:r>
               <w:rPr>
@@ -4353,7 +4353,7 @@
               <w14:ligatures w14:val="standardContextual"/>
             </w:rPr>
           </w:pPr>
-          <w:hyperlink w:anchor="_Toc242795845" w:history="1">
+          <w:hyperlink w:anchor="_Toc242867930" w:history="1">
             <w:r>
               <w:rPr>
                 <w:rStyle w:val="Hyperlink"/>
@@ -4377,7 +4377,7 @@
               <w:rPr>
                 <w:noProof/>
               </w:rPr>
-              <w:instrText xml:space="preserve"> PAGEREF _Toc242795845 \h </w:instrText>
+              <w:instrText xml:space="preserve"> PAGEREF _Toc242867930 \h </w:instrText>
             </w:r>
             <w:r>
               <w:rPr>
@@ -4417,7 +4417,7 @@
               <w14:ligatures w14:val="standardContextual"/>
             </w:rPr>
           </w:pPr>
-          <w:hyperlink w:anchor="_Toc242795846" w:history="1">
+          <w:hyperlink w:anchor="_Toc242867931" w:history="1">
             <w:r>
               <w:rPr>
                 <w:rStyle w:val="Hyperlink"/>
@@ -4441,7 +4441,7 @@
               <w:rPr>
                 <w:noProof/>
               </w:rPr>
-              <w:instrText xml:space="preserve"> PAGEREF _Toc242795846 \h </w:instrText>
+              <w:instrText xml:space="preserve"> PAGEREF _Toc242867931 \h </w:instrText>
             </w:r>
             <w:r>
               <w:rPr>
@@ -4481,7 +4481,7 @@
               <w14:ligatures w14:val="standardContextual"/>
             </w:rPr>
           </w:pPr>
-          <w:hyperlink w:anchor="_Toc242795847" w:history="1">
+          <w:hyperlink w:anchor="_Toc242867932" w:history="1">
             <w:r>
               <w:rPr>
                 <w:rStyle w:val="Hyperlink"/>
@@ -4505,7 +4505,7 @@
               <w:rPr>
                 <w:noProof/>
               </w:rPr>
-              <w:instrText xml:space="preserve"> PAGEREF _Toc242795847 \h </w:instrText>
+              <w:instrText xml:space="preserve"> PAGEREF _Toc242867932 \h </w:instrText>
             </w:r>
             <w:r>
               <w:rPr>
@@ -4545,7 +4545,7 @@
               <w14:ligatures w14:val="standardContextual"/>
             </w:rPr>
           </w:pPr>
-          <w:hyperlink w:anchor="_Toc242795848" w:history="1">
+          <w:hyperlink w:anchor="_Toc242867933" w:history="1">
             <w:r>
               <w:rPr>
                 <w:rStyle w:val="Hyperlink"/>
@@ -4569,7 +4569,7 @@
               <w:rPr>
                 <w:noProof/>
               </w:rPr>
-              <w:instrText xml:space="preserve"> PAGEREF _Toc242795848 \h </w:instrText>
+              <w:instrText xml:space="preserve"> PAGEREF _Toc242867933 \h </w:instrText>
             </w:r>
             <w:r>
               <w:rPr>
@@ -4609,7 +4609,7 @@
               <w14:ligatures w14:val="standardContextual"/>
             </w:rPr>
           </w:pPr>
-          <w:hyperlink w:anchor="_Toc242795849" w:history="1">
+          <w:hyperlink w:anchor="_Toc242867934" w:history="1">
             <w:r>
               <w:rPr>
                 <w:rStyle w:val="Hyperlink"/>
@@ -4633,7 +4633,7 @@
               <w:rPr>
                 <w:noProof/>
               </w:rPr>
-              <w:instrText xml:space="preserve"> PAGEREF _Toc242795849 \h </w:instrText>
+              <w:instrText xml:space="preserve"> PAGEREF _Toc242867934 \h </w:instrText>
             </w:r>
             <w:r>
               <w:rPr>
@@ -4673,7 +4673,7 @@
               <w14:ligatures w14:val="standardContextual"/>
             </w:rPr>
           </w:pPr>
-          <w:hyperlink w:anchor="_Toc242795850" w:history="1">
+          <w:hyperlink w:anchor="_Toc242867935" w:history="1">
             <w:r>
               <w:rPr>
                 <w:rStyle w:val="Hyperlink"/>
@@ -4697,7 +4697,7 @@
               <w:rPr>
                 <w:noProof/>
               </w:rPr>
-              <w:instrText xml:space="preserve"> PAGEREF _Toc242795850 \h </w:instrText>
+              <w:instrText xml:space="preserve"> PAGEREF _Toc242867935 \h </w:instrText>
             </w:r>
             <w:r>
               <w:rPr>
@@ -4737,7 +4737,7 @@
               <w14:ligatures w14:val="standardContextual"/>
             </w:rPr>
           </w:pPr>
-          <w:hyperlink w:anchor="_Toc242795851" w:history="1">
+          <w:hyperlink w:anchor="_Toc242867936" w:history="1">
             <w:r>
               <w:rPr>
                 <w:rStyle w:val="Hyperlink"/>
@@ -4761,7 +4761,7 @@
               <w:rPr>
                 <w:noProof/>
               </w:rPr>
-              <w:instrText xml:space="preserve"> PAGEREF _Toc242795851 \h </w:instrText>
+              <w:instrText xml:space="preserve"> PAGEREF _Toc242867936 \h </w:instrText>
             </w:r>
             <w:r>
               <w:rPr>
@@ -4801,7 +4801,7 @@
               <w14:ligatures w14:val="standardContextual"/>
             </w:rPr>
           </w:pPr>
-          <w:hyperlink w:anchor="_Toc242795852" w:history="1">
+          <w:hyperlink w:anchor="_Toc242867937" w:history="1">
             <w:r>
               <w:rPr>
                 <w:rStyle w:val="Hyperlink"/>
@@ -4825,7 +4825,7 @@
               <w:rPr>
                 <w:noProof/>
               </w:rPr>
-              <w:instrText xml:space="preserve"> PAGEREF _Toc242795852 \h </w:instrText>
+              <w:instrText xml:space="preserve"> PAGEREF _Toc242867937 \h </w:instrText>
             </w:r>
             <w:r>
               <w:rPr>
@@ -4865,7 +4865,7 @@
               <w14:ligatures w14:val="standardContextual"/>
             </w:rPr>
           </w:pPr>
-          <w:hyperlink w:anchor="_Toc242795853" w:history="1">
+          <w:hyperlink w:anchor="_Toc242867938" w:history="1">
             <w:r>
               <w:rPr>
                 <w:rStyle w:val="Hyperlink"/>
@@ -4889,7 +4889,7 @@
               <w:rPr>
                 <w:noProof/>
               </w:rPr>
-              <w:instrText xml:space="preserve"> PAGEREF _Toc242795853 \h </w:instrText>
+              <w:instrText xml:space="preserve"> PAGEREF _Toc242867938 \h </w:instrText>
             </w:r>
             <w:r>
               <w:rPr>
@@ -4929,13 +4929,13 @@
               <w14:ligatures w14:val="standardContextual"/>
             </w:rPr>
           </w:pPr>
-          <w:hyperlink w:anchor="_Toc242795854" w:history="1">
+          <w:hyperlink w:anchor="_Toc242867939" w:history="1">
             <w:r>
               <w:rPr>
                 <w:rStyle w:val="Hyperlink"/>
                 <w:noProof/>
               </w:rPr>
-              <w:t>Appendix D Papers and certificates</w:t>
+              <w:t>Appendix D Individual contribution</w:t>
             </w:r>
             <w:r>
               <w:rPr>
@@ -4953,7 +4953,7 @@
               <w:rPr>
                 <w:noProof/>
               </w:rPr>
-              <w:instrText xml:space="preserve"> PAGEREF _Toc242795854 \h </w:instrText>
+              <w:instrText xml:space="preserve"> PAGEREF _Toc242867939 \h </w:instrText>
             </w:r>
             <w:r>
               <w:rPr>
@@ -4971,6 +4971,70 @@
                 <w:noProof/>
               </w:rPr>
               <w:t>33</w:t>
+            </w:r>
+            <w:r>
+              <w:rPr>
+                <w:noProof/>
+              </w:rPr>
+              <w:fldChar w:fldCharType="end"/>
+            </w:r>
+          </w:hyperlink>
+        </w:p>
+        <w:p>
+          <w:pPr>
+            <w:pStyle w:val="TOC2"/>
+            <w:tabs>
+              <w:tab w:val="right" w:leader="dot" w:pos="9016"/>
+            </w:tabs>
+            <w:rPr>
+              <w:rFonts w:asciiTheme="minorHAnsi" w:eastAsiaTheme="minorEastAsia" w:hAnsiTheme="minorHAnsi" w:cstheme="minorBidi"/>
+              <w:noProof/>
+              <w:kern w:val="2"/>
+              <w14:ligatures w14:val="standardContextual"/>
+            </w:rPr>
+          </w:pPr>
+          <w:hyperlink w:anchor="_Toc242867940" w:history="1">
+            <w:r>
+              <w:rPr>
+                <w:rStyle w:val="Hyperlink"/>
+                <w:noProof/>
+              </w:rPr>
+              <w:t>Appendix E Papers and certificates</w:t>
+            </w:r>
+            <w:r>
+              <w:rPr>
+                <w:noProof/>
+              </w:rPr>
+              <w:tab/>
+            </w:r>
+            <w:r>
+              <w:rPr>
+                <w:noProof/>
+              </w:rPr>
+              <w:fldChar w:fldCharType="begin"/>
+            </w:r>
+            <w:r>
+              <w:rPr>
+                <w:noProof/>
+              </w:rPr>
+              <w:instrText xml:space="preserve"> PAGEREF _Toc242867940 \h </w:instrText>
+            </w:r>
+            <w:r>
+              <w:rPr>
+                <w:noProof/>
+              </w:rPr>
+            </w:r>
+            <w:r>
+              <w:rPr>
+                <w:noProof/>
+              </w:rPr>
+              <w:fldChar w:fldCharType="separate"/>
+            </w:r>
+            <w:r>
+              <w:rPr>
+                <w:noProof/>
+              </w:rPr>
+              <w:t>34</w:t>
             </w:r>
             <w:r>
               <w:rPr>
@@ -4998,7 +5062,7 @@
         <w:spacing w:before="240" w:after="280"/>
         <w:jc w:val="center"/>
       </w:pPr>
-      <w:bookmarkStart w:id="1" w:name="_Toc242795796"/>
+      <w:bookmarkStart w:id="1" w:name="_Toc242867881"/>
       <w:r>
         <w:lastRenderedPageBreak/>
         <w:t>ABSTRACT</w:t>
@@ -5058,7 +5122,7 @@
         <w:spacing w:before="240" w:after="280"/>
         <w:jc w:val="center"/>
       </w:pPr>
-      <w:bookmarkStart w:id="2" w:name="_Toc242795797"/>
+      <w:bookmarkStart w:id="2" w:name="_Toc242867882"/>
       <w:r>
         <w:lastRenderedPageBreak/>
         <w:t>ABBREVIATIONS</w:t>
@@ -5080,7 +5144,7 @@
           <w:left w:w="10" w:type="dxa"/>
           <w:right w:w="10" w:type="dxa"/>
         </w:tblCellMar>
-        <w:tblLook w:val="0000" w:firstRow="0" w:lastRow="0" w:firstColumn="0" w:lastColumn="0" w:noHBand="0" w:noVBand="0"/>
+        <w:tblLook w:val="04A0" w:firstRow="1" w:lastRow="0" w:firstColumn="1" w:lastColumn="0" w:noHBand="0" w:noVBand="1"/>
       </w:tblPr>
       <w:tblGrid>
         <w:gridCol w:w="2200"/>
@@ -6056,7 +6120,7 @@
         <w:spacing w:before="240" w:after="280"/>
         <w:jc w:val="center"/>
       </w:pPr>
-      <w:bookmarkStart w:id="3" w:name="_Toc242795798"/>
+      <w:bookmarkStart w:id="3" w:name="_Toc242867883"/>
       <w:r>
         <w:lastRenderedPageBreak/>
         <w:t>LIST OF FIGURES</w:t>
@@ -6078,7 +6142,7 @@
           <w:left w:w="10" w:type="dxa"/>
           <w:right w:w="10" w:type="dxa"/>
         </w:tblCellMar>
-        <w:tblLook w:val="0000" w:firstRow="0" w:lastRow="0" w:firstColumn="0" w:lastColumn="0" w:noHBand="0" w:noVBand="0"/>
+        <w:tblLook w:val="04A0" w:firstRow="1" w:lastRow="0" w:firstColumn="1" w:lastColumn="0" w:noHBand="0" w:noVBand="1"/>
       </w:tblPr>
       <w:tblGrid>
         <w:gridCol w:w="1400"/>
@@ -7451,7 +7515,7 @@
         <w:spacing w:before="240" w:after="280"/>
         <w:jc w:val="center"/>
       </w:pPr>
-      <w:bookmarkStart w:id="4" w:name="_Toc242795799"/>
+      <w:bookmarkStart w:id="4" w:name="_Toc242867884"/>
       <w:r>
         <w:lastRenderedPageBreak/>
         <w:t>LIST OF TABLES</w:t>
@@ -7473,7 +7537,7 @@
           <w:left w:w="10" w:type="dxa"/>
           <w:right w:w="10" w:type="dxa"/>
         </w:tblCellMar>
-        <w:tblLook w:val="0000" w:firstRow="0" w:lastRow="0" w:firstColumn="0" w:lastColumn="0" w:noHBand="0" w:noVBand="0"/>
+        <w:tblLook w:val="04A0" w:firstRow="1" w:lastRow="0" w:firstColumn="1" w:lastColumn="0" w:noHBand="0" w:noVBand="1"/>
       </w:tblPr>
       <w:tblGrid>
         <w:gridCol w:w="1400"/>
@@ -8947,7 +9011,7 @@
         <w:spacing w:before="240" w:after="280"/>
         <w:jc w:val="center"/>
       </w:pPr>
-      <w:bookmarkStart w:id="5" w:name="_Toc242795800"/>
+      <w:bookmarkStart w:id="5" w:name="_Toc242867885"/>
       <w:r>
         <w:lastRenderedPageBreak/>
         <w:t>INTRODUCTION</w:t>
@@ -8959,7 +9023,7 @@
         <w:pStyle w:val="Heading2"/>
         <w:spacing w:before="240" w:after="120"/>
       </w:pPr>
-      <w:bookmarkStart w:id="6" w:name="_Toc242795801"/>
+      <w:bookmarkStart w:id="6" w:name="_Toc242867886"/>
       <w:r>
         <w:t>1.1 Introduction</w:t>
       </w:r>
@@ -8988,7 +9052,7 @@
         <w:pStyle w:val="Heading2"/>
         <w:spacing w:before="240" w:after="120"/>
       </w:pPr>
-      <w:bookmarkStart w:id="7" w:name="_Toc242795802"/>
+      <w:bookmarkStart w:id="7" w:name="_Toc242867887"/>
       <w:r>
         <w:t>1.2 Problem Statement</w:t>
       </w:r>
@@ -9008,7 +9072,7 @@
         <w:pStyle w:val="Heading2"/>
         <w:spacing w:before="240" w:after="120"/>
       </w:pPr>
-      <w:bookmarkStart w:id="8" w:name="_Toc242795803"/>
+      <w:bookmarkStart w:id="8" w:name="_Toc242867888"/>
       <w:r>
         <w:t>1.3 Objectives</w:t>
       </w:r>
@@ -9111,7 +9175,7 @@
         <w:pStyle w:val="Heading2"/>
         <w:spacing w:before="240" w:after="120"/>
       </w:pPr>
-      <w:bookmarkStart w:id="9" w:name="_Toc242795804"/>
+      <w:bookmarkStart w:id="9" w:name="_Toc242867889"/>
       <w:r>
         <w:t>1.4 Scope of the Project</w:t>
       </w:r>
@@ -9140,7 +9204,7 @@
         <w:spacing w:before="240" w:after="280"/>
         <w:jc w:val="center"/>
       </w:pPr>
-      <w:bookmarkStart w:id="10" w:name="_Toc242795805"/>
+      <w:bookmarkStart w:id="10" w:name="_Toc242867890"/>
       <w:r>
         <w:lastRenderedPageBreak/>
         <w:t>LITERATURE REVIEW</w:t>
@@ -9152,7 +9216,7 @@
         <w:pStyle w:val="Heading2"/>
         <w:spacing w:before="240" w:after="120"/>
       </w:pPr>
-      <w:bookmarkStart w:id="11" w:name="_Toc242795806"/>
+      <w:bookmarkStart w:id="11" w:name="_Toc242867891"/>
       <w:r>
         <w:t>2.1 Review of Existing Systems and Related Work</w:t>
       </w:r>
@@ -9230,7 +9294,7 @@
           <w:left w:w="10" w:type="dxa"/>
           <w:right w:w="10" w:type="dxa"/>
         </w:tblCellMar>
-        <w:tblLook w:val="0000" w:firstRow="0" w:lastRow="0" w:firstColumn="0" w:lastColumn="0" w:noHBand="0" w:noVBand="0"/>
+        <w:tblLook w:val="04A0" w:firstRow="1" w:lastRow="0" w:firstColumn="1" w:lastColumn="0" w:noHBand="0" w:noVBand="1"/>
       </w:tblPr>
       <w:tblGrid>
         <w:gridCol w:w="1421"/>
@@ -10286,7 +10350,7 @@
         <w:pStyle w:val="Heading2"/>
         <w:spacing w:before="240" w:after="120"/>
       </w:pPr>
-      <w:bookmarkStart w:id="12" w:name="_Toc242795807"/>
+      <w:bookmarkStart w:id="12" w:name="_Toc242867892"/>
       <w:r>
         <w:t>2.2 Research Gap</w:t>
       </w:r>
@@ -10309,7 +10373,7 @@
         <w:pStyle w:val="Heading2"/>
         <w:spacing w:before="240" w:after="120"/>
       </w:pPr>
-      <w:bookmarkStart w:id="13" w:name="_Toc242795808"/>
+      <w:bookmarkStart w:id="13" w:name="_Toc242867893"/>
       <w:r>
         <w:t>2.3 Summary of Findings</w:t>
       </w:r>
@@ -10379,7 +10443,7 @@
         <w:spacing w:before="240" w:after="280"/>
         <w:jc w:val="center"/>
       </w:pPr>
-      <w:bookmarkStart w:id="14" w:name="_Toc242795809"/>
+      <w:bookmarkStart w:id="14" w:name="_Toc242867894"/>
       <w:r>
         <w:lastRenderedPageBreak/>
         <w:t>SYSTEM ANALYSIS</w:t>
@@ -10391,7 +10455,7 @@
         <w:pStyle w:val="Heading2"/>
         <w:spacing w:before="240" w:after="120"/>
       </w:pPr>
-      <w:bookmarkStart w:id="15" w:name="_Toc242795810"/>
+      <w:bookmarkStart w:id="15" w:name="_Toc242867895"/>
       <w:r>
         <w:t>3.1 Requirement Analysis</w:t>
       </w:r>
@@ -10411,7 +10475,7 @@
         <w:pStyle w:val="Heading3"/>
         <w:spacing w:before="200" w:after="100"/>
       </w:pPr>
-      <w:bookmarkStart w:id="16" w:name="_Toc242795811"/>
+      <w:bookmarkStart w:id="16" w:name="_Toc242867896"/>
       <w:r>
         <w:t>3.1.1 Functional requirements</w:t>
       </w:r>
@@ -10456,7 +10520,7 @@
           <w:left w:w="10" w:type="dxa"/>
           <w:right w:w="10" w:type="dxa"/>
         </w:tblCellMar>
-        <w:tblLook w:val="0000" w:firstRow="0" w:lastRow="0" w:firstColumn="0" w:lastColumn="0" w:noHBand="0" w:noVBand="0"/>
+        <w:tblLook w:val="04A0" w:firstRow="1" w:lastRow="0" w:firstColumn="1" w:lastColumn="0" w:noHBand="0" w:noVBand="1"/>
       </w:tblPr>
       <w:tblGrid>
         <w:gridCol w:w="800"/>
@@ -11991,7 +12055,7 @@
         <w:pStyle w:val="Heading3"/>
         <w:spacing w:before="200" w:after="100"/>
       </w:pPr>
-      <w:bookmarkStart w:id="17" w:name="_Toc242795812"/>
+      <w:bookmarkStart w:id="17" w:name="_Toc242867897"/>
       <w:r>
         <w:t>3.1.2 Non-functional requirements</w:t>
       </w:r>
@@ -12036,7 +12100,7 @@
           <w:left w:w="10" w:type="dxa"/>
           <w:right w:w="10" w:type="dxa"/>
         </w:tblCellMar>
-        <w:tblLook w:val="0000" w:firstRow="0" w:lastRow="0" w:firstColumn="0" w:lastColumn="0" w:noHBand="0" w:noVBand="0"/>
+        <w:tblLook w:val="04A0" w:firstRow="1" w:lastRow="0" w:firstColumn="1" w:lastColumn="0" w:noHBand="0" w:noVBand="1"/>
       </w:tblPr>
       <w:tblGrid>
         <w:gridCol w:w="1680"/>
@@ -12881,7 +12945,7 @@
         <w:pStyle w:val="Heading2"/>
         <w:spacing w:before="240" w:after="120"/>
       </w:pPr>
-      <w:bookmarkStart w:id="18" w:name="_Toc242795813"/>
+      <w:bookmarkStart w:id="18" w:name="_Toc242867898"/>
       <w:r>
         <w:t>3.2 Feasibility Study</w:t>
       </w:r>
@@ -12904,7 +12968,7 @@
         <w:pStyle w:val="Heading2"/>
         <w:spacing w:before="240" w:after="120"/>
       </w:pPr>
-      <w:bookmarkStart w:id="19" w:name="_Toc242795814"/>
+      <w:bookmarkStart w:id="19" w:name="_Toc242867899"/>
       <w:r>
         <w:t>3.3 System Specifications</w:t>
       </w:r>
@@ -12949,7 +13013,7 @@
           <w:left w:w="10" w:type="dxa"/>
           <w:right w:w="10" w:type="dxa"/>
         </w:tblCellMar>
-        <w:tblLook w:val="0000" w:firstRow="0" w:lastRow="0" w:firstColumn="0" w:lastColumn="0" w:noHBand="0" w:noVBand="0"/>
+        <w:tblLook w:val="04A0" w:firstRow="1" w:lastRow="0" w:firstColumn="1" w:lastColumn="0" w:noHBand="0" w:noVBand="1"/>
       </w:tblPr>
       <w:tblGrid>
         <w:gridCol w:w="2600"/>
@@ -13674,7 +13738,7 @@
         <w:spacing w:before="240" w:after="280"/>
         <w:jc w:val="center"/>
       </w:pPr>
-      <w:bookmarkStart w:id="20" w:name="_Toc242795815"/>
+      <w:bookmarkStart w:id="20" w:name="_Toc242867900"/>
       <w:r>
         <w:lastRenderedPageBreak/>
         <w:t>SYSTEM DESIGN</w:t>
@@ -13686,7 +13750,7 @@
         <w:pStyle w:val="Heading2"/>
         <w:spacing w:before="240" w:after="120"/>
       </w:pPr>
-      <w:bookmarkStart w:id="21" w:name="_Toc242795816"/>
+      <w:bookmarkStart w:id="21" w:name="_Toc242867901"/>
       <w:r>
         <w:t>4.1 System Architecture</w:t>
       </w:r>
@@ -13712,10 +13776,10 @@
           <w:noProof/>
         </w:rPr>
         <w:drawing>
-          <wp:inline distT="0" distB="0" distL="0" distR="0" wp14:anchorId="7504AFDE" wp14:editId="4FDBD261">
+          <wp:inline distT="0" distB="0" distL="0" distR="0" wp14:anchorId="0E94D74E" wp14:editId="7F1481BB">
             <wp:extent cx="4191000" cy="2171700"/>
             <wp:effectExtent l="0" t="0" r="0" b="0"/>
-            <wp:docPr id="1874791649" name="01_architecture.png" descr="System architecture: desktop client, local service, local model runtime and storage" title="Figure 4.1 System architecture: desktop client, local service, local model runtime and storage"/>
+            <wp:docPr id="1437260279" name="01_architecture.png" descr="System architecture: desktop client, local service, local model runtime and storage" title="Figure 4.1 System architecture: desktop client, local service, local model runtime and storage"/>
             <wp:cNvGraphicFramePr>
               <a:graphicFrameLocks xmlns:a="http://schemas.openxmlformats.org/drawingml/2006/main" noChangeAspect="1"/>
             </wp:cNvGraphicFramePr>
@@ -13781,7 +13845,7 @@
         <w:pStyle w:val="Heading2"/>
         <w:spacing w:before="240" w:after="120"/>
       </w:pPr>
-      <w:bookmarkStart w:id="22" w:name="_Toc242795817"/>
+      <w:bookmarkStart w:id="22" w:name="_Toc242867902"/>
       <w:r>
         <w:t>4.2 Module Design</w:t>
       </w:r>
@@ -13811,10 +13875,10 @@
           <w:noProof/>
         </w:rPr>
         <w:drawing>
-          <wp:inline distT="0" distB="0" distL="0" distR="0" wp14:anchorId="3F22C175" wp14:editId="336486C3">
+          <wp:inline distT="0" distB="0" distL="0" distR="0" wp14:anchorId="50C1DE31" wp14:editId="3875CFFF">
             <wp:extent cx="4095750" cy="866775"/>
             <wp:effectExtent l="0" t="0" r="0" b="0"/>
-            <wp:docPr id="1099774602" name="02_module_design.png" descr="Module design and the data each module passes to the next" title="Figure 4.2 Module design and the data each module passes to the next"/>
+            <wp:docPr id="1301865563" name="02_module_design.png" descr="Module design and the data each module passes to the next" title="Figure 4.2 Module design and the data each module passes to the next"/>
             <wp:cNvGraphicFramePr>
               <a:graphicFrameLocks xmlns:a="http://schemas.openxmlformats.org/drawingml/2006/main" noChangeAspect="1"/>
             </wp:cNvGraphicFramePr>
@@ -13877,7 +13941,7 @@
         <w:pStyle w:val="Heading2"/>
         <w:spacing w:before="240" w:after="120"/>
       </w:pPr>
-      <w:bookmarkStart w:id="23" w:name="_Toc242795818"/>
+      <w:bookmarkStart w:id="23" w:name="_Toc242867903"/>
       <w:r>
         <w:t>4.3 Data Flow Diagrams and UML Diagrams</w:t>
       </w:r>
@@ -13888,7 +13952,7 @@
         <w:pStyle w:val="Heading3"/>
         <w:spacing w:before="200" w:after="100"/>
       </w:pPr>
-      <w:bookmarkStart w:id="24" w:name="_Toc242795819"/>
+      <w:bookmarkStart w:id="24" w:name="_Toc242867904"/>
       <w:r>
         <w:t>4.3.1 Data flow diagrams</w:t>
       </w:r>
@@ -13905,10 +13969,10 @@
           <w:noProof/>
         </w:rPr>
         <w:drawing>
-          <wp:inline distT="0" distB="0" distL="0" distR="0" wp14:anchorId="3292B7D7" wp14:editId="41A37425">
+          <wp:inline distT="0" distB="0" distL="0" distR="0" wp14:anchorId="1AB94D72" wp14:editId="51DCBFCB">
             <wp:extent cx="3810000" cy="1085850"/>
             <wp:effectExtent l="0" t="0" r="0" b="0"/>
-            <wp:docPr id="1936336902" name="03_dfd_context.png" descr="Data flow diagram, context level" title="Figure 4.3 Data flow diagram, context level"/>
+            <wp:docPr id="1584396309" name="03_dfd_context.png" descr="Data flow diagram, context level" title="Figure 4.3 Data flow diagram, context level"/>
             <wp:cNvGraphicFramePr>
               <a:graphicFrameLocks xmlns:a="http://schemas.openxmlformats.org/drawingml/2006/main" noChangeAspect="1"/>
             </wp:cNvGraphicFramePr>
@@ -13977,10 +14041,10 @@
           <w:noProof/>
         </w:rPr>
         <w:drawing>
-          <wp:inline distT="0" distB="0" distL="0" distR="0" wp14:anchorId="36AB7C65" wp14:editId="6BCFF712">
+          <wp:inline distT="0" distB="0" distL="0" distR="0" wp14:anchorId="1CB69D20" wp14:editId="24B687F4">
             <wp:extent cx="4191000" cy="1371600"/>
             <wp:effectExtent l="0" t="0" r="0" b="0"/>
-            <wp:docPr id="1384734648" name="04_dfd_level1.png" descr="Data flow diagram, level 1" title="Figure 4.4 Data flow diagram, level 1"/>
+            <wp:docPr id="1906599776" name="04_dfd_level1.png" descr="Data flow diagram, level 1" title="Figure 4.4 Data flow diagram, level 1"/>
             <wp:cNvGraphicFramePr>
               <a:graphicFrameLocks xmlns:a="http://schemas.openxmlformats.org/drawingml/2006/main" noChangeAspect="1"/>
             </wp:cNvGraphicFramePr>
@@ -14047,7 +14111,7 @@
         <w:pStyle w:val="Heading3"/>
         <w:spacing w:before="200" w:after="100"/>
       </w:pPr>
-      <w:bookmarkStart w:id="25" w:name="_Toc242795820"/>
+      <w:bookmarkStart w:id="25" w:name="_Toc242867905"/>
       <w:r>
         <w:t>4.3.2 UML diagrams</w:t>
       </w:r>
@@ -14064,10 +14128,10 @@
           <w:noProof/>
         </w:rPr>
         <w:drawing>
-          <wp:inline distT="0" distB="0" distL="0" distR="0" wp14:anchorId="24465937" wp14:editId="39D94735">
+          <wp:inline distT="0" distB="0" distL="0" distR="0" wp14:anchorId="098A5F61" wp14:editId="1C79C782">
             <wp:extent cx="3429000" cy="3000375"/>
             <wp:effectExtent l="0" t="0" r="0" b="0"/>
-            <wp:docPr id="1586591001" name="05_use_case.png" descr="Use case diagram of user actions" title="Figure 4.5 Use case diagram of user actions"/>
+            <wp:docPr id="2126890737" name="05_use_case.png" descr="Use case diagram of user actions" title="Figure 4.5 Use case diagram of user actions"/>
             <wp:cNvGraphicFramePr>
               <a:graphicFrameLocks xmlns:a="http://schemas.openxmlformats.org/drawingml/2006/main" noChangeAspect="1"/>
             </wp:cNvGraphicFramePr>
@@ -14140,10 +14204,10 @@
         </w:rPr>
         <w:lastRenderedPageBreak/>
         <w:drawing>
-          <wp:inline distT="0" distB="0" distL="0" distR="0" wp14:anchorId="5F8D86E2" wp14:editId="537C62A5">
+          <wp:inline distT="0" distB="0" distL="0" distR="0" wp14:anchorId="06E793B5" wp14:editId="7D1A332F">
             <wp:extent cx="4000500" cy="2600325"/>
             <wp:effectExtent l="0" t="0" r="0" b="0"/>
-            <wp:docPr id="1824792348" name="06_class_diagram.png" descr="Class diagram of response and settings classes" title="Figure 4.6 Class diagram of response and settings classes"/>
+            <wp:docPr id="359337807" name="06_class_diagram.png" descr="Class diagram of response and settings classes" title="Figure 4.6 Class diagram of response and settings classes"/>
             <wp:cNvGraphicFramePr>
               <a:graphicFrameLocks xmlns:a="http://schemas.openxmlformats.org/drawingml/2006/main" noChangeAspect="1"/>
             </wp:cNvGraphicFramePr>
@@ -14215,10 +14279,10 @@
           <w:noProof/>
         </w:rPr>
         <w:drawing>
-          <wp:inline distT="0" distB="0" distL="0" distR="0" wp14:anchorId="65E125E9" wp14:editId="097850E9">
+          <wp:inline distT="0" distB="0" distL="0" distR="0" wp14:anchorId="712A8742" wp14:editId="0793F27B">
             <wp:extent cx="4191000" cy="1628775"/>
             <wp:effectExtent l="0" t="0" r="0" b="0"/>
-            <wp:docPr id="1251098563" name="07_sequence_open.png" descr="Sequence diagram of an open request" title="Figure 4.7 Sequence diagram of an open request"/>
+            <wp:docPr id="1904971778" name="07_sequence_open.png" descr="Sequence diagram of an open request" title="Figure 4.7 Sequence diagram of an open request"/>
             <wp:cNvGraphicFramePr>
               <a:graphicFrameLocks xmlns:a="http://schemas.openxmlformats.org/drawingml/2006/main" noChangeAspect="1"/>
             </wp:cNvGraphicFramePr>
@@ -14288,10 +14352,10 @@
         </w:rPr>
         <w:lastRenderedPageBreak/>
         <w:drawing>
-          <wp:inline distT="0" distB="0" distL="0" distR="0" wp14:anchorId="67C4B862" wp14:editId="00E27B38">
+          <wp:inline distT="0" distB="0" distL="0" distR="0" wp14:anchorId="51CA03C4" wp14:editId="4DFF610D">
             <wp:extent cx="4191000" cy="2886075"/>
             <wp:effectExtent l="0" t="0" r="0" b="0"/>
-            <wp:docPr id="1342830502" name="10_sequence_followup.png" descr="Sequence diagram of a follow-up question resolved from memory" title="Figure 4.8 Sequence diagram of a follow-up question resolved from memory"/>
+            <wp:docPr id="487701844" name="10_sequence_followup.png" descr="Sequence diagram of a follow-up question resolved from memory" title="Figure 4.8 Sequence diagram of a follow-up question resolved from memory"/>
             <wp:cNvGraphicFramePr>
               <a:graphicFrameLocks xmlns:a="http://schemas.openxmlformats.org/drawingml/2006/main" noChangeAspect="1"/>
             </wp:cNvGraphicFramePr>
@@ -14354,7 +14418,7 @@
         <w:pStyle w:val="Heading2"/>
         <w:spacing w:before="240" w:after="120"/>
       </w:pPr>
-      <w:bookmarkStart w:id="26" w:name="_Toc242795821"/>
+      <w:bookmarkStart w:id="26" w:name="_Toc242867906"/>
       <w:r>
         <w:t>4.4 Database Design</w:t>
       </w:r>
@@ -14381,10 +14445,10 @@
         </w:rPr>
         <w:lastRenderedPageBreak/>
         <w:drawing>
-          <wp:inline distT="0" distB="0" distL="0" distR="0" wp14:anchorId="0B9DD13D" wp14:editId="4070C5FC">
+          <wp:inline distT="0" distB="0" distL="0" distR="0" wp14:anchorId="593B0A4F" wp14:editId="490769B1">
             <wp:extent cx="3810000" cy="2619375"/>
             <wp:effectExtent l="0" t="0" r="0" b="0"/>
-            <wp:docPr id="1450052579" name="08_er_diagram.png" descr="Entity-relationship diagram" title="Figure 4.9 Entity-relationship diagram"/>
+            <wp:docPr id="151808908" name="08_er_diagram.png" descr="Entity-relationship diagram" title="Figure 4.9 Entity-relationship diagram"/>
             <wp:cNvGraphicFramePr>
               <a:graphicFrameLocks xmlns:a="http://schemas.openxmlformats.org/drawingml/2006/main" noChangeAspect="1"/>
             </wp:cNvGraphicFramePr>
@@ -14481,7 +14545,7 @@
           <w:left w:w="10" w:type="dxa"/>
           <w:right w:w="10" w:type="dxa"/>
         </w:tblCellMar>
-        <w:tblLook w:val="0000" w:firstRow="0" w:lastRow="0" w:firstColumn="0" w:lastColumn="0" w:noHBand="0" w:noVBand="0"/>
+        <w:tblLook w:val="04A0" w:firstRow="1" w:lastRow="0" w:firstColumn="1" w:lastColumn="0" w:noHBand="0" w:noVBand="1"/>
       </w:tblPr>
       <w:tblGrid>
         <w:gridCol w:w="2600"/>
@@ -15171,7 +15235,7 @@
           <w:left w:w="10" w:type="dxa"/>
           <w:right w:w="10" w:type="dxa"/>
         </w:tblCellMar>
-        <w:tblLook w:val="0000" w:firstRow="0" w:lastRow="0" w:firstColumn="0" w:lastColumn="0" w:noHBand="0" w:noVBand="0"/>
+        <w:tblLook w:val="04A0" w:firstRow="1" w:lastRow="0" w:firstColumn="1" w:lastColumn="0" w:noHBand="0" w:noVBand="1"/>
       </w:tblPr>
       <w:tblGrid>
         <w:gridCol w:w="2600"/>
@@ -15648,7 +15712,7 @@
         <w:pStyle w:val="Heading2"/>
         <w:spacing w:before="240" w:after="120"/>
       </w:pPr>
-      <w:bookmarkStart w:id="27" w:name="_Toc242795822"/>
+      <w:bookmarkStart w:id="27" w:name="_Toc242867907"/>
       <w:r>
         <w:t>4.5 UI / UX Design</w:t>
       </w:r>
@@ -15674,10 +15738,10 @@
           <w:noProof/>
         </w:rPr>
         <w:drawing>
-          <wp:inline distT="0" distB="0" distL="0" distR="0" wp14:anchorId="41683C0F" wp14:editId="56D4F5FF">
+          <wp:inline distT="0" distB="0" distL="0" distR="0" wp14:anchorId="3C6E81D8" wp14:editId="76780D70">
             <wp:extent cx="4095750" cy="3200400"/>
             <wp:effectExtent l="0" t="0" r="0" b="0"/>
-            <wp:docPr id="234286648" name="ui-chat.png" descr="Chat view: related files with the reason each is linked" title="Figure 4.10 Chat view: related files with the reason each is linked"/>
+            <wp:docPr id="505303898" name="ui-chat.png" descr="Chat view: related files with the reason each is linked" title="Figure 4.10 Chat view: related files with the reason each is linked"/>
             <wp:cNvGraphicFramePr>
               <a:graphicFrameLocks xmlns:a="http://schemas.openxmlformats.org/drawingml/2006/main" noChangeAspect="1"/>
             </wp:cNvGraphicFramePr>
@@ -15744,7 +15808,7 @@
         <w:pStyle w:val="Heading2"/>
         <w:spacing w:before="240" w:after="120"/>
       </w:pPr>
-      <w:bookmarkStart w:id="28" w:name="_Toc242795823"/>
+      <w:bookmarkStart w:id="28" w:name="_Toc242867908"/>
       <w:r>
         <w:t>4.6 Technology Stack</w:t>
       </w:r>
@@ -15789,7 +15853,7 @@
           <w:left w:w="10" w:type="dxa"/>
           <w:right w:w="10" w:type="dxa"/>
         </w:tblCellMar>
-        <w:tblLook w:val="0000" w:firstRow="0" w:lastRow="0" w:firstColumn="0" w:lastColumn="0" w:noHBand="0" w:noVBand="0"/>
+        <w:tblLook w:val="04A0" w:firstRow="1" w:lastRow="0" w:firstColumn="1" w:lastColumn="0" w:noHBand="0" w:noVBand="1"/>
       </w:tblPr>
       <w:tblGrid>
         <w:gridCol w:w="2200"/>
@@ -16261,7 +16325,7 @@
         <w:spacing w:before="240" w:after="280"/>
         <w:jc w:val="center"/>
       </w:pPr>
-      <w:bookmarkStart w:id="29" w:name="_Toc242795824"/>
+      <w:bookmarkStart w:id="29" w:name="_Toc242867909"/>
       <w:r>
         <w:lastRenderedPageBreak/>
         <w:t>IMPLEMENTATION</w:t>
@@ -16273,7 +16337,7 @@
         <w:pStyle w:val="Heading2"/>
         <w:spacing w:before="240" w:after="120"/>
       </w:pPr>
-      <w:bookmarkStart w:id="30" w:name="_Toc242795825"/>
+      <w:bookmarkStart w:id="30" w:name="_Toc242867910"/>
       <w:r>
         <w:t>5.1 Module-wise Description</w:t>
       </w:r>
@@ -16284,7 +16348,7 @@
         <w:pStyle w:val="Heading3"/>
         <w:spacing w:before="200" w:after="100"/>
       </w:pPr>
-      <w:bookmarkStart w:id="31" w:name="_Toc242795826"/>
+      <w:bookmarkStart w:id="31" w:name="_Toc242867911"/>
       <w:r>
         <w:t>5.1.1 Natural Language Interface</w:t>
       </w:r>
@@ -16304,7 +16368,7 @@
         <w:pStyle w:val="Heading3"/>
         <w:spacing w:before="200" w:after="100"/>
       </w:pPr>
-      <w:bookmarkStart w:id="32" w:name="_Toc242795827"/>
+      <w:bookmarkStart w:id="32" w:name="_Toc242867912"/>
       <w:r>
         <w:t>5.1.2 Semantic Search Engine</w:t>
       </w:r>
@@ -16324,7 +16388,7 @@
         <w:pStyle w:val="Heading3"/>
         <w:spacing w:before="200" w:after="100"/>
       </w:pPr>
-      <w:bookmarkStart w:id="33" w:name="_Toc242795828"/>
+      <w:bookmarkStart w:id="33" w:name="_Toc242867913"/>
       <w:r>
         <w:t>5.1.3 AI File Organiser</w:t>
       </w:r>
@@ -16344,7 +16408,7 @@
         <w:pStyle w:val="Heading3"/>
         <w:spacing w:before="200" w:after="100"/>
       </w:pPr>
-      <w:bookmarkStart w:id="34" w:name="_Toc242795829"/>
+      <w:bookmarkStart w:id="34" w:name="_Toc242867914"/>
       <w:r>
         <w:t>5.1.4 Knowledge Graph</w:t>
       </w:r>
@@ -16367,7 +16431,7 @@
         <w:pStyle w:val="Heading3"/>
         <w:spacing w:before="200" w:after="100"/>
       </w:pPr>
-      <w:bookmarkStart w:id="35" w:name="_Toc242795830"/>
+      <w:bookmarkStart w:id="35" w:name="_Toc242867915"/>
       <w:r>
         <w:t>5.1.5 Context Memory Engine</w:t>
       </w:r>
@@ -16391,7 +16455,7 @@
         <w:pStyle w:val="Heading3"/>
         <w:spacing w:before="200" w:after="100"/>
       </w:pPr>
-      <w:bookmarkStart w:id="36" w:name="_Toc242795831"/>
+      <w:bookmarkStart w:id="36" w:name="_Toc242867916"/>
       <w:r>
         <w:t>5.1.6 Intelligent Workspace Manager</w:t>
       </w:r>
@@ -16411,7 +16475,7 @@
         <w:pStyle w:val="Heading3"/>
         <w:spacing w:before="200" w:after="100"/>
       </w:pPr>
-      <w:bookmarkStart w:id="37" w:name="_Toc242795832"/>
+      <w:bookmarkStart w:id="37" w:name="_Toc242867917"/>
       <w:r>
         <w:t>5.1.7 Privacy audit</w:t>
       </w:r>
@@ -16431,7 +16495,7 @@
         <w:pStyle w:val="Heading2"/>
         <w:spacing w:before="240" w:after="120"/>
       </w:pPr>
-      <w:bookmarkStart w:id="38" w:name="_Toc242795833"/>
+      <w:bookmarkStart w:id="38" w:name="_Toc242867918"/>
       <w:r>
         <w:t>5.2 Technologies Used</w:t>
       </w:r>
@@ -16451,7 +16515,7 @@
         <w:pStyle w:val="Heading2"/>
         <w:spacing w:before="240" w:after="120"/>
       </w:pPr>
-      <w:bookmarkStart w:id="39" w:name="_Toc242795834"/>
+      <w:bookmarkStart w:id="39" w:name="_Toc242867919"/>
       <w:r>
         <w:t>5.3 Code Snippets</w:t>
       </w:r>
@@ -16649,7 +16713,7 @@
         <w:pStyle w:val="Heading2"/>
         <w:spacing w:before="240" w:after="120"/>
       </w:pPr>
-      <w:bookmarkStart w:id="40" w:name="_Toc242795835"/>
+      <w:bookmarkStart w:id="40" w:name="_Toc242867920"/>
       <w:r>
         <w:lastRenderedPageBreak/>
         <w:t>5.4 Screenshots of Outputs</w:t>
@@ -16667,10 +16731,10 @@
           <w:noProof/>
         </w:rPr>
         <w:drawing>
-          <wp:inline distT="0" distB="0" distL="0" distR="0" wp14:anchorId="42EE1CB7" wp14:editId="43D07398">
+          <wp:inline distT="0" distB="0" distL="0" distR="0" wp14:anchorId="76A876F3" wp14:editId="37E82C75">
             <wp:extent cx="4095750" cy="3200400"/>
             <wp:effectExtent l="0" t="0" r="0" b="0"/>
-            <wp:docPr id="578096056" name="ui-knowledge-graph.png" descr="Knowledge-graph view with a selected file and its neighbours" title="Figure 5.1 Knowledge-graph view with a selected file and its neighbours"/>
+            <wp:docPr id="1650871347" name="ui-knowledge-graph.png" descr="Knowledge-graph view with a selected file and its neighbours" title="Figure 5.1 Knowledge-graph view with a selected file and its neighbours"/>
             <wp:cNvGraphicFramePr>
               <a:graphicFrameLocks xmlns:a="http://schemas.openxmlformats.org/drawingml/2006/main" noChangeAspect="1"/>
             </wp:cNvGraphicFramePr>
@@ -16739,10 +16803,10 @@
           <w:noProof/>
         </w:rPr>
         <w:drawing>
-          <wp:inline distT="0" distB="0" distL="0" distR="0" wp14:anchorId="2EEF6344" wp14:editId="30BFE166">
+          <wp:inline distT="0" distB="0" distL="0" distR="0" wp14:anchorId="60FE58CC" wp14:editId="18A17137">
             <wp:extent cx="4095750" cy="3200400"/>
             <wp:effectExtent l="0" t="0" r="0" b="0"/>
-            <wp:docPr id="1708260658" name="ui-workspaces.png" descr="Workspace view with a created workspace and suggestions" title="Figure 5.2 Workspace view with a created workspace and suggestions"/>
+            <wp:docPr id="198615853" name="ui-workspaces.png" descr="Workspace view with a created workspace and suggestions" title="Figure 5.2 Workspace view with a created workspace and suggestions"/>
             <wp:cNvGraphicFramePr>
               <a:graphicFrameLocks xmlns:a="http://schemas.openxmlformats.org/drawingml/2006/main" noChangeAspect="1"/>
             </wp:cNvGraphicFramePr>
@@ -16812,7 +16876,7 @@
         <w:spacing w:before="240" w:after="280"/>
         <w:jc w:val="center"/>
       </w:pPr>
-      <w:bookmarkStart w:id="41" w:name="_Toc242795836"/>
+      <w:bookmarkStart w:id="41" w:name="_Toc242867921"/>
       <w:r>
         <w:lastRenderedPageBreak/>
         <w:t>TESTING AND VALIDATION</w:t>
@@ -16824,7 +16888,7 @@
         <w:pStyle w:val="Heading2"/>
         <w:spacing w:before="240" w:after="120"/>
       </w:pPr>
-      <w:bookmarkStart w:id="42" w:name="_Toc242795837"/>
+      <w:bookmarkStart w:id="42" w:name="_Toc242867922"/>
       <w:r>
         <w:t>6.1 Testing Types</w:t>
       </w:r>
@@ -16869,7 +16933,7 @@
           <w:left w:w="10" w:type="dxa"/>
           <w:right w:w="10" w:type="dxa"/>
         </w:tblCellMar>
-        <w:tblLook w:val="0000" w:firstRow="0" w:lastRow="0" w:firstColumn="0" w:lastColumn="0" w:noHBand="0" w:noVBand="0"/>
+        <w:tblLook w:val="04A0" w:firstRow="1" w:lastRow="0" w:firstColumn="1" w:lastColumn="0" w:noHBand="0" w:noVBand="1"/>
       </w:tblPr>
       <w:tblGrid>
         <w:gridCol w:w="1678"/>
@@ -17435,7 +17499,7 @@
         <w:pStyle w:val="Heading2"/>
         <w:spacing w:before="240" w:after="120"/>
       </w:pPr>
-      <w:bookmarkStart w:id="43" w:name="_Toc242795838"/>
+      <w:bookmarkStart w:id="43" w:name="_Toc242867923"/>
       <w:r>
         <w:t>6.2 Test Cases and Results</w:t>
       </w:r>
@@ -17489,7 +17553,7 @@
           <w:left w:w="10" w:type="dxa"/>
           <w:right w:w="10" w:type="dxa"/>
         </w:tblCellMar>
-        <w:tblLook w:val="0000" w:firstRow="0" w:lastRow="0" w:firstColumn="0" w:lastColumn="0" w:noHBand="0" w:noVBand="0"/>
+        <w:tblLook w:val="04A0" w:firstRow="1" w:lastRow="0" w:firstColumn="1" w:lastColumn="0" w:noHBand="0" w:noVBand="1"/>
       </w:tblPr>
       <w:tblGrid>
         <w:gridCol w:w="3000"/>
@@ -18507,7 +18571,7 @@
         <w:spacing w:before="240" w:after="280"/>
         <w:jc w:val="center"/>
       </w:pPr>
-      <w:bookmarkStart w:id="44" w:name="_Toc242795839"/>
+      <w:bookmarkStart w:id="44" w:name="_Toc242867924"/>
       <w:r>
         <w:lastRenderedPageBreak/>
         <w:t>RESULTS AND DISCUSSION</w:t>
@@ -18519,7 +18583,7 @@
         <w:pStyle w:val="Heading2"/>
         <w:spacing w:before="240" w:after="120"/>
       </w:pPr>
-      <w:bookmarkStart w:id="45" w:name="_Toc242795840"/>
+      <w:bookmarkStart w:id="45" w:name="_Toc242867925"/>
       <w:r>
         <w:t>7.1 Performance Evaluation</w:t>
       </w:r>
@@ -18576,7 +18640,7 @@
           <w:left w:w="10" w:type="dxa"/>
           <w:right w:w="10" w:type="dxa"/>
         </w:tblCellMar>
-        <w:tblLook w:val="0000" w:firstRow="0" w:lastRow="0" w:firstColumn="0" w:lastColumn="0" w:noHBand="0" w:noVBand="0"/>
+        <w:tblLook w:val="04A0" w:firstRow="1" w:lastRow="0" w:firstColumn="1" w:lastColumn="0" w:noHBand="0" w:noVBand="1"/>
       </w:tblPr>
       <w:tblGrid>
         <w:gridCol w:w="1300"/>
@@ -19232,7 +19296,7 @@
           <w:left w:w="10" w:type="dxa"/>
           <w:right w:w="10" w:type="dxa"/>
         </w:tblCellMar>
-        <w:tblLook w:val="0000" w:firstRow="0" w:lastRow="0" w:firstColumn="0" w:lastColumn="0" w:noHBand="0" w:noVBand="0"/>
+        <w:tblLook w:val="04A0" w:firstRow="1" w:lastRow="0" w:firstColumn="1" w:lastColumn="0" w:noHBand="0" w:noVBand="1"/>
       </w:tblPr>
       <w:tblGrid>
         <w:gridCol w:w="1300"/>
@@ -19858,10 +19922,10 @@
           <w:noProof/>
         </w:rPr>
         <w:drawing>
-          <wp:inline distT="0" distB="0" distL="0" distR="0" wp14:anchorId="4C36DAA6" wp14:editId="6F6EEEEA">
+          <wp:inline distT="0" distB="0" distL="0" distR="0" wp14:anchorId="0480FC10" wp14:editId="6352A450">
             <wp:extent cx="4191000" cy="1257300"/>
             <wp:effectExtent l="0" t="0" r="0" b="0"/>
-            <wp:docPr id="392475381" name="fig_scale.png" descr="Scale results: graph rebuild time, indexing throughput and search latency" title="Figure 7.1 Scale results: graph rebuild time, indexing throughput and search latency"/>
+            <wp:docPr id="884819378" name="fig_scale.png" descr="Scale results: graph rebuild time, indexing throughput and search latency" title="Figure 7.1 Scale results: graph rebuild time, indexing throughput and search latency"/>
             <wp:cNvGraphicFramePr>
               <a:graphicFrameLocks xmlns:a="http://schemas.openxmlformats.org/drawingml/2006/main" noChangeAspect="1"/>
             </wp:cNvGraphicFramePr>
@@ -19924,7 +19988,7 @@
         <w:pStyle w:val="Heading2"/>
         <w:spacing w:before="240" w:after="120"/>
       </w:pPr>
-      <w:bookmarkStart w:id="46" w:name="_Toc242795841"/>
+      <w:bookmarkStart w:id="46" w:name="_Toc242867926"/>
       <w:r>
         <w:t>7.2 Comparison with Existing Systems</w:t>
       </w:r>
@@ -19935,7 +19999,7 @@
         <w:pStyle w:val="Heading3"/>
         <w:spacing w:before="200" w:after="100"/>
       </w:pPr>
-      <w:bookmarkStart w:id="47" w:name="_Toc242795842"/>
+      <w:bookmarkStart w:id="47" w:name="_Toc242867927"/>
       <w:r>
         <w:t>7.2.1 Capability comparison</w:t>
       </w:r>
@@ -19980,7 +20044,7 @@
           <w:left w:w="10" w:type="dxa"/>
           <w:right w:w="10" w:type="dxa"/>
         </w:tblCellMar>
-        <w:tblLook w:val="0000" w:firstRow="0" w:lastRow="0" w:firstColumn="0" w:lastColumn="0" w:noHBand="0" w:noVBand="0"/>
+        <w:tblLook w:val="04A0" w:firstRow="1" w:lastRow="0" w:firstColumn="1" w:lastColumn="0" w:noHBand="0" w:noVBand="1"/>
       </w:tblPr>
       <w:tblGrid>
         <w:gridCol w:w="1710"/>
@@ -21537,7 +21601,7 @@
         <w:pStyle w:val="Heading3"/>
         <w:spacing w:before="200" w:after="100"/>
       </w:pPr>
-      <w:bookmarkStart w:id="48" w:name="_Toc242795843"/>
+      <w:bookmarkStart w:id="48" w:name="_Toc242867928"/>
       <w:r>
         <w:t>7.2.2 Measured retrieval comparison</w:t>
       </w:r>
@@ -21595,7 +21659,7 @@
           <w:left w:w="10" w:type="dxa"/>
           <w:right w:w="10" w:type="dxa"/>
         </w:tblCellMar>
-        <w:tblLook w:val="0000" w:firstRow="0" w:lastRow="0" w:firstColumn="0" w:lastColumn="0" w:noHBand="0" w:noVBand="0"/>
+        <w:tblLook w:val="04A0" w:firstRow="1" w:lastRow="0" w:firstColumn="1" w:lastColumn="0" w:noHBand="0" w:noVBand="1"/>
       </w:tblPr>
       <w:tblGrid>
         <w:gridCol w:w="2200"/>
@@ -22638,10 +22702,10 @@
           <w:noProof/>
         </w:rPr>
         <w:drawing>
-          <wp:inline distT="0" distB="0" distL="0" distR="0" wp14:anchorId="0DD07455" wp14:editId="110B94F5">
+          <wp:inline distT="0" distB="0" distL="0" distR="0" wp14:anchorId="74767B3C" wp14:editId="00629567">
             <wp:extent cx="3429000" cy="2066925"/>
             <wp:effectExtent l="0" t="0" r="0" b="0"/>
-            <wp:docPr id="144650485" name="fig_retrieval.png" descr="Hit@1 by system and query group, with 95% Wilson intervals" title="Figure 7.2 Hit@1 by system and query group, with 95% Wilson intervals"/>
+            <wp:docPr id="2092693440" name="fig_retrieval.png" descr="Hit@1 by system and query group, with 95% Wilson intervals" title="Figure 7.2 Hit@1 by system and query group, with 95% Wilson intervals"/>
             <wp:cNvGraphicFramePr>
               <a:graphicFrameLocks xmlns:a="http://schemas.openxmlformats.org/drawingml/2006/main" noChangeAspect="1"/>
             </wp:cNvGraphicFramePr>
@@ -22717,7 +22781,7 @@
         <w:pStyle w:val="Heading2"/>
         <w:spacing w:before="240" w:after="120"/>
       </w:pPr>
-      <w:bookmarkStart w:id="49" w:name="_Toc242795844"/>
+      <w:bookmarkStart w:id="49" w:name="_Toc242867929"/>
       <w:r>
         <w:t>7.3 Observations</w:t>
       </w:r>
@@ -22762,7 +22826,7 @@
           <w:left w:w="10" w:type="dxa"/>
           <w:right w:w="10" w:type="dxa"/>
         </w:tblCellMar>
-        <w:tblLook w:val="0000" w:firstRow="0" w:lastRow="0" w:firstColumn="0" w:lastColumn="0" w:noHBand="0" w:noVBand="0"/>
+        <w:tblLook w:val="04A0" w:firstRow="1" w:lastRow="0" w:firstColumn="1" w:lastColumn="0" w:noHBand="0" w:noVBand="1"/>
       </w:tblPr>
       <w:tblGrid>
         <w:gridCol w:w="2900"/>
@@ -23522,7 +23586,7 @@
         <w:spacing w:before="240" w:after="280"/>
         <w:jc w:val="center"/>
       </w:pPr>
-      <w:bookmarkStart w:id="50" w:name="_Toc242795845"/>
+      <w:bookmarkStart w:id="50" w:name="_Toc242867930"/>
       <w:r>
         <w:lastRenderedPageBreak/>
         <w:t>CONCLUSION AND FUTURE SCOPE</w:t>
@@ -23534,7 +23598,7 @@
         <w:pStyle w:val="Heading2"/>
         <w:spacing w:before="240" w:after="120"/>
       </w:pPr>
-      <w:bookmarkStart w:id="51" w:name="_Toc242795846"/>
+      <w:bookmarkStart w:id="51" w:name="_Toc242867931"/>
       <w:r>
         <w:t>8.1 Summary of Work</w:t>
       </w:r>
@@ -23557,7 +23621,7 @@
         <w:pStyle w:val="Heading2"/>
         <w:spacing w:before="240" w:after="120"/>
       </w:pPr>
-      <w:bookmarkStart w:id="52" w:name="_Toc242795847"/>
+      <w:bookmarkStart w:id="52" w:name="_Toc242867932"/>
       <w:r>
         <w:t>8.2 Limitations</w:t>
       </w:r>
@@ -23659,7 +23723,7 @@
         <w:pStyle w:val="Heading2"/>
         <w:spacing w:before="240" w:after="120"/>
       </w:pPr>
-      <w:bookmarkStart w:id="53" w:name="_Toc242795848"/>
+      <w:bookmarkStart w:id="53" w:name="_Toc242867933"/>
       <w:r>
         <w:t>8.3 Future Enhancement</w:t>
       </w:r>
@@ -23755,7 +23819,7 @@
         <w:spacing w:before="240" w:after="280"/>
         <w:jc w:val="center"/>
       </w:pPr>
-      <w:bookmarkStart w:id="54" w:name="_Toc242795849"/>
+      <w:bookmarkStart w:id="54" w:name="_Toc242867934"/>
       <w:r>
         <w:lastRenderedPageBreak/>
         <w:t>REFERENCES</w:t>
@@ -23853,7 +23917,7 @@
         <w:spacing w:before="240" w:after="280"/>
         <w:jc w:val="center"/>
       </w:pPr>
-      <w:bookmarkStart w:id="55" w:name="_Toc242795850"/>
+      <w:bookmarkStart w:id="55" w:name="_Toc242867935"/>
       <w:r>
         <w:lastRenderedPageBreak/>
         <w:t>APPENDICES</w:t>
@@ -23865,7 +23929,7 @@
         <w:pStyle w:val="Heading2"/>
         <w:spacing w:before="240" w:after="120"/>
       </w:pPr>
-      <w:bookmarkStart w:id="56" w:name="_Toc242795851"/>
+      <w:bookmarkStart w:id="56" w:name="_Toc242867936"/>
       <w:r>
         <w:t>Appendix A Source code</w:t>
       </w:r>
@@ -23885,7 +23949,7 @@
         <w:pStyle w:val="Heading2"/>
         <w:spacing w:before="240" w:after="120"/>
       </w:pPr>
-      <w:bookmarkStart w:id="57" w:name="_Toc242795852"/>
+      <w:bookmarkStart w:id="57" w:name="_Toc242867937"/>
       <w:r>
         <w:t>Appendix B Scale benchmark raw results</w:t>
       </w:r>
@@ -23930,7 +23994,7 @@
           <w:left w:w="10" w:type="dxa"/>
           <w:right w:w="10" w:type="dxa"/>
         </w:tblCellMar>
-        <w:tblLook w:val="0000" w:firstRow="0" w:lastRow="0" w:firstColumn="0" w:lastColumn="0" w:noHBand="0" w:noVBand="0"/>
+        <w:tblLook w:val="04A0" w:firstRow="1" w:lastRow="0" w:firstColumn="1" w:lastColumn="0" w:noHBand="0" w:noVBand="1"/>
       </w:tblPr>
       <w:tblGrid>
         <w:gridCol w:w="3000"/>
@@ -24659,7 +24723,7 @@
         <w:pStyle w:val="Heading2"/>
         <w:spacing w:before="240" w:after="120"/>
       </w:pPr>
-      <w:bookmarkStart w:id="58" w:name="_Toc242795853"/>
+      <w:bookmarkStart w:id="58" w:name="_Toc242867938"/>
       <w:r>
         <w:t>Appendix C Research paper</w:t>
       </w:r>
@@ -24679,11 +24743,59 @@
         <w:pStyle w:val="Heading2"/>
         <w:spacing w:before="240" w:after="120"/>
       </w:pPr>
-      <w:bookmarkStart w:id="59" w:name="_Toc242795854"/>
-      <w:r>
-        <w:t>Appendix D Papers and certificates</w:t>
+      <w:bookmarkStart w:id="59" w:name="_Toc242867939"/>
+      <w:r>
+        <w:t>Appendix D Individual contribution</w:t>
       </w:r>
       <w:bookmarkEnd w:id="59"/>
+    </w:p>
+    <w:p>
+      <w:pPr>
+        <w:spacing w:after="160" w:line="360" w:lineRule="auto"/>
+        <w:jc w:val="both"/>
+      </w:pPr>
+      <w:r>
+        <w:t>Zaid Ali Syed (Roll No. 2305139): system architecture and design; implementation of the six modules, the privacy audit and the desktop application; the scale benchmark, the retrieval comparison and the performance fixes; the research paper and the technical content of this report.</w:t>
+      </w:r>
+    </w:p>
+    <w:p>
+      <w:pPr>
+        <w:spacing w:after="160" w:line="360" w:lineRule="auto"/>
+        <w:jc w:val="both"/>
+      </w:pPr>
+      <w:r>
+        <w:t>Om Vyas (Roll No. 2305170): testing and evaluation, including the test cases, checking of search quality and validation of results against expected answers.</w:t>
+      </w:r>
+    </w:p>
+    <w:p>
+      <w:pPr>
+        <w:spacing w:after="160" w:line="360" w:lineRule="auto"/>
+        <w:jc w:val="both"/>
+      </w:pPr>
+      <w:r>
+        <w:t>Krushna Kadam (Roll No. 2305165): documentation and presentation, including report structure and formatting, the slides and review of the final deliverables.</w:t>
+      </w:r>
+    </w:p>
+    <w:p>
+      <w:pPr>
+        <w:spacing w:after="160" w:line="360" w:lineRule="auto"/>
+        <w:jc w:val="both"/>
+      </w:pPr>
+      <w:r>
+        <w:lastRenderedPageBreak/>
+        <w:t>All three members took part in design discussions, demonstration rehearsal and review under the guidance of Dr. Minakshi R. Rajput.</w:t>
+      </w:r>
+    </w:p>
+    <w:p>
+      <w:pPr>
+        <w:pStyle w:val="Heading2"/>
+        <w:spacing w:before="240" w:after="120"/>
+      </w:pPr>
+      <w:bookmarkStart w:id="60" w:name="_Toc242867940"/>
+      <w:r>
+        <w:t>Appendix E Papers and certificates</w:t>
+      </w:r>
+      <w:bookmarkEnd w:id="60"/>
     </w:p>
     <w:p>
       <w:pPr>
@@ -24871,10 +24983,10 @@
 <file path=word/numbering.xml><?xml version="1.0" encoding="utf-8"?>
 <w:numbering xmlns:wpc="http://schemas.microsoft.com/office/word/2010/wordprocessingCanvas" xmlns:cx="http://schemas.microsoft.com/office/drawing/2014/chartex" xmlns:cx1="http://schemas.microsoft.com/office/drawing/2015/9/8/chartex" xmlns:cx2="http://schemas.microsoft.com/office/drawing/2015/10/21/chartex" xmlns:cx3="http://schemas.microsoft.com/office/drawing/2016/5/9/chartex" xmlns:cx4="http://schemas.microsoft.com/office/drawing/2016/5/10/chartex" xmlns:cx5="http://schemas.microsoft.com/office/drawing/2016/5/11/chartex" xmlns:cx6="http://schemas.microsoft.com/office/drawing/2016/5/12/chartex" xmlns:cx7="http://schemas.microsoft.com/office/drawing/2016/5/13/chartex" xmlns:cx8="http://schemas.microsoft.com/office/drawing/2016/5/14/chartex" xmlns:mc="http://schemas.openxmlformats.org/markup-compatibility/2006" xmlns:aink="http://schemas.microsoft.com/office/drawing/2016/ink" xmlns:am3d="http://schemas.microsoft.com/office/drawing/2017/model3d" xmlns:o="urn:schemas-microsoft-com:office:office" xmlns:oel="http://schemas.microsoft.com/office/2019/extlst" xmlns:r="http://schemas.openxmlformats.org/officeDocument/2006/relationships" xmlns:m="http://schemas.openxmlformats.org/officeDocument/2006/math" xmlns:v="urn:schemas-microsoft-com:vml" xmlns:wp14="http://schemas.microsoft.com/office/word/2010/wordprocessingDrawing" xmlns:wp="http://schemas.openxmlformats.org/drawingml/2006/wordprocessingDrawing" xmlns:w10="urn:schemas-microsoft-com:office:word" xmlns:w="http://schemas.openxmlformats.org/wordprocessingml/2006/main" xmlns:w14="http://schemas.microsoft.com/office/word/2010/wordml" xmlns:w15="http://schemas.microsoft.com/office/word/2012/wordml" xmlns:w16cex="http://schemas.microsoft.com/office/word/2018/wordml/cex" xmlns:w16cid="http://schemas.microsoft.com/office/word/2016/wordml/cid" xmlns:w16="http://schemas.microsoft.com/office/word/2018/wordml" xmlns:w16du="http://schemas.microsoft.com/office/word/2023/wordml/word16du" xmlns:w16sdtdh="http://schemas.microsoft.com/office/word/2020/wordml/sdtdatahash" xmlns:w16sdtfl="http://schemas.microsoft.com/office/word/2024/wordml/sdtformatlock" xmlns:w16se="http://schemas.microsoft.com/office/word/2015/wordml/symex" xmlns:wpg="http://schemas.microsoft.com/office/word/2010/wordprocessingGroup" xmlns:wpi="http://schemas.microsoft.com/office/word/2010/wordprocessingInk" xmlns:wne="http://schemas.microsoft.com/office/word/2006/wordml" xmlns:wps="http://schemas.microsoft.com/office/word/2010/wordprocessingShape" mc:Ignorable="w14 w15 w16se w16cid w16 w16cex w16sdtdh w16sdtfl w16du wp14">
   <w:abstractNum w:abstractNumId="0" w15:restartNumberingAfterBreak="0">
-    <w:nsid w:val="2C3D6779"/>
+    <w:nsid w:val="15F03CFA"/>
     <w:multiLevelType w:val="hybridMultilevel"/>
-    <w:tmpl w:val="C3926202"/>
-    <w:lvl w:ilvl="0" w:tplc="77B4AA50">
+    <w:tmpl w:val="FA74E720"/>
+    <w:lvl w:ilvl="0" w:tplc="3EF0F4CA">
       <w:start w:val="1"/>
       <w:numFmt w:val="bullet"/>
       <w:lvlText w:val="●"/>
@@ -24883,7 +24995,7 @@
         <w:ind w:left="720" w:hanging="360"/>
       </w:pPr>
     </w:lvl>
-    <w:lvl w:ilvl="1" w:tplc="6A20AFE8">
+    <w:lvl w:ilvl="1" w:tplc="91DC1806">
       <w:start w:val="1"/>
       <w:numFmt w:val="bullet"/>
       <w:lvlText w:val="○"/>
@@ -24892,7 +25004,7 @@
         <w:ind w:left="1440" w:hanging="360"/>
       </w:pPr>
     </w:lvl>
-    <w:lvl w:ilvl="2" w:tplc="09845B5C">
+    <w:lvl w:ilvl="2" w:tplc="11402DBE">
       <w:start w:val="1"/>
       <w:numFmt w:val="bullet"/>
       <w:lvlText w:val="■"/>
@@ -24901,7 +25013,7 @@
         <w:ind w:left="2160" w:hanging="360"/>
       </w:pPr>
     </w:lvl>
-    <w:lvl w:ilvl="3" w:tplc="76320236">
+    <w:lvl w:ilvl="3" w:tplc="27E875FC">
       <w:start w:val="1"/>
       <w:numFmt w:val="bullet"/>
       <w:lvlText w:val="●"/>
@@ -24910,7 +25022,7 @@
         <w:ind w:left="2880" w:hanging="360"/>
       </w:pPr>
     </w:lvl>
-    <w:lvl w:ilvl="4" w:tplc="2EFA84E4">
+    <w:lvl w:ilvl="4" w:tplc="B9FCA8F4">
       <w:start w:val="1"/>
       <w:numFmt w:val="bullet"/>
       <w:lvlText w:val="○"/>
@@ -24919,7 +25031,7 @@
         <w:ind w:left="3600" w:hanging="360"/>
       </w:pPr>
     </w:lvl>
-    <w:lvl w:ilvl="5" w:tplc="95ECF396">
+    <w:lvl w:ilvl="5" w:tplc="35BAAA3E">
       <w:start w:val="1"/>
       <w:numFmt w:val="bullet"/>
       <w:lvlText w:val="■"/>
@@ -24928,7 +25040,7 @@
         <w:ind w:left="4320" w:hanging="360"/>
       </w:pPr>
     </w:lvl>
-    <w:lvl w:ilvl="6" w:tplc="844004D0">
+    <w:lvl w:ilvl="6" w:tplc="B894879E">
       <w:start w:val="1"/>
       <w:numFmt w:val="bullet"/>
       <w:lvlText w:val="●"/>
@@ -24937,7 +25049,7 @@
         <w:ind w:left="5040" w:hanging="360"/>
       </w:pPr>
     </w:lvl>
-    <w:lvl w:ilvl="7" w:tplc="D7A67282">
+    <w:lvl w:ilvl="7" w:tplc="5E3C87D4">
       <w:start w:val="1"/>
       <w:numFmt w:val="bullet"/>
       <w:lvlText w:val="●"/>
@@ -24946,7 +25058,7 @@
         <w:ind w:left="5760" w:hanging="360"/>
       </w:pPr>
     </w:lvl>
-    <w:lvl w:ilvl="8" w:tplc="4AEE0898">
+    <w:lvl w:ilvl="8" w:tplc="41280422">
       <w:start w:val="1"/>
       <w:numFmt w:val="bullet"/>
       <w:lvlText w:val="●"/>
@@ -24957,10 +25069,10 @@
     </w:lvl>
   </w:abstractNum>
   <w:abstractNum w:abstractNumId="1" w15:restartNumberingAfterBreak="0">
-    <w:nsid w:val="3D1C0FE8"/>
+    <w:nsid w:val="2DF07E8D"/>
     <w:multiLevelType w:val="hybridMultilevel"/>
-    <w:tmpl w:val="C76E3966"/>
-    <w:lvl w:ilvl="0" w:tplc="86BA11CE">
+    <w:tmpl w:val="69F2E2FA"/>
+    <w:lvl w:ilvl="0" w:tplc="31A4AC12">
       <w:start w:val="1"/>
       <w:numFmt w:val="bullet"/>
       <w:lvlText w:val="•"/>
@@ -24969,54 +25081,54 @@
         <w:ind w:left="720" w:hanging="360"/>
       </w:pPr>
     </w:lvl>
-    <w:lvl w:ilvl="1" w:tplc="934E987C">
+    <w:lvl w:ilvl="1" w:tplc="BDB8B1E8">
       <w:numFmt w:val="decimal"/>
       <w:lvlText w:val=""/>
       <w:lvlJc w:val="left"/>
     </w:lvl>
-    <w:lvl w:ilvl="2" w:tplc="37926A2C">
+    <w:lvl w:ilvl="2" w:tplc="94200BC0">
       <w:numFmt w:val="decimal"/>
       <w:lvlText w:val=""/>
       <w:lvlJc w:val="left"/>
     </w:lvl>
-    <w:lvl w:ilvl="3" w:tplc="99443B34">
+    <w:lvl w:ilvl="3" w:tplc="448C0080">
       <w:numFmt w:val="decimal"/>
       <w:lvlText w:val=""/>
       <w:lvlJc w:val="left"/>
     </w:lvl>
-    <w:lvl w:ilvl="4" w:tplc="8620EC2A">
+    <w:lvl w:ilvl="4" w:tplc="A250740C">
       <w:numFmt w:val="decimal"/>
       <w:lvlText w:val=""/>
       <w:lvlJc w:val="left"/>
     </w:lvl>
-    <w:lvl w:ilvl="5" w:tplc="C442A690">
+    <w:lvl w:ilvl="5" w:tplc="4F9C9F00">
       <w:numFmt w:val="decimal"/>
       <w:lvlText w:val=""/>
       <w:lvlJc w:val="left"/>
     </w:lvl>
-    <w:lvl w:ilvl="6" w:tplc="5A806390">
+    <w:lvl w:ilvl="6" w:tplc="6C6CE548">
       <w:numFmt w:val="decimal"/>
       <w:lvlText w:val=""/>
       <w:lvlJc w:val="left"/>
     </w:lvl>
-    <w:lvl w:ilvl="7" w:tplc="FFB6A036">
+    <w:lvl w:ilvl="7" w:tplc="813A2A66">
       <w:numFmt w:val="decimal"/>
       <w:lvlText w:val=""/>
       <w:lvlJc w:val="left"/>
     </w:lvl>
-    <w:lvl w:ilvl="8" w:tplc="E0BE64CE">
+    <w:lvl w:ilvl="8" w:tplc="196E121E">
       <w:numFmt w:val="decimal"/>
       <w:lvlText w:val=""/>
       <w:lvlJc w:val="left"/>
     </w:lvl>
   </w:abstractNum>
-  <w:num w:numId="1" w16cid:durableId="873271226">
+  <w:num w:numId="1" w16cid:durableId="776876870">
     <w:abstractNumId w:val="0"/>
     <w:lvlOverride w:ilvl="0">
       <w:startOverride w:val="1"/>
     </w:lvlOverride>
   </w:num>
-  <w:num w:numId="2" w16cid:durableId="1745952328">
+  <w:num w:numId="2" w16cid:durableId="217665979">
     <w:abstractNumId w:val="1"/>
     <w:lvlOverride w:ilvl="0">
       <w:startOverride w:val="1"/>
@@ -25630,7 +25742,7 @@
     <w:autoRedefine/>
     <w:uiPriority w:val="39"/>
     <w:unhideWhenUsed/>
-    <w:rsid w:val="00EB4F84"/>
+    <w:rsid w:val="00FA577B"/>
     <w:pPr>
       <w:spacing w:after="100"/>
     </w:pPr>
@@ -25642,7 +25754,7 @@
     <w:autoRedefine/>
     <w:uiPriority w:val="39"/>
     <w:unhideWhenUsed/>
-    <w:rsid w:val="00EB4F84"/>
+    <w:rsid w:val="00FA577B"/>
     <w:pPr>
       <w:spacing w:after="100"/>
       <w:ind w:left="240"/>
@@ -25655,7 +25767,7 @@
     <w:autoRedefine/>
     <w:uiPriority w:val="39"/>
     <w:unhideWhenUsed/>
-    <w:rsid w:val="00EB4F84"/>
+    <w:rsid w:val="00FA577B"/>
     <w:pPr>
       <w:spacing w:after="100"/>
       <w:ind w:left="480"/>

</xml_diff>